<commit_message>
ENSO: intensity classes, Brazil episode-by-episode table (crop year N+1, by species), growth decomposition from 2010/11
Co-Authored-By: Claude Fable 5.1 <noreply@anthropic.com>
Claude-Session: https://claude.ai/code/session_01FCxjZoAHXMLJTirXSfbmgL
</commit_message>
<xml_diff>
--- a/timeseries/output/reports/Bresil_balance_sheet_cafe.docx
+++ b/timeseries/output/reports/Bresil_balance_sheet_cafe.docx
@@ -58,7 +58,7 @@
         <w:rPr>
           <w:sz w:val="20"/>
         </w:rPr>
-        <w:t>Entre 2015/16 et 2025/26, la production est passée de 49 400 à 63 000 (+2.5 % par an) : surface bearing -1.1 % par an, rendement +3.6 % par an. Le rendement fait la croissance.</w:t>
+        <w:t>Entre 2010/11 et 2025/26, la production est passée de 54 500 à 63 000 (+1.0 % par an) : surface bearing -1.0 % par an, rendement +2.0 % par an. Le rendement fait la croissance.</w:t>
       </w:r>
     </w:p>
     <w:p>
@@ -70,6 +70,17 @@
           <w:sz w:val="20"/>
         </w:rPr>
         <w:t>El Niño : rendement en moyenne -4.4 % par rapport aux campagnes voisines sur 8 campagnes (88 % d'entre elles sous la moyenne) ; El Niño fort : -7.2 % (4 campagnes, 100 % sous la moyenne). La Niña : +0.1 % (10 campagnes).</w:t>
+      </w:r>
+    </w:p>
+    <w:p>
+      <w:pPr>
+        <w:pStyle w:val="ListBullet"/>
+      </w:pPr>
+      <w:r>
+        <w:rPr>
+          <w:sz w:val="20"/>
+        </w:rPr>
+        <w:t>El Niño fort (ONI ≥ 2 : épisodes 2015/16, 2023/24, campagnes suivantes 2016/17, 2024/25) : Minas Gerais -281 mm et +1.6 °C, Espírito Santo -400 mm et +1.5 °C. Robusta -19.4 % par rapport à l'attendu, arabica -0.1 % (années ON, qui tiennent grâce au cycle), total -5.6 %.</w:t>
       </w:r>
     </w:p>
     <w:p>
@@ -1909,7 +1920,7 @@
           <w:i w:val="0"/>
           <w:sz w:val="20"/>
         </w:rPr>
-        <w:t>Décomposition de la croissance 2015/16 → 2025/26 : production +2.5 %/an = surface bearing -1.1 %/an + rendement +3.6 %/an (rendement implicite 23.9 → 33.9 sacs par ha bearing).</w:t>
+        <w:t>Décomposition de la croissance 2010/11 → 2025/26 : production +1.0 %/an = surface bearing -1.0 %/an + rendement +2.0 %/an (rendement implicite 25.1 → 33.9 sacs par ha bearing).</w:t>
       </w:r>
     </w:p>
     <w:p>
@@ -2592,13 +2603,23 @@
       </w:r>
     </w:p>
     <w:p>
+      <w:r>
+        <w:rPr>
+          <w:b w:val="0"/>
+          <w:i w:val="0"/>
+          <w:sz w:val="20"/>
+        </w:rPr>
+        <w:t>Convention retenue, comme demandé : l'épisode ENSO de l'hiver N/N+1 est rattaché à la campagne N+1/N+2 (celle dont la floraison, sept.-nov. N+1, et le remplissage se déroulent pendant et juste après l'épisode). Exemples : El Niño 2015/16 → campagne 2016/17 ; El Niño 2023/24 → campagne 2024/25 ; El Niño 2009/10 → 2010/11. Les classes d'intensité suivent le pic ONI : fort ≥ 2, modéré 1 à 2, faible &lt; 1.</w:t>
+      </w:r>
+    </w:p>
+    <w:p>
       <w:pPr>
         <w:jc w:val="center"/>
       </w:pPr>
       <w:r>
         <w:drawing>
           <wp:inline xmlns:a="http://schemas.openxmlformats.org/drawingml/2006/main" xmlns:pic="http://schemas.openxmlformats.org/drawingml/2006/picture">
-            <wp:extent cx="6120000" cy="2000268"/>
+            <wp:extent cx="6120000" cy="1934070"/>
             <wp:docPr id="4" name="Picture 4"/>
             <wp:cNvGraphicFramePr>
               <a:graphicFrameLocks noChangeAspect="1"/>
@@ -2619,7 +2640,7 @@
                   <pic:spPr>
                     <a:xfrm>
                       <a:off x="0" y="0"/>
-                      <a:ext cx="6120000" cy="2000268"/>
+                      <a:ext cx="6120000" cy="1934070"/>
                     </a:xfrm>
                     <a:prstGeom prst="rect"/>
                   </pic:spPr>
@@ -2638,7 +2659,3155 @@
           <w:color w:val="52514E"/>
           <w:sz w:val="16"/>
         </w:rPr>
-        <w:t>Figure 4. Météo des États caféiers par phase ENSO (balance sheet).</w:t>
+        <w:t>Figure 4. Météo des États caféiers pendant la campagne qui suit chaque classe d'épisode (écart à la moyenne 1998-2025).</w:t>
+      </w:r>
+    </w:p>
+    <w:p>
+      <w:r>
+        <w:rPr>
+          <w:b/>
+          <w:i w:val="0"/>
+          <w:sz w:val="20"/>
+        </w:rPr>
+        <w:t>Épisode par épisode, campagne N+1 (écart = par rapport à la moyenne des campagnes voisines, cycle ON/OFF retiré ; variation = par rapport à la campagne précédente) :</w:t>
+      </w:r>
+    </w:p>
+    <w:tbl>
+      <w:tblPr>
+        <w:tblStyle w:val="LightGrid-Accent1"/>
+        <w:tblW w:type="auto" w:w="0"/>
+        <w:jc w:val="center"/>
+        <w:tblLook w:firstColumn="1" w:firstRow="1" w:lastColumn="0" w:lastRow="0" w:noHBand="0" w:noVBand="1" w:val="04A0"/>
+      </w:tblPr>
+      <w:tblGrid>
+        <w:gridCol w:w="1246"/>
+        <w:gridCol w:w="1246"/>
+        <w:gridCol w:w="1246"/>
+        <w:gridCol w:w="1246"/>
+        <w:gridCol w:w="1246"/>
+        <w:gridCol w:w="1246"/>
+        <w:gridCol w:w="1246"/>
+        <w:gridCol w:w="1246"/>
+      </w:tblGrid>
+      <w:tr>
+        <w:tc>
+          <w:tcPr>
+            <w:tcW w:type="dxa" w:w="1247"/>
+          </w:tcPr>
+          <w:p>
+            <w:r/>
+            <w:r>
+              <w:rPr>
+                <w:b/>
+                <w:sz w:val="14"/>
+              </w:rPr>
+              <w:t>Épisode (ONI)</w:t>
+            </w:r>
+          </w:p>
+        </w:tc>
+        <w:tc>
+          <w:tcPr>
+            <w:tcW w:type="dxa" w:w="1474"/>
+          </w:tcPr>
+          <w:p>
+            <w:r/>
+            <w:r>
+              <w:rPr>
+                <w:b/>
+                <w:sz w:val="14"/>
+              </w:rPr>
+              <w:t>Classe</w:t>
+            </w:r>
+          </w:p>
+        </w:tc>
+        <w:tc>
+          <w:tcPr>
+            <w:tcW w:type="dxa" w:w="1077"/>
+          </w:tcPr>
+          <w:p>
+            <w:r/>
+            <w:r>
+              <w:rPr>
+                <w:b/>
+                <w:sz w:val="14"/>
+              </w:rPr>
+              <w:t>Campagne N+1</w:t>
+            </w:r>
+          </w:p>
+        </w:tc>
+        <w:tc>
+          <w:tcPr>
+            <w:tcW w:type="dxa" w:w="1587"/>
+          </w:tcPr>
+          <w:p>
+            <w:r/>
+            <w:r>
+              <w:rPr>
+                <w:b/>
+                <w:sz w:val="14"/>
+              </w:rPr>
+              <w:t>Arabica (var. / écart)</w:t>
+            </w:r>
+          </w:p>
+        </w:tc>
+        <w:tc>
+          <w:tcPr>
+            <w:tcW w:type="dxa" w:w="1587"/>
+          </w:tcPr>
+          <w:p>
+            <w:r/>
+            <w:r>
+              <w:rPr>
+                <w:b/>
+                <w:sz w:val="14"/>
+              </w:rPr>
+              <w:t>Robusta (var. / écart)</w:t>
+            </w:r>
+          </w:p>
+        </w:tc>
+        <w:tc>
+          <w:tcPr>
+            <w:tcW w:type="dxa" w:w="850"/>
+          </w:tcPr>
+          <w:p>
+            <w:r/>
+            <w:r>
+              <w:rPr>
+                <w:b/>
+                <w:sz w:val="14"/>
+              </w:rPr>
+              <w:t>Rendement écart</w:t>
+            </w:r>
+          </w:p>
+        </w:tc>
+        <w:tc>
+          <w:tcPr>
+            <w:tcW w:type="dxa" w:w="1247"/>
+          </w:tcPr>
+          <w:p>
+            <w:r/>
+            <w:r>
+              <w:rPr>
+                <w:b/>
+                <w:sz w:val="14"/>
+              </w:rPr>
+              <w:t>Minas Gerais</w:t>
+            </w:r>
+          </w:p>
+        </w:tc>
+        <w:tc>
+          <w:tcPr>
+            <w:tcW w:type="dxa" w:w="1247"/>
+          </w:tcPr>
+          <w:p>
+            <w:r/>
+            <w:r>
+              <w:rPr>
+                <w:b/>
+                <w:sz w:val="14"/>
+              </w:rPr>
+              <w:t>Espírito Santo</w:t>
+            </w:r>
+          </w:p>
+        </w:tc>
+      </w:tr>
+      <w:tr>
+        <w:tc>
+          <w:tcPr>
+            <w:tcW w:type="dxa" w:w="1247"/>
+          </w:tcPr>
+          <w:p>
+            <w:r/>
+            <w:r>
+              <w:rPr>
+                <w:sz w:val="14"/>
+              </w:rPr>
+              <w:t>2002/03 (+1.3)</w:t>
+            </w:r>
+          </w:p>
+        </w:tc>
+        <w:tc>
+          <w:tcPr>
+            <w:tcW w:type="dxa" w:w="1474"/>
+          </w:tcPr>
+          <w:p>
+            <w:r/>
+            <w:r>
+              <w:rPr>
+                <w:sz w:val="14"/>
+              </w:rPr>
+              <w:t>El Niño modere (1-2)</w:t>
+            </w:r>
+          </w:p>
+        </w:tc>
+        <w:tc>
+          <w:tcPr>
+            <w:tcW w:type="dxa" w:w="1077"/>
+          </w:tcPr>
+          <w:p>
+            <w:r/>
+            <w:r>
+              <w:rPr>
+                <w:sz w:val="14"/>
+              </w:rPr>
+              <w:t>2003/04 OFF</w:t>
+            </w:r>
+          </w:p>
+        </w:tc>
+        <w:tc>
+          <w:tcPr>
+            <w:tcW w:type="dxa" w:w="1587"/>
+          </w:tcPr>
+          <w:p>
+            <w:r/>
+            <w:r>
+              <w:rPr>
+                <w:sz w:val="14"/>
+              </w:rPr>
+              <w:t>23 600 (-43 % / -13.5 %)</w:t>
+            </w:r>
+          </w:p>
+        </w:tc>
+        <w:tc>
+          <w:tcPr>
+            <w:tcW w:type="dxa" w:w="1587"/>
+          </w:tcPr>
+          <w:p>
+            <w:r/>
+            <w:r>
+              <w:rPr>
+                <w:sz w:val="14"/>
+              </w:rPr>
+              <w:t>9 600 (-20 % / -8.7 %)</w:t>
+            </w:r>
+          </w:p>
+        </w:tc>
+        <w:tc>
+          <w:tcPr>
+            <w:tcW w:type="dxa" w:w="850"/>
+          </w:tcPr>
+          <w:p>
+            <w:r/>
+            <w:r>
+              <w:rPr>
+                <w:sz w:val="14"/>
+              </w:rPr>
+              <w:t>-20.5 %</w:t>
+            </w:r>
+          </w:p>
+        </w:tc>
+        <w:tc>
+          <w:tcPr>
+            <w:tcW w:type="dxa" w:w="1247"/>
+          </w:tcPr>
+          <w:p>
+            <w:r/>
+            <w:r>
+              <w:rPr>
+                <w:sz w:val="14"/>
+              </w:rPr>
+              <w:t>+157 mm / -0.3 °C</w:t>
+            </w:r>
+          </w:p>
+        </w:tc>
+        <w:tc>
+          <w:tcPr>
+            <w:tcW w:type="dxa" w:w="1247"/>
+          </w:tcPr>
+          <w:p>
+            <w:r/>
+            <w:r>
+              <w:rPr>
+                <w:sz w:val="14"/>
+              </w:rPr>
+              <w:t>-184 mm / +0.2 °C</w:t>
+            </w:r>
+          </w:p>
+        </w:tc>
+      </w:tr>
+      <w:tr>
+        <w:tc>
+          <w:tcPr>
+            <w:tcW w:type="dxa" w:w="1247"/>
+          </w:tcPr>
+          <w:p>
+            <w:r/>
+            <w:r>
+              <w:rPr>
+                <w:sz w:val="14"/>
+              </w:rPr>
+              <w:t>2004/05 (+0.7)</w:t>
+            </w:r>
+          </w:p>
+        </w:tc>
+        <w:tc>
+          <w:tcPr>
+            <w:tcW w:type="dxa" w:w="1474"/>
+          </w:tcPr>
+          <w:p>
+            <w:r/>
+            <w:r>
+              <w:rPr>
+                <w:sz w:val="14"/>
+              </w:rPr>
+              <w:t>El Niño faible (&lt; 1)</w:t>
+            </w:r>
+          </w:p>
+        </w:tc>
+        <w:tc>
+          <w:tcPr>
+            <w:tcW w:type="dxa" w:w="1077"/>
+          </w:tcPr>
+          <w:p>
+            <w:r/>
+            <w:r>
+              <w:rPr>
+                <w:sz w:val="14"/>
+              </w:rPr>
+              <w:t>2005/06 OFF</w:t>
+            </w:r>
+          </w:p>
+        </w:tc>
+        <w:tc>
+          <w:tcPr>
+            <w:tcW w:type="dxa" w:w="1587"/>
+          </w:tcPr>
+          <w:p>
+            <w:r/>
+            <w:r>
+              <w:rPr>
+                <w:sz w:val="14"/>
+              </w:rPr>
+              <w:t>26 000 (-24 % / -2.2 %)</w:t>
+            </w:r>
+          </w:p>
+        </w:tc>
+        <w:tc>
+          <w:tcPr>
+            <w:tcW w:type="dxa" w:w="1587"/>
+          </w:tcPr>
+          <w:p>
+            <w:r/>
+            <w:r>
+              <w:rPr>
+                <w:sz w:val="14"/>
+              </w:rPr>
+              <w:t>10 100 (+9 % / -1.4 %)</w:t>
+            </w:r>
+          </w:p>
+        </w:tc>
+        <w:tc>
+          <w:tcPr>
+            <w:tcW w:type="dxa" w:w="850"/>
+          </w:tcPr>
+          <w:p>
+            <w:r/>
+            <w:r>
+              <w:rPr>
+                <w:sz w:val="14"/>
+              </w:rPr>
+              <w:t>-3.1 %</w:t>
+            </w:r>
+          </w:p>
+        </w:tc>
+        <w:tc>
+          <w:tcPr>
+            <w:tcW w:type="dxa" w:w="1247"/>
+          </w:tcPr>
+          <w:p>
+            <w:r/>
+            <w:r>
+              <w:rPr>
+                <w:sz w:val="14"/>
+              </w:rPr>
+              <w:t>+148 mm / -0.5 °C</w:t>
+            </w:r>
+          </w:p>
+        </w:tc>
+        <w:tc>
+          <w:tcPr>
+            <w:tcW w:type="dxa" w:w="1247"/>
+          </w:tcPr>
+          <w:p>
+            <w:r/>
+            <w:r>
+              <w:rPr>
+                <w:sz w:val="14"/>
+              </w:rPr>
+              <w:t>+417 mm / -0.5 °C</w:t>
+            </w:r>
+          </w:p>
+        </w:tc>
+      </w:tr>
+      <w:tr>
+        <w:tc>
+          <w:tcPr>
+            <w:tcW w:type="dxa" w:w="1247"/>
+          </w:tcPr>
+          <w:p>
+            <w:r/>
+            <w:r>
+              <w:rPr>
+                <w:sz w:val="14"/>
+              </w:rPr>
+              <w:t>2005/06 (-0.9)</w:t>
+            </w:r>
+          </w:p>
+        </w:tc>
+        <w:tc>
+          <w:tcPr>
+            <w:tcW w:type="dxa" w:w="1474"/>
+          </w:tcPr>
+          <w:p>
+            <w:r/>
+            <w:r>
+              <w:rPr>
+                <w:sz w:val="14"/>
+              </w:rPr>
+              <w:t>La Niña faible (&gt; -1)</w:t>
+            </w:r>
+          </w:p>
+        </w:tc>
+        <w:tc>
+          <w:tcPr>
+            <w:tcW w:type="dxa" w:w="1077"/>
+          </w:tcPr>
+          <w:p>
+            <w:r/>
+            <w:r>
+              <w:rPr>
+                <w:sz w:val="14"/>
+              </w:rPr>
+              <w:t>2006/07 ON</w:t>
+            </w:r>
+          </w:p>
+        </w:tc>
+        <w:tc>
+          <w:tcPr>
+            <w:tcW w:type="dxa" w:w="1587"/>
+          </w:tcPr>
+          <w:p>
+            <w:r/>
+            <w:r>
+              <w:rPr>
+                <w:sz w:val="14"/>
+              </w:rPr>
+              <w:t>36 000 (+38 % / +0.5 %)</w:t>
+            </w:r>
+          </w:p>
+        </w:tc>
+        <w:tc>
+          <w:tcPr>
+            <w:tcW w:type="dxa" w:w="1587"/>
+          </w:tcPr>
+          <w:p>
+            <w:r/>
+            <w:r>
+              <w:rPr>
+                <w:sz w:val="14"/>
+              </w:rPr>
+              <w:t>10 700 (+6 % / -2.1 %)</w:t>
+            </w:r>
+          </w:p>
+        </w:tc>
+        <w:tc>
+          <w:tcPr>
+            <w:tcW w:type="dxa" w:w="850"/>
+          </w:tcPr>
+          <w:p>
+            <w:r/>
+            <w:r>
+              <w:rPr>
+                <w:sz w:val="14"/>
+              </w:rPr>
+              <w:t>-4.1 %</w:t>
+            </w:r>
+          </w:p>
+        </w:tc>
+        <w:tc>
+          <w:tcPr>
+            <w:tcW w:type="dxa" w:w="1247"/>
+          </w:tcPr>
+          <w:p>
+            <w:r/>
+            <w:r>
+              <w:rPr>
+                <w:sz w:val="14"/>
+              </w:rPr>
+              <w:t>-6 mm / -0.5 °C</w:t>
+            </w:r>
+          </w:p>
+        </w:tc>
+        <w:tc>
+          <w:tcPr>
+            <w:tcW w:type="dxa" w:w="1247"/>
+          </w:tcPr>
+          <w:p>
+            <w:r/>
+            <w:r>
+              <w:rPr>
+                <w:sz w:val="14"/>
+              </w:rPr>
+              <w:t>-13 mm / -0.5 °C</w:t>
+            </w:r>
+          </w:p>
+        </w:tc>
+      </w:tr>
+      <w:tr>
+        <w:tc>
+          <w:tcPr>
+            <w:tcW w:type="dxa" w:w="1247"/>
+          </w:tcPr>
+          <w:p>
+            <w:r/>
+            <w:r>
+              <w:rPr>
+                <w:sz w:val="14"/>
+              </w:rPr>
+              <w:t>2006/07 (+0.9)</w:t>
+            </w:r>
+          </w:p>
+        </w:tc>
+        <w:tc>
+          <w:tcPr>
+            <w:tcW w:type="dxa" w:w="1474"/>
+          </w:tcPr>
+          <w:p>
+            <w:r/>
+            <w:r>
+              <w:rPr>
+                <w:sz w:val="14"/>
+              </w:rPr>
+              <w:t>El Niño faible (&lt; 1)</w:t>
+            </w:r>
+          </w:p>
+        </w:tc>
+        <w:tc>
+          <w:tcPr>
+            <w:tcW w:type="dxa" w:w="1077"/>
+          </w:tcPr>
+          <w:p>
+            <w:r/>
+            <w:r>
+              <w:rPr>
+                <w:sz w:val="14"/>
+              </w:rPr>
+              <w:t>2007/08 OFF</w:t>
+            </w:r>
+          </w:p>
+        </w:tc>
+        <w:tc>
+          <w:tcPr>
+            <w:tcW w:type="dxa" w:w="1587"/>
+          </w:tcPr>
+          <w:p>
+            <w:r/>
+            <w:r>
+              <w:rPr>
+                <w:sz w:val="14"/>
+              </w:rPr>
+              <w:t>27 650 (-23 % / -7.4 %)</w:t>
+            </w:r>
+          </w:p>
+        </w:tc>
+        <w:tc>
+          <w:tcPr>
+            <w:tcW w:type="dxa" w:w="1587"/>
+          </w:tcPr>
+          <w:p>
+            <w:r/>
+            <w:r>
+              <w:rPr>
+                <w:sz w:val="14"/>
+              </w:rPr>
+              <w:t>11 450 (+7 % / +1.0 %)</w:t>
+            </w:r>
+          </w:p>
+        </w:tc>
+        <w:tc>
+          <w:tcPr>
+            <w:tcW w:type="dxa" w:w="850"/>
+          </w:tcPr>
+          <w:p>
+            <w:r/>
+            <w:r>
+              <w:rPr>
+                <w:sz w:val="14"/>
+              </w:rPr>
+              <w:t>-4.6 %</w:t>
+            </w:r>
+          </w:p>
+        </w:tc>
+        <w:tc>
+          <w:tcPr>
+            <w:tcW w:type="dxa" w:w="1247"/>
+          </w:tcPr>
+          <w:p>
+            <w:r/>
+            <w:r>
+              <w:rPr>
+                <w:sz w:val="14"/>
+              </w:rPr>
+              <w:t>+141 mm / -0.5 °C</w:t>
+            </w:r>
+          </w:p>
+        </w:tc>
+        <w:tc>
+          <w:tcPr>
+            <w:tcW w:type="dxa" w:w="1247"/>
+          </w:tcPr>
+          <w:p>
+            <w:r/>
+            <w:r>
+              <w:rPr>
+                <w:sz w:val="14"/>
+              </w:rPr>
+              <w:t>+161 mm / -0.6 °C</w:t>
+            </w:r>
+          </w:p>
+        </w:tc>
+      </w:tr>
+      <w:tr>
+        <w:tc>
+          <w:tcPr>
+            <w:tcW w:type="dxa" w:w="1247"/>
+          </w:tcPr>
+          <w:p>
+            <w:r/>
+            <w:r>
+              <w:rPr>
+                <w:sz w:val="14"/>
+              </w:rPr>
+              <w:t>2007/08 (-1.6)</w:t>
+            </w:r>
+          </w:p>
+        </w:tc>
+        <w:tc>
+          <w:tcPr>
+            <w:tcW w:type="dxa" w:w="1474"/>
+          </w:tcPr>
+          <w:p>
+            <w:r/>
+            <w:r>
+              <w:rPr>
+                <w:sz w:val="14"/>
+              </w:rPr>
+              <w:t>La Niña forte (&lt;= -1.5)</w:t>
+            </w:r>
+          </w:p>
+        </w:tc>
+        <w:tc>
+          <w:tcPr>
+            <w:tcW w:type="dxa" w:w="1077"/>
+          </w:tcPr>
+          <w:p>
+            <w:r/>
+            <w:r>
+              <w:rPr>
+                <w:sz w:val="14"/>
+              </w:rPr>
+              <w:t>2008/09 ON</w:t>
+            </w:r>
+          </w:p>
+        </w:tc>
+        <w:tc>
+          <w:tcPr>
+            <w:tcW w:type="dxa" w:w="1587"/>
+          </w:tcPr>
+          <w:p>
+            <w:r/>
+            <w:r>
+              <w:rPr>
+                <w:sz w:val="14"/>
+              </w:rPr>
+              <w:t>40 500 (+46 % / +6.3 %)</w:t>
+            </w:r>
+          </w:p>
+        </w:tc>
+        <w:tc>
+          <w:tcPr>
+            <w:tcW w:type="dxa" w:w="1587"/>
+          </w:tcPr>
+          <w:p>
+            <w:r/>
+            <w:r>
+              <w:rPr>
+                <w:sz w:val="14"/>
+              </w:rPr>
+              <w:t>12 800 (+12 % / +9.6 %)</w:t>
+            </w:r>
+          </w:p>
+        </w:tc>
+        <w:tc>
+          <w:tcPr>
+            <w:tcW w:type="dxa" w:w="850"/>
+          </w:tcPr>
+          <w:p>
+            <w:r/>
+            <w:r>
+              <w:rPr>
+                <w:sz w:val="14"/>
+              </w:rPr>
+              <w:t>+6.3 %</w:t>
+            </w:r>
+          </w:p>
+        </w:tc>
+        <w:tc>
+          <w:tcPr>
+            <w:tcW w:type="dxa" w:w="1247"/>
+          </w:tcPr>
+          <w:p>
+            <w:r/>
+            <w:r>
+              <w:rPr>
+                <w:sz w:val="14"/>
+              </w:rPr>
+              <w:t>+70 mm / -0.5 °C</w:t>
+            </w:r>
+          </w:p>
+        </w:tc>
+        <w:tc>
+          <w:tcPr>
+            <w:tcW w:type="dxa" w:w="1247"/>
+          </w:tcPr>
+          <w:p>
+            <w:r/>
+            <w:r>
+              <w:rPr>
+                <w:sz w:val="14"/>
+              </w:rPr>
+              <w:t>-208 mm / -0.0 °C</w:t>
+            </w:r>
+          </w:p>
+        </w:tc>
+      </w:tr>
+      <w:tr>
+        <w:tc>
+          <w:tcPr>
+            <w:tcW w:type="dxa" w:w="1247"/>
+          </w:tcPr>
+          <w:p>
+            <w:r/>
+            <w:r>
+              <w:rPr>
+                <w:sz w:val="14"/>
+              </w:rPr>
+              <w:t>2008/09 (-0.8)</w:t>
+            </w:r>
+          </w:p>
+        </w:tc>
+        <w:tc>
+          <w:tcPr>
+            <w:tcW w:type="dxa" w:w="1474"/>
+          </w:tcPr>
+          <w:p>
+            <w:r/>
+            <w:r>
+              <w:rPr>
+                <w:sz w:val="14"/>
+              </w:rPr>
+              <w:t>La Niña faible (&gt; -1)</w:t>
+            </w:r>
+          </w:p>
+        </w:tc>
+        <w:tc>
+          <w:tcPr>
+            <w:tcW w:type="dxa" w:w="1077"/>
+          </w:tcPr>
+          <w:p>
+            <w:r/>
+            <w:r>
+              <w:rPr>
+                <w:sz w:val="14"/>
+              </w:rPr>
+              <w:t>2009/10 OFF</w:t>
+            </w:r>
+          </w:p>
+        </w:tc>
+        <w:tc>
+          <w:tcPr>
+            <w:tcW w:type="dxa" w:w="1587"/>
+          </w:tcPr>
+          <w:p>
+            <w:r/>
+            <w:r>
+              <w:rPr>
+                <w:sz w:val="14"/>
+              </w:rPr>
+              <w:t>33 000 (-19 % / +1.6 %)</w:t>
+            </w:r>
+          </w:p>
+        </w:tc>
+        <w:tc>
+          <w:tcPr>
+            <w:tcW w:type="dxa" w:w="1587"/>
+          </w:tcPr>
+          <w:p>
+            <w:r/>
+            <w:r>
+              <w:rPr>
+                <w:sz w:val="14"/>
+              </w:rPr>
+              <w:t>11 800 (-8 % / -8.2 %)</w:t>
+            </w:r>
+          </w:p>
+        </w:tc>
+        <w:tc>
+          <w:tcPr>
+            <w:tcW w:type="dxa" w:w="850"/>
+          </w:tcPr>
+          <w:p>
+            <w:r/>
+            <w:r>
+              <w:rPr>
+                <w:sz w:val="14"/>
+              </w:rPr>
+              <w:t>+1.0 %</w:t>
+            </w:r>
+          </w:p>
+        </w:tc>
+        <w:tc>
+          <w:tcPr>
+            <w:tcW w:type="dxa" w:w="1247"/>
+          </w:tcPr>
+          <w:p>
+            <w:r/>
+            <w:r>
+              <w:rPr>
+                <w:sz w:val="14"/>
+              </w:rPr>
+              <w:t>+295 mm / -0.5 °C</w:t>
+            </w:r>
+          </w:p>
+        </w:tc>
+        <w:tc>
+          <w:tcPr>
+            <w:tcW w:type="dxa" w:w="1247"/>
+          </w:tcPr>
+          <w:p>
+            <w:r/>
+            <w:r>
+              <w:rPr>
+                <w:sz w:val="14"/>
+              </w:rPr>
+              <w:t>+266 mm / -0.3 °C</w:t>
+            </w:r>
+          </w:p>
+        </w:tc>
+      </w:tr>
+      <w:tr>
+        <w:tc>
+          <w:tcPr>
+            <w:tcW w:type="dxa" w:w="1247"/>
+          </w:tcPr>
+          <w:p>
+            <w:r/>
+            <w:r>
+              <w:rPr>
+                <w:sz w:val="14"/>
+              </w:rPr>
+              <w:t>2009/10 (+1.6)</w:t>
+            </w:r>
+          </w:p>
+        </w:tc>
+        <w:tc>
+          <w:tcPr>
+            <w:tcW w:type="dxa" w:w="1474"/>
+          </w:tcPr>
+          <w:p>
+            <w:r/>
+            <w:r>
+              <w:rPr>
+                <w:sz w:val="14"/>
+              </w:rPr>
+              <w:t>El Niño modere (1-2)</w:t>
+            </w:r>
+          </w:p>
+        </w:tc>
+        <w:tc>
+          <w:tcPr>
+            <w:tcW w:type="dxa" w:w="1077"/>
+          </w:tcPr>
+          <w:p>
+            <w:r/>
+            <w:r>
+              <w:rPr>
+                <w:sz w:val="14"/>
+              </w:rPr>
+              <w:t>2010/11 ON</w:t>
+            </w:r>
+          </w:p>
+        </w:tc>
+        <w:tc>
+          <w:tcPr>
+            <w:tcW w:type="dxa" w:w="1587"/>
+          </w:tcPr>
+          <w:p>
+            <w:r/>
+            <w:r>
+              <w:rPr>
+                <w:sz w:val="14"/>
+              </w:rPr>
+              <w:t>41 800 (+27 % / +1.4 %)</w:t>
+            </w:r>
+          </w:p>
+        </w:tc>
+        <w:tc>
+          <w:tcPr>
+            <w:tcW w:type="dxa" w:w="1587"/>
+          </w:tcPr>
+          <w:p>
+            <w:r/>
+            <w:r>
+              <w:rPr>
+                <w:sz w:val="14"/>
+              </w:rPr>
+              <w:t>12 700 (+8 % / -7.1 %)</w:t>
+            </w:r>
+          </w:p>
+        </w:tc>
+        <w:tc>
+          <w:tcPr>
+            <w:tcW w:type="dxa" w:w="850"/>
+          </w:tcPr>
+          <w:p>
+            <w:r/>
+            <w:r>
+              <w:rPr>
+                <w:sz w:val="14"/>
+              </w:rPr>
+              <w:t>-2.0 %</w:t>
+            </w:r>
+          </w:p>
+        </w:tc>
+        <w:tc>
+          <w:tcPr>
+            <w:tcW w:type="dxa" w:w="1247"/>
+          </w:tcPr>
+          <w:p>
+            <w:r/>
+            <w:r>
+              <w:rPr>
+                <w:sz w:val="14"/>
+              </w:rPr>
+              <w:t>-101 mm / -0.1 °C</w:t>
+            </w:r>
+          </w:p>
+        </w:tc>
+        <w:tc>
+          <w:tcPr>
+            <w:tcW w:type="dxa" w:w="1247"/>
+          </w:tcPr>
+          <w:p>
+            <w:r/>
+            <w:r>
+              <w:rPr>
+                <w:sz w:val="14"/>
+              </w:rPr>
+              <w:t>-57 mm / +0.2 °C</w:t>
+            </w:r>
+          </w:p>
+        </w:tc>
+      </w:tr>
+      <w:tr>
+        <w:tc>
+          <w:tcPr>
+            <w:tcW w:type="dxa" w:w="1247"/>
+          </w:tcPr>
+          <w:p>
+            <w:r/>
+            <w:r>
+              <w:rPr>
+                <w:sz w:val="14"/>
+              </w:rPr>
+              <w:t>2010/11 (-1.6)</w:t>
+            </w:r>
+          </w:p>
+        </w:tc>
+        <w:tc>
+          <w:tcPr>
+            <w:tcW w:type="dxa" w:w="1474"/>
+          </w:tcPr>
+          <w:p>
+            <w:r/>
+            <w:r>
+              <w:rPr>
+                <w:sz w:val="14"/>
+              </w:rPr>
+              <w:t>La Niña forte (&lt;= -1.5)</w:t>
+            </w:r>
+          </w:p>
+        </w:tc>
+        <w:tc>
+          <w:tcPr>
+            <w:tcW w:type="dxa" w:w="1077"/>
+          </w:tcPr>
+          <w:p>
+            <w:r/>
+            <w:r>
+              <w:rPr>
+                <w:sz w:val="14"/>
+              </w:rPr>
+              <w:t>2011/12 OFF</w:t>
+            </w:r>
+          </w:p>
+        </w:tc>
+        <w:tc>
+          <w:tcPr>
+            <w:tcW w:type="dxa" w:w="1587"/>
+          </w:tcPr>
+          <w:p>
+            <w:r/>
+            <w:r>
+              <w:rPr>
+                <w:sz w:val="14"/>
+              </w:rPr>
+              <w:t>34 700 (-17 % / -3.2 %)</w:t>
+            </w:r>
+          </w:p>
+        </w:tc>
+        <w:tc>
+          <w:tcPr>
+            <w:tcW w:type="dxa" w:w="1587"/>
+          </w:tcPr>
+          <w:p>
+            <w:r/>
+            <w:r>
+              <w:rPr>
+                <w:sz w:val="14"/>
+              </w:rPr>
+              <w:t>14 500 (+14 % / +4.8 %)</w:t>
+            </w:r>
+          </w:p>
+        </w:tc>
+        <w:tc>
+          <w:tcPr>
+            <w:tcW w:type="dxa" w:w="850"/>
+          </w:tcPr>
+          <w:p>
+            <w:r/>
+            <w:r>
+              <w:rPr>
+                <w:sz w:val="14"/>
+              </w:rPr>
+              <w:t>-1.5 %</w:t>
+            </w:r>
+          </w:p>
+        </w:tc>
+        <w:tc>
+          <w:tcPr>
+            <w:tcW w:type="dxa" w:w="1247"/>
+          </w:tcPr>
+          <w:p>
+            <w:r/>
+            <w:r>
+              <w:rPr>
+                <w:sz w:val="14"/>
+              </w:rPr>
+              <w:t>+157 mm / -0.6 °C</w:t>
+            </w:r>
+          </w:p>
+        </w:tc>
+        <w:tc>
+          <w:tcPr>
+            <w:tcW w:type="dxa" w:w="1247"/>
+          </w:tcPr>
+          <w:p>
+            <w:r/>
+            <w:r>
+              <w:rPr>
+                <w:sz w:val="14"/>
+              </w:rPr>
+              <w:t>+194 mm / -0.7 °C</w:t>
+            </w:r>
+          </w:p>
+        </w:tc>
+      </w:tr>
+      <w:tr>
+        <w:tc>
+          <w:tcPr>
+            <w:tcW w:type="dxa" w:w="1247"/>
+          </w:tcPr>
+          <w:p>
+            <w:r/>
+            <w:r>
+              <w:rPr>
+                <w:sz w:val="14"/>
+              </w:rPr>
+              <w:t>2011/12 (-1.1)</w:t>
+            </w:r>
+          </w:p>
+        </w:tc>
+        <w:tc>
+          <w:tcPr>
+            <w:tcW w:type="dxa" w:w="1474"/>
+          </w:tcPr>
+          <w:p>
+            <w:r/>
+            <w:r>
+              <w:rPr>
+                <w:sz w:val="14"/>
+              </w:rPr>
+              <w:t>La Niña moderee (-1.5 a -1)</w:t>
+            </w:r>
+          </w:p>
+        </w:tc>
+        <w:tc>
+          <w:tcPr>
+            <w:tcW w:type="dxa" w:w="1077"/>
+          </w:tcPr>
+          <w:p>
+            <w:r/>
+            <w:r>
+              <w:rPr>
+                <w:sz w:val="14"/>
+              </w:rPr>
+              <w:t>2012/13 ON</w:t>
+            </w:r>
+          </w:p>
+        </w:tc>
+        <w:tc>
+          <w:tcPr>
+            <w:tcW w:type="dxa" w:w="1587"/>
+          </w:tcPr>
+          <w:p>
+            <w:r/>
+            <w:r>
+              <w:rPr>
+                <w:sz w:val="14"/>
+              </w:rPr>
+              <w:t>42 100 (+21 % / -1.4 %)</w:t>
+            </w:r>
+          </w:p>
+        </w:tc>
+        <w:tc>
+          <w:tcPr>
+            <w:tcW w:type="dxa" w:w="1587"/>
+          </w:tcPr>
+          <w:p>
+            <w:r/>
+            <w:r>
+              <w:rPr>
+                <w:sz w:val="14"/>
+              </w:rPr>
+              <w:t>15 500 (+7 % / +3.9 %)</w:t>
+            </w:r>
+          </w:p>
+        </w:tc>
+        <w:tc>
+          <w:tcPr>
+            <w:tcW w:type="dxa" w:w="850"/>
+          </w:tcPr>
+          <w:p>
+            <w:r/>
+            <w:r>
+              <w:rPr>
+                <w:sz w:val="14"/>
+              </w:rPr>
+              <w:t>+1.9 %</w:t>
+            </w:r>
+          </w:p>
+        </w:tc>
+        <w:tc>
+          <w:tcPr>
+            <w:tcW w:type="dxa" w:w="1247"/>
+          </w:tcPr>
+          <w:p>
+            <w:r/>
+            <w:r>
+              <w:rPr>
+                <w:sz w:val="14"/>
+              </w:rPr>
+              <w:t>+27 mm / -0.7 °C</w:t>
+            </w:r>
+          </w:p>
+        </w:tc>
+        <w:tc>
+          <w:tcPr>
+            <w:tcW w:type="dxa" w:w="1247"/>
+          </w:tcPr>
+          <w:p>
+            <w:r/>
+            <w:r>
+              <w:rPr>
+                <w:sz w:val="14"/>
+              </w:rPr>
+              <w:t>+125 mm / -0.7 °C</w:t>
+            </w:r>
+          </w:p>
+        </w:tc>
+      </w:tr>
+      <w:tr>
+        <w:tc>
+          <w:tcPr>
+            <w:tcW w:type="dxa" w:w="1247"/>
+          </w:tcPr>
+          <w:p>
+            <w:r/>
+            <w:r>
+              <w:rPr>
+                <w:sz w:val="14"/>
+              </w:rPr>
+              <w:t>2014/15 (+0.7)</w:t>
+            </w:r>
+          </w:p>
+        </w:tc>
+        <w:tc>
+          <w:tcPr>
+            <w:tcW w:type="dxa" w:w="1474"/>
+          </w:tcPr>
+          <w:p>
+            <w:r/>
+            <w:r>
+              <w:rPr>
+                <w:sz w:val="14"/>
+              </w:rPr>
+              <w:t>El Niño faible (&lt; 1)</w:t>
+            </w:r>
+          </w:p>
+        </w:tc>
+        <w:tc>
+          <w:tcPr>
+            <w:tcW w:type="dxa" w:w="1077"/>
+          </w:tcPr>
+          <w:p>
+            <w:r/>
+            <w:r>
+              <w:rPr>
+                <w:sz w:val="14"/>
+              </w:rPr>
+              <w:t>2015/16 OFF</w:t>
+            </w:r>
+          </w:p>
+        </w:tc>
+        <w:tc>
+          <w:tcPr>
+            <w:tcW w:type="dxa" w:w="1587"/>
+          </w:tcPr>
+          <w:p>
+            <w:r/>
+            <w:r>
+              <w:rPr>
+                <w:sz w:val="14"/>
+              </w:rPr>
+              <w:t>36 100 (-3 % / -3.0 %)</w:t>
+            </w:r>
+          </w:p>
+        </w:tc>
+        <w:tc>
+          <w:tcPr>
+            <w:tcW w:type="dxa" w:w="1587"/>
+          </w:tcPr>
+          <w:p>
+            <w:r/>
+            <w:r>
+              <w:rPr>
+                <w:sz w:val="14"/>
+              </w:rPr>
+              <w:t>13 300 (-22 % / -4.0 %)</w:t>
+            </w:r>
+          </w:p>
+        </w:tc>
+        <w:tc>
+          <w:tcPr>
+            <w:tcW w:type="dxa" w:w="850"/>
+          </w:tcPr>
+          <w:p>
+            <w:r/>
+            <w:r>
+              <w:rPr>
+                <w:sz w:val="14"/>
+              </w:rPr>
+              <w:t>-3.0 %</w:t>
+            </w:r>
+          </w:p>
+        </w:tc>
+        <w:tc>
+          <w:tcPr>
+            <w:tcW w:type="dxa" w:w="1247"/>
+          </w:tcPr>
+          <w:p>
+            <w:r/>
+            <w:r>
+              <w:rPr>
+                <w:sz w:val="14"/>
+              </w:rPr>
+              <w:t>-183 mm / +0.6 °C</w:t>
+            </w:r>
+          </w:p>
+        </w:tc>
+        <w:tc>
+          <w:tcPr>
+            <w:tcW w:type="dxa" w:w="1247"/>
+          </w:tcPr>
+          <w:p>
+            <w:r/>
+            <w:r>
+              <w:rPr>
+                <w:sz w:val="14"/>
+              </w:rPr>
+              <w:t>-327 mm / +0.6 °C</w:t>
+            </w:r>
+          </w:p>
+        </w:tc>
+      </w:tr>
+      <w:tr>
+        <w:tc>
+          <w:tcPr>
+            <w:tcW w:type="dxa" w:w="1247"/>
+          </w:tcPr>
+          <w:p>
+            <w:r/>
+            <w:r>
+              <w:rPr>
+                <w:sz w:val="14"/>
+              </w:rPr>
+              <w:t>2015/16 (+2.6)</w:t>
+            </w:r>
+          </w:p>
+        </w:tc>
+        <w:tc>
+          <w:tcPr>
+            <w:tcW w:type="dxa" w:w="1474"/>
+          </w:tcPr>
+          <w:p>
+            <w:r/>
+            <w:r>
+              <w:rPr>
+                <w:sz w:val="14"/>
+              </w:rPr>
+              <w:t>El Niño fort (ONI &gt;= 2)</w:t>
+            </w:r>
+          </w:p>
+        </w:tc>
+        <w:tc>
+          <w:tcPr>
+            <w:tcW w:type="dxa" w:w="1077"/>
+          </w:tcPr>
+          <w:p>
+            <w:r/>
+            <w:r>
+              <w:rPr>
+                <w:sz w:val="14"/>
+              </w:rPr>
+              <w:t>2016/17 ON</w:t>
+            </w:r>
+          </w:p>
+        </w:tc>
+        <w:tc>
+          <w:tcPr>
+            <w:tcW w:type="dxa" w:w="1587"/>
+          </w:tcPr>
+          <w:p>
+            <w:r/>
+            <w:r>
+              <w:rPr>
+                <w:sz w:val="14"/>
+              </w:rPr>
+              <w:t>45 600 (+26 % / +3.0 %)</w:t>
+            </w:r>
+          </w:p>
+        </w:tc>
+        <w:tc>
+          <w:tcPr>
+            <w:tcW w:type="dxa" w:w="1587"/>
+          </w:tcPr>
+          <w:p>
+            <w:r/>
+            <w:r>
+              <w:rPr>
+                <w:sz w:val="14"/>
+              </w:rPr>
+              <w:t>10 500 (-21 % / -29.7 %)</w:t>
+            </w:r>
+          </w:p>
+        </w:tc>
+        <w:tc>
+          <w:tcPr>
+            <w:tcW w:type="dxa" w:w="850"/>
+          </w:tcPr>
+          <w:p>
+            <w:r/>
+            <w:r>
+              <w:rPr>
+                <w:sz w:val="14"/>
+              </w:rPr>
+              <w:t>-6.1 %</w:t>
+            </w:r>
+          </w:p>
+        </w:tc>
+        <w:tc>
+          <w:tcPr>
+            <w:tcW w:type="dxa" w:w="1247"/>
+          </w:tcPr>
+          <w:p>
+            <w:r/>
+            <w:r>
+              <w:rPr>
+                <w:sz w:val="14"/>
+              </w:rPr>
+              <w:t>-117 mm / +0.8 °C</w:t>
+            </w:r>
+          </w:p>
+        </w:tc>
+        <w:tc>
+          <w:tcPr>
+            <w:tcW w:type="dxa" w:w="1247"/>
+          </w:tcPr>
+          <w:p>
+            <w:r/>
+            <w:r>
+              <w:rPr>
+                <w:sz w:val="14"/>
+              </w:rPr>
+              <w:t>-472 mm / +1.3 °C</w:t>
+            </w:r>
+          </w:p>
+        </w:tc>
+      </w:tr>
+      <w:tr>
+        <w:tc>
+          <w:tcPr>
+            <w:tcW w:type="dxa" w:w="1247"/>
+          </w:tcPr>
+          <w:p>
+            <w:r/>
+            <w:r>
+              <w:rPr>
+                <w:sz w:val="14"/>
+              </w:rPr>
+              <w:t>2016/17 (-0.7)</w:t>
+            </w:r>
+          </w:p>
+        </w:tc>
+        <w:tc>
+          <w:tcPr>
+            <w:tcW w:type="dxa" w:w="1474"/>
+          </w:tcPr>
+          <w:p>
+            <w:r/>
+            <w:r>
+              <w:rPr>
+                <w:sz w:val="14"/>
+              </w:rPr>
+              <w:t>La Niña faible (&gt; -1)</w:t>
+            </w:r>
+          </w:p>
+        </w:tc>
+        <w:tc>
+          <w:tcPr>
+            <w:tcW w:type="dxa" w:w="1077"/>
+          </w:tcPr>
+          <w:p>
+            <w:r/>
+            <w:r>
+              <w:rPr>
+                <w:sz w:val="14"/>
+              </w:rPr>
+              <w:t>2017/18 OFF</w:t>
+            </w:r>
+          </w:p>
+        </w:tc>
+        <w:tc>
+          <w:tcPr>
+            <w:tcW w:type="dxa" w:w="1587"/>
+          </w:tcPr>
+          <w:p>
+            <w:r/>
+            <w:r>
+              <w:rPr>
+                <w:sz w:val="14"/>
+              </w:rPr>
+              <w:t>39 500 (-13 % / -0.3 %)</w:t>
+            </w:r>
+          </w:p>
+        </w:tc>
+        <w:tc>
+          <w:tcPr>
+            <w:tcW w:type="dxa" w:w="1587"/>
+          </w:tcPr>
+          <w:p>
+            <w:r/>
+            <w:r>
+              <w:rPr>
+                <w:sz w:val="14"/>
+              </w:rPr>
+              <w:t>12 600 (+20 % / -14.6 %)</w:t>
+            </w:r>
+          </w:p>
+        </w:tc>
+        <w:tc>
+          <w:tcPr>
+            <w:tcW w:type="dxa" w:w="850"/>
+          </w:tcPr>
+          <w:p>
+            <w:r/>
+            <w:r>
+              <w:rPr>
+                <w:sz w:val="14"/>
+              </w:rPr>
+              <w:t>-2.4 %</w:t>
+            </w:r>
+          </w:p>
+        </w:tc>
+        <w:tc>
+          <w:tcPr>
+            <w:tcW w:type="dxa" w:w="1247"/>
+          </w:tcPr>
+          <w:p>
+            <w:r/>
+            <w:r>
+              <w:rPr>
+                <w:sz w:val="14"/>
+              </w:rPr>
+              <w:t>-208 mm / +0.1 °C</w:t>
+            </w:r>
+          </w:p>
+        </w:tc>
+        <w:tc>
+          <w:tcPr>
+            <w:tcW w:type="dxa" w:w="1247"/>
+          </w:tcPr>
+          <w:p>
+            <w:r/>
+            <w:r>
+              <w:rPr>
+                <w:sz w:val="14"/>
+              </w:rPr>
+              <w:t>-73 mm / -0.2 °C</w:t>
+            </w:r>
+          </w:p>
+        </w:tc>
+      </w:tr>
+      <w:tr>
+        <w:tc>
+          <w:tcPr>
+            <w:tcW w:type="dxa" w:w="1247"/>
+          </w:tcPr>
+          <w:p>
+            <w:r/>
+            <w:r>
+              <w:rPr>
+                <w:sz w:val="14"/>
+              </w:rPr>
+              <w:t>2017/18 (-1.0)</w:t>
+            </w:r>
+          </w:p>
+        </w:tc>
+        <w:tc>
+          <w:tcPr>
+            <w:tcW w:type="dxa" w:w="1474"/>
+          </w:tcPr>
+          <w:p>
+            <w:r/>
+            <w:r>
+              <w:rPr>
+                <w:sz w:val="14"/>
+              </w:rPr>
+              <w:t>La Niña moderee (-1.5 a -1)</w:t>
+            </w:r>
+          </w:p>
+        </w:tc>
+        <w:tc>
+          <w:tcPr>
+            <w:tcW w:type="dxa" w:w="1077"/>
+          </w:tcPr>
+          <w:p>
+            <w:r/>
+            <w:r>
+              <w:rPr>
+                <w:sz w:val="14"/>
+              </w:rPr>
+              <w:t>2018/19 ON</w:t>
+            </w:r>
+          </w:p>
+        </w:tc>
+        <w:tc>
+          <w:tcPr>
+            <w:tcW w:type="dxa" w:w="1587"/>
+          </w:tcPr>
+          <w:p>
+            <w:r/>
+            <w:r>
+              <w:rPr>
+                <w:sz w:val="14"/>
+              </w:rPr>
+              <w:t>49 700 (+26 % / +4.0 %)</w:t>
+            </w:r>
+          </w:p>
+        </w:tc>
+        <w:tc>
+          <w:tcPr>
+            <w:tcW w:type="dxa" w:w="1587"/>
+          </w:tcPr>
+          <w:p>
+            <w:r/>
+            <w:r>
+              <w:rPr>
+                <w:sz w:val="14"/>
+              </w:rPr>
+              <w:t>16 800 (+33 % / +8.7 %)</w:t>
+            </w:r>
+          </w:p>
+        </w:tc>
+        <w:tc>
+          <w:tcPr>
+            <w:tcW w:type="dxa" w:w="850"/>
+          </w:tcPr>
+          <w:p>
+            <w:r/>
+            <w:r>
+              <w:rPr>
+                <w:sz w:val="14"/>
+              </w:rPr>
+              <w:t>+5.4 %</w:t>
+            </w:r>
+          </w:p>
+        </w:tc>
+        <w:tc>
+          <w:tcPr>
+            <w:tcW w:type="dxa" w:w="1247"/>
+          </w:tcPr>
+          <w:p>
+            <w:r/>
+            <w:r>
+              <w:rPr>
+                <w:sz w:val="14"/>
+              </w:rPr>
+              <w:t>-68 mm / +0.1 °C</w:t>
+            </w:r>
+          </w:p>
+        </w:tc>
+        <w:tc>
+          <w:tcPr>
+            <w:tcW w:type="dxa" w:w="1247"/>
+          </w:tcPr>
+          <w:p>
+            <w:r/>
+            <w:r>
+              <w:rPr>
+                <w:sz w:val="14"/>
+              </w:rPr>
+              <w:t>+44 mm / -0.1 °C</w:t>
+            </w:r>
+          </w:p>
+        </w:tc>
+      </w:tr>
+      <w:tr>
+        <w:tc>
+          <w:tcPr>
+            <w:tcW w:type="dxa" w:w="1247"/>
+          </w:tcPr>
+          <w:p>
+            <w:r/>
+            <w:r>
+              <w:rPr>
+                <w:sz w:val="14"/>
+              </w:rPr>
+              <w:t>2018/19 (+0.9)</w:t>
+            </w:r>
+          </w:p>
+        </w:tc>
+        <w:tc>
+          <w:tcPr>
+            <w:tcW w:type="dxa" w:w="1474"/>
+          </w:tcPr>
+          <w:p>
+            <w:r/>
+            <w:r>
+              <w:rPr>
+                <w:sz w:val="14"/>
+              </w:rPr>
+              <w:t>El Niño faible (&lt; 1)</w:t>
+            </w:r>
+          </w:p>
+        </w:tc>
+        <w:tc>
+          <w:tcPr>
+            <w:tcW w:type="dxa" w:w="1077"/>
+          </w:tcPr>
+          <w:p>
+            <w:r/>
+            <w:r>
+              <w:rPr>
+                <w:sz w:val="14"/>
+              </w:rPr>
+              <w:t>2019/20 OFF</w:t>
+            </w:r>
+          </w:p>
+        </w:tc>
+        <w:tc>
+          <w:tcPr>
+            <w:tcW w:type="dxa" w:w="1587"/>
+          </w:tcPr>
+          <w:p>
+            <w:r/>
+            <w:r>
+              <w:rPr>
+                <w:sz w:val="14"/>
+              </w:rPr>
+              <w:t>42 000 (-15 % / +4.3 %)</w:t>
+            </w:r>
+          </w:p>
+        </w:tc>
+        <w:tc>
+          <w:tcPr>
+            <w:tcW w:type="dxa" w:w="1587"/>
+          </w:tcPr>
+          <w:p>
+            <w:r/>
+            <w:r>
+              <w:rPr>
+                <w:sz w:val="14"/>
+              </w:rPr>
+              <w:t>18 500 (+10 % / +3.9 %)</w:t>
+            </w:r>
+          </w:p>
+        </w:tc>
+        <w:tc>
+          <w:tcPr>
+            <w:tcW w:type="dxa" w:w="850"/>
+          </w:tcPr>
+          <w:p>
+            <w:r/>
+            <w:r>
+              <w:rPr>
+                <w:sz w:val="14"/>
+              </w:rPr>
+              <w:t>+4.5 %</w:t>
+            </w:r>
+          </w:p>
+        </w:tc>
+        <w:tc>
+          <w:tcPr>
+            <w:tcW w:type="dxa" w:w="1247"/>
+          </w:tcPr>
+          <w:p>
+            <w:r/>
+            <w:r>
+              <w:rPr>
+                <w:sz w:val="14"/>
+              </w:rPr>
+              <w:t>+5 mm / +0.5 °C</w:t>
+            </w:r>
+          </w:p>
+        </w:tc>
+        <w:tc>
+          <w:tcPr>
+            <w:tcW w:type="dxa" w:w="1247"/>
+          </w:tcPr>
+          <w:p>
+            <w:r/>
+            <w:r>
+              <w:rPr>
+                <w:sz w:val="14"/>
+              </w:rPr>
+              <w:t>-7 mm / +0.6 °C</w:t>
+            </w:r>
+          </w:p>
+        </w:tc>
+      </w:tr>
+      <w:tr>
+        <w:tc>
+          <w:tcPr>
+            <w:tcW w:type="dxa" w:w="1247"/>
+          </w:tcPr>
+          <w:p>
+            <w:r/>
+            <w:r>
+              <w:rPr>
+                <w:sz w:val="14"/>
+              </w:rPr>
+              <w:t>2020/21 (-1.3)</w:t>
+            </w:r>
+          </w:p>
+        </w:tc>
+        <w:tc>
+          <w:tcPr>
+            <w:tcW w:type="dxa" w:w="1474"/>
+          </w:tcPr>
+          <w:p>
+            <w:r/>
+            <w:r>
+              <w:rPr>
+                <w:sz w:val="14"/>
+              </w:rPr>
+              <w:t>La Niña moderee (-1.5 a -1)</w:t>
+            </w:r>
+          </w:p>
+        </w:tc>
+        <w:tc>
+          <w:tcPr>
+            <w:tcW w:type="dxa" w:w="1077"/>
+          </w:tcPr>
+          <w:p>
+            <w:r/>
+            <w:r>
+              <w:rPr>
+                <w:sz w:val="14"/>
+              </w:rPr>
+              <w:t>2021/22 OFF</w:t>
+            </w:r>
+          </w:p>
+        </w:tc>
+        <w:tc>
+          <w:tcPr>
+            <w:tcW w:type="dxa" w:w="1587"/>
+          </w:tcPr>
+          <w:p>
+            <w:r/>
+            <w:r>
+              <w:rPr>
+                <w:sz w:val="14"/>
+              </w:rPr>
+              <w:t>36 400 (-27 % / -9.1 %)</w:t>
+            </w:r>
+          </w:p>
+        </w:tc>
+        <w:tc>
+          <w:tcPr>
+            <w:tcW w:type="dxa" w:w="1587"/>
+          </w:tcPr>
+          <w:p>
+            <w:r/>
+            <w:r>
+              <w:rPr>
+                <w:sz w:val="14"/>
+              </w:rPr>
+              <w:t>21 700 (+7 % / +4.8 %)</w:t>
+            </w:r>
+          </w:p>
+        </w:tc>
+        <w:tc>
+          <w:tcPr>
+            <w:tcW w:type="dxa" w:w="850"/>
+          </w:tcPr>
+          <w:p>
+            <w:r/>
+            <w:r>
+              <w:rPr>
+                <w:sz w:val="14"/>
+              </w:rPr>
+              <w:t>-3.1 %</w:t>
+            </w:r>
+          </w:p>
+        </w:tc>
+        <w:tc>
+          <w:tcPr>
+            <w:tcW w:type="dxa" w:w="1247"/>
+          </w:tcPr>
+          <w:p>
+            <w:r/>
+            <w:r>
+              <w:rPr>
+                <w:sz w:val="14"/>
+              </w:rPr>
+              <w:t>-366 mm / +0.8 °C</w:t>
+            </w:r>
+          </w:p>
+        </w:tc>
+        <w:tc>
+          <w:tcPr>
+            <w:tcW w:type="dxa" w:w="1247"/>
+          </w:tcPr>
+          <w:p>
+            <w:r/>
+            <w:r>
+              <w:rPr>
+                <w:sz w:val="14"/>
+              </w:rPr>
+              <w:t>-190 mm / +0.3 °C</w:t>
+            </w:r>
+          </w:p>
+        </w:tc>
+      </w:tr>
+      <w:tr>
+        <w:tc>
+          <w:tcPr>
+            <w:tcW w:type="dxa" w:w="1247"/>
+          </w:tcPr>
+          <w:p>
+            <w:r/>
+            <w:r>
+              <w:rPr>
+                <w:sz w:val="14"/>
+              </w:rPr>
+              <w:t>2021/22 (-1.0)</w:t>
+            </w:r>
+          </w:p>
+        </w:tc>
+        <w:tc>
+          <w:tcPr>
+            <w:tcW w:type="dxa" w:w="1474"/>
+          </w:tcPr>
+          <w:p>
+            <w:r/>
+            <w:r>
+              <w:rPr>
+                <w:sz w:val="14"/>
+              </w:rPr>
+              <w:t>La Niña moderee (-1.5 a -1)</w:t>
+            </w:r>
+          </w:p>
+        </w:tc>
+        <w:tc>
+          <w:tcPr>
+            <w:tcW w:type="dxa" w:w="1077"/>
+          </w:tcPr>
+          <w:p>
+            <w:r/>
+            <w:r>
+              <w:rPr>
+                <w:sz w:val="14"/>
+              </w:rPr>
+              <w:t>2022/23 ON</w:t>
+            </w:r>
+          </w:p>
+        </w:tc>
+        <w:tc>
+          <w:tcPr>
+            <w:tcW w:type="dxa" w:w="1587"/>
+          </w:tcPr>
+          <w:p>
+            <w:r/>
+            <w:r>
+              <w:rPr>
+                <w:sz w:val="14"/>
+              </w:rPr>
+              <w:t>39 800 (+9 % / -17.8 %)</w:t>
+            </w:r>
+          </w:p>
+        </w:tc>
+        <w:tc>
+          <w:tcPr>
+            <w:tcW w:type="dxa" w:w="1587"/>
+          </w:tcPr>
+          <w:p>
+            <w:r/>
+            <w:r>
+              <w:rPr>
+                <w:sz w:val="14"/>
+              </w:rPr>
+              <w:t>22 800 (+5 % / +8.1 %)</w:t>
+            </w:r>
+          </w:p>
+        </w:tc>
+        <w:tc>
+          <w:tcPr>
+            <w:tcW w:type="dxa" w:w="850"/>
+          </w:tcPr>
+          <w:p>
+            <w:r/>
+            <w:r>
+              <w:rPr>
+                <w:sz w:val="14"/>
+              </w:rPr>
+              <w:t>-9.8 %</w:t>
+            </w:r>
+          </w:p>
+        </w:tc>
+        <w:tc>
+          <w:tcPr>
+            <w:tcW w:type="dxa" w:w="1247"/>
+          </w:tcPr>
+          <w:p>
+            <w:r/>
+            <w:r>
+              <w:rPr>
+                <w:sz w:val="14"/>
+              </w:rPr>
+              <w:t>+172 mm / -0.4 °C</w:t>
+            </w:r>
+          </w:p>
+        </w:tc>
+        <w:tc>
+          <w:tcPr>
+            <w:tcW w:type="dxa" w:w="1247"/>
+          </w:tcPr>
+          <w:p>
+            <w:r/>
+            <w:r>
+              <w:rPr>
+                <w:sz w:val="14"/>
+              </w:rPr>
+              <w:t>+32 mm / -0.1 °C</w:t>
+            </w:r>
+          </w:p>
+        </w:tc>
+      </w:tr>
+      <w:tr>
+        <w:tc>
+          <w:tcPr>
+            <w:tcW w:type="dxa" w:w="1247"/>
+          </w:tcPr>
+          <w:p>
+            <w:r/>
+            <w:r>
+              <w:rPr>
+                <w:sz w:val="14"/>
+              </w:rPr>
+              <w:t>2022/23 (-1.0)</w:t>
+            </w:r>
+          </w:p>
+        </w:tc>
+        <w:tc>
+          <w:tcPr>
+            <w:tcW w:type="dxa" w:w="1474"/>
+          </w:tcPr>
+          <w:p>
+            <w:r/>
+            <w:r>
+              <w:rPr>
+                <w:sz w:val="14"/>
+              </w:rPr>
+              <w:t>La Niña moderee (-1.5 a -1)</w:t>
+            </w:r>
+          </w:p>
+        </w:tc>
+        <w:tc>
+          <w:tcPr>
+            <w:tcW w:type="dxa" w:w="1077"/>
+          </w:tcPr>
+          <w:p>
+            <w:r/>
+            <w:r>
+              <w:rPr>
+                <w:sz w:val="14"/>
+              </w:rPr>
+              <w:t>2023/24 OFF</w:t>
+            </w:r>
+          </w:p>
+        </w:tc>
+        <w:tc>
+          <w:tcPr>
+            <w:tcW w:type="dxa" w:w="1587"/>
+          </w:tcPr>
+          <w:p>
+            <w:r/>
+            <w:r>
+              <w:rPr>
+                <w:sz w:val="14"/>
+              </w:rPr>
+              <w:t>44 900 (+13 % / +22.6 %)</w:t>
+            </w:r>
+          </w:p>
+        </w:tc>
+        <w:tc>
+          <w:tcPr>
+            <w:tcW w:type="dxa" w:w="1587"/>
+          </w:tcPr>
+          <w:p>
+            <w:r/>
+            <w:r>
+              <w:rPr>
+                <w:sz w:val="14"/>
+              </w:rPr>
+              <w:t>21 400 (-6 % / -5.3 %)</w:t>
+            </w:r>
+          </w:p>
+        </w:tc>
+        <w:tc>
+          <w:tcPr>
+            <w:tcW w:type="dxa" w:w="850"/>
+          </w:tcPr>
+          <w:p>
+            <w:r/>
+            <w:r>
+              <w:rPr>
+                <w:sz w:val="14"/>
+              </w:rPr>
+              <w:t>+7.1 %</w:t>
+            </w:r>
+          </w:p>
+        </w:tc>
+        <w:tc>
+          <w:tcPr>
+            <w:tcW w:type="dxa" w:w="1247"/>
+          </w:tcPr>
+          <w:p>
+            <w:r/>
+            <w:r>
+              <w:rPr>
+                <w:sz w:val="14"/>
+              </w:rPr>
+              <w:t>-16 mm / +0.1 °C</w:t>
+            </w:r>
+          </w:p>
+        </w:tc>
+        <w:tc>
+          <w:tcPr>
+            <w:tcW w:type="dxa" w:w="1247"/>
+          </w:tcPr>
+          <w:p>
+            <w:r/>
+            <w:r>
+              <w:rPr>
+                <w:sz w:val="14"/>
+              </w:rPr>
+              <w:t>+72 mm / +0.2 °C</w:t>
+            </w:r>
+          </w:p>
+        </w:tc>
+      </w:tr>
+      <w:tr>
+        <w:tc>
+          <w:tcPr>
+            <w:tcW w:type="dxa" w:w="1247"/>
+          </w:tcPr>
+          <w:p>
+            <w:r/>
+            <w:r>
+              <w:rPr>
+                <w:sz w:val="14"/>
+              </w:rPr>
+              <w:t>2023/24 (+2.0)</w:t>
+            </w:r>
+          </w:p>
+        </w:tc>
+        <w:tc>
+          <w:tcPr>
+            <w:tcW w:type="dxa" w:w="1474"/>
+          </w:tcPr>
+          <w:p>
+            <w:r/>
+            <w:r>
+              <w:rPr>
+                <w:sz w:val="14"/>
+              </w:rPr>
+              <w:t>El Niño fort (ONI &gt;= 2)</w:t>
+            </w:r>
+          </w:p>
+        </w:tc>
+        <w:tc>
+          <w:tcPr>
+            <w:tcW w:type="dxa" w:w="1077"/>
+          </w:tcPr>
+          <w:p>
+            <w:r/>
+            <w:r>
+              <w:rPr>
+                <w:sz w:val="14"/>
+              </w:rPr>
+              <w:t>2024/25 ON</w:t>
+            </w:r>
+          </w:p>
+        </w:tc>
+        <w:tc>
+          <w:tcPr>
+            <w:tcW w:type="dxa" w:w="1587"/>
+          </w:tcPr>
+          <w:p>
+            <w:r/>
+            <w:r>
+              <w:rPr>
+                <w:sz w:val="14"/>
+              </w:rPr>
+              <w:t>44 500 (-1 % / -3.2 %)</w:t>
+            </w:r>
+          </w:p>
+        </w:tc>
+        <w:tc>
+          <w:tcPr>
+            <w:tcW w:type="dxa" w:w="1587"/>
+          </w:tcPr>
+          <w:p>
+            <w:r/>
+            <w:r>
+              <w:rPr>
+                <w:sz w:val="14"/>
+              </w:rPr>
+              <w:t>21 000 (-2 % / -9.0 %)</w:t>
+            </w:r>
+          </w:p>
+        </w:tc>
+        <w:tc>
+          <w:tcPr>
+            <w:tcW w:type="dxa" w:w="850"/>
+          </w:tcPr>
+          <w:p>
+            <w:r/>
+            <w:r>
+              <w:rPr>
+                <w:sz w:val="14"/>
+              </w:rPr>
+              <w:t>-0.1 %</w:t>
+            </w:r>
+          </w:p>
+        </w:tc>
+        <w:tc>
+          <w:tcPr>
+            <w:tcW w:type="dxa" w:w="1247"/>
+          </w:tcPr>
+          <w:p>
+            <w:r/>
+            <w:r>
+              <w:rPr>
+                <w:sz w:val="14"/>
+              </w:rPr>
+              <w:t>-445 mm / +2.4 °C</w:t>
+            </w:r>
+          </w:p>
+        </w:tc>
+        <w:tc>
+          <w:tcPr>
+            <w:tcW w:type="dxa" w:w="1247"/>
+          </w:tcPr>
+          <w:p>
+            <w:r/>
+            <w:r>
+              <w:rPr>
+                <w:sz w:val="14"/>
+              </w:rPr>
+              <w:t>-328 mm / +1.7 °C</w:t>
+            </w:r>
+          </w:p>
+        </w:tc>
+      </w:tr>
+    </w:tbl>
+    <w:p/>
+    <w:p>
+      <w:r>
+        <w:rPr>
+          <w:b/>
+          <w:i w:val="0"/>
+          <w:sz w:val="20"/>
+        </w:rPr>
+        <w:t>Moyennes par classe d'intensité (campagnes N+1) :</w:t>
+      </w:r>
+    </w:p>
+    <w:tbl>
+      <w:tblPr>
+        <w:tblStyle w:val="LightGrid-Accent1"/>
+        <w:tblW w:type="auto" w:w="0"/>
+        <w:jc w:val="center"/>
+        <w:tblLook w:firstColumn="1" w:firstRow="1" w:lastColumn="0" w:lastRow="0" w:noHBand="0" w:noVBand="1" w:val="04A0"/>
+      </w:tblPr>
+      <w:tblGrid>
+        <w:gridCol w:w="1108"/>
+        <w:gridCol w:w="1108"/>
+        <w:gridCol w:w="1108"/>
+        <w:gridCol w:w="1108"/>
+        <w:gridCol w:w="1108"/>
+        <w:gridCol w:w="1108"/>
+        <w:gridCol w:w="1108"/>
+        <w:gridCol w:w="1108"/>
+        <w:gridCol w:w="1108"/>
+      </w:tblGrid>
+      <w:tr>
+        <w:tc>
+          <w:tcPr>
+            <w:tcW w:type="dxa" w:w="1587"/>
+          </w:tcPr>
+          <w:p>
+            <w:r/>
+            <w:r>
+              <w:rPr>
+                <w:b/>
+                <w:sz w:val="14"/>
+              </w:rPr>
+              <w:t>Classe</w:t>
+            </w:r>
+          </w:p>
+        </w:tc>
+        <w:tc>
+          <w:tcPr>
+            <w:tcW w:type="dxa" w:w="454"/>
+          </w:tcPr>
+          <w:p>
+            <w:r/>
+            <w:r>
+              <w:rPr>
+                <w:b/>
+                <w:sz w:val="14"/>
+              </w:rPr>
+              <w:t>n</w:t>
+            </w:r>
+          </w:p>
+        </w:tc>
+        <w:tc>
+          <w:tcPr>
+            <w:tcW w:type="dxa" w:w="850"/>
+          </w:tcPr>
+          <w:p>
+            <w:r/>
+            <w:r>
+              <w:rPr>
+                <w:b/>
+                <w:sz w:val="14"/>
+              </w:rPr>
+              <w:t>Arabica</w:t>
+            </w:r>
+          </w:p>
+        </w:tc>
+        <w:tc>
+          <w:tcPr>
+            <w:tcW w:type="dxa" w:w="850"/>
+          </w:tcPr>
+          <w:p>
+            <w:r/>
+            <w:r>
+              <w:rPr>
+                <w:b/>
+                <w:sz w:val="14"/>
+              </w:rPr>
+              <w:t>Robusta</w:t>
+            </w:r>
+          </w:p>
+        </w:tc>
+        <w:tc>
+          <w:tcPr>
+            <w:tcW w:type="dxa" w:w="850"/>
+          </w:tcPr>
+          <w:p>
+            <w:r/>
+            <w:r>
+              <w:rPr>
+                <w:b/>
+                <w:sz w:val="14"/>
+              </w:rPr>
+              <w:t>Total</w:t>
+            </w:r>
+          </w:p>
+        </w:tc>
+        <w:tc>
+          <w:tcPr>
+            <w:tcW w:type="dxa" w:w="907"/>
+          </w:tcPr>
+          <w:p>
+            <w:r/>
+            <w:r>
+              <w:rPr>
+                <w:b/>
+                <w:sz w:val="14"/>
+              </w:rPr>
+              <w:t>Rendement</w:t>
+            </w:r>
+          </w:p>
+        </w:tc>
+        <w:tc>
+          <w:tcPr>
+            <w:tcW w:type="dxa" w:w="1304"/>
+          </w:tcPr>
+          <w:p>
+            <w:r/>
+            <w:r>
+              <w:rPr>
+                <w:b/>
+                <w:sz w:val="14"/>
+              </w:rPr>
+              <w:t>Minas Gerais</w:t>
+            </w:r>
+          </w:p>
+        </w:tc>
+        <w:tc>
+          <w:tcPr>
+            <w:tcW w:type="dxa" w:w="1304"/>
+          </w:tcPr>
+          <w:p>
+            <w:r/>
+            <w:r>
+              <w:rPr>
+                <w:b/>
+                <w:sz w:val="14"/>
+              </w:rPr>
+              <w:t>Espírito Santo</w:t>
+            </w:r>
+          </w:p>
+        </w:tc>
+        <w:tc>
+          <w:tcPr>
+            <w:tcW w:type="dxa" w:w="1984"/>
+          </w:tcPr>
+          <w:p>
+            <w:r/>
+            <w:r>
+              <w:rPr>
+                <w:b/>
+                <w:sz w:val="14"/>
+              </w:rPr>
+              <w:t>Campagnes</w:t>
+            </w:r>
+          </w:p>
+        </w:tc>
+      </w:tr>
+      <w:tr>
+        <w:tc>
+          <w:tcPr>
+            <w:tcW w:type="dxa" w:w="1587"/>
+          </w:tcPr>
+          <w:p>
+            <w:r/>
+            <w:r>
+              <w:rPr>
+                <w:sz w:val="14"/>
+              </w:rPr>
+              <w:t>El Niño fort (ONI &gt;= 2)</w:t>
+            </w:r>
+          </w:p>
+        </w:tc>
+        <w:tc>
+          <w:tcPr>
+            <w:tcW w:type="dxa" w:w="454"/>
+          </w:tcPr>
+          <w:p>
+            <w:r/>
+            <w:r>
+              <w:rPr>
+                <w:sz w:val="14"/>
+              </w:rPr>
+              <w:t>2</w:t>
+            </w:r>
+          </w:p>
+        </w:tc>
+        <w:tc>
+          <w:tcPr>
+            <w:tcW w:type="dxa" w:w="850"/>
+          </w:tcPr>
+          <w:p>
+            <w:r/>
+            <w:r>
+              <w:rPr>
+                <w:sz w:val="14"/>
+              </w:rPr>
+              <w:t>-0.1 %</w:t>
+            </w:r>
+          </w:p>
+        </w:tc>
+        <w:tc>
+          <w:tcPr>
+            <w:tcW w:type="dxa" w:w="850"/>
+          </w:tcPr>
+          <w:p>
+            <w:r/>
+            <w:r>
+              <w:rPr>
+                <w:sz w:val="14"/>
+              </w:rPr>
+              <w:t>-19.4 %</w:t>
+            </w:r>
+          </w:p>
+        </w:tc>
+        <w:tc>
+          <w:tcPr>
+            <w:tcW w:type="dxa" w:w="850"/>
+          </w:tcPr>
+          <w:p>
+            <w:r/>
+            <w:r>
+              <w:rPr>
+                <w:sz w:val="14"/>
+              </w:rPr>
+              <w:t>-5.6 %</w:t>
+            </w:r>
+          </w:p>
+        </w:tc>
+        <w:tc>
+          <w:tcPr>
+            <w:tcW w:type="dxa" w:w="907"/>
+          </w:tcPr>
+          <w:p>
+            <w:r/>
+            <w:r>
+              <w:rPr>
+                <w:sz w:val="14"/>
+              </w:rPr>
+              <w:t>-3.1 %</w:t>
+            </w:r>
+          </w:p>
+        </w:tc>
+        <w:tc>
+          <w:tcPr>
+            <w:tcW w:type="dxa" w:w="1304"/>
+          </w:tcPr>
+          <w:p>
+            <w:r/>
+            <w:r>
+              <w:rPr>
+                <w:sz w:val="14"/>
+              </w:rPr>
+              <w:t>-281 mm / +1.6 °C</w:t>
+            </w:r>
+          </w:p>
+        </w:tc>
+        <w:tc>
+          <w:tcPr>
+            <w:tcW w:type="dxa" w:w="1304"/>
+          </w:tcPr>
+          <w:p>
+            <w:r/>
+            <w:r>
+              <w:rPr>
+                <w:sz w:val="14"/>
+              </w:rPr>
+              <w:t>-400 mm / +1.5 °C</w:t>
+            </w:r>
+          </w:p>
+        </w:tc>
+        <w:tc>
+          <w:tcPr>
+            <w:tcW w:type="dxa" w:w="1984"/>
+          </w:tcPr>
+          <w:p>
+            <w:r/>
+            <w:r>
+              <w:rPr>
+                <w:sz w:val="14"/>
+              </w:rPr>
+              <w:t>2016/17 2024/25</w:t>
+            </w:r>
+          </w:p>
+        </w:tc>
+      </w:tr>
+      <w:tr>
+        <w:tc>
+          <w:tcPr>
+            <w:tcW w:type="dxa" w:w="1587"/>
+          </w:tcPr>
+          <w:p>
+            <w:r/>
+            <w:r>
+              <w:rPr>
+                <w:sz w:val="14"/>
+              </w:rPr>
+              <w:t>El Niño modere (1-2)</w:t>
+            </w:r>
+          </w:p>
+        </w:tc>
+        <w:tc>
+          <w:tcPr>
+            <w:tcW w:type="dxa" w:w="454"/>
+          </w:tcPr>
+          <w:p>
+            <w:r/>
+            <w:r>
+              <w:rPr>
+                <w:sz w:val="14"/>
+              </w:rPr>
+              <w:t>2</w:t>
+            </w:r>
+          </w:p>
+        </w:tc>
+        <w:tc>
+          <w:tcPr>
+            <w:tcW w:type="dxa" w:w="850"/>
+          </w:tcPr>
+          <w:p>
+            <w:r/>
+            <w:r>
+              <w:rPr>
+                <w:sz w:val="14"/>
+              </w:rPr>
+              <w:t>-6.1 %</w:t>
+            </w:r>
+          </w:p>
+        </w:tc>
+        <w:tc>
+          <w:tcPr>
+            <w:tcW w:type="dxa" w:w="850"/>
+          </w:tcPr>
+          <w:p>
+            <w:r/>
+            <w:r>
+              <w:rPr>
+                <w:sz w:val="14"/>
+              </w:rPr>
+              <w:t>-7.9 %</w:t>
+            </w:r>
+          </w:p>
+        </w:tc>
+        <w:tc>
+          <w:tcPr>
+            <w:tcW w:type="dxa" w:w="850"/>
+          </w:tcPr>
+          <w:p>
+            <w:r/>
+            <w:r>
+              <w:rPr>
+                <w:sz w:val="14"/>
+              </w:rPr>
+              <w:t>-6.6 %</w:t>
+            </w:r>
+          </w:p>
+        </w:tc>
+        <w:tc>
+          <w:tcPr>
+            <w:tcW w:type="dxa" w:w="907"/>
+          </w:tcPr>
+          <w:p>
+            <w:r/>
+            <w:r>
+              <w:rPr>
+                <w:sz w:val="14"/>
+              </w:rPr>
+              <w:t>-11.2 %</w:t>
+            </w:r>
+          </w:p>
+        </w:tc>
+        <w:tc>
+          <w:tcPr>
+            <w:tcW w:type="dxa" w:w="1304"/>
+          </w:tcPr>
+          <w:p>
+            <w:r/>
+            <w:r>
+              <w:rPr>
+                <w:sz w:val="14"/>
+              </w:rPr>
+              <w:t>+28 mm / -0.2 °C</w:t>
+            </w:r>
+          </w:p>
+        </w:tc>
+        <w:tc>
+          <w:tcPr>
+            <w:tcW w:type="dxa" w:w="1304"/>
+          </w:tcPr>
+          <w:p>
+            <w:r/>
+            <w:r>
+              <w:rPr>
+                <w:sz w:val="14"/>
+              </w:rPr>
+              <w:t>-120 mm / +0.2 °C</w:t>
+            </w:r>
+          </w:p>
+        </w:tc>
+        <w:tc>
+          <w:tcPr>
+            <w:tcW w:type="dxa" w:w="1984"/>
+          </w:tcPr>
+          <w:p>
+            <w:r/>
+            <w:r>
+              <w:rPr>
+                <w:sz w:val="14"/>
+              </w:rPr>
+              <w:t>2003/04 2010/11</w:t>
+            </w:r>
+          </w:p>
+        </w:tc>
+      </w:tr>
+      <w:tr>
+        <w:tc>
+          <w:tcPr>
+            <w:tcW w:type="dxa" w:w="1587"/>
+          </w:tcPr>
+          <w:p>
+            <w:r/>
+            <w:r>
+              <w:rPr>
+                <w:sz w:val="14"/>
+              </w:rPr>
+              <w:t>El Niño faible (&lt; 1)</w:t>
+            </w:r>
+          </w:p>
+        </w:tc>
+        <w:tc>
+          <w:tcPr>
+            <w:tcW w:type="dxa" w:w="454"/>
+          </w:tcPr>
+          <w:p>
+            <w:r/>
+            <w:r>
+              <w:rPr>
+                <w:sz w:val="14"/>
+              </w:rPr>
+              <w:t>4</w:t>
+            </w:r>
+          </w:p>
+        </w:tc>
+        <w:tc>
+          <w:tcPr>
+            <w:tcW w:type="dxa" w:w="850"/>
+          </w:tcPr>
+          <w:p>
+            <w:r/>
+            <w:r>
+              <w:rPr>
+                <w:sz w:val="14"/>
+              </w:rPr>
+              <w:t>-2.1 %</w:t>
+            </w:r>
+          </w:p>
+        </w:tc>
+        <w:tc>
+          <w:tcPr>
+            <w:tcW w:type="dxa" w:w="850"/>
+          </w:tcPr>
+          <w:p>
+            <w:r/>
+            <w:r>
+              <w:rPr>
+                <w:sz w:val="14"/>
+              </w:rPr>
+              <w:t>-0.2 %</w:t>
+            </w:r>
+          </w:p>
+        </w:tc>
+        <w:tc>
+          <w:tcPr>
+            <w:tcW w:type="dxa" w:w="850"/>
+          </w:tcPr>
+          <w:p>
+            <w:r/>
+            <w:r>
+              <w:rPr>
+                <w:sz w:val="14"/>
+              </w:rPr>
+              <w:t>-1.6 %</w:t>
+            </w:r>
+          </w:p>
+        </w:tc>
+        <w:tc>
+          <w:tcPr>
+            <w:tcW w:type="dxa" w:w="907"/>
+          </w:tcPr>
+          <w:p>
+            <w:r/>
+            <w:r>
+              <w:rPr>
+                <w:sz w:val="14"/>
+              </w:rPr>
+              <w:t>-1.5 %</w:t>
+            </w:r>
+          </w:p>
+        </w:tc>
+        <w:tc>
+          <w:tcPr>
+            <w:tcW w:type="dxa" w:w="1304"/>
+          </w:tcPr>
+          <w:p>
+            <w:r/>
+            <w:r>
+              <w:rPr>
+                <w:sz w:val="14"/>
+              </w:rPr>
+              <w:t>+27 mm / +0.0 °C</w:t>
+            </w:r>
+          </w:p>
+        </w:tc>
+        <w:tc>
+          <w:tcPr>
+            <w:tcW w:type="dxa" w:w="1304"/>
+          </w:tcPr>
+          <w:p>
+            <w:r/>
+            <w:r>
+              <w:rPr>
+                <w:sz w:val="14"/>
+              </w:rPr>
+              <w:t>+61 mm / +0.0 °C</w:t>
+            </w:r>
+          </w:p>
+        </w:tc>
+        <w:tc>
+          <w:tcPr>
+            <w:tcW w:type="dxa" w:w="1984"/>
+          </w:tcPr>
+          <w:p>
+            <w:r/>
+            <w:r>
+              <w:rPr>
+                <w:sz w:val="14"/>
+              </w:rPr>
+              <w:t>2005/06 2007/08 2015/16 2019/20</w:t>
+            </w:r>
+          </w:p>
+        </w:tc>
+      </w:tr>
+      <w:tr>
+        <w:tc>
+          <w:tcPr>
+            <w:tcW w:type="dxa" w:w="1587"/>
+          </w:tcPr>
+          <w:p>
+            <w:r/>
+            <w:r>
+              <w:rPr>
+                <w:sz w:val="14"/>
+              </w:rPr>
+              <w:t>La Niña faible (&gt; -1)</w:t>
+            </w:r>
+          </w:p>
+        </w:tc>
+        <w:tc>
+          <w:tcPr>
+            <w:tcW w:type="dxa" w:w="454"/>
+          </w:tcPr>
+          <w:p>
+            <w:r/>
+            <w:r>
+              <w:rPr>
+                <w:sz w:val="14"/>
+              </w:rPr>
+              <w:t>3</w:t>
+            </w:r>
+          </w:p>
+        </w:tc>
+        <w:tc>
+          <w:tcPr>
+            <w:tcW w:type="dxa" w:w="850"/>
+          </w:tcPr>
+          <w:p>
+            <w:r/>
+            <w:r>
+              <w:rPr>
+                <w:sz w:val="14"/>
+              </w:rPr>
+              <w:t>+0.6 %</w:t>
+            </w:r>
+          </w:p>
+        </w:tc>
+        <w:tc>
+          <w:tcPr>
+            <w:tcW w:type="dxa" w:w="850"/>
+          </w:tcPr>
+          <w:p>
+            <w:r/>
+            <w:r>
+              <w:rPr>
+                <w:sz w:val="14"/>
+              </w:rPr>
+              <w:t>-8.3 %</w:t>
+            </w:r>
+          </w:p>
+        </w:tc>
+        <w:tc>
+          <w:tcPr>
+            <w:tcW w:type="dxa" w:w="850"/>
+          </w:tcPr>
+          <w:p>
+            <w:r/>
+            <w:r>
+              <w:rPr>
+                <w:sz w:val="14"/>
+              </w:rPr>
+              <w:t>-1.7 %</w:t>
+            </w:r>
+          </w:p>
+        </w:tc>
+        <w:tc>
+          <w:tcPr>
+            <w:tcW w:type="dxa" w:w="907"/>
+          </w:tcPr>
+          <w:p>
+            <w:r/>
+            <w:r>
+              <w:rPr>
+                <w:sz w:val="14"/>
+              </w:rPr>
+              <w:t>-1.8 %</w:t>
+            </w:r>
+          </w:p>
+        </w:tc>
+        <w:tc>
+          <w:tcPr>
+            <w:tcW w:type="dxa" w:w="1304"/>
+          </w:tcPr>
+          <w:p>
+            <w:r/>
+            <w:r>
+              <w:rPr>
+                <w:sz w:val="14"/>
+              </w:rPr>
+              <w:t>+27 mm / -0.3 °C</w:t>
+            </w:r>
+          </w:p>
+        </w:tc>
+        <w:tc>
+          <w:tcPr>
+            <w:tcW w:type="dxa" w:w="1304"/>
+          </w:tcPr>
+          <w:p>
+            <w:r/>
+            <w:r>
+              <w:rPr>
+                <w:sz w:val="14"/>
+              </w:rPr>
+              <w:t>+60 mm / -0.3 °C</w:t>
+            </w:r>
+          </w:p>
+        </w:tc>
+        <w:tc>
+          <w:tcPr>
+            <w:tcW w:type="dxa" w:w="1984"/>
+          </w:tcPr>
+          <w:p>
+            <w:r/>
+            <w:r>
+              <w:rPr>
+                <w:sz w:val="14"/>
+              </w:rPr>
+              <w:t>2006/07 2009/10 2017/18</w:t>
+            </w:r>
+          </w:p>
+        </w:tc>
+      </w:tr>
+      <w:tr>
+        <w:tc>
+          <w:tcPr>
+            <w:tcW w:type="dxa" w:w="1587"/>
+          </w:tcPr>
+          <w:p>
+            <w:r/>
+            <w:r>
+              <w:rPr>
+                <w:sz w:val="14"/>
+              </w:rPr>
+              <w:t>La Niña moderee (-1.5 a -1)</w:t>
+            </w:r>
+          </w:p>
+        </w:tc>
+        <w:tc>
+          <w:tcPr>
+            <w:tcW w:type="dxa" w:w="454"/>
+          </w:tcPr>
+          <w:p>
+            <w:r/>
+            <w:r>
+              <w:rPr>
+                <w:sz w:val="14"/>
+              </w:rPr>
+              <w:t>5</w:t>
+            </w:r>
+          </w:p>
+        </w:tc>
+        <w:tc>
+          <w:tcPr>
+            <w:tcW w:type="dxa" w:w="850"/>
+          </w:tcPr>
+          <w:p>
+            <w:r/>
+            <w:r>
+              <w:rPr>
+                <w:sz w:val="14"/>
+              </w:rPr>
+              <w:t>-0.3 %</w:t>
+            </w:r>
+          </w:p>
+        </w:tc>
+        <w:tc>
+          <w:tcPr>
+            <w:tcW w:type="dxa" w:w="850"/>
+          </w:tcPr>
+          <w:p>
+            <w:r/>
+            <w:r>
+              <w:rPr>
+                <w:sz w:val="14"/>
+              </w:rPr>
+              <w:t>+4.0 %</w:t>
+            </w:r>
+          </w:p>
+        </w:tc>
+        <w:tc>
+          <w:tcPr>
+            <w:tcW w:type="dxa" w:w="850"/>
+          </w:tcPr>
+          <w:p>
+            <w:r/>
+            <w:r>
+              <w:rPr>
+                <w:sz w:val="14"/>
+              </w:rPr>
+              <w:t>+0.8 %</w:t>
+            </w:r>
+          </w:p>
+        </w:tc>
+        <w:tc>
+          <w:tcPr>
+            <w:tcW w:type="dxa" w:w="907"/>
+          </w:tcPr>
+          <w:p>
+            <w:r/>
+            <w:r>
+              <w:rPr>
+                <w:sz w:val="14"/>
+              </w:rPr>
+              <w:t>+0.3 %</w:t>
+            </w:r>
+          </w:p>
+        </w:tc>
+        <w:tc>
+          <w:tcPr>
+            <w:tcW w:type="dxa" w:w="1304"/>
+          </w:tcPr>
+          <w:p>
+            <w:r/>
+            <w:r>
+              <w:rPr>
+                <w:sz w:val="14"/>
+              </w:rPr>
+              <w:t>-51 mm / -0.0 °C</w:t>
+            </w:r>
+          </w:p>
+        </w:tc>
+        <w:tc>
+          <w:tcPr>
+            <w:tcW w:type="dxa" w:w="1304"/>
+          </w:tcPr>
+          <w:p>
+            <w:r/>
+            <w:r>
+              <w:rPr>
+                <w:sz w:val="14"/>
+              </w:rPr>
+              <w:t>+17 mm / -0.1 °C</w:t>
+            </w:r>
+          </w:p>
+        </w:tc>
+        <w:tc>
+          <w:tcPr>
+            <w:tcW w:type="dxa" w:w="1984"/>
+          </w:tcPr>
+          <w:p>
+            <w:r/>
+            <w:r>
+              <w:rPr>
+                <w:sz w:val="14"/>
+              </w:rPr>
+              <w:t>2012/13 2018/19 2021/22 2022/23 2023/24</w:t>
+            </w:r>
+          </w:p>
+        </w:tc>
+      </w:tr>
+      <w:tr>
+        <w:tc>
+          <w:tcPr>
+            <w:tcW w:type="dxa" w:w="1587"/>
+          </w:tcPr>
+          <w:p>
+            <w:r/>
+            <w:r>
+              <w:rPr>
+                <w:sz w:val="14"/>
+              </w:rPr>
+              <w:t>La Niña forte (&lt;= -1.5)</w:t>
+            </w:r>
+          </w:p>
+        </w:tc>
+        <w:tc>
+          <w:tcPr>
+            <w:tcW w:type="dxa" w:w="454"/>
+          </w:tcPr>
+          <w:p>
+            <w:r/>
+            <w:r>
+              <w:rPr>
+                <w:sz w:val="14"/>
+              </w:rPr>
+              <w:t>2</w:t>
+            </w:r>
+          </w:p>
+        </w:tc>
+        <w:tc>
+          <w:tcPr>
+            <w:tcW w:type="dxa" w:w="850"/>
+          </w:tcPr>
+          <w:p>
+            <w:r/>
+            <w:r>
+              <w:rPr>
+                <w:sz w:val="14"/>
+              </w:rPr>
+              <w:t>+1.6 %</w:t>
+            </w:r>
+          </w:p>
+        </w:tc>
+        <w:tc>
+          <w:tcPr>
+            <w:tcW w:type="dxa" w:w="850"/>
+          </w:tcPr>
+          <w:p>
+            <w:r/>
+            <w:r>
+              <w:rPr>
+                <w:sz w:val="14"/>
+              </w:rPr>
+              <w:t>+7.2 %</w:t>
+            </w:r>
+          </w:p>
+        </w:tc>
+        <w:tc>
+          <w:tcPr>
+            <w:tcW w:type="dxa" w:w="850"/>
+          </w:tcPr>
+          <w:p>
+            <w:r/>
+            <w:r>
+              <w:rPr>
+                <w:sz w:val="14"/>
+              </w:rPr>
+              <w:t>+3.0 %</w:t>
+            </w:r>
+          </w:p>
+        </w:tc>
+        <w:tc>
+          <w:tcPr>
+            <w:tcW w:type="dxa" w:w="907"/>
+          </w:tcPr>
+          <w:p>
+            <w:r/>
+            <w:r>
+              <w:rPr>
+                <w:sz w:val="14"/>
+              </w:rPr>
+              <w:t>+2.4 %</w:t>
+            </w:r>
+          </w:p>
+        </w:tc>
+        <w:tc>
+          <w:tcPr>
+            <w:tcW w:type="dxa" w:w="1304"/>
+          </w:tcPr>
+          <w:p>
+            <w:r/>
+            <w:r>
+              <w:rPr>
+                <w:sz w:val="14"/>
+              </w:rPr>
+              <w:t>+113 mm / -0.5 °C</w:t>
+            </w:r>
+          </w:p>
+        </w:tc>
+        <w:tc>
+          <w:tcPr>
+            <w:tcW w:type="dxa" w:w="1304"/>
+          </w:tcPr>
+          <w:p>
+            <w:r/>
+            <w:r>
+              <w:rPr>
+                <w:sz w:val="14"/>
+              </w:rPr>
+              <w:t>-7 mm / -0.4 °C</w:t>
+            </w:r>
+          </w:p>
+        </w:tc>
+        <w:tc>
+          <w:tcPr>
+            <w:tcW w:type="dxa" w:w="1984"/>
+          </w:tcPr>
+          <w:p>
+            <w:r/>
+            <w:r>
+              <w:rPr>
+                <w:sz w:val="14"/>
+              </w:rPr>
+              <w:t>2008/09 2011/12</w:t>
+            </w:r>
+          </w:p>
+        </w:tc>
+      </w:tr>
+    </w:tbl>
+    <w:p/>
+    <w:p>
+      <w:r>
+        <w:rPr>
+          <w:b w:val="0"/>
+          <w:i w:val="0"/>
+          <w:sz w:val="20"/>
+        </w:rPr>
+        <w:t>Lecture : les deux El Niño forts de la période (2015/16, 2023/24) ont donné des campagnes N+1 avec -400 mm et +1.5 °C en Espírito Santo et -281 mm, +1.6 °C à Minas Gerais. Le conilon, non irrigué dans une bonne partie de São Mateus, a perdu -19.4 % par rapport à l'attendu (−30 % en 2016/17) ; l'arabica, en année ON les deux fois, est resté à -0.1 % de l'attendu : le cycle a masqué le choc, mais ces deux années ON sont les plus faibles de leur décennie pour une année ON. Les El Niño faibles (ONI &lt; 1) n'ont pas de signature météo ni de signature de rendement.</w:t>
       </w:r>
     </w:p>
     <w:p>
@@ -2658,7 +5827,7 @@
       <w:r>
         <w:drawing>
           <wp:inline xmlns:a="http://schemas.openxmlformats.org/drawingml/2006/main" xmlns:pic="http://schemas.openxmlformats.org/drawingml/2006/picture">
-            <wp:extent cx="5760000" cy="2346158"/>
+            <wp:extent cx="5760000" cy="2097915"/>
             <wp:docPr id="5" name="Picture 5"/>
             <wp:cNvGraphicFramePr>
               <a:graphicFrameLocks noChangeAspect="1"/>
@@ -2679,7 +5848,7 @@
                   <pic:spPr>
                     <a:xfrm>
                       <a:off x="0" y="0"/>
-                      <a:ext cx="5760000" cy="2346158"/>
+                      <a:ext cx="5760000" cy="2097915"/>
                     </a:xfrm>
                     <a:prstGeom prst="rect"/>
                   </pic:spPr>

</xml_diff>

<commit_message>
Reports: Brazil ENSO bars by species, readable class labels
Co-Authored-By: Claude Fable 5.1 <noreply@anthropic.com>
Claude-Session: https://claude.ai/code/session_01FCxjZoAHXMLJTirXSfbmgL
</commit_message>
<xml_diff>
--- a/timeseries/output/reports/Bresil_balance_sheet_cafe.docx
+++ b/timeseries/output/reports/Bresil_balance_sheet_cafe.docx
@@ -5827,7 +5827,7 @@
       <w:r>
         <w:drawing>
           <wp:inline xmlns:a="http://schemas.openxmlformats.org/drawingml/2006/main" xmlns:pic="http://schemas.openxmlformats.org/drawingml/2006/picture">
-            <wp:extent cx="5760000" cy="2097915"/>
+            <wp:extent cx="5760000" cy="1232806"/>
             <wp:docPr id="5" name="Picture 5"/>
             <wp:cNvGraphicFramePr>
               <a:graphicFrameLocks noChangeAspect="1"/>
@@ -5848,7 +5848,7 @@
                   <pic:spPr>
                     <a:xfrm>
                       <a:off x="0" y="0"/>
-                      <a:ext cx="5760000" cy="2097915"/>
+                      <a:ext cx="5760000" cy="1232806"/>
                     </a:xfrm>
                     <a:prstGeom prst="rect"/>
                   </pic:spPr>

</xml_diff>

<commit_message>
Brazil report: arithmetic line under each forecast year, 2014/15 episode excluded
Co-Authored-By: Claude Fable 5.1 <noreply@anthropic.com>
Claude-Session: https://claude.ai/code/session_01FCxjZoAHXMLJTirXSfbmgL
</commit_message>
<xml_diff>
--- a/timeseries/output/reports/Bresil_balance_sheet_cafe.docx
+++ b/timeseries/output/reports/Bresil_balance_sheet_cafe.docx
@@ -69,7 +69,7 @@
         <w:rPr>
           <w:sz w:val="20"/>
         </w:rPr>
-        <w:t>El Niño : rendement en moyenne -4.4 % par rapport aux campagnes voisines sur 8 campagnes (88 % d'entre elles sous la moyenne) ; El Niño fort : -7.2 % (4 campagnes, 100 % sous la moyenne). La Niña : +0.1 % (10 campagnes).</w:t>
+        <w:t>El Niño : rendement en moyenne -4.5 % par rapport aux campagnes voisines sur 7 campagnes (86 % d'entre elles sous la moyenne) ; El Niño fort : -7.2 % (4 campagnes, 100 % sous la moyenne). La Niña : +0.1 % (10 campagnes).</w:t>
       </w:r>
     </w:p>
     <w:p>
@@ -80,7 +80,7 @@
         <w:rPr>
           <w:sz w:val="20"/>
         </w:rPr>
-        <w:t>El Niño fort (ONI ≥ 2 : épisodes 2015/16, 2023/24, campagnes suivantes 2016/17, 2024/25) : Minas Gerais -281 mm et +1.6 °C, Espírito Santo -400 mm et +1.5 °C. Robusta -19.4 % par rapport à l'attendu, arabica -0.1 % (années ON, qui tiennent grâce au cycle), total -5.6 %.</w:t>
+        <w:t>El Niño fort (ONI ≥ 2 : épisodes 2015/16, 2023/24, campagnes suivantes 2016/17, 2024/25) : Minas Gerais -288 mm et +1.6 °C, Espírito Santo -412 mm et +1.5 °C. Robusta -19.4 % par rapport à l'attendu, arabica -0.1 % (années ON, qui tiennent grâce au cycle), total -5.6 %.</w:t>
       </w:r>
     </w:p>
     <w:p>
@@ -102,7 +102,7 @@
         <w:rPr>
           <w:sz w:val="20"/>
         </w:rPr>
-        <w:t>Prévision Production Total 2027/28 : 70 056 (intervalle 80 % 65 509 – 74 604) par le modèle ARMA ; avec l'effet El Niño historique moyen (-3.8 %) : 67 366.</w:t>
+        <w:t>Prévision Production Total 2027/28 : 70 056 (intervalle 80 % 65 509 – 74 604) par le modèle ARMA ; avec l'effet El Niño historique moyen (-3.9 %) : 67 310.</w:t>
       </w:r>
     </w:p>
     <w:p>
@@ -2571,7 +2571,7 @@
           <w:i w:val="0"/>
           <w:sz w:val="20"/>
         </w:rPr>
-        <w:t>Sur 23 campagnes, 15 ont une production sous la moyenne de leurs voisines ; écart-type des écarts 9.3 % : c'est l'ordre de grandeur de l'aléa annuel que la météo et le cycle imposent, à comparer à la tendance.</w:t>
+        <w:t>Sur 22 campagnes, 14 ont une production sous la moyenne de leurs voisines ; écart-type des écarts 9.5 % : c'est l'ordre de grandeur de l'aléa annuel que la météo et le cycle imposent, à comparer à la tendance.</w:t>
       </w:r>
     </w:p>
     <w:p>
@@ -2609,7 +2609,7 @@
           <w:i w:val="0"/>
           <w:sz w:val="20"/>
         </w:rPr>
-        <w:t>Convention retenue, comme demandé : l'épisode ENSO de l'hiver N/N+1 est rattaché à la campagne N+1/N+2 (celle dont la floraison, sept.-nov. N+1, et le remplissage se déroulent pendant et juste après l'épisode). Exemples : El Niño 2015/16 → campagne 2016/17 ; El Niño 2023/24 → campagne 2024/25 ; El Niño 2009/10 → 2010/11. Les classes d'intensité suivent le pic ONI : fort ≥ 2, modéré 1 à 2, faible &lt; 1.</w:t>
+        <w:t>Convention retenue, comme demandé : l'épisode ENSO de l'hiver N/N+1 est rattaché à la campagne N+1/N+2 (celle dont la floraison, sept.-nov. N+1, et le remplissage se déroulent pendant et juste après l'épisode). Exemples : El Niño 2015/16 → campagne 2016/17 ; El Niño 2023/24 → campagne 2024/25 ; El Niño 2009/10 → 2010/11. Les classes d'intensité suivent le pic ONI : fort ≥ 2, modéré 1 à 2, faible &lt; 1. L'épisode 2014/15 (El Niño faible, contesté) est exclu des tableaux et des moyennes, comme demandé.</w:t>
       </w:r>
     </w:p>
     <w:p>
@@ -2906,7 +2906,7 @@
               <w:rPr>
                 <w:sz w:val="14"/>
               </w:rPr>
-              <w:t>+157 mm / -0.3 °C</w:t>
+              <w:t>+150 mm / -0.3 °C</w:t>
             </w:r>
           </w:p>
         </w:tc>
@@ -2920,7 +2920,7 @@
               <w:rPr>
                 <w:sz w:val="14"/>
               </w:rPr>
-              <w:t>-184 mm / +0.2 °C</w:t>
+              <w:t>-196 mm / +0.2 °C</w:t>
             </w:r>
           </w:p>
         </w:tc>
@@ -3020,7 +3020,7 @@
               <w:rPr>
                 <w:sz w:val="14"/>
               </w:rPr>
-              <w:t>+148 mm / -0.5 °C</w:t>
+              <w:t>+141 mm / -0.5 °C</w:t>
             </w:r>
           </w:p>
         </w:tc>
@@ -3034,7 +3034,7 @@
               <w:rPr>
                 <w:sz w:val="14"/>
               </w:rPr>
-              <w:t>+417 mm / -0.5 °C</w:t>
+              <w:t>+405 mm / -0.5 °C</w:t>
             </w:r>
           </w:p>
         </w:tc>
@@ -3134,7 +3134,7 @@
               <w:rPr>
                 <w:sz w:val="14"/>
               </w:rPr>
-              <w:t>-6 mm / -0.5 °C</w:t>
+              <w:t>-13 mm / -0.5 °C</w:t>
             </w:r>
           </w:p>
         </w:tc>
@@ -3148,7 +3148,7 @@
               <w:rPr>
                 <w:sz w:val="14"/>
               </w:rPr>
-              <w:t>-13 mm / -0.5 °C</w:t>
+              <w:t>-25 mm / -0.5 °C</w:t>
             </w:r>
           </w:p>
         </w:tc>
@@ -3248,7 +3248,7 @@
               <w:rPr>
                 <w:sz w:val="14"/>
               </w:rPr>
-              <w:t>+141 mm / -0.5 °C</w:t>
+              <w:t>+134 mm / -0.5 °C</w:t>
             </w:r>
           </w:p>
         </w:tc>
@@ -3262,7 +3262,7 @@
               <w:rPr>
                 <w:sz w:val="14"/>
               </w:rPr>
-              <w:t>+161 mm / -0.6 °C</w:t>
+              <w:t>+149 mm / -0.6 °C</w:t>
             </w:r>
           </w:p>
         </w:tc>
@@ -3362,7 +3362,7 @@
               <w:rPr>
                 <w:sz w:val="14"/>
               </w:rPr>
-              <w:t>+70 mm / -0.5 °C</w:t>
+              <w:t>+63 mm / -0.5 °C</w:t>
             </w:r>
           </w:p>
         </w:tc>
@@ -3376,7 +3376,7 @@
               <w:rPr>
                 <w:sz w:val="14"/>
               </w:rPr>
-              <w:t>-208 mm / -0.0 °C</w:t>
+              <w:t>-220 mm / +0.0 °C</w:t>
             </w:r>
           </w:p>
         </w:tc>
@@ -3476,7 +3476,7 @@
               <w:rPr>
                 <w:sz w:val="14"/>
               </w:rPr>
-              <w:t>+295 mm / -0.5 °C</w:t>
+              <w:t>+288 mm / -0.5 °C</w:t>
             </w:r>
           </w:p>
         </w:tc>
@@ -3490,7 +3490,7 @@
               <w:rPr>
                 <w:sz w:val="14"/>
               </w:rPr>
-              <w:t>+266 mm / -0.3 °C</w:t>
+              <w:t>+254 mm / -0.3 °C</w:t>
             </w:r>
           </w:p>
         </w:tc>
@@ -3590,7 +3590,7 @@
               <w:rPr>
                 <w:sz w:val="14"/>
               </w:rPr>
-              <w:t>-101 mm / -0.1 °C</w:t>
+              <w:t>-108 mm / -0.1 °C</w:t>
             </w:r>
           </w:p>
         </w:tc>
@@ -3604,7 +3604,7 @@
               <w:rPr>
                 <w:sz w:val="14"/>
               </w:rPr>
-              <w:t>-57 mm / +0.2 °C</w:t>
+              <w:t>-69 mm / +0.2 °C</w:t>
             </w:r>
           </w:p>
         </w:tc>
@@ -3704,7 +3704,7 @@
               <w:rPr>
                 <w:sz w:val="14"/>
               </w:rPr>
-              <w:t>+157 mm / -0.6 °C</w:t>
+              <w:t>+150 mm / -0.6 °C</w:t>
             </w:r>
           </w:p>
         </w:tc>
@@ -3718,7 +3718,7 @@
               <w:rPr>
                 <w:sz w:val="14"/>
               </w:rPr>
-              <w:t>+194 mm / -0.7 °C</w:t>
+              <w:t>+182 mm / -0.7 °C</w:t>
             </w:r>
           </w:p>
         </w:tc>
@@ -3818,7 +3818,7 @@
               <w:rPr>
                 <w:sz w:val="14"/>
               </w:rPr>
-              <w:t>+27 mm / -0.7 °C</w:t>
+              <w:t>+20 mm / -0.7 °C</w:t>
             </w:r>
           </w:p>
         </w:tc>
@@ -3832,7 +3832,7 @@
               <w:rPr>
                 <w:sz w:val="14"/>
               </w:rPr>
-              <w:t>+125 mm / -0.7 °C</w:t>
+              <w:t>+113 mm / -0.7 °C</w:t>
             </w:r>
           </w:p>
         </w:tc>
@@ -3848,7 +3848,7 @@
               <w:rPr>
                 <w:sz w:val="14"/>
               </w:rPr>
-              <w:t>2014/15 (+0.7)</w:t>
+              <w:t>2015/16 (+2.6)</w:t>
             </w:r>
           </w:p>
         </w:tc>
@@ -3862,7 +3862,7 @@
               <w:rPr>
                 <w:sz w:val="14"/>
               </w:rPr>
-              <w:t>El Niño faible (&lt; 1)</w:t>
+              <w:t>El Niño fort (ONI &gt;= 2)</w:t>
             </w:r>
           </w:p>
         </w:tc>
@@ -3876,7 +3876,7 @@
               <w:rPr>
                 <w:sz w:val="14"/>
               </w:rPr>
-              <w:t>2015/16 OFF</w:t>
+              <w:t>2016/17 ON</w:t>
             </w:r>
           </w:p>
         </w:tc>
@@ -3890,7 +3890,7 @@
               <w:rPr>
                 <w:sz w:val="14"/>
               </w:rPr>
-              <w:t>36 100 (-3 % / -3.0 %)</w:t>
+              <w:t>45 600 (+26 % / +3.0 %)</w:t>
             </w:r>
           </w:p>
         </w:tc>
@@ -3904,7 +3904,7 @@
               <w:rPr>
                 <w:sz w:val="14"/>
               </w:rPr>
-              <w:t>13 300 (-22 % / -4.0 %)</w:t>
+              <w:t>10 500 (-21 % / -29.7 %)</w:t>
             </w:r>
           </w:p>
         </w:tc>
@@ -3918,7 +3918,7 @@
               <w:rPr>
                 <w:sz w:val="14"/>
               </w:rPr>
-              <w:t>-3.0 %</w:t>
+              <w:t>-6.1 %</w:t>
             </w:r>
           </w:p>
         </w:tc>
@@ -3932,7 +3932,7 @@
               <w:rPr>
                 <w:sz w:val="14"/>
               </w:rPr>
-              <w:t>-183 mm / +0.6 °C</w:t>
+              <w:t>-124 mm / +0.8 °C</w:t>
             </w:r>
           </w:p>
         </w:tc>
@@ -3946,7 +3946,7 @@
               <w:rPr>
                 <w:sz w:val="14"/>
               </w:rPr>
-              <w:t>-327 mm / +0.6 °C</w:t>
+              <w:t>-484 mm / +1.3 °C</w:t>
             </w:r>
           </w:p>
         </w:tc>
@@ -3962,7 +3962,7 @@
               <w:rPr>
                 <w:sz w:val="14"/>
               </w:rPr>
-              <w:t>2015/16 (+2.6)</w:t>
+              <w:t>2016/17 (-0.7)</w:t>
             </w:r>
           </w:p>
         </w:tc>
@@ -3976,7 +3976,7 @@
               <w:rPr>
                 <w:sz w:val="14"/>
               </w:rPr>
-              <w:t>El Niño fort (ONI &gt;= 2)</w:t>
+              <w:t>La Niña faible (&gt; -1)</w:t>
             </w:r>
           </w:p>
         </w:tc>
@@ -3990,7 +3990,7 @@
               <w:rPr>
                 <w:sz w:val="14"/>
               </w:rPr>
-              <w:t>2016/17 ON</w:t>
+              <w:t>2017/18 OFF</w:t>
             </w:r>
           </w:p>
         </w:tc>
@@ -4004,7 +4004,7 @@
               <w:rPr>
                 <w:sz w:val="14"/>
               </w:rPr>
-              <w:t>45 600 (+26 % / +3.0 %)</w:t>
+              <w:t>39 500 (-13 % / -0.3 %)</w:t>
             </w:r>
           </w:p>
         </w:tc>
@@ -4018,7 +4018,7 @@
               <w:rPr>
                 <w:sz w:val="14"/>
               </w:rPr>
-              <w:t>10 500 (-21 % / -29.7 %)</w:t>
+              <w:t>12 600 (+20 % / -14.6 %)</w:t>
             </w:r>
           </w:p>
         </w:tc>
@@ -4032,7 +4032,7 @@
               <w:rPr>
                 <w:sz w:val="14"/>
               </w:rPr>
-              <w:t>-6.1 %</w:t>
+              <w:t>-2.4 %</w:t>
             </w:r>
           </w:p>
         </w:tc>
@@ -4046,7 +4046,7 @@
               <w:rPr>
                 <w:sz w:val="14"/>
               </w:rPr>
-              <w:t>-117 mm / +0.8 °C</w:t>
+              <w:t>-215 mm / +0.1 °C</w:t>
             </w:r>
           </w:p>
         </w:tc>
@@ -4060,7 +4060,7 @@
               <w:rPr>
                 <w:sz w:val="14"/>
               </w:rPr>
-              <w:t>-472 mm / +1.3 °C</w:t>
+              <w:t>-85 mm / -0.2 °C</w:t>
             </w:r>
           </w:p>
         </w:tc>
@@ -4076,7 +4076,7 @@
               <w:rPr>
                 <w:sz w:val="14"/>
               </w:rPr>
-              <w:t>2016/17 (-0.7)</w:t>
+              <w:t>2017/18 (-1.0)</w:t>
             </w:r>
           </w:p>
         </w:tc>
@@ -4090,7 +4090,7 @@
               <w:rPr>
                 <w:sz w:val="14"/>
               </w:rPr>
-              <w:t>La Niña faible (&gt; -1)</w:t>
+              <w:t>La Niña moderee (-1.5 a -1)</w:t>
             </w:r>
           </w:p>
         </w:tc>
@@ -4104,7 +4104,7 @@
               <w:rPr>
                 <w:sz w:val="14"/>
               </w:rPr>
-              <w:t>2017/18 OFF</w:t>
+              <w:t>2018/19 ON</w:t>
             </w:r>
           </w:p>
         </w:tc>
@@ -4118,7 +4118,7 @@
               <w:rPr>
                 <w:sz w:val="14"/>
               </w:rPr>
-              <w:t>39 500 (-13 % / -0.3 %)</w:t>
+              <w:t>49 700 (+26 % / +4.0 %)</w:t>
             </w:r>
           </w:p>
         </w:tc>
@@ -4132,7 +4132,7 @@
               <w:rPr>
                 <w:sz w:val="14"/>
               </w:rPr>
-              <w:t>12 600 (+20 % / -14.6 %)</w:t>
+              <w:t>16 800 (+33 % / +8.7 %)</w:t>
             </w:r>
           </w:p>
         </w:tc>
@@ -4146,7 +4146,7 @@
               <w:rPr>
                 <w:sz w:val="14"/>
               </w:rPr>
-              <w:t>-2.4 %</w:t>
+              <w:t>+5.4 %</w:t>
             </w:r>
           </w:p>
         </w:tc>
@@ -4160,7 +4160,7 @@
               <w:rPr>
                 <w:sz w:val="14"/>
               </w:rPr>
-              <w:t>-208 mm / +0.1 °C</w:t>
+              <w:t>-75 mm / +0.1 °C</w:t>
             </w:r>
           </w:p>
         </w:tc>
@@ -4174,7 +4174,7 @@
               <w:rPr>
                 <w:sz w:val="14"/>
               </w:rPr>
-              <w:t>-73 mm / -0.2 °C</w:t>
+              <w:t>+32 mm / -0.1 °C</w:t>
             </w:r>
           </w:p>
         </w:tc>
@@ -4190,7 +4190,7 @@
               <w:rPr>
                 <w:sz w:val="14"/>
               </w:rPr>
-              <w:t>2017/18 (-1.0)</w:t>
+              <w:t>2018/19 (+0.9)</w:t>
             </w:r>
           </w:p>
         </w:tc>
@@ -4204,7 +4204,7 @@
               <w:rPr>
                 <w:sz w:val="14"/>
               </w:rPr>
-              <w:t>La Niña moderee (-1.5 a -1)</w:t>
+              <w:t>El Niño faible (&lt; 1)</w:t>
             </w:r>
           </w:p>
         </w:tc>
@@ -4218,7 +4218,7 @@
               <w:rPr>
                 <w:sz w:val="14"/>
               </w:rPr>
-              <w:t>2018/19 ON</w:t>
+              <w:t>2019/20 OFF</w:t>
             </w:r>
           </w:p>
         </w:tc>
@@ -4232,7 +4232,7 @@
               <w:rPr>
                 <w:sz w:val="14"/>
               </w:rPr>
-              <w:t>49 700 (+26 % / +4.0 %)</w:t>
+              <w:t>42 000 (-15 % / +4.3 %)</w:t>
             </w:r>
           </w:p>
         </w:tc>
@@ -4246,7 +4246,7 @@
               <w:rPr>
                 <w:sz w:val="14"/>
               </w:rPr>
-              <w:t>16 800 (+33 % / +8.7 %)</w:t>
+              <w:t>18 500 (+10 % / +3.9 %)</w:t>
             </w:r>
           </w:p>
         </w:tc>
@@ -4260,7 +4260,7 @@
               <w:rPr>
                 <w:sz w:val="14"/>
               </w:rPr>
-              <w:t>+5.4 %</w:t>
+              <w:t>+4.5 %</w:t>
             </w:r>
           </w:p>
         </w:tc>
@@ -4274,7 +4274,7 @@
               <w:rPr>
                 <w:sz w:val="14"/>
               </w:rPr>
-              <w:t>-68 mm / +0.1 °C</w:t>
+              <w:t>-2 mm / +0.5 °C</w:t>
             </w:r>
           </w:p>
         </w:tc>
@@ -4288,7 +4288,7 @@
               <w:rPr>
                 <w:sz w:val="14"/>
               </w:rPr>
-              <w:t>+44 mm / -0.1 °C</w:t>
+              <w:t>-19 mm / +0.6 °C</w:t>
             </w:r>
           </w:p>
         </w:tc>
@@ -4304,7 +4304,7 @@
               <w:rPr>
                 <w:sz w:val="14"/>
               </w:rPr>
-              <w:t>2018/19 (+0.9)</w:t>
+              <w:t>2020/21 (-1.3)</w:t>
             </w:r>
           </w:p>
         </w:tc>
@@ -4318,7 +4318,7 @@
               <w:rPr>
                 <w:sz w:val="14"/>
               </w:rPr>
-              <w:t>El Niño faible (&lt; 1)</w:t>
+              <w:t>La Niña moderee (-1.5 a -1)</w:t>
             </w:r>
           </w:p>
         </w:tc>
@@ -4332,7 +4332,7 @@
               <w:rPr>
                 <w:sz w:val="14"/>
               </w:rPr>
-              <w:t>2019/20 OFF</w:t>
+              <w:t>2021/22 OFF</w:t>
             </w:r>
           </w:p>
         </w:tc>
@@ -4346,7 +4346,7 @@
               <w:rPr>
                 <w:sz w:val="14"/>
               </w:rPr>
-              <w:t>42 000 (-15 % / +4.3 %)</w:t>
+              <w:t>36 400 (-27 % / -9.1 %)</w:t>
             </w:r>
           </w:p>
         </w:tc>
@@ -4360,7 +4360,7 @@
               <w:rPr>
                 <w:sz w:val="14"/>
               </w:rPr>
-              <w:t>18 500 (+10 % / +3.9 %)</w:t>
+              <w:t>21 700 (+7 % / +4.8 %)</w:t>
             </w:r>
           </w:p>
         </w:tc>
@@ -4374,7 +4374,7 @@
               <w:rPr>
                 <w:sz w:val="14"/>
               </w:rPr>
-              <w:t>+4.5 %</w:t>
+              <w:t>-3.1 %</w:t>
             </w:r>
           </w:p>
         </w:tc>
@@ -4388,7 +4388,7 @@
               <w:rPr>
                 <w:sz w:val="14"/>
               </w:rPr>
-              <w:t>+5 mm / +0.5 °C</w:t>
+              <w:t>-373 mm / +0.8 °C</w:t>
             </w:r>
           </w:p>
         </w:tc>
@@ -4402,7 +4402,7 @@
               <w:rPr>
                 <w:sz w:val="14"/>
               </w:rPr>
-              <w:t>-7 mm / +0.6 °C</w:t>
+              <w:t>-202 mm / +0.3 °C</w:t>
             </w:r>
           </w:p>
         </w:tc>
@@ -4418,7 +4418,7 @@
               <w:rPr>
                 <w:sz w:val="14"/>
               </w:rPr>
-              <w:t>2020/21 (-1.3)</w:t>
+              <w:t>2021/22 (-1.0)</w:t>
             </w:r>
           </w:p>
         </w:tc>
@@ -4446,7 +4446,7 @@
               <w:rPr>
                 <w:sz w:val="14"/>
               </w:rPr>
-              <w:t>2021/22 OFF</w:t>
+              <w:t>2022/23 ON</w:t>
             </w:r>
           </w:p>
         </w:tc>
@@ -4460,7 +4460,7 @@
               <w:rPr>
                 <w:sz w:val="14"/>
               </w:rPr>
-              <w:t>36 400 (-27 % / -9.1 %)</w:t>
+              <w:t>39 800 (+9 % / -17.8 %)</w:t>
             </w:r>
           </w:p>
         </w:tc>
@@ -4474,7 +4474,7 @@
               <w:rPr>
                 <w:sz w:val="14"/>
               </w:rPr>
-              <w:t>21 700 (+7 % / +4.8 %)</w:t>
+              <w:t>22 800 (+5 % / +8.1 %)</w:t>
             </w:r>
           </w:p>
         </w:tc>
@@ -4488,7 +4488,7 @@
               <w:rPr>
                 <w:sz w:val="14"/>
               </w:rPr>
-              <w:t>-3.1 %</w:t>
+              <w:t>-9.8 %</w:t>
             </w:r>
           </w:p>
         </w:tc>
@@ -4502,7 +4502,7 @@
               <w:rPr>
                 <w:sz w:val="14"/>
               </w:rPr>
-              <w:t>-366 mm / +0.8 °C</w:t>
+              <w:t>+165 mm / -0.4 °C</w:t>
             </w:r>
           </w:p>
         </w:tc>
@@ -4516,7 +4516,7 @@
               <w:rPr>
                 <w:sz w:val="14"/>
               </w:rPr>
-              <w:t>-190 mm / +0.3 °C</w:t>
+              <w:t>+20 mm / -0.1 °C</w:t>
             </w:r>
           </w:p>
         </w:tc>
@@ -4532,7 +4532,7 @@
               <w:rPr>
                 <w:sz w:val="14"/>
               </w:rPr>
-              <w:t>2021/22 (-1.0)</w:t>
+              <w:t>2022/23 (-1.0)</w:t>
             </w:r>
           </w:p>
         </w:tc>
@@ -4560,7 +4560,7 @@
               <w:rPr>
                 <w:sz w:val="14"/>
               </w:rPr>
-              <w:t>2022/23 ON</w:t>
+              <w:t>2023/24 OFF</w:t>
             </w:r>
           </w:p>
         </w:tc>
@@ -4574,7 +4574,7 @@
               <w:rPr>
                 <w:sz w:val="14"/>
               </w:rPr>
-              <w:t>39 800 (+9 % / -17.8 %)</w:t>
+              <w:t>44 900 (+13 % / +22.6 %)</w:t>
             </w:r>
           </w:p>
         </w:tc>
@@ -4588,7 +4588,7 @@
               <w:rPr>
                 <w:sz w:val="14"/>
               </w:rPr>
-              <w:t>22 800 (+5 % / +8.1 %)</w:t>
+              <w:t>21 400 (-6 % / -5.3 %)</w:t>
             </w:r>
           </w:p>
         </w:tc>
@@ -4602,7 +4602,7 @@
               <w:rPr>
                 <w:sz w:val="14"/>
               </w:rPr>
-              <w:t>-9.8 %</w:t>
+              <w:t>+7.1 %</w:t>
             </w:r>
           </w:p>
         </w:tc>
@@ -4616,7 +4616,7 @@
               <w:rPr>
                 <w:sz w:val="14"/>
               </w:rPr>
-              <w:t>+172 mm / -0.4 °C</w:t>
+              <w:t>-23 mm / +0.1 °C</w:t>
             </w:r>
           </w:p>
         </w:tc>
@@ -4630,7 +4630,7 @@
               <w:rPr>
                 <w:sz w:val="14"/>
               </w:rPr>
-              <w:t>+32 mm / -0.1 °C</w:t>
+              <w:t>+60 mm / +0.2 °C</w:t>
             </w:r>
           </w:p>
         </w:tc>
@@ -4646,7 +4646,7 @@
               <w:rPr>
                 <w:sz w:val="14"/>
               </w:rPr>
-              <w:t>2022/23 (-1.0)</w:t>
+              <w:t>2023/24 (+2.0)</w:t>
             </w:r>
           </w:p>
         </w:tc>
@@ -4660,7 +4660,7 @@
               <w:rPr>
                 <w:sz w:val="14"/>
               </w:rPr>
-              <w:t>La Niña moderee (-1.5 a -1)</w:t>
+              <w:t>El Niño fort (ONI &gt;= 2)</w:t>
             </w:r>
           </w:p>
         </w:tc>
@@ -4674,7 +4674,7 @@
               <w:rPr>
                 <w:sz w:val="14"/>
               </w:rPr>
-              <w:t>2023/24 OFF</w:t>
+              <w:t>2024/25 ON</w:t>
             </w:r>
           </w:p>
         </w:tc>
@@ -4688,7 +4688,7 @@
               <w:rPr>
                 <w:sz w:val="14"/>
               </w:rPr>
-              <w:t>44 900 (+13 % / +22.6 %)</w:t>
+              <w:t>44 500 (-1 % / -3.2 %)</w:t>
             </w:r>
           </w:p>
         </w:tc>
@@ -4702,7 +4702,7 @@
               <w:rPr>
                 <w:sz w:val="14"/>
               </w:rPr>
-              <w:t>21 400 (-6 % / -5.3 %)</w:t>
+              <w:t>21 000 (-2 % / -9.0 %)</w:t>
             </w:r>
           </w:p>
         </w:tc>
@@ -4716,7 +4716,7 @@
               <w:rPr>
                 <w:sz w:val="14"/>
               </w:rPr>
-              <w:t>+7.1 %</w:t>
+              <w:t>-0.1 %</w:t>
             </w:r>
           </w:p>
         </w:tc>
@@ -4730,7 +4730,7 @@
               <w:rPr>
                 <w:sz w:val="14"/>
               </w:rPr>
-              <w:t>-16 mm / +0.1 °C</w:t>
+              <w:t>-452 mm / +2.4 °C</w:t>
             </w:r>
           </w:p>
         </w:tc>
@@ -4744,121 +4744,7 @@
               <w:rPr>
                 <w:sz w:val="14"/>
               </w:rPr>
-              <w:t>+72 mm / +0.2 °C</w:t>
-            </w:r>
-          </w:p>
-        </w:tc>
-      </w:tr>
-      <w:tr>
-        <w:tc>
-          <w:tcPr>
-            <w:tcW w:type="dxa" w:w="1247"/>
-          </w:tcPr>
-          <w:p>
-            <w:r/>
-            <w:r>
-              <w:rPr>
-                <w:sz w:val="14"/>
-              </w:rPr>
-              <w:t>2023/24 (+2.0)</w:t>
-            </w:r>
-          </w:p>
-        </w:tc>
-        <w:tc>
-          <w:tcPr>
-            <w:tcW w:type="dxa" w:w="1474"/>
-          </w:tcPr>
-          <w:p>
-            <w:r/>
-            <w:r>
-              <w:rPr>
-                <w:sz w:val="14"/>
-              </w:rPr>
-              <w:t>El Niño fort (ONI &gt;= 2)</w:t>
-            </w:r>
-          </w:p>
-        </w:tc>
-        <w:tc>
-          <w:tcPr>
-            <w:tcW w:type="dxa" w:w="1077"/>
-          </w:tcPr>
-          <w:p>
-            <w:r/>
-            <w:r>
-              <w:rPr>
-                <w:sz w:val="14"/>
-              </w:rPr>
-              <w:t>2024/25 ON</w:t>
-            </w:r>
-          </w:p>
-        </w:tc>
-        <w:tc>
-          <w:tcPr>
-            <w:tcW w:type="dxa" w:w="1587"/>
-          </w:tcPr>
-          <w:p>
-            <w:r/>
-            <w:r>
-              <w:rPr>
-                <w:sz w:val="14"/>
-              </w:rPr>
-              <w:t>44 500 (-1 % / -3.2 %)</w:t>
-            </w:r>
-          </w:p>
-        </w:tc>
-        <w:tc>
-          <w:tcPr>
-            <w:tcW w:type="dxa" w:w="1587"/>
-          </w:tcPr>
-          <w:p>
-            <w:r/>
-            <w:r>
-              <w:rPr>
-                <w:sz w:val="14"/>
-              </w:rPr>
-              <w:t>21 000 (-2 % / -9.0 %)</w:t>
-            </w:r>
-          </w:p>
-        </w:tc>
-        <w:tc>
-          <w:tcPr>
-            <w:tcW w:type="dxa" w:w="850"/>
-          </w:tcPr>
-          <w:p>
-            <w:r/>
-            <w:r>
-              <w:rPr>
-                <w:sz w:val="14"/>
-              </w:rPr>
-              <w:t>-0.1 %</w:t>
-            </w:r>
-          </w:p>
-        </w:tc>
-        <w:tc>
-          <w:tcPr>
-            <w:tcW w:type="dxa" w:w="1247"/>
-          </w:tcPr>
-          <w:p>
-            <w:r/>
-            <w:r>
-              <w:rPr>
-                <w:sz w:val="14"/>
-              </w:rPr>
-              <w:t>-445 mm / +2.4 °C</w:t>
-            </w:r>
-          </w:p>
-        </w:tc>
-        <w:tc>
-          <w:tcPr>
-            <w:tcW w:type="dxa" w:w="1247"/>
-          </w:tcPr>
-          <w:p>
-            <w:r/>
-            <w:r>
-              <w:rPr>
-                <w:sz w:val="14"/>
-              </w:rPr>
-              <w:t>-328 mm / +1.7 °C</w:t>
+              <w:t>-340 mm / +1.7 °C</w:t>
             </w:r>
           </w:p>
         </w:tc>
@@ -5125,7 +5011,7 @@
               <w:rPr>
                 <w:sz w:val="14"/>
               </w:rPr>
-              <w:t>-281 mm / +1.6 °C</w:t>
+              <w:t>-288 mm / +1.6 °C</w:t>
             </w:r>
           </w:p>
         </w:tc>
@@ -5139,7 +5025,7 @@
               <w:rPr>
                 <w:sz w:val="14"/>
               </w:rPr>
-              <w:t>-400 mm / +1.5 °C</w:t>
+              <w:t>-412 mm / +1.5 °C</w:t>
             </w:r>
           </w:p>
         </w:tc>
@@ -5253,7 +5139,7 @@
               <w:rPr>
                 <w:sz w:val="14"/>
               </w:rPr>
-              <w:t>+28 mm / -0.2 °C</w:t>
+              <w:t>+21 mm / -0.2 °C</w:t>
             </w:r>
           </w:p>
         </w:tc>
@@ -5267,7 +5153,7 @@
               <w:rPr>
                 <w:sz w:val="14"/>
               </w:rPr>
-              <w:t>-120 mm / +0.2 °C</w:t>
+              <w:t>-133 mm / +0.2 °C</w:t>
             </w:r>
           </w:p>
         </w:tc>
@@ -5311,7 +5197,7 @@
               <w:rPr>
                 <w:sz w:val="14"/>
               </w:rPr>
-              <w:t>4</w:t>
+              <w:t>3</w:t>
             </w:r>
           </w:p>
         </w:tc>
@@ -5325,7 +5211,7 @@
               <w:rPr>
                 <w:sz w:val="14"/>
               </w:rPr>
-              <w:t>-2.1 %</w:t>
+              <w:t>-1.8 %</w:t>
             </w:r>
           </w:p>
         </w:tc>
@@ -5339,7 +5225,7 @@
               <w:rPr>
                 <w:sz w:val="14"/>
               </w:rPr>
-              <w:t>-0.2 %</w:t>
+              <w:t>+1.1 %</w:t>
             </w:r>
           </w:p>
         </w:tc>
@@ -5353,7 +5239,7 @@
               <w:rPr>
                 <w:sz w:val="14"/>
               </w:rPr>
-              <w:t>-1.6 %</w:t>
+              <w:t>-1.0 %</w:t>
             </w:r>
           </w:p>
         </w:tc>
@@ -5367,7 +5253,7 @@
               <w:rPr>
                 <w:sz w:val="14"/>
               </w:rPr>
-              <w:t>-1.5 %</w:t>
+              <w:t>-1.1 %</w:t>
             </w:r>
           </w:p>
         </w:tc>
@@ -5381,7 +5267,7 @@
               <w:rPr>
                 <w:sz w:val="14"/>
               </w:rPr>
-              <w:t>+27 mm / +0.0 °C</w:t>
+              <w:t>+91 mm / -0.1 °C</w:t>
             </w:r>
           </w:p>
         </w:tc>
@@ -5395,7 +5281,7 @@
               <w:rPr>
                 <w:sz w:val="14"/>
               </w:rPr>
-              <w:t>+61 mm / +0.0 °C</w:t>
+              <w:t>+178 mm / -0.2 °C</w:t>
             </w:r>
           </w:p>
         </w:tc>
@@ -5409,7 +5295,7 @@
               <w:rPr>
                 <w:sz w:val="14"/>
               </w:rPr>
-              <w:t>2005/06 2007/08 2015/16 2019/20</w:t>
+              <w:t>2005/06 2007/08 2019/20</w:t>
             </w:r>
           </w:p>
         </w:tc>
@@ -5509,7 +5395,7 @@
               <w:rPr>
                 <w:sz w:val="14"/>
               </w:rPr>
-              <w:t>+27 mm / -0.3 °C</w:t>
+              <w:t>+20 mm / -0.3 °C</w:t>
             </w:r>
           </w:p>
         </w:tc>
@@ -5523,7 +5409,7 @@
               <w:rPr>
                 <w:sz w:val="14"/>
               </w:rPr>
-              <w:t>+60 mm / -0.3 °C</w:t>
+              <w:t>+48 mm / -0.3 °C</w:t>
             </w:r>
           </w:p>
         </w:tc>
@@ -5637,7 +5523,7 @@
               <w:rPr>
                 <w:sz w:val="14"/>
               </w:rPr>
-              <w:t>-51 mm / -0.0 °C</w:t>
+              <w:t>-57 mm / +0.0 °C</w:t>
             </w:r>
           </w:p>
         </w:tc>
@@ -5651,7 +5537,7 @@
               <w:rPr>
                 <w:sz w:val="14"/>
               </w:rPr>
-              <w:t>+17 mm / -0.1 °C</w:t>
+              <w:t>+5 mm / -0.1 °C</w:t>
             </w:r>
           </w:p>
         </w:tc>
@@ -5765,7 +5651,7 @@
               <w:rPr>
                 <w:sz w:val="14"/>
               </w:rPr>
-              <w:t>+113 mm / -0.5 °C</w:t>
+              <w:t>+106 mm / -0.5 °C</w:t>
             </w:r>
           </w:p>
         </w:tc>
@@ -5779,7 +5665,7 @@
               <w:rPr>
                 <w:sz w:val="14"/>
               </w:rPr>
-              <w:t>-7 mm / -0.4 °C</w:t>
+              <w:t>-19 mm / -0.3 °C</w:t>
             </w:r>
           </w:p>
         </w:tc>
@@ -5807,7 +5693,7 @@
           <w:i w:val="0"/>
           <w:sz w:val="20"/>
         </w:rPr>
-        <w:t>Lecture : les deux El Niño forts de la période (2015/16, 2023/24) ont donné des campagnes N+1 avec -400 mm et +1.5 °C en Espírito Santo et -281 mm, +1.6 °C à Minas Gerais. Le conilon, non irrigué dans une bonne partie de São Mateus, a perdu -19.4 % par rapport à l'attendu (−30 % en 2016/17) ; l'arabica, en année ON les deux fois, est resté à -0.1 % de l'attendu : le cycle a masqué le choc, mais ces deux années ON sont les plus faibles de leur décennie pour une année ON. Les El Niño faibles (ONI &lt; 1) n'ont pas de signature météo ni de signature de rendement.</w:t>
+        <w:t>Lecture : les deux El Niño forts de la période (2015/16, 2023/24) ont donné des campagnes N+1 avec -412 mm et +1.5 °C en Espírito Santo et -288 mm, +1.6 °C à Minas Gerais. Le conilon, non irrigué dans une bonne partie de São Mateus, a perdu -19.4 % par rapport à l'attendu (−30 % en 2016/17) ; l'arabica, en année ON les deux fois, est resté à -0.1 % de l'attendu : le cycle a masqué le choc, mais ces deux années ON sont les plus faibles de leur décennie pour une année ON. Les El Niño faibles (ONI &lt; 1) n'ont pas de signature météo ni de signature de rendement.</w:t>
       </w:r>
     </w:p>
     <w:p>
@@ -5817,7 +5703,7 @@
           <w:i w:val="0"/>
           <w:sz w:val="20"/>
         </w:rPr>
-        <w:t>Dans les données : les campagnes El Niño ont eu -33 mm de pluie à Minas Gerais et -118 mm en Espírito Santo, avec +0.36 °C et +0.46 °C, mais +142 mm au Paraná ; les campagnes La Niña +10 mm à Minas et -84 mm au Paraná. Le signal attendu (Sud plus humide, Sudeste plus sec et plus chaud sous El Niño) est bien là, et c'est le Sudeste qui porte l'arabica et le conilon.</w:t>
+        <w:t>Dans les données : les campagnes El Niño ont eu -21 mm de pluie à Minas Gerais et -104 mm en Espírito Santo, avec +0.35 °C et +0.46 °C, mais +145 mm au Paraná ; les campagnes La Niña +4 mm à Minas et -78 mm au Paraná. Le signal attendu (Sud plus humide, Sudeste plus sec et plus chaud sous El Niño) est bien là, et c'est le Sudeste qui porte l'arabica et le conilon.</w:t>
       </w:r>
     </w:p>
     <w:p>
@@ -6088,7 +5974,7 @@
               <w:rPr>
                 <w:sz w:val="15"/>
               </w:rPr>
-              <w:t>8</w:t>
+              <w:t>7</w:t>
             </w:r>
           </w:p>
         </w:tc>
@@ -6102,7 +5988,7 @@
               <w:rPr>
                 <w:sz w:val="15"/>
               </w:rPr>
-              <w:t>-4.4 %</w:t>
+              <w:t>-4.5 %</w:t>
             </w:r>
           </w:p>
         </w:tc>
@@ -6116,7 +6002,7 @@
               <w:rPr>
                 <w:sz w:val="15"/>
               </w:rPr>
-              <w:t>88 %</w:t>
+              <w:t>86 %</w:t>
             </w:r>
           </w:p>
         </w:tc>
@@ -6130,7 +6016,7 @@
               <w:rPr>
                 <w:sz w:val="15"/>
               </w:rPr>
-              <w:t>-3.8 %</w:t>
+              <w:t>-3.9 %</w:t>
             </w:r>
           </w:p>
         </w:tc>
@@ -6144,7 +6030,7 @@
               <w:rPr>
                 <w:sz w:val="15"/>
               </w:rPr>
-              <w:t>2003/04 2005/06 2007/08 2010/11 2015/16 2016/17 2019/20 2024/25</w:t>
+              <w:t>2003/04 2005/06 2007/08 2010/11 2016/17 2019/20 2024/25</w:t>
             </w:r>
           </w:p>
         </w:tc>
@@ -6416,7 +6302,7 @@
           <w:i w:val="0"/>
           <w:sz w:val="20"/>
         </w:rPr>
-        <w:t>Lecture : pour Brésil, El Niño est historiquement négatif pour le rendement (-4.4 %) et La Niña neutre (+0.1 %). Avec 8 à 15 campagnes par phase, ce sont des tendances centrales, pas des lois : l'intensité de l'épisode, son calage sur la floraison et l'état du verger font l'écart.</w:t>
+        <w:t>Lecture : pour Brésil, El Niño est historiquement négatif pour le rendement (-4.5 %) et La Niña neutre (+0.1 %). Avec 8 à 15 campagnes par phase, ce sont des tendances centrales, pas des lois : l'intensité de l'épisode, son calage sur la floraison et l'état du verger font l'écart.</w:t>
       </w:r>
     </w:p>
     <w:p>
@@ -6436,7 +6322,7 @@
           <w:i w:val="0"/>
           <w:sz w:val="20"/>
         </w:rPr>
-        <w:t>Campagne pilotée : 2027/28. Point de départ (modèle, ON/OFF connu pour le Brésil) : 66 038 ; avec l'effet El Niño moyen (-3.8 %) : 63 502 ; avec l'effet des El Niño forts (-6.1 %) : 62 016 (milliers de sacs).</w:t>
+        <w:t>Campagne pilotée : 2027/28. Point de départ (modèle, ON/OFF connu pour le Brésil) : 66 038 ; avec l'effet El Niño moyen (-3.9 %) : 63 449 ; avec l'effet des El Niño forts (-6.1 %) : 62 016 (milliers de sacs).</w:t>
       </w:r>
     </w:p>
     <w:p>
@@ -7359,6 +7245,92 @@
       </w:tr>
     </w:tbl>
     <w:p/>
+    <w:p>
+      <w:r>
+        <w:rPr>
+          <w:b/>
+          <w:i w:val="0"/>
+          <w:sz w:val="20"/>
+        </w:rPr>
+        <w:t>Comment chaque chiffre est obtenu (milliers de sacs) :</w:t>
+      </w:r>
+    </w:p>
+    <w:p>
+      <w:pPr>
+        <w:pStyle w:val="ListBullet"/>
+      </w:pPr>
+      <w:r>
+        <w:rPr>
+          <w:sz w:val="17"/>
+        </w:rPr>
+        <w:t>2026/27 : Arabica 49 944 = 26 423 (niveau de base) + 16 077 (tendance +618 par an × 26 campagnes depuis 2001/02) + 7 443 (année ON : bonus du cycle) ; Robusta 24 710 = 7 813 (niveau de base) + 14 814 (tendance +570 par an × 26 campagnes depuis 2001/02) + 2 083 (report de 72 % de la surprise de la dernière campagne observée) ; Total 72 338 = 34 231 (niveau de base) + 30 629 (tendance +1 178 par an × 26 campagnes depuis 2001/02) + 7 479 (année ON : bonus du cycle). Météo : normale, donc 0.</w:t>
+      </w:r>
+    </w:p>
+    <w:p>
+      <w:pPr>
+        <w:pStyle w:val="ListBullet"/>
+      </w:pPr>
+      <w:r>
+        <w:rPr>
+          <w:sz w:val="17"/>
+        </w:rPr>
+        <w:t>2027/28 : Arabica 43 119 = 26 423 (niveau de base) + 16 696 (tendance +618 par an × 27 campagnes depuis 2001/02) + 0 (année OFF : pas de bonus) ; Robusta 23 196 = 7 813 (niveau de base) + 15 383 (tendance +570 par an × 27 campagnes depuis 2001/02) ; Total 66 038 = 34 231 (niveau de base) + 31 807 (tendance +1 178 par an × 27 campagnes depuis 2001/02) + 0 (année OFF : pas de bonus). Météo : normale, donc 0. Campagne pilotée par l'El Niño en cours : si modéré, arabica -6.1 % → 40 493, robusta -7.9 % → 21 373 ; si fort, arabica -0.1 % → 43 074, robusta -19.4 % → 18 698 (moyennes historiques des campagnes N+1 de chaque classe).</w:t>
+      </w:r>
+    </w:p>
+    <w:p>
+      <w:pPr>
+        <w:pStyle w:val="ListBullet"/>
+      </w:pPr>
+      <w:r>
+        <w:rPr>
+          <w:sz w:val="17"/>
+        </w:rPr>
+        <w:t>2028/29 : Arabica 51 180 = 26 423 (niveau de base) + 17 314 (tendance +618 par an × 28 campagnes depuis 2001/02) + 7 443 (année ON : bonus du cycle) ; Robusta 23 766 = 7 813 (niveau de base) + 15 953 (tendance +570 par an × 28 campagnes depuis 2001/02) ; Total 74 694 = 34 231 (niveau de base) + 32 985 (tendance +1 178 par an × 28 campagnes depuis 2001/02) + 7 479 (année ON : bonus du cycle). Météo : normale, donc 0.</w:t>
+      </w:r>
+    </w:p>
+    <w:p>
+      <w:pPr>
+        <w:pStyle w:val="ListBullet"/>
+      </w:pPr>
+      <w:r>
+        <w:rPr>
+          <w:sz w:val="17"/>
+        </w:rPr>
+        <w:t>2029/30 : Arabica 44 356 = 26 423 (niveau de base) + 17 932 (tendance +618 par an × 29 campagnes depuis 2001/02) + 0 (année OFF : pas de bonus) ; Robusta 24 336 = 7 813 (niveau de base) + 16 523 (tendance +570 par an × 29 campagnes depuis 2001/02) ; Total 68 394 = 34 231 (niveau de base) + 34 163 (tendance +1 178 par an × 29 campagnes depuis 2001/02) + 0 (année OFF : pas de bonus). Météo : normale, donc 0.</w:t>
+      </w:r>
+    </w:p>
+    <w:p>
+      <w:pPr>
+        <w:pStyle w:val="ListBullet"/>
+      </w:pPr>
+      <w:r>
+        <w:rPr>
+          <w:sz w:val="17"/>
+        </w:rPr>
+        <w:t>2030/31 : Arabica 52 417 = 26 423 (niveau de base) + 18 551 (tendance +618 par an × 30 campagnes depuis 2001/02) + 7 443 (année ON : bonus du cycle) ; Robusta 24 905 = 7 813 (niveau de base) + 17 092 (tendance +570 par an × 30 campagnes depuis 2001/02) ; Total 77 050 = 34 231 (niveau de base) + 35 341 (tendance +1 178 par an × 30 campagnes depuis 2001/02) + 7 479 (année ON : bonus du cycle). Météo : normale, donc 0.</w:t>
+      </w:r>
+    </w:p>
+    <w:p>
+      <w:pPr>
+        <w:pStyle w:val="ListBullet"/>
+      </w:pPr>
+      <w:r>
+        <w:rPr>
+          <w:sz w:val="17"/>
+        </w:rPr>
+        <w:t>2031/32 : Arabica 45 592 = 26 423 (niveau de base) + 19 169 (tendance +618 par an × 31 campagnes depuis 2001/02) + 0 (année OFF : pas de bonus) ; Robusta 25 475 = 7 813 (niveau de base) + 17 662 (tendance +570 par an × 31 campagnes depuis 2001/02) ; Total 70 750 = 34 231 (niveau de base) + 36 519 (tendance +1 178 par an × 31 campagnes depuis 2001/02) + 0 (année OFF : pas de bonus). Météo : normale, donc 0.</w:t>
+      </w:r>
+    </w:p>
+    <w:p>
+      <w:r>
+        <w:rPr>
+          <w:b w:val="0"/>
+          <w:i/>
+          <w:sz w:val="20"/>
+        </w:rPr>
+        <w:t>En une phrase : chaque prévision = niveau de base + tendance × nombre de campagnes + bonus ON/OFF, à laquelle on applique l'effet El Niño historique de la classe attendue ; l'intervalle 80 % vient de la taille des surprises passées.</w:t>
+      </w:r>
+    </w:p>
     <w:p>
       <w:pPr>
         <w:jc w:val="center"/>

</xml_diff>

<commit_message>
Brazil report: drop 2014/15 from the yield-shock table, label the driving ENSO episode
Co-Authored-By: Claude Fable 5.1 <noreply@anthropic.com>
Claude-Session: https://claude.ai/code/session_01FCxjZoAHXMLJTirXSfbmgL
</commit_message>
<xml_diff>
--- a/timeseries/output/reports/Bresil_balance_sheet_cafe.docx
+++ b/timeseries/output/reports/Bresil_balance_sheet_cafe.docx
@@ -2033,7 +2033,7 @@
         </w:tc>
         <w:tc>
           <w:tcPr>
-            <w:tcW w:type="dxa" w:w="1814"/>
+            <w:tcW w:type="dxa" w:w="1928"/>
           </w:tcPr>
           <w:p>
             <w:r/>
@@ -2042,13 +2042,13 @@
                 <w:b/>
                 <w:sz w:val="16"/>
               </w:rPr>
-              <w:t>Phase ENSO (ONI)</w:t>
-            </w:r>
-          </w:p>
-        </w:tc>
-        <w:tc>
-          <w:tcPr>
-            <w:tcW w:type="dxa" w:w="4195"/>
+              <w:t>Épisode ENSO pilote (ONI)</w:t>
+            </w:r>
+          </w:p>
+        </w:tc>
+        <w:tc>
+          <w:tcPr>
+            <w:tcW w:type="dxa" w:w="4082"/>
           </w:tcPr>
           <w:p>
             <w:r/>
@@ -2107,7 +2107,7 @@
         </w:tc>
         <w:tc>
           <w:tcPr>
-            <w:tcW w:type="dxa" w:w="1814"/>
+            <w:tcW w:type="dxa" w:w="1928"/>
           </w:tcPr>
           <w:p>
             <w:r/>
@@ -2115,13 +2115,13 @@
               <w:rPr>
                 <w:sz w:val="16"/>
               </w:rPr>
-              <w:t>El Niño (+1.3)</w:t>
-            </w:r>
-          </w:p>
-        </w:tc>
-        <w:tc>
-          <w:tcPr>
-            <w:tcW w:type="dxa" w:w="4195"/>
+              <w:t>El Niño 2002/03 (+1.3)</w:t>
+            </w:r>
+          </w:p>
+        </w:tc>
+        <w:tc>
+          <w:tcPr>
+            <w:tcW w:type="dxa" w:w="4082"/>
           </w:tcPr>
           <w:p>
             <w:r/>
@@ -2178,7 +2178,7 @@
         </w:tc>
         <w:tc>
           <w:tcPr>
-            <w:tcW w:type="dxa" w:w="1814"/>
+            <w:tcW w:type="dxa" w:w="1928"/>
           </w:tcPr>
           <w:p>
             <w:r/>
@@ -2186,13 +2186,13 @@
               <w:rPr>
                 <w:sz w:val="16"/>
               </w:rPr>
-              <w:t>La Niña (-1.0)</w:t>
-            </w:r>
-          </w:p>
-        </w:tc>
-        <w:tc>
-          <w:tcPr>
-            <w:tcW w:type="dxa" w:w="4195"/>
+              <w:t>La Niña 2021/22 (-1.0)</w:t>
+            </w:r>
+          </w:p>
+        </w:tc>
+        <w:tc>
+          <w:tcPr>
+            <w:tcW w:type="dxa" w:w="4082"/>
           </w:tcPr>
           <w:p>
             <w:r/>
@@ -2215,7 +2215,7 @@
               <w:rPr>
                 <w:sz w:val="16"/>
               </w:rPr>
-              <w:t>2014/15</w:t>
+              <w:t>2016/17</w:t>
             </w:r>
           </w:p>
         </w:tc>
@@ -2229,7 +2229,7 @@
               <w:rPr>
                 <w:sz w:val="16"/>
               </w:rPr>
-              <w:t>-7.9 %</w:t>
+              <w:t>-6.1 %</w:t>
             </w:r>
           </w:p>
         </w:tc>
@@ -2243,13 +2243,13 @@
               <w:rPr>
                 <w:sz w:val="16"/>
               </w:rPr>
-              <w:t>-3.0 %</w:t>
-            </w:r>
-          </w:p>
-        </w:tc>
-        <w:tc>
-          <w:tcPr>
-            <w:tcW w:type="dxa" w:w="1814"/>
+              <w:t>+13.6 %</w:t>
+            </w:r>
+          </w:p>
+        </w:tc>
+        <w:tc>
+          <w:tcPr>
+            <w:tcW w:type="dxa" w:w="1928"/>
           </w:tcPr>
           <w:p>
             <w:r/>
@@ -2257,13 +2257,13 @@
               <w:rPr>
                 <w:sz w:val="16"/>
               </w:rPr>
-              <w:t>neutre (-0.4)</w:t>
-            </w:r>
-          </w:p>
-        </w:tc>
-        <w:tc>
-          <w:tcPr>
-            <w:tcW w:type="dxa" w:w="4195"/>
+              <w:t>El Niño 2015/16 (+2.6)</w:t>
+            </w:r>
+          </w:p>
+        </w:tc>
+        <w:tc>
+          <w:tcPr>
+            <w:tcW w:type="dxa" w:w="4082"/>
           </w:tcPr>
           <w:p>
             <w:r/>
@@ -2271,7 +2271,7 @@
               <w:rPr>
                 <w:sz w:val="16"/>
               </w:rPr>
-              <w:t>sécheresse et chaleur de janvier-février 2014 à Minas Gerais (année ON amputée)</w:t>
+              <w:t>sécheresse 2015-16 en Espírito Santo : conilon au plus bas (10,5 M sacs)</w:t>
             </w:r>
           </w:p>
         </w:tc>
@@ -2287,7 +2287,7 @@
               <w:rPr>
                 <w:sz w:val="16"/>
               </w:rPr>
-              <w:t>2016/17</w:t>
+              <w:t>2004/05</w:t>
             </w:r>
           </w:p>
         </w:tc>
@@ -2301,7 +2301,7 @@
               <w:rPr>
                 <w:sz w:val="16"/>
               </w:rPr>
-              <w:t>-6.1 %</w:t>
+              <w:t>-4.6 %</w:t>
             </w:r>
           </w:p>
         </w:tc>
@@ -2315,13 +2315,13 @@
               <w:rPr>
                 <w:sz w:val="16"/>
               </w:rPr>
-              <w:t>+13.6 %</w:t>
-            </w:r>
-          </w:p>
-        </w:tc>
-        <w:tc>
-          <w:tcPr>
-            <w:tcW w:type="dxa" w:w="1814"/>
+              <w:t>+42.6 %</w:t>
+            </w:r>
+          </w:p>
+        </w:tc>
+        <w:tc>
+          <w:tcPr>
+            <w:tcW w:type="dxa" w:w="1928"/>
           </w:tcPr>
           <w:p>
             <w:r/>
@@ -2329,13 +2329,13 @@
               <w:rPr>
                 <w:sz w:val="16"/>
               </w:rPr>
-              <w:t>El Niño (+2.6)</w:t>
-            </w:r>
-          </w:p>
-        </w:tc>
-        <w:tc>
-          <w:tcPr>
-            <w:tcW w:type="dxa" w:w="4195"/>
+              <w:t>neutre 2003/04 (+0.4)</w:t>
+            </w:r>
+          </w:p>
+        </w:tc>
+        <w:tc>
+          <w:tcPr>
+            <w:tcW w:type="dxa" w:w="4082"/>
           </w:tcPr>
           <w:p>
             <w:r/>
@@ -2343,7 +2343,6 @@
               <w:rPr>
                 <w:sz w:val="16"/>
               </w:rPr>
-              <w:t>sécheresse 2015-16 en Espírito Santo : conilon au plus bas (10,5 M sacs)</w:t>
             </w:r>
           </w:p>
         </w:tc>
@@ -2393,7 +2392,7 @@
         </w:tc>
         <w:tc>
           <w:tcPr>
-            <w:tcW w:type="dxa" w:w="1814"/>
+            <w:tcW w:type="dxa" w:w="1928"/>
           </w:tcPr>
           <w:p>
             <w:r/>
@@ -2401,13 +2400,13 @@
               <w:rPr>
                 <w:sz w:val="16"/>
               </w:rPr>
-              <w:t>neutre (-0.3)</w:t>
-            </w:r>
-          </w:p>
-        </w:tc>
-        <w:tc>
-          <w:tcPr>
-            <w:tcW w:type="dxa" w:w="4195"/>
+              <w:t>neutre 2001/02 (-0.3)</w:t>
+            </w:r>
+          </w:p>
+        </w:tc>
+        <w:tc>
+          <w:tcPr>
+            <w:tcW w:type="dxa" w:w="4082"/>
           </w:tcPr>
           <w:p>
             <w:r/>
@@ -2465,7 +2464,7 @@
         </w:tc>
         <w:tc>
           <w:tcPr>
-            <w:tcW w:type="dxa" w:w="1814"/>
+            <w:tcW w:type="dxa" w:w="1928"/>
           </w:tcPr>
           <w:p>
             <w:r/>
@@ -2473,13 +2472,13 @@
               <w:rPr>
                 <w:sz w:val="16"/>
               </w:rPr>
-              <w:t>neutre (-0.2)</w:t>
-            </w:r>
-          </w:p>
-        </w:tc>
-        <w:tc>
-          <w:tcPr>
-            <w:tcW w:type="dxa" w:w="4195"/>
+              <w:t>neutre 2012/13 (-0.2)</w:t>
+            </w:r>
+          </w:p>
+        </w:tc>
+        <w:tc>
+          <w:tcPr>
+            <w:tcW w:type="dxa" w:w="4082"/>
           </w:tcPr>
           <w:p>
             <w:r/>
@@ -2536,7 +2535,7 @@
         </w:tc>
         <w:tc>
           <w:tcPr>
-            <w:tcW w:type="dxa" w:w="1814"/>
+            <w:tcW w:type="dxa" w:w="1928"/>
           </w:tcPr>
           <w:p>
             <w:r/>
@@ -2544,13 +2543,13 @@
               <w:rPr>
                 <w:sz w:val="16"/>
               </w:rPr>
-              <w:t>La Niña (-1.0)</w:t>
-            </w:r>
-          </w:p>
-        </w:tc>
-        <w:tc>
-          <w:tcPr>
-            <w:tcW w:type="dxa" w:w="4195"/>
+              <w:t>La Niña 2022/23 (-1.0)</w:t>
+            </w:r>
+          </w:p>
+        </w:tc>
+        <w:tc>
+          <w:tcPr>
+            <w:tcW w:type="dxa" w:w="4082"/>
           </w:tcPr>
           <w:p>
             <w:r/>

</xml_diff>

<commit_message>
ENSO: two intensity levels (fort = |ONI| >= 1.5), plain wording of the forecast arithmetic
Co-Authored-By: Claude Fable 5.1 <noreply@anthropic.com>
Claude-Session: https://claude.ai/code/session_01FCxjZoAHXMLJTirXSfbmgL
</commit_message>
<xml_diff>
--- a/timeseries/output/reports/Bresil_balance_sheet_cafe.docx
+++ b/timeseries/output/reports/Bresil_balance_sheet_cafe.docx
@@ -80,7 +80,18 @@
         <w:rPr>
           <w:sz w:val="20"/>
         </w:rPr>
-        <w:t>El Niño fort (ONI ≥ 2 : épisodes 2015/16, 2023/24, campagnes suivantes 2016/17, 2024/25) : Minas Gerais -288 mm et +1.6 °C, Espírito Santo -412 mm et +1.5 °C. Robusta -19.4 % par rapport à l'attendu, arabica -0.1 % (années ON, qui tiennent grâce au cycle), total -5.6 %.</w:t>
+        <w:t>El Niño fort (ONI ≥ 1,5 : épisodes 2009/10, 2015/16, 2023/24, campagnes suivantes 2010/11, 2016/17, 2024/25) : Minas Gerais -228 mm et +1.1 °C, Espírito Santo -298 mm et +1.1 °C. Robusta -15.3 % par rapport à l'attendu, arabica +0.4 % (années ON, qui tiennent grâce au cycle), total -4.0 %.</w:t>
+      </w:r>
+    </w:p>
+    <w:p>
+      <w:pPr>
+        <w:pStyle w:val="ListBullet"/>
+      </w:pPr>
+      <w:r>
+        <w:rPr>
+          <w:sz w:val="20"/>
+        </w:rPr>
+        <w:t>El Niño ordinaire (ONI entre 0,5 et 1,5 : 2002/03, 2004/05, 2006/07, 2018/19) : arabica -4.7 %, robusta -1.3 %, total -3.8 % ; Minas Gerais +105 mm, Espírito Santo +85 mm : pas de signal net.</w:t>
       </w:r>
     </w:p>
     <w:p>
@@ -2608,7 +2619,7 @@
           <w:i w:val="0"/>
           <w:sz w:val="20"/>
         </w:rPr>
-        <w:t>Convention retenue, comme demandé : l'épisode ENSO de l'hiver N/N+1 est rattaché à la campagne N+1/N+2 (celle dont la floraison, sept.-nov. N+1, et le remplissage se déroulent pendant et juste après l'épisode). Exemples : El Niño 2015/16 → campagne 2016/17 ; El Niño 2023/24 → campagne 2024/25 ; El Niño 2009/10 → 2010/11. Les classes d'intensité suivent le pic ONI : fort ≥ 2, modéré 1 à 2, faible &lt; 1. L'épisode 2014/15 (El Niño faible, contesté) est exclu des tableaux et des moyennes, comme demandé.</w:t>
+        <w:t>Convention retenue, comme demandé : l'épisode ENSO de l'hiver N/N+1 est rattaché à la campagne N+1/N+2 (celle dont la floraison, sept.-nov. N+1, et le remplissage se déroulent pendant et juste après l'épisode). Exemples : El Niño 2015/16 → campagne 2016/17 ; El Niño 2023/24 → campagne 2024/25 ; El Niño 2009/10 → 2010/11. Deux niveaux seulement : El Niño fort quand le pic ONI atteint +1,5 (2009/10, 2015/16, 2023/24), El Niño sinon ; La Niña forte sous −1,5, La Niña sinon. L'épisode 2014/15 est exclu des tableaux et des moyennes, comme demandé.</w:t>
       </w:r>
     </w:p>
     <w:p>
@@ -2835,7 +2846,7 @@
               <w:rPr>
                 <w:sz w:val="14"/>
               </w:rPr>
-              <w:t>El Niño modere (1-2)</w:t>
+              <w:t>El Niño (ONI 0.5-1.5)</w:t>
             </w:r>
           </w:p>
         </w:tc>
@@ -2949,7 +2960,7 @@
               <w:rPr>
                 <w:sz w:val="14"/>
               </w:rPr>
-              <w:t>El Niño faible (&lt; 1)</w:t>
+              <w:t>El Niño (ONI 0.5-1.5)</w:t>
             </w:r>
           </w:p>
         </w:tc>
@@ -3063,7 +3074,7 @@
               <w:rPr>
                 <w:sz w:val="14"/>
               </w:rPr>
-              <w:t>La Niña faible (&gt; -1)</w:t>
+              <w:t>La Niña (ONI -0.5 a -1.5)</w:t>
             </w:r>
           </w:p>
         </w:tc>
@@ -3177,7 +3188,7 @@
               <w:rPr>
                 <w:sz w:val="14"/>
               </w:rPr>
-              <w:t>El Niño faible (&lt; 1)</w:t>
+              <w:t>El Niño (ONI 0.5-1.5)</w:t>
             </w:r>
           </w:p>
         </w:tc>
@@ -3291,7 +3302,7 @@
               <w:rPr>
                 <w:sz w:val="14"/>
               </w:rPr>
-              <w:t>La Niña forte (&lt;= -1.5)</w:t>
+              <w:t>La Niña forte (ONI &lt;= -1.5)</w:t>
             </w:r>
           </w:p>
         </w:tc>
@@ -3405,7 +3416,7 @@
               <w:rPr>
                 <w:sz w:val="14"/>
               </w:rPr>
-              <w:t>La Niña faible (&gt; -1)</w:t>
+              <w:t>La Niña (ONI -0.5 a -1.5)</w:t>
             </w:r>
           </w:p>
         </w:tc>
@@ -3519,7 +3530,7 @@
               <w:rPr>
                 <w:sz w:val="14"/>
               </w:rPr>
-              <w:t>El Niño modere (1-2)</w:t>
+              <w:t>El Niño fort (ONI &gt;= 1.5)</w:t>
             </w:r>
           </w:p>
         </w:tc>
@@ -3633,7 +3644,7 @@
               <w:rPr>
                 <w:sz w:val="14"/>
               </w:rPr>
-              <w:t>La Niña forte (&lt;= -1.5)</w:t>
+              <w:t>La Niña forte (ONI &lt;= -1.5)</w:t>
             </w:r>
           </w:p>
         </w:tc>
@@ -3747,7 +3758,7 @@
               <w:rPr>
                 <w:sz w:val="14"/>
               </w:rPr>
-              <w:t>La Niña moderee (-1.5 a -1)</w:t>
+              <w:t>La Niña (ONI -0.5 a -1.5)</w:t>
             </w:r>
           </w:p>
         </w:tc>
@@ -3861,7 +3872,7 @@
               <w:rPr>
                 <w:sz w:val="14"/>
               </w:rPr>
-              <w:t>El Niño fort (ONI &gt;= 2)</w:t>
+              <w:t>El Niño fort (ONI &gt;= 1.5)</w:t>
             </w:r>
           </w:p>
         </w:tc>
@@ -3975,7 +3986,7 @@
               <w:rPr>
                 <w:sz w:val="14"/>
               </w:rPr>
-              <w:t>La Niña faible (&gt; -1)</w:t>
+              <w:t>La Niña (ONI -0.5 a -1.5)</w:t>
             </w:r>
           </w:p>
         </w:tc>
@@ -4089,7 +4100,7 @@
               <w:rPr>
                 <w:sz w:val="14"/>
               </w:rPr>
-              <w:t>La Niña moderee (-1.5 a -1)</w:t>
+              <w:t>La Niña (ONI -0.5 a -1.5)</w:t>
             </w:r>
           </w:p>
         </w:tc>
@@ -4203,7 +4214,7 @@
               <w:rPr>
                 <w:sz w:val="14"/>
               </w:rPr>
-              <w:t>El Niño faible (&lt; 1)</w:t>
+              <w:t>El Niño (ONI 0.5-1.5)</w:t>
             </w:r>
           </w:p>
         </w:tc>
@@ -4317,7 +4328,7 @@
               <w:rPr>
                 <w:sz w:val="14"/>
               </w:rPr>
-              <w:t>La Niña moderee (-1.5 a -1)</w:t>
+              <w:t>La Niña (ONI -0.5 a -1.5)</w:t>
             </w:r>
           </w:p>
         </w:tc>
@@ -4431,7 +4442,7 @@
               <w:rPr>
                 <w:sz w:val="14"/>
               </w:rPr>
-              <w:t>La Niña moderee (-1.5 a -1)</w:t>
+              <w:t>La Niña (ONI -0.5 a -1.5)</w:t>
             </w:r>
           </w:p>
         </w:tc>
@@ -4545,7 +4556,7 @@
               <w:rPr>
                 <w:sz w:val="14"/>
               </w:rPr>
-              <w:t>La Niña moderee (-1.5 a -1)</w:t>
+              <w:t>La Niña (ONI -0.5 a -1.5)</w:t>
             </w:r>
           </w:p>
         </w:tc>
@@ -4659,7 +4670,7 @@
               <w:rPr>
                 <w:sz w:val="14"/>
               </w:rPr>
-              <w:t>El Niño fort (ONI &gt;= 2)</w:t>
+              <w:t>El Niño fort (ONI &gt;= 1.5)</w:t>
             </w:r>
           </w:p>
         </w:tc>
@@ -4926,7 +4937,7 @@
               <w:rPr>
                 <w:sz w:val="14"/>
               </w:rPr>
-              <w:t>El Niño fort (ONI &gt;= 2)</w:t>
+              <w:t>El Niño fort (ONI &gt;= 1.5)</w:t>
             </w:r>
           </w:p>
         </w:tc>
@@ -4940,7 +4951,7 @@
               <w:rPr>
                 <w:sz w:val="14"/>
               </w:rPr>
-              <w:t>2</w:t>
+              <w:t>3</w:t>
             </w:r>
           </w:p>
         </w:tc>
@@ -4954,7 +4965,7 @@
               <w:rPr>
                 <w:sz w:val="14"/>
               </w:rPr>
-              <w:t>-0.1 %</w:t>
+              <w:t>+0.4 %</w:t>
             </w:r>
           </w:p>
         </w:tc>
@@ -4968,7 +4979,7 @@
               <w:rPr>
                 <w:sz w:val="14"/>
               </w:rPr>
-              <w:t>-19.4 %</w:t>
+              <w:t>-15.3 %</w:t>
             </w:r>
           </w:p>
         </w:tc>
@@ -4982,7 +4993,7 @@
               <w:rPr>
                 <w:sz w:val="14"/>
               </w:rPr>
-              <w:t>-5.6 %</w:t>
+              <w:t>-4.0 %</w:t>
             </w:r>
           </w:p>
         </w:tc>
@@ -4996,7 +5007,7 @@
               <w:rPr>
                 <w:sz w:val="14"/>
               </w:rPr>
-              <w:t>-3.1 %</w:t>
+              <w:t>-2.7 %</w:t>
             </w:r>
           </w:p>
         </w:tc>
@@ -5010,7 +5021,7 @@
               <w:rPr>
                 <w:sz w:val="14"/>
               </w:rPr>
-              <w:t>-288 mm / +1.6 °C</w:t>
+              <w:t>-228 mm / +1.1 °C</w:t>
             </w:r>
           </w:p>
         </w:tc>
@@ -5024,7 +5035,7 @@
               <w:rPr>
                 <w:sz w:val="14"/>
               </w:rPr>
-              <w:t>-412 mm / +1.5 °C</w:t>
+              <w:t>-298 mm / +1.1 °C</w:t>
             </w:r>
           </w:p>
         </w:tc>
@@ -5038,7 +5049,7 @@
               <w:rPr>
                 <w:sz w:val="14"/>
               </w:rPr>
-              <w:t>2016/17 2024/25</w:t>
+              <w:t>2010/11 2016/17 2024/25</w:t>
             </w:r>
           </w:p>
         </w:tc>
@@ -5054,7 +5065,7 @@
               <w:rPr>
                 <w:sz w:val="14"/>
               </w:rPr>
-              <w:t>El Niño modere (1-2)</w:t>
+              <w:t>El Niño (ONI 0.5-1.5)</w:t>
             </w:r>
           </w:p>
         </w:tc>
@@ -5068,7 +5079,7 @@
               <w:rPr>
                 <w:sz w:val="14"/>
               </w:rPr>
-              <w:t>2</w:t>
+              <w:t>4</w:t>
             </w:r>
           </w:p>
         </w:tc>
@@ -5082,7 +5093,7 @@
               <w:rPr>
                 <w:sz w:val="14"/>
               </w:rPr>
-              <w:t>-6.1 %</w:t>
+              <w:t>-4.7 %</w:t>
             </w:r>
           </w:p>
         </w:tc>
@@ -5096,7 +5107,7 @@
               <w:rPr>
                 <w:sz w:val="14"/>
               </w:rPr>
-              <w:t>-7.9 %</w:t>
+              <w:t>-1.3 %</w:t>
             </w:r>
           </w:p>
         </w:tc>
@@ -5110,7 +5121,7 @@
               <w:rPr>
                 <w:sz w:val="14"/>
               </w:rPr>
-              <w:t>-6.6 %</w:t>
+              <w:t>-3.8 %</w:t>
             </w:r>
           </w:p>
         </w:tc>
@@ -5124,7 +5135,7 @@
               <w:rPr>
                 <w:sz w:val="14"/>
               </w:rPr>
-              <w:t>-11.2 %</w:t>
+              <w:t>-5.9 %</w:t>
             </w:r>
           </w:p>
         </w:tc>
@@ -5138,7 +5149,7 @@
               <w:rPr>
                 <w:sz w:val="14"/>
               </w:rPr>
-              <w:t>+21 mm / -0.2 °C</w:t>
+              <w:t>+105 mm / -0.2 °C</w:t>
             </w:r>
           </w:p>
         </w:tc>
@@ -5152,7 +5163,7 @@
               <w:rPr>
                 <w:sz w:val="14"/>
               </w:rPr>
-              <w:t>-133 mm / +0.2 °C</w:t>
+              <w:t>+85 mm / -0.1 °C</w:t>
             </w:r>
           </w:p>
         </w:tc>
@@ -5166,7 +5177,7 @@
               <w:rPr>
                 <w:sz w:val="14"/>
               </w:rPr>
-              <w:t>2003/04 2010/11</w:t>
+              <w:t>2003/04 2005/06 2007/08 2019/20</w:t>
             </w:r>
           </w:p>
         </w:tc>
@@ -5182,7 +5193,7 @@
               <w:rPr>
                 <w:sz w:val="14"/>
               </w:rPr>
-              <w:t>El Niño faible (&lt; 1)</w:t>
+              <w:t>La Niña (ONI -0.5 a -1.5)</w:t>
             </w:r>
           </w:p>
         </w:tc>
@@ -5196,7 +5207,7 @@
               <w:rPr>
                 <w:sz w:val="14"/>
               </w:rPr>
-              <w:t>3</w:t>
+              <w:t>8</w:t>
             </w:r>
           </w:p>
         </w:tc>
@@ -5210,7 +5221,7 @@
               <w:rPr>
                 <w:sz w:val="14"/>
               </w:rPr>
-              <w:t>-1.8 %</w:t>
+              <w:t>+0.0 %</w:t>
             </w:r>
           </w:p>
         </w:tc>
@@ -5224,7 +5235,7 @@
               <w:rPr>
                 <w:sz w:val="14"/>
               </w:rPr>
-              <w:t>+1.1 %</w:t>
+              <w:t>-0.6 %</w:t>
             </w:r>
           </w:p>
         </w:tc>
@@ -5238,7 +5249,7 @@
               <w:rPr>
                 <w:sz w:val="14"/>
               </w:rPr>
-              <w:t>-1.0 %</w:t>
+              <w:t>-0.1 %</w:t>
             </w:r>
           </w:p>
         </w:tc>
@@ -5252,7 +5263,7 @@
               <w:rPr>
                 <w:sz w:val="14"/>
               </w:rPr>
-              <w:t>-1.1 %</w:t>
+              <w:t>-0.5 %</w:t>
             </w:r>
           </w:p>
         </w:tc>
@@ -5266,7 +5277,7 @@
               <w:rPr>
                 <w:sz w:val="14"/>
               </w:rPr>
-              <w:t>+91 mm / -0.1 °C</w:t>
+              <w:t>-29 mm / -0.1 °C</w:t>
             </w:r>
           </w:p>
         </w:tc>
@@ -5280,7 +5291,7 @@
               <w:rPr>
                 <w:sz w:val="14"/>
               </w:rPr>
-              <w:t>+178 mm / -0.2 °C</w:t>
+              <w:t>+21 mm / -0.2 °C</w:t>
             </w:r>
           </w:p>
         </w:tc>
@@ -5294,7 +5305,7 @@
               <w:rPr>
                 <w:sz w:val="14"/>
               </w:rPr>
-              <w:t>2005/06 2007/08 2019/20</w:t>
+              <w:t>2006/07 2009/10 2012/13 2017/18 2018/19 2021/22 2022/23 2023/24</w:t>
             </w:r>
           </w:p>
         </w:tc>
@@ -5310,263 +5321,7 @@
               <w:rPr>
                 <w:sz w:val="14"/>
               </w:rPr>
-              <w:t>La Niña faible (&gt; -1)</w:t>
-            </w:r>
-          </w:p>
-        </w:tc>
-        <w:tc>
-          <w:tcPr>
-            <w:tcW w:type="dxa" w:w="454"/>
-          </w:tcPr>
-          <w:p>
-            <w:r/>
-            <w:r>
-              <w:rPr>
-                <w:sz w:val="14"/>
-              </w:rPr>
-              <w:t>3</w:t>
-            </w:r>
-          </w:p>
-        </w:tc>
-        <w:tc>
-          <w:tcPr>
-            <w:tcW w:type="dxa" w:w="850"/>
-          </w:tcPr>
-          <w:p>
-            <w:r/>
-            <w:r>
-              <w:rPr>
-                <w:sz w:val="14"/>
-              </w:rPr>
-              <w:t>+0.6 %</w:t>
-            </w:r>
-          </w:p>
-        </w:tc>
-        <w:tc>
-          <w:tcPr>
-            <w:tcW w:type="dxa" w:w="850"/>
-          </w:tcPr>
-          <w:p>
-            <w:r/>
-            <w:r>
-              <w:rPr>
-                <w:sz w:val="14"/>
-              </w:rPr>
-              <w:t>-8.3 %</w:t>
-            </w:r>
-          </w:p>
-        </w:tc>
-        <w:tc>
-          <w:tcPr>
-            <w:tcW w:type="dxa" w:w="850"/>
-          </w:tcPr>
-          <w:p>
-            <w:r/>
-            <w:r>
-              <w:rPr>
-                <w:sz w:val="14"/>
-              </w:rPr>
-              <w:t>-1.7 %</w:t>
-            </w:r>
-          </w:p>
-        </w:tc>
-        <w:tc>
-          <w:tcPr>
-            <w:tcW w:type="dxa" w:w="907"/>
-          </w:tcPr>
-          <w:p>
-            <w:r/>
-            <w:r>
-              <w:rPr>
-                <w:sz w:val="14"/>
-              </w:rPr>
-              <w:t>-1.8 %</w:t>
-            </w:r>
-          </w:p>
-        </w:tc>
-        <w:tc>
-          <w:tcPr>
-            <w:tcW w:type="dxa" w:w="1304"/>
-          </w:tcPr>
-          <w:p>
-            <w:r/>
-            <w:r>
-              <w:rPr>
-                <w:sz w:val="14"/>
-              </w:rPr>
-              <w:t>+20 mm / -0.3 °C</w:t>
-            </w:r>
-          </w:p>
-        </w:tc>
-        <w:tc>
-          <w:tcPr>
-            <w:tcW w:type="dxa" w:w="1304"/>
-          </w:tcPr>
-          <w:p>
-            <w:r/>
-            <w:r>
-              <w:rPr>
-                <w:sz w:val="14"/>
-              </w:rPr>
-              <w:t>+48 mm / -0.3 °C</w:t>
-            </w:r>
-          </w:p>
-        </w:tc>
-        <w:tc>
-          <w:tcPr>
-            <w:tcW w:type="dxa" w:w="1984"/>
-          </w:tcPr>
-          <w:p>
-            <w:r/>
-            <w:r>
-              <w:rPr>
-                <w:sz w:val="14"/>
-              </w:rPr>
-              <w:t>2006/07 2009/10 2017/18</w:t>
-            </w:r>
-          </w:p>
-        </w:tc>
-      </w:tr>
-      <w:tr>
-        <w:tc>
-          <w:tcPr>
-            <w:tcW w:type="dxa" w:w="1587"/>
-          </w:tcPr>
-          <w:p>
-            <w:r/>
-            <w:r>
-              <w:rPr>
-                <w:sz w:val="14"/>
-              </w:rPr>
-              <w:t>La Niña moderee (-1.5 a -1)</w:t>
-            </w:r>
-          </w:p>
-        </w:tc>
-        <w:tc>
-          <w:tcPr>
-            <w:tcW w:type="dxa" w:w="454"/>
-          </w:tcPr>
-          <w:p>
-            <w:r/>
-            <w:r>
-              <w:rPr>
-                <w:sz w:val="14"/>
-              </w:rPr>
-              <w:t>5</w:t>
-            </w:r>
-          </w:p>
-        </w:tc>
-        <w:tc>
-          <w:tcPr>
-            <w:tcW w:type="dxa" w:w="850"/>
-          </w:tcPr>
-          <w:p>
-            <w:r/>
-            <w:r>
-              <w:rPr>
-                <w:sz w:val="14"/>
-              </w:rPr>
-              <w:t>-0.3 %</w:t>
-            </w:r>
-          </w:p>
-        </w:tc>
-        <w:tc>
-          <w:tcPr>
-            <w:tcW w:type="dxa" w:w="850"/>
-          </w:tcPr>
-          <w:p>
-            <w:r/>
-            <w:r>
-              <w:rPr>
-                <w:sz w:val="14"/>
-              </w:rPr>
-              <w:t>+4.0 %</w:t>
-            </w:r>
-          </w:p>
-        </w:tc>
-        <w:tc>
-          <w:tcPr>
-            <w:tcW w:type="dxa" w:w="850"/>
-          </w:tcPr>
-          <w:p>
-            <w:r/>
-            <w:r>
-              <w:rPr>
-                <w:sz w:val="14"/>
-              </w:rPr>
-              <w:t>+0.8 %</w:t>
-            </w:r>
-          </w:p>
-        </w:tc>
-        <w:tc>
-          <w:tcPr>
-            <w:tcW w:type="dxa" w:w="907"/>
-          </w:tcPr>
-          <w:p>
-            <w:r/>
-            <w:r>
-              <w:rPr>
-                <w:sz w:val="14"/>
-              </w:rPr>
-              <w:t>+0.3 %</w:t>
-            </w:r>
-          </w:p>
-        </w:tc>
-        <w:tc>
-          <w:tcPr>
-            <w:tcW w:type="dxa" w:w="1304"/>
-          </w:tcPr>
-          <w:p>
-            <w:r/>
-            <w:r>
-              <w:rPr>
-                <w:sz w:val="14"/>
-              </w:rPr>
-              <w:t>-57 mm / +0.0 °C</w:t>
-            </w:r>
-          </w:p>
-        </w:tc>
-        <w:tc>
-          <w:tcPr>
-            <w:tcW w:type="dxa" w:w="1304"/>
-          </w:tcPr>
-          <w:p>
-            <w:r/>
-            <w:r>
-              <w:rPr>
-                <w:sz w:val="14"/>
-              </w:rPr>
-              <w:t>+5 mm / -0.1 °C</w:t>
-            </w:r>
-          </w:p>
-        </w:tc>
-        <w:tc>
-          <w:tcPr>
-            <w:tcW w:type="dxa" w:w="1984"/>
-          </w:tcPr>
-          <w:p>
-            <w:r/>
-            <w:r>
-              <w:rPr>
-                <w:sz w:val="14"/>
-              </w:rPr>
-              <w:t>2012/13 2018/19 2021/22 2022/23 2023/24</w:t>
-            </w:r>
-          </w:p>
-        </w:tc>
-      </w:tr>
-      <w:tr>
-        <w:tc>
-          <w:tcPr>
-            <w:tcW w:type="dxa" w:w="1587"/>
-          </w:tcPr>
-          <w:p>
-            <w:r/>
-            <w:r>
-              <w:rPr>
-                <w:sz w:val="14"/>
-              </w:rPr>
-              <w:t>La Niña forte (&lt;= -1.5)</w:t>
+              <w:t>La Niña forte (ONI &lt;= -1.5)</w:t>
             </w:r>
           </w:p>
         </w:tc>
@@ -5692,7 +5447,7 @@
           <w:i w:val="0"/>
           <w:sz w:val="20"/>
         </w:rPr>
-        <w:t>Lecture : les deux El Niño forts de la période (2015/16, 2023/24) ont donné des campagnes N+1 avec -412 mm et +1.5 °C en Espírito Santo et -288 mm, +1.6 °C à Minas Gerais. Le conilon, non irrigué dans une bonne partie de São Mateus, a perdu -19.4 % par rapport à l'attendu (−30 % en 2016/17) ; l'arabica, en année ON les deux fois, est resté à -0.1 % de l'attendu : le cycle a masqué le choc, mais ces deux années ON sont les plus faibles de leur décennie pour une année ON. Les El Niño faibles (ONI &lt; 1) n'ont pas de signature météo ni de signature de rendement.</w:t>
+        <w:t>Lecture : les El Niño forts de la période (2009/10, 2015/16, 2023/24) ont donné des campagnes N+1 avec -298 mm et +1.1 °C en Espírito Santo et -228 mm, +1.1 °C à Minas Gerais. Le conilon, non irrigué dans une bonne partie de São Mateus, a perdu -15.3 % par rapport à l'attendu (−30 % en 2016/17) ; l'arabica, en année ON les trois fois, est resté à +0.4 % de l'attendu : le cycle a masqué le choc. Les El Niño ordinaires (ONI &lt; 1,5) n'ont pas de signature météo nette ni de signature de rendement.</w:t>
       </w:r>
     </w:p>
     <w:p>
@@ -5712,7 +5467,7 @@
       <w:r>
         <w:drawing>
           <wp:inline xmlns:a="http://schemas.openxmlformats.org/drawingml/2006/main" xmlns:pic="http://schemas.openxmlformats.org/drawingml/2006/picture">
-            <wp:extent cx="5760000" cy="1232806"/>
+            <wp:extent cx="5760000" cy="1463143"/>
             <wp:docPr id="5" name="Picture 5"/>
             <wp:cNvGraphicFramePr>
               <a:graphicFrameLocks noChangeAspect="1"/>
@@ -5733,7 +5488,7 @@
                   <pic:spPr>
                     <a:xfrm>
                       <a:off x="0" y="0"/>
-                      <a:ext cx="5760000" cy="1232806"/>
+                      <a:ext cx="5760000" cy="1463143"/>
                     </a:xfrm>
                     <a:prstGeom prst="rect"/>
                   </pic:spPr>
@@ -7255,14 +7010,13 @@
       </w:r>
     </w:p>
     <w:p>
-      <w:pPr>
-        <w:pStyle w:val="ListBullet"/>
-      </w:pPr>
       <w:r>
         <w:rPr>
-          <w:sz w:val="17"/>
+          <w:b w:val="0"/>
+          <w:i/>
+          <w:sz w:val="18"/>
         </w:rPr>
-        <w:t>2026/27 : Arabica 49 944 = 26 423 (niveau de base) + 16 077 (tendance +618 par an × 26 campagnes depuis 2001/02) + 7 443 (année ON : bonus du cycle) ; Robusta 24 710 = 7 813 (niveau de base) + 14 814 (tendance +570 par an × 26 campagnes depuis 2001/02) + 2 083 (report de 72 % de la surprise de la dernière campagne observée) ; Total 72 338 = 34 231 (niveau de base) + 30 629 (tendance +1 178 par an × 26 campagnes depuis 2001/02) + 7 479 (année ON : bonus du cycle). Météo : normale, donc 0.</w:t>
+        <w:t>Vocabulaire : le point de départ est le niveau de production que le modèle estime pour la première campagne (2001/02) hors effet du cycle ; la croissance structurelle est le gain moyen par an sur 2001-2025 une fois le cycle ON/OFF retiré (nouvelles variétés, densité, irrigation, Cerrado) ; on la multiplie par le nombre de campagnes écoulées depuis 2001/02 ; le bonus ON est le supplément moyen d'une année ON. La météo n'entre pas dans ces chiffres : ils supposent une météo normale.</w:t>
       </w:r>
     </w:p>
     <w:p>
@@ -7273,7 +7027,7 @@
         <w:rPr>
           <w:sz w:val="17"/>
         </w:rPr>
-        <w:t>2027/28 : Arabica 43 119 = 26 423 (niveau de base) + 16 696 (tendance +618 par an × 27 campagnes depuis 2001/02) + 0 (année OFF : pas de bonus) ; Robusta 23 196 = 7 813 (niveau de base) + 15 383 (tendance +570 par an × 27 campagnes depuis 2001/02) ; Total 66 038 = 34 231 (niveau de base) + 31 807 (tendance +1 178 par an × 27 campagnes depuis 2001/02) + 0 (année OFF : pas de bonus). Météo : normale, donc 0. Campagne pilotée par l'El Niño en cours : si modéré, arabica -6.1 % → 40 493, robusta -7.9 % → 21 373 ; si fort, arabica -0.1 % → 43 074, robusta -19.4 % → 18 698 (moyennes historiques des campagnes N+1 de chaque classe).</w:t>
+        <w:t>2026/27 : Arabica 49 944 = 26 423 (point de départ 2001/02) + 16 077 (croissance structurelle +618 par an × 26 campagnes) + 7 443 (année ON : bonus du cycle) ; Robusta 24 710 = 7 813 (point de départ 2001/02) + 14 814 (croissance structurelle +570 par an × 26 campagnes) + 2 083 (report de 72 % de la surprise de la dernière campagne observée) ; Total 72 338 = 34 231 (point de départ 2001/02) + 30 629 (croissance structurelle +1 178 par an × 26 campagnes) + 7 479 (année ON : bonus du cycle). Météo : normale, donc 0.</w:t>
       </w:r>
     </w:p>
     <w:p>
@@ -7284,7 +7038,7 @@
         <w:rPr>
           <w:sz w:val="17"/>
         </w:rPr>
-        <w:t>2028/29 : Arabica 51 180 = 26 423 (niveau de base) + 17 314 (tendance +618 par an × 28 campagnes depuis 2001/02) + 7 443 (année ON : bonus du cycle) ; Robusta 23 766 = 7 813 (niveau de base) + 15 953 (tendance +570 par an × 28 campagnes depuis 2001/02) ; Total 74 694 = 34 231 (niveau de base) + 32 985 (tendance +1 178 par an × 28 campagnes depuis 2001/02) + 7 479 (année ON : bonus du cycle). Météo : normale, donc 0.</w:t>
+        <w:t>2027/28 : Arabica 43 119 = 26 423 (point de départ 2001/02) + 16 696 (croissance structurelle +618 par an × 27 campagnes) + 0 (année OFF : pas de bonus) ; Robusta 23 196 = 7 813 (point de départ 2001/02) + 15 383 (croissance structurelle +570 par an × 27 campagnes) ; Total 66 038 = 34 231 (point de départ 2001/02) + 31 807 (croissance structurelle +1 178 par an × 27 campagnes) + 0 (année OFF : pas de bonus). Météo : normale, donc 0. Campagne pilotée par l'El Niño en cours : si El Niño ordinaire, arabica -4.7 % → 41 091, robusta -1.3 % → 22 892 ; si fort, arabica +0.4 % → 43 283, robusta -15.3 % → 19 652 (moyennes historiques des campagnes N+1 de chaque classe).</w:t>
       </w:r>
     </w:p>
     <w:p>
@@ -7295,7 +7049,7 @@
         <w:rPr>
           <w:sz w:val="17"/>
         </w:rPr>
-        <w:t>2029/30 : Arabica 44 356 = 26 423 (niveau de base) + 17 932 (tendance +618 par an × 29 campagnes depuis 2001/02) + 0 (année OFF : pas de bonus) ; Robusta 24 336 = 7 813 (niveau de base) + 16 523 (tendance +570 par an × 29 campagnes depuis 2001/02) ; Total 68 394 = 34 231 (niveau de base) + 34 163 (tendance +1 178 par an × 29 campagnes depuis 2001/02) + 0 (année OFF : pas de bonus). Météo : normale, donc 0.</w:t>
+        <w:t>2028/29 : Arabica 51 180 = 26 423 (point de départ 2001/02) + 17 314 (croissance structurelle +618 par an × 28 campagnes) + 7 443 (année ON : bonus du cycle) ; Robusta 23 766 = 7 813 (point de départ 2001/02) + 15 953 (croissance structurelle +570 par an × 28 campagnes) ; Total 74 694 = 34 231 (point de départ 2001/02) + 32 985 (croissance structurelle +1 178 par an × 28 campagnes) + 7 479 (année ON : bonus du cycle). Météo : normale, donc 0.</w:t>
       </w:r>
     </w:p>
     <w:p>
@@ -7306,7 +7060,7 @@
         <w:rPr>
           <w:sz w:val="17"/>
         </w:rPr>
-        <w:t>2030/31 : Arabica 52 417 = 26 423 (niveau de base) + 18 551 (tendance +618 par an × 30 campagnes depuis 2001/02) + 7 443 (année ON : bonus du cycle) ; Robusta 24 905 = 7 813 (niveau de base) + 17 092 (tendance +570 par an × 30 campagnes depuis 2001/02) ; Total 77 050 = 34 231 (niveau de base) + 35 341 (tendance +1 178 par an × 30 campagnes depuis 2001/02) + 7 479 (année ON : bonus du cycle). Météo : normale, donc 0.</w:t>
+        <w:t>2029/30 : Arabica 44 356 = 26 423 (point de départ 2001/02) + 17 932 (croissance structurelle +618 par an × 29 campagnes) + 0 (année OFF : pas de bonus) ; Robusta 24 336 = 7 813 (point de départ 2001/02) + 16 523 (croissance structurelle +570 par an × 29 campagnes) ; Total 68 394 = 34 231 (point de départ 2001/02) + 34 163 (croissance structurelle +1 178 par an × 29 campagnes) + 0 (année OFF : pas de bonus). Météo : normale, donc 0.</w:t>
       </w:r>
     </w:p>
     <w:p>
@@ -7317,7 +7071,18 @@
         <w:rPr>
           <w:sz w:val="17"/>
         </w:rPr>
-        <w:t>2031/32 : Arabica 45 592 = 26 423 (niveau de base) + 19 169 (tendance +618 par an × 31 campagnes depuis 2001/02) + 0 (année OFF : pas de bonus) ; Robusta 25 475 = 7 813 (niveau de base) + 17 662 (tendance +570 par an × 31 campagnes depuis 2001/02) ; Total 70 750 = 34 231 (niveau de base) + 36 519 (tendance +1 178 par an × 31 campagnes depuis 2001/02) + 0 (année OFF : pas de bonus). Météo : normale, donc 0.</w:t>
+        <w:t>2030/31 : Arabica 52 417 = 26 423 (point de départ 2001/02) + 18 551 (croissance structurelle +618 par an × 30 campagnes) + 7 443 (année ON : bonus du cycle) ; Robusta 24 905 = 7 813 (point de départ 2001/02) + 17 092 (croissance structurelle +570 par an × 30 campagnes) ; Total 77 050 = 34 231 (point de départ 2001/02) + 35 341 (croissance structurelle +1 178 par an × 30 campagnes) + 7 479 (année ON : bonus du cycle). Météo : normale, donc 0.</w:t>
+      </w:r>
+    </w:p>
+    <w:p>
+      <w:pPr>
+        <w:pStyle w:val="ListBullet"/>
+      </w:pPr>
+      <w:r>
+        <w:rPr>
+          <w:sz w:val="17"/>
+        </w:rPr>
+        <w:t>2031/32 : Arabica 45 592 = 26 423 (point de départ 2001/02) + 19 169 (croissance structurelle +618 par an × 31 campagnes) + 0 (année OFF : pas de bonus) ; Robusta 25 475 = 7 813 (point de départ 2001/02) + 17 662 (croissance structurelle +570 par an × 31 campagnes) ; Total 70 750 = 34 231 (point de départ 2001/02) + 36 519 (croissance structurelle +1 178 par an × 31 campagnes) + 0 (année OFF : pas de bonus). Météo : normale, donc 0.</w:t>
       </w:r>
     </w:p>
     <w:p>
@@ -7327,7 +7092,7 @@
           <w:i/>
           <w:sz w:val="20"/>
         </w:rPr>
-        <w:t>En une phrase : chaque prévision = niveau de base + tendance × nombre de campagnes + bonus ON/OFF, à laquelle on applique l'effet El Niño historique de la classe attendue ; l'intervalle 80 % vient de la taille des surprises passées.</w:t>
+        <w:t>En une phrase : chaque prévision = point de départ + croissance structurelle × nombre de campagnes + bonus ON/OFF, à laquelle on applique l'effet El Niño historique de la classe attendue ; l'intervalle 80 % vient de la taille des surprises passées.</w:t>
       </w:r>
     </w:p>
     <w:p>

</xml_diff>

<commit_message>
Brazil report: ON/OFF shown as +/- half the cycle gap around the mid-cycle level
Co-Authored-By: Claude Fable 5.1 <noreply@anthropic.com>
Claude-Session: https://claude.ai/code/session_01FCxjZoAHXMLJTirXSfbmgL
</commit_message>
<xml_diff>
--- a/timeseries/output/reports/Bresil_balance_sheet_cafe.docx
+++ b/timeseries/output/reports/Bresil_balance_sheet_cafe.docx
@@ -7016,7 +7016,7 @@
           <w:i/>
           <w:sz w:val="18"/>
         </w:rPr>
-        <w:t>Vocabulaire : le point de départ est le niveau de production que le modèle estime pour la première campagne (2001/02) hors effet du cycle ; la croissance structurelle est le gain moyen par an sur 2001-2025 une fois le cycle ON/OFF retiré (nouvelles variétés, densité, irrigation, Cerrado) ; on la multiplie par le nombre de campagnes écoulées depuis 2001/02 ; le bonus ON est le supplément moyen d'une année ON. La météo n'entre pas dans ces chiffres : ils supposent une météo normale.</w:t>
+        <w:t>Vocabulaire : le point de départ est le niveau de production que le modèle estime pour la première campagne (2001/02) hors effet du cycle ; la croissance structurelle est le gain moyen par an sur 2001-2025 une fois le cycle ON/OFF retiré (nouvelles variétés, densité, irrigation, Cerrado) ; on la multiplie par le nombre de campagnes écoulées depuis 2001/02 ; le cycle ajoute la moitié de l'écart ON/OFF les années ON et la retire les années OFF (écart total arabica : 7 443 milliers de sacs). La météo n'entre pas dans ces chiffres : ils supposent une météo normale.</w:t>
       </w:r>
     </w:p>
     <w:p>
@@ -7027,7 +7027,7 @@
         <w:rPr>
           <w:sz w:val="17"/>
         </w:rPr>
-        <w:t>2026/27 : Arabica 49 944 = 26 423 (point de départ 2001/02) + 16 077 (croissance structurelle +618 par an × 26 campagnes) + 7 443 (année ON : bonus du cycle) ; Robusta 24 710 = 7 813 (point de départ 2001/02) + 14 814 (croissance structurelle +570 par an × 26 campagnes) + 2 083 (report de 72 % de la surprise de la dernière campagne observée) ; Total 72 338 = 34 231 (point de départ 2001/02) + 30 629 (croissance structurelle +1 178 par an × 26 campagnes) + 7 479 (année ON : bonus du cycle). Météo : normale, donc 0.</w:t>
+        <w:t>2026/27 : Arabica 49 944 = 30 145 (point de départ 2001/02  niveau moyen du cycle) + 16 077 (croissance structurelle +618 par an × 26 campagnes) + 3 721 (année ON : moitié de l’écart ON/OFF en plus) ; Robusta 24 710 = 7 813 (point de départ 2001/02  niveau moyen du cycle) + 14 814 (croissance structurelle +570 par an × 26 campagnes) + 2 083 (report de 72 % de la surprise de la dernière campagne observée) ; Total 72 338 = 37 971 (point de départ 2001/02  niveau moyen du cycle) + 30 629 (croissance structurelle +1 178 par an × 26 campagnes) + 3 739 (année ON : moitié de l’écart ON/OFF en plus). Météo : normale, donc 0.</w:t>
       </w:r>
     </w:p>
     <w:p>
@@ -7038,7 +7038,7 @@
         <w:rPr>
           <w:sz w:val="17"/>
         </w:rPr>
-        <w:t>2027/28 : Arabica 43 119 = 26 423 (point de départ 2001/02) + 16 696 (croissance structurelle +618 par an × 27 campagnes) + 0 (année OFF : pas de bonus) ; Robusta 23 196 = 7 813 (point de départ 2001/02) + 15 383 (croissance structurelle +570 par an × 27 campagnes) ; Total 66 038 = 34 231 (point de départ 2001/02) + 31 807 (croissance structurelle +1 178 par an × 27 campagnes) + 0 (année OFF : pas de bonus). Météo : normale, donc 0. Campagne pilotée par l'El Niño en cours : si El Niño ordinaire, arabica -4.7 % → 41 091, robusta -1.3 % → 22 892 ; si fort, arabica +0.4 % → 43 283, robusta -15.3 % → 19 652 (moyennes historiques des campagnes N+1 de chaque classe).</w:t>
+        <w:t>2027/28 : Arabica 43 119 = 30 145 (point de départ 2001/02  niveau moyen du cycle) + 16 696 (croissance structurelle +618 par an × 27 campagnes) − 3 721 (année OFF : moitié de l’écart ON/OFF en moins) ; Robusta 23 196 = 7 813 (point de départ 2001/02  niveau moyen du cycle) + 15 383 (croissance structurelle +570 par an × 27 campagnes) ; Total 66 038 = 37 971 (point de départ 2001/02  niveau moyen du cycle) + 31 807 (croissance structurelle +1 178 par an × 27 campagnes) − 3 739 (année OFF : moitié de l’écart ON/OFF en moins). Météo : normale, donc 0. Campagne pilotée par l'El Niño en cours : si El Niño ordinaire, arabica -4.7 % → 41 091, robusta -1.3 % → 22 892 ; si fort, arabica +0.4 % → 43 283, robusta -15.3 % → 19 652 (moyennes historiques des campagnes N+1 de chaque classe).</w:t>
       </w:r>
     </w:p>
     <w:p>
@@ -7049,7 +7049,7 @@
         <w:rPr>
           <w:sz w:val="17"/>
         </w:rPr>
-        <w:t>2028/29 : Arabica 51 180 = 26 423 (point de départ 2001/02) + 17 314 (croissance structurelle +618 par an × 28 campagnes) + 7 443 (année ON : bonus du cycle) ; Robusta 23 766 = 7 813 (point de départ 2001/02) + 15 953 (croissance structurelle +570 par an × 28 campagnes) ; Total 74 694 = 34 231 (point de départ 2001/02) + 32 985 (croissance structurelle +1 178 par an × 28 campagnes) + 7 479 (année ON : bonus du cycle). Météo : normale, donc 0.</w:t>
+        <w:t>2028/29 : Arabica 51 180 = 30 145 (point de départ 2001/02  niveau moyen du cycle) + 17 314 (croissance structurelle +618 par an × 28 campagnes) + 3 721 (année ON : moitié de l’écart ON/OFF en plus) ; Robusta 23 766 = 7 813 (point de départ 2001/02  niveau moyen du cycle) + 15 953 (croissance structurelle +570 par an × 28 campagnes) ; Total 74 694 = 37 971 (point de départ 2001/02  niveau moyen du cycle) + 32 985 (croissance structurelle +1 178 par an × 28 campagnes) + 3 739 (année ON : moitié de l’écart ON/OFF en plus). Météo : normale, donc 0.</w:t>
       </w:r>
     </w:p>
     <w:p>
@@ -7060,7 +7060,7 @@
         <w:rPr>
           <w:sz w:val="17"/>
         </w:rPr>
-        <w:t>2029/30 : Arabica 44 356 = 26 423 (point de départ 2001/02) + 17 932 (croissance structurelle +618 par an × 29 campagnes) + 0 (année OFF : pas de bonus) ; Robusta 24 336 = 7 813 (point de départ 2001/02) + 16 523 (croissance structurelle +570 par an × 29 campagnes) ; Total 68 394 = 34 231 (point de départ 2001/02) + 34 163 (croissance structurelle +1 178 par an × 29 campagnes) + 0 (année OFF : pas de bonus). Météo : normale, donc 0.</w:t>
+        <w:t>2029/30 : Arabica 44 356 = 30 145 (point de départ 2001/02  niveau moyen du cycle) + 17 932 (croissance structurelle +618 par an × 29 campagnes) − 3 721 (année OFF : moitié de l’écart ON/OFF en moins) ; Robusta 24 336 = 7 813 (point de départ 2001/02  niveau moyen du cycle) + 16 523 (croissance structurelle +570 par an × 29 campagnes) ; Total 68 394 = 37 971 (point de départ 2001/02  niveau moyen du cycle) + 34 163 (croissance structurelle +1 178 par an × 29 campagnes) − 3 739 (année OFF : moitié de l’écart ON/OFF en moins). Météo : normale, donc 0.</w:t>
       </w:r>
     </w:p>
     <w:p>
@@ -7071,7 +7071,7 @@
         <w:rPr>
           <w:sz w:val="17"/>
         </w:rPr>
-        <w:t>2030/31 : Arabica 52 417 = 26 423 (point de départ 2001/02) + 18 551 (croissance structurelle +618 par an × 30 campagnes) + 7 443 (année ON : bonus du cycle) ; Robusta 24 905 = 7 813 (point de départ 2001/02) + 17 092 (croissance structurelle +570 par an × 30 campagnes) ; Total 77 050 = 34 231 (point de départ 2001/02) + 35 341 (croissance structurelle +1 178 par an × 30 campagnes) + 7 479 (année ON : bonus du cycle). Météo : normale, donc 0.</w:t>
+        <w:t>2030/31 : Arabica 52 417 = 30 145 (point de départ 2001/02  niveau moyen du cycle) + 18 551 (croissance structurelle +618 par an × 30 campagnes) + 3 721 (année ON : moitié de l’écart ON/OFF en plus) ; Robusta 24 905 = 7 813 (point de départ 2001/02  niveau moyen du cycle) + 17 092 (croissance structurelle +570 par an × 30 campagnes) ; Total 77 050 = 37 971 (point de départ 2001/02  niveau moyen du cycle) + 35 341 (croissance structurelle +1 178 par an × 30 campagnes) + 3 739 (année ON : moitié de l’écart ON/OFF en plus). Météo : normale, donc 0.</w:t>
       </w:r>
     </w:p>
     <w:p>
@@ -7082,7 +7082,7 @@
         <w:rPr>
           <w:sz w:val="17"/>
         </w:rPr>
-        <w:t>2031/32 : Arabica 45 592 = 26 423 (point de départ 2001/02) + 19 169 (croissance structurelle +618 par an × 31 campagnes) + 0 (année OFF : pas de bonus) ; Robusta 25 475 = 7 813 (point de départ 2001/02) + 17 662 (croissance structurelle +570 par an × 31 campagnes) ; Total 70 750 = 34 231 (point de départ 2001/02) + 36 519 (croissance structurelle +1 178 par an × 31 campagnes) + 0 (année OFF : pas de bonus). Météo : normale, donc 0.</w:t>
+        <w:t>2031/32 : Arabica 45 592 = 30 145 (point de départ 2001/02  niveau moyen du cycle) + 19 169 (croissance structurelle +618 par an × 31 campagnes) − 3 721 (année OFF : moitié de l’écart ON/OFF en moins) ; Robusta 25 475 = 7 813 (point de départ 2001/02  niveau moyen du cycle) + 17 662 (croissance structurelle +570 par an × 31 campagnes) ; Total 70 750 = 37 971 (point de départ 2001/02  niveau moyen du cycle) + 36 519 (croissance structurelle +1 178 par an × 31 campagnes) − 3 739 (année OFF : moitié de l’écart ON/OFF en moins). Météo : normale, donc 0.</w:t>
       </w:r>
     </w:p>
     <w:p>
@@ -7092,7 +7092,7 @@
           <w:i/>
           <w:sz w:val="20"/>
         </w:rPr>
-        <w:t>En une phrase : chaque prévision = point de départ + croissance structurelle × nombre de campagnes + bonus ON/OFF, à laquelle on applique l'effet El Niño historique de la classe attendue ; l'intervalle 80 % vient de la taille des surprises passées.</w:t>
+        <w:t>En une phrase : chaque prévision = point de départ + croissance structurelle × nombre de campagnes ± moitié de l'écart ON/OFF, à laquelle on applique l'effet El Niño historique de la classe attendue ; l'intervalle 80 % vient de la taille des surprises passées.</w:t>
       </w:r>
     </w:p>
     <w:p>

</xml_diff>

<commit_message>
Brazil report: fix punctuation in the arithmetic lines
Co-Authored-By: Claude Fable 5.1 <noreply@anthropic.com>
Claude-Session: https://claude.ai/code/session_01FCxjZoAHXMLJTirXSfbmgL
</commit_message>
<xml_diff>
--- a/timeseries/output/reports/Bresil_balance_sheet_cafe.docx
+++ b/timeseries/output/reports/Bresil_balance_sheet_cafe.docx
@@ -7027,7 +7027,7 @@
         <w:rPr>
           <w:sz w:val="17"/>
         </w:rPr>
-        <w:t>2026/27 : Arabica 49 944 = 30 145 (point de départ 2001/02  niveau moyen du cycle) + 16 077 (croissance structurelle +618 par an × 26 campagnes) + 3 721 (année ON : moitié de l’écart ON/OFF en plus) ; Robusta 24 710 = 7 813 (point de départ 2001/02  niveau moyen du cycle) + 14 814 (croissance structurelle +570 par an × 26 campagnes) + 2 083 (report de 72 % de la surprise de la dernière campagne observée) ; Total 72 338 = 37 971 (point de départ 2001/02  niveau moyen du cycle) + 30 629 (croissance structurelle +1 178 par an × 26 campagnes) + 3 739 (année ON : moitié de l’écart ON/OFF en plus). Météo : normale, donc 0.</w:t>
+        <w:t>2026/27 : Arabica 49 944 = 30 145 (point de départ 2001/02, niveau moyen du cycle) + 16 077 (croissance structurelle 618 par an × 26 campagnes) + 3 721 (année ON : moitié de l’écart ON/OFF en plus) ; Robusta 24 710 = 7 813 (point de départ 2001/02, niveau moyen du cycle) + 14 814 (croissance structurelle 570 par an × 26 campagnes) + 2 083 (report de 72 % de la surprise de la dernière campagne observée) ; Total 72 338 = 37 971 (point de départ 2001/02, niveau moyen du cycle) + 30 629 (croissance structurelle 1 178 par an × 26 campagnes) + 3 739 (année ON : moitié de l’écart ON/OFF en plus). Météo : normale, donc 0.</w:t>
       </w:r>
     </w:p>
     <w:p>
@@ -7038,7 +7038,7 @@
         <w:rPr>
           <w:sz w:val="17"/>
         </w:rPr>
-        <w:t>2027/28 : Arabica 43 119 = 30 145 (point de départ 2001/02  niveau moyen du cycle) + 16 696 (croissance structurelle +618 par an × 27 campagnes) − 3 721 (année OFF : moitié de l’écart ON/OFF en moins) ; Robusta 23 196 = 7 813 (point de départ 2001/02  niveau moyen du cycle) + 15 383 (croissance structurelle +570 par an × 27 campagnes) ; Total 66 038 = 37 971 (point de départ 2001/02  niveau moyen du cycle) + 31 807 (croissance structurelle +1 178 par an × 27 campagnes) − 3 739 (année OFF : moitié de l’écart ON/OFF en moins). Météo : normale, donc 0. Campagne pilotée par l'El Niño en cours : si El Niño ordinaire, arabica -4.7 % → 41 091, robusta -1.3 % → 22 892 ; si fort, arabica +0.4 % → 43 283, robusta -15.3 % → 19 652 (moyennes historiques des campagnes N+1 de chaque classe).</w:t>
+        <w:t>2027/28 : Arabica 43 119 = 30 145 (point de départ 2001/02, niveau moyen du cycle) + 16 696 (croissance structurelle 618 par an × 27 campagnes) − 3 721 (année OFF : moitié de l’écart ON/OFF en moins) ; Robusta 23 196 = 7 813 (point de départ 2001/02, niveau moyen du cycle) + 15 383 (croissance structurelle 570 par an × 27 campagnes) ; Total 66 038 = 37 971 (point de départ 2001/02, niveau moyen du cycle) + 31 807 (croissance structurelle 1 178 par an × 27 campagnes) − 3 739 (année OFF : moitié de l’écart ON/OFF en moins). Météo : normale, donc 0. Campagne pilotée par l'El Niño en cours : si El Niño ordinaire, arabica -4.7 % → 41 091, robusta -1.3 % → 22 892 ; si fort, arabica +0.4 % → 43 283, robusta -15.3 % → 19 652 (moyennes historiques des campagnes N+1 de chaque classe).</w:t>
       </w:r>
     </w:p>
     <w:p>
@@ -7049,7 +7049,7 @@
         <w:rPr>
           <w:sz w:val="17"/>
         </w:rPr>
-        <w:t>2028/29 : Arabica 51 180 = 30 145 (point de départ 2001/02  niveau moyen du cycle) + 17 314 (croissance structurelle +618 par an × 28 campagnes) + 3 721 (année ON : moitié de l’écart ON/OFF en plus) ; Robusta 23 766 = 7 813 (point de départ 2001/02  niveau moyen du cycle) + 15 953 (croissance structurelle +570 par an × 28 campagnes) ; Total 74 694 = 37 971 (point de départ 2001/02  niveau moyen du cycle) + 32 985 (croissance structurelle +1 178 par an × 28 campagnes) + 3 739 (année ON : moitié de l’écart ON/OFF en plus). Météo : normale, donc 0.</w:t>
+        <w:t>2028/29 : Arabica 51 180 = 30 145 (point de départ 2001/02, niveau moyen du cycle) + 17 314 (croissance structurelle 618 par an × 28 campagnes) + 3 721 (année ON : moitié de l’écart ON/OFF en plus) ; Robusta 23 766 = 7 813 (point de départ 2001/02, niveau moyen du cycle) + 15 953 (croissance structurelle 570 par an × 28 campagnes) ; Total 74 694 = 37 971 (point de départ 2001/02, niveau moyen du cycle) + 32 985 (croissance structurelle 1 178 par an × 28 campagnes) + 3 739 (année ON : moitié de l’écart ON/OFF en plus). Météo : normale, donc 0.</w:t>
       </w:r>
     </w:p>
     <w:p>
@@ -7060,7 +7060,7 @@
         <w:rPr>
           <w:sz w:val="17"/>
         </w:rPr>
-        <w:t>2029/30 : Arabica 44 356 = 30 145 (point de départ 2001/02  niveau moyen du cycle) + 17 932 (croissance structurelle +618 par an × 29 campagnes) − 3 721 (année OFF : moitié de l’écart ON/OFF en moins) ; Robusta 24 336 = 7 813 (point de départ 2001/02  niveau moyen du cycle) + 16 523 (croissance structurelle +570 par an × 29 campagnes) ; Total 68 394 = 37 971 (point de départ 2001/02  niveau moyen du cycle) + 34 163 (croissance structurelle +1 178 par an × 29 campagnes) − 3 739 (année OFF : moitié de l’écart ON/OFF en moins). Météo : normale, donc 0.</w:t>
+        <w:t>2029/30 : Arabica 44 356 = 30 145 (point de départ 2001/02, niveau moyen du cycle) + 17 932 (croissance structurelle 618 par an × 29 campagnes) − 3 721 (année OFF : moitié de l’écart ON/OFF en moins) ; Robusta 24 336 = 7 813 (point de départ 2001/02, niveau moyen du cycle) + 16 523 (croissance structurelle 570 par an × 29 campagnes) ; Total 68 394 = 37 971 (point de départ 2001/02, niveau moyen du cycle) + 34 163 (croissance structurelle 1 178 par an × 29 campagnes) − 3 739 (année OFF : moitié de l’écart ON/OFF en moins). Météo : normale, donc 0.</w:t>
       </w:r>
     </w:p>
     <w:p>
@@ -7071,7 +7071,7 @@
         <w:rPr>
           <w:sz w:val="17"/>
         </w:rPr>
-        <w:t>2030/31 : Arabica 52 417 = 30 145 (point de départ 2001/02  niveau moyen du cycle) + 18 551 (croissance structurelle +618 par an × 30 campagnes) + 3 721 (année ON : moitié de l’écart ON/OFF en plus) ; Robusta 24 905 = 7 813 (point de départ 2001/02  niveau moyen du cycle) + 17 092 (croissance structurelle +570 par an × 30 campagnes) ; Total 77 050 = 37 971 (point de départ 2001/02  niveau moyen du cycle) + 35 341 (croissance structurelle +1 178 par an × 30 campagnes) + 3 739 (année ON : moitié de l’écart ON/OFF en plus). Météo : normale, donc 0.</w:t>
+        <w:t>2030/31 : Arabica 52 417 = 30 145 (point de départ 2001/02, niveau moyen du cycle) + 18 551 (croissance structurelle 618 par an × 30 campagnes) + 3 721 (année ON : moitié de l’écart ON/OFF en plus) ; Robusta 24 905 = 7 813 (point de départ 2001/02, niveau moyen du cycle) + 17 092 (croissance structurelle 570 par an × 30 campagnes) ; Total 77 050 = 37 971 (point de départ 2001/02, niveau moyen du cycle) + 35 341 (croissance structurelle 1 178 par an × 30 campagnes) + 3 739 (année ON : moitié de l’écart ON/OFF en plus). Météo : normale, donc 0.</w:t>
       </w:r>
     </w:p>
     <w:p>
@@ -7082,7 +7082,7 @@
         <w:rPr>
           <w:sz w:val="17"/>
         </w:rPr>
-        <w:t>2031/32 : Arabica 45 592 = 30 145 (point de départ 2001/02  niveau moyen du cycle) + 19 169 (croissance structurelle +618 par an × 31 campagnes) − 3 721 (année OFF : moitié de l’écart ON/OFF en moins) ; Robusta 25 475 = 7 813 (point de départ 2001/02  niveau moyen du cycle) + 17 662 (croissance structurelle +570 par an × 31 campagnes) ; Total 70 750 = 37 971 (point de départ 2001/02  niveau moyen du cycle) + 36 519 (croissance structurelle +1 178 par an × 31 campagnes) − 3 739 (année OFF : moitié de l’écart ON/OFF en moins). Météo : normale, donc 0.</w:t>
+        <w:t>2031/32 : Arabica 45 592 = 30 145 (point de départ 2001/02, niveau moyen du cycle) + 19 169 (croissance structurelle 618 par an × 31 campagnes) − 3 721 (année OFF : moitié de l’écart ON/OFF en moins) ; Robusta 25 475 = 7 813 (point de départ 2001/02, niveau moyen du cycle) + 17 662 (croissance structurelle 570 par an × 31 campagnes) ; Total 70 750 = 37 971 (point de départ 2001/02, niveau moyen du cycle) + 36 519 (croissance structurelle 1 178 par an × 31 campagnes) − 3 739 (année OFF : moitié de l’écart ON/OFF en moins). Météo : normale, donc 0.</w:t>
       </w:r>
     </w:p>
     <w:p>

</xml_diff>

<commit_message>
Brazil report: back to the ON bonus presentation
Co-Authored-By: Claude Fable 5.1 <noreply@anthropic.com>
Claude-Session: https://claude.ai/code/session_01FCxjZoAHXMLJTirXSfbmgL
</commit_message>
<xml_diff>
--- a/timeseries/output/reports/Bresil_balance_sheet_cafe.docx
+++ b/timeseries/output/reports/Bresil_balance_sheet_cafe.docx
@@ -7016,7 +7016,7 @@
           <w:i/>
           <w:sz w:val="18"/>
         </w:rPr>
-        <w:t>Vocabulaire : le point de départ est le niveau de production que le modèle estime pour la première campagne (2001/02) hors effet du cycle ; la croissance structurelle est le gain moyen par an sur 2001-2025 une fois le cycle ON/OFF retiré (nouvelles variétés, densité, irrigation, Cerrado) ; on la multiplie par le nombre de campagnes écoulées depuis 2001/02 ; le cycle ajoute la moitié de l'écart ON/OFF les années ON et la retire les années OFF (écart total arabica : 7 443 milliers de sacs). La météo n'entre pas dans ces chiffres : ils supposent une météo normale.</w:t>
+        <w:t>Vocabulaire : le point de départ est le niveau de production que le modèle estime pour la première campagne (2001/02) hors effet du cycle ; la croissance structurelle est le gain moyen par an sur 2001-2025 une fois le cycle ON/OFF retiré (nouvelles variétés, densité, irrigation, Cerrado) ; on la multiplie par le nombre de campagnes écoulées depuis 2001/02 ; le bonus ON est le supplément d'une année ON par rapport à une année OFF (7 443 milliers de sacs pour l'arabica). La météo n'entre pas dans ces chiffres : ils supposent une météo normale.</w:t>
       </w:r>
     </w:p>
     <w:p>
@@ -7027,7 +7027,7 @@
         <w:rPr>
           <w:sz w:val="17"/>
         </w:rPr>
-        <w:t>2026/27 : Arabica 49 944 = 30 145 (point de départ 2001/02, niveau moyen du cycle) + 16 077 (croissance structurelle 618 par an × 26 campagnes) + 3 721 (année ON : moitié de l’écart ON/OFF en plus) ; Robusta 24 710 = 7 813 (point de départ 2001/02, niveau moyen du cycle) + 14 814 (croissance structurelle 570 par an × 26 campagnes) + 2 083 (report de 72 % de la surprise de la dernière campagne observée) ; Total 72 338 = 37 971 (point de départ 2001/02, niveau moyen du cycle) + 30 629 (croissance structurelle 1 178 par an × 26 campagnes) + 3 739 (année ON : moitié de l’écart ON/OFF en plus). Météo : normale, donc 0.</w:t>
+        <w:t>2026/27 : Arabica 49 944 = 26 423 (point de départ 2001/02, année OFF) + 16 077 (croissance structurelle 618 par an × 26 campagnes) + 7 443 (année ON : bonus du cycle) ; Robusta 24 710 = 7 813 (point de départ 2001/02, année OFF) + 14 814 (croissance structurelle 570 par an × 26 campagnes) + 2 083 (report de 72 % de la surprise de la dernière campagne observée) ; Total 72 338 = 34 231 (point de départ 2001/02, année OFF) + 30 629 (croissance structurelle 1 178 par an × 26 campagnes) + 7 479 (année ON : bonus du cycle). Météo : normale, donc 0.</w:t>
       </w:r>
     </w:p>
     <w:p>
@@ -7038,7 +7038,7 @@
         <w:rPr>
           <w:sz w:val="17"/>
         </w:rPr>
-        <w:t>2027/28 : Arabica 43 119 = 30 145 (point de départ 2001/02, niveau moyen du cycle) + 16 696 (croissance structurelle 618 par an × 27 campagnes) − 3 721 (année OFF : moitié de l’écart ON/OFF en moins) ; Robusta 23 196 = 7 813 (point de départ 2001/02, niveau moyen du cycle) + 15 383 (croissance structurelle 570 par an × 27 campagnes) ; Total 66 038 = 37 971 (point de départ 2001/02, niveau moyen du cycle) + 31 807 (croissance structurelle 1 178 par an × 27 campagnes) − 3 739 (année OFF : moitié de l’écart ON/OFF en moins). Météo : normale, donc 0. Campagne pilotée par l'El Niño en cours : si El Niño ordinaire, arabica -4.7 % → 41 091, robusta -1.3 % → 22 892 ; si fort, arabica +0.4 % → 43 283, robusta -15.3 % → 19 652 (moyennes historiques des campagnes N+1 de chaque classe).</w:t>
+        <w:t>2027/28 : Arabica 43 119 = 26 423 (point de départ 2001/02, année OFF) + 16 696 (croissance structurelle 618 par an × 27 campagnes) + 0 (année OFF : pas de bonus) ; Robusta 23 196 = 7 813 (point de départ 2001/02, année OFF) + 15 383 (croissance structurelle 570 par an × 27 campagnes) ; Total 66 038 = 34 231 (point de départ 2001/02, année OFF) + 31 807 (croissance structurelle 1 178 par an × 27 campagnes) + 0 (année OFF : pas de bonus). Météo : normale, donc 0. Campagne pilotée par l'El Niño en cours : si El Niño ordinaire, arabica -4.7 % → 41 091, robusta -1.3 % → 22 892 ; si fort, arabica +0.4 % → 43 283, robusta -15.3 % → 19 652 (moyennes historiques des campagnes N+1 de chaque classe).</w:t>
       </w:r>
     </w:p>
     <w:p>
@@ -7049,7 +7049,7 @@
         <w:rPr>
           <w:sz w:val="17"/>
         </w:rPr>
-        <w:t>2028/29 : Arabica 51 180 = 30 145 (point de départ 2001/02, niveau moyen du cycle) + 17 314 (croissance structurelle 618 par an × 28 campagnes) + 3 721 (année ON : moitié de l’écart ON/OFF en plus) ; Robusta 23 766 = 7 813 (point de départ 2001/02, niveau moyen du cycle) + 15 953 (croissance structurelle 570 par an × 28 campagnes) ; Total 74 694 = 37 971 (point de départ 2001/02, niveau moyen du cycle) + 32 985 (croissance structurelle 1 178 par an × 28 campagnes) + 3 739 (année ON : moitié de l’écart ON/OFF en plus). Météo : normale, donc 0.</w:t>
+        <w:t>2028/29 : Arabica 51 180 = 26 423 (point de départ 2001/02, année OFF) + 17 314 (croissance structurelle 618 par an × 28 campagnes) + 7 443 (année ON : bonus du cycle) ; Robusta 23 766 = 7 813 (point de départ 2001/02, année OFF) + 15 953 (croissance structurelle 570 par an × 28 campagnes) ; Total 74 694 = 34 231 (point de départ 2001/02, année OFF) + 32 985 (croissance structurelle 1 178 par an × 28 campagnes) + 7 479 (année ON : bonus du cycle). Météo : normale, donc 0.</w:t>
       </w:r>
     </w:p>
     <w:p>
@@ -7060,7 +7060,7 @@
         <w:rPr>
           <w:sz w:val="17"/>
         </w:rPr>
-        <w:t>2029/30 : Arabica 44 356 = 30 145 (point de départ 2001/02, niveau moyen du cycle) + 17 932 (croissance structurelle 618 par an × 29 campagnes) − 3 721 (année OFF : moitié de l’écart ON/OFF en moins) ; Robusta 24 336 = 7 813 (point de départ 2001/02, niveau moyen du cycle) + 16 523 (croissance structurelle 570 par an × 29 campagnes) ; Total 68 394 = 37 971 (point de départ 2001/02, niveau moyen du cycle) + 34 163 (croissance structurelle 1 178 par an × 29 campagnes) − 3 739 (année OFF : moitié de l’écart ON/OFF en moins). Météo : normale, donc 0.</w:t>
+        <w:t>2029/30 : Arabica 44 356 = 26 423 (point de départ 2001/02, année OFF) + 17 932 (croissance structurelle 618 par an × 29 campagnes) + 0 (année OFF : pas de bonus) ; Robusta 24 336 = 7 813 (point de départ 2001/02, année OFF) + 16 523 (croissance structurelle 570 par an × 29 campagnes) ; Total 68 394 = 34 231 (point de départ 2001/02, année OFF) + 34 163 (croissance structurelle 1 178 par an × 29 campagnes) + 0 (année OFF : pas de bonus). Météo : normale, donc 0.</w:t>
       </w:r>
     </w:p>
     <w:p>
@@ -7071,7 +7071,7 @@
         <w:rPr>
           <w:sz w:val="17"/>
         </w:rPr>
-        <w:t>2030/31 : Arabica 52 417 = 30 145 (point de départ 2001/02, niveau moyen du cycle) + 18 551 (croissance structurelle 618 par an × 30 campagnes) + 3 721 (année ON : moitié de l’écart ON/OFF en plus) ; Robusta 24 905 = 7 813 (point de départ 2001/02, niveau moyen du cycle) + 17 092 (croissance structurelle 570 par an × 30 campagnes) ; Total 77 050 = 37 971 (point de départ 2001/02, niveau moyen du cycle) + 35 341 (croissance structurelle 1 178 par an × 30 campagnes) + 3 739 (année ON : moitié de l’écart ON/OFF en plus). Météo : normale, donc 0.</w:t>
+        <w:t>2030/31 : Arabica 52 417 = 26 423 (point de départ 2001/02, année OFF) + 18 551 (croissance structurelle 618 par an × 30 campagnes) + 7 443 (année ON : bonus du cycle) ; Robusta 24 905 = 7 813 (point de départ 2001/02, année OFF) + 17 092 (croissance structurelle 570 par an × 30 campagnes) ; Total 77 050 = 34 231 (point de départ 2001/02, année OFF) + 35 341 (croissance structurelle 1 178 par an × 30 campagnes) + 7 479 (année ON : bonus du cycle). Météo : normale, donc 0.</w:t>
       </w:r>
     </w:p>
     <w:p>
@@ -7082,7 +7082,7 @@
         <w:rPr>
           <w:sz w:val="17"/>
         </w:rPr>
-        <w:t>2031/32 : Arabica 45 592 = 30 145 (point de départ 2001/02, niveau moyen du cycle) + 19 169 (croissance structurelle 618 par an × 31 campagnes) − 3 721 (année OFF : moitié de l’écart ON/OFF en moins) ; Robusta 25 475 = 7 813 (point de départ 2001/02, niveau moyen du cycle) + 17 662 (croissance structurelle 570 par an × 31 campagnes) ; Total 70 750 = 37 971 (point de départ 2001/02, niveau moyen du cycle) + 36 519 (croissance structurelle 1 178 par an × 31 campagnes) − 3 739 (année OFF : moitié de l’écart ON/OFF en moins). Météo : normale, donc 0.</w:t>
+        <w:t>2031/32 : Arabica 45 592 = 26 423 (point de départ 2001/02, année OFF) + 19 169 (croissance structurelle 618 par an × 31 campagnes) + 0 (année OFF : pas de bonus) ; Robusta 25 475 = 7 813 (point de départ 2001/02, année OFF) + 17 662 (croissance structurelle 570 par an × 31 campagnes) ; Total 70 750 = 34 231 (point de départ 2001/02, année OFF) + 36 519 (croissance structurelle 1 178 par an × 31 campagnes) + 0 (année OFF : pas de bonus). Météo : normale, donc 0.</w:t>
       </w:r>
     </w:p>
     <w:p>
@@ -7092,7 +7092,7 @@
           <w:i/>
           <w:sz w:val="20"/>
         </w:rPr>
-        <w:t>En une phrase : chaque prévision = point de départ + croissance structurelle × nombre de campagnes ± moitié de l'écart ON/OFF, à laquelle on applique l'effet El Niño historique de la classe attendue ; l'intervalle 80 % vient de la taille des surprises passées.</w:t>
+        <w:t>En une phrase : chaque prévision = point de départ + croissance structurelle × nombre de campagnes + bonus ON, à laquelle on applique l'effet El Niño historique de la classe attendue ; l'intervalle 80 % vient de la taille des surprises passées.</w:t>
       </w:r>
     </w:p>
     <w:p>

</xml_diff>

<commit_message>
ENSO: distinct class names, regenerate reports
Co-Authored-By: Claude Fable 5.1 <noreply@anthropic.com>
Claude-Session: https://claude.ai/code/session_01FCxjZoAHXMLJTirXSfbmgL
</commit_message>
<xml_diff>
--- a/timeseries/output/reports/Bresil_balance_sheet_cafe.docx
+++ b/timeseries/output/reports/Bresil_balance_sheet_cafe.docx
@@ -80,7 +80,7 @@
         <w:rPr>
           <w:sz w:val="20"/>
         </w:rPr>
-        <w:t>El Niño fort (ONI ≥ 1,5 : épisodes 2009/10, 2015/16, 2023/24, campagnes suivantes 2010/11, 2016/17, 2024/25) : Minas Gerais -228 mm et +1.1 °C, Espírito Santo -298 mm et +1.1 °C. Robusta -15.3 % par rapport à l'attendu, arabica +0.4 % (années ON, qui tiennent grâce au cycle), total -4.0 %.</w:t>
+        <w:t>El Niño fort (pic ≥ 1,6 : épisodes 2009/10, 2015/16, campagnes suivantes 2010/11, 2016/17) : Minas Gerais -116 mm et +0.4 °C, Espírito Santo -277 mm et +0.8 °C. Robusta -18.4 % par rapport à l'attendu, arabica +2.2 % (années ON, qui tiennent grâce au cycle), total -3.4 %.</w:t>
       </w:r>
     </w:p>
     <w:p>
@@ -91,7 +91,7 @@
         <w:rPr>
           <w:sz w:val="20"/>
         </w:rPr>
-        <w:t>El Niño ordinaire (ONI entre 0,5 et 1,5 : 2002/03, 2004/05, 2006/07, 2018/19) : arabica -4.7 %, robusta -1.3 %, total -3.8 % ; Minas Gerais +105 mm, Espírito Santo +85 mm : pas de signal net.</w:t>
+        <w:t>El Niño ordinaire (pic entre 0,6 et 1,6, 2023/24 inclus : 2002/03, 2004/05, 2006/07, 2018/19, 2023/24) : arabica -4.4 %, robusta -2.9 %, total -4.1 % ; Minas Gerais -6 mm, Espírito Santo -0 mm : pas de signal net.</w:t>
       </w:r>
     </w:p>
     <w:p>
@@ -2619,7 +2619,7 @@
           <w:i w:val="0"/>
           <w:sz w:val="20"/>
         </w:rPr>
-        <w:t>Convention retenue, comme demandé : l'épisode ENSO de l'hiver N/N+1 est rattaché à la campagne N+1/N+2 (celle dont la floraison, sept.-nov. N+1, et le remplissage se déroulent pendant et juste après l'épisode). Exemples : El Niño 2015/16 → campagne 2016/17 ; El Niño 2023/24 → campagne 2024/25 ; El Niño 2009/10 → 2010/11. Deux niveaux seulement : El Niño fort quand le pic ONI atteint +1,5 (2009/10, 2015/16, 2023/24), El Niño sinon ; La Niña forte sous −1,5, La Niña sinon. L'épisode 2014/15 est exclu des tableaux et des moyennes, comme demandé.</w:t>
+        <w:t>Convention retenue, comme demandé : l'épisode ENSO de l'hiver N/N+1 est rattaché à la campagne N+1/N+2 (celle dont la floraison, sept.-nov. N+1, et le remplissage se déroulent pendant et juste après l'épisode). Exemples : El Niño 2015/16 → campagne 2016/17 ; El Niño 2023/24 → campagne 2024/25 ; El Niño 2009/10 → 2010/11. Niveaux : El Niño fort quand le pic atteint 1,6 (2009/10, 2015/16), El Niño entre 0,6 et 1,6, faible sous 0,6 ; même grille pour La Niña. 2023/24 est classé El Niño simple (pic ONI 2,0 mais indice relatif RONI d'environ 1,3). L'épisode 2014/15 est exclu des tableaux et des moyennes, comme demandé.</w:t>
       </w:r>
     </w:p>
     <w:p>
@@ -2846,7 +2846,7 @@
               <w:rPr>
                 <w:sz w:val="14"/>
               </w:rPr>
-              <w:t>El Niño (ONI 0.5-1.5)</w:t>
+              <w:t>El Niño ordinaire</w:t>
             </w:r>
           </w:p>
         </w:tc>
@@ -2960,7 +2960,7 @@
               <w:rPr>
                 <w:sz w:val="14"/>
               </w:rPr>
-              <w:t>El Niño (ONI 0.5-1.5)</w:t>
+              <w:t>El Niño ordinaire</w:t>
             </w:r>
           </w:p>
         </w:tc>
@@ -3074,7 +3074,7 @@
               <w:rPr>
                 <w:sz w:val="14"/>
               </w:rPr>
-              <w:t>La Niña (ONI -0.5 a -1.5)</w:t>
+              <w:t>La Niña ordinaire</w:t>
             </w:r>
           </w:p>
         </w:tc>
@@ -3188,7 +3188,7 @@
               <w:rPr>
                 <w:sz w:val="14"/>
               </w:rPr>
-              <w:t>El Niño (ONI 0.5-1.5)</w:t>
+              <w:t>El Niño ordinaire</w:t>
             </w:r>
           </w:p>
         </w:tc>
@@ -3302,7 +3302,7 @@
               <w:rPr>
                 <w:sz w:val="14"/>
               </w:rPr>
-              <w:t>La Niña forte (ONI &lt;= -1.5)</w:t>
+              <w:t>La Niña forte</w:t>
             </w:r>
           </w:p>
         </w:tc>
@@ -3416,7 +3416,7 @@
               <w:rPr>
                 <w:sz w:val="14"/>
               </w:rPr>
-              <w:t>La Niña (ONI -0.5 a -1.5)</w:t>
+              <w:t>La Niña ordinaire</w:t>
             </w:r>
           </w:p>
         </w:tc>
@@ -3530,7 +3530,7 @@
               <w:rPr>
                 <w:sz w:val="14"/>
               </w:rPr>
-              <w:t>El Niño fort (ONI &gt;= 1.5)</w:t>
+              <w:t>El Niño fort</w:t>
             </w:r>
           </w:p>
         </w:tc>
@@ -3644,7 +3644,7 @@
               <w:rPr>
                 <w:sz w:val="14"/>
               </w:rPr>
-              <w:t>La Niña forte (ONI &lt;= -1.5)</w:t>
+              <w:t>La Niña forte</w:t>
             </w:r>
           </w:p>
         </w:tc>
@@ -3758,7 +3758,7 @@
               <w:rPr>
                 <w:sz w:val="14"/>
               </w:rPr>
-              <w:t>La Niña (ONI -0.5 a -1.5)</w:t>
+              <w:t>La Niña ordinaire</w:t>
             </w:r>
           </w:p>
         </w:tc>
@@ -3872,7 +3872,7 @@
               <w:rPr>
                 <w:sz w:val="14"/>
               </w:rPr>
-              <w:t>El Niño fort (ONI &gt;= 1.5)</w:t>
+              <w:t>El Niño fort</w:t>
             </w:r>
           </w:p>
         </w:tc>
@@ -3986,7 +3986,7 @@
               <w:rPr>
                 <w:sz w:val="14"/>
               </w:rPr>
-              <w:t>La Niña (ONI -0.5 a -1.5)</w:t>
+              <w:t>La Niña ordinaire</w:t>
             </w:r>
           </w:p>
         </w:tc>
@@ -4100,7 +4100,7 @@
               <w:rPr>
                 <w:sz w:val="14"/>
               </w:rPr>
-              <w:t>La Niña (ONI -0.5 a -1.5)</w:t>
+              <w:t>La Niña ordinaire</w:t>
             </w:r>
           </w:p>
         </w:tc>
@@ -4214,7 +4214,7 @@
               <w:rPr>
                 <w:sz w:val="14"/>
               </w:rPr>
-              <w:t>El Niño (ONI 0.5-1.5)</w:t>
+              <w:t>El Niño ordinaire</w:t>
             </w:r>
           </w:p>
         </w:tc>
@@ -4328,7 +4328,7 @@
               <w:rPr>
                 <w:sz w:val="14"/>
               </w:rPr>
-              <w:t>La Niña (ONI -0.5 a -1.5)</w:t>
+              <w:t>La Niña ordinaire</w:t>
             </w:r>
           </w:p>
         </w:tc>
@@ -4442,7 +4442,7 @@
               <w:rPr>
                 <w:sz w:val="14"/>
               </w:rPr>
-              <w:t>La Niña (ONI -0.5 a -1.5)</w:t>
+              <w:t>La Niña ordinaire</w:t>
             </w:r>
           </w:p>
         </w:tc>
@@ -4556,7 +4556,7 @@
               <w:rPr>
                 <w:sz w:val="14"/>
               </w:rPr>
-              <w:t>La Niña (ONI -0.5 a -1.5)</w:t>
+              <w:t>La Niña ordinaire</w:t>
             </w:r>
           </w:p>
         </w:tc>
@@ -4670,7 +4670,7 @@
               <w:rPr>
                 <w:sz w:val="14"/>
               </w:rPr>
-              <w:t>El Niño fort (ONI &gt;= 1.5)</w:t>
+              <w:t>El Niño ordinaire</w:t>
             </w:r>
           </w:p>
         </w:tc>
@@ -4937,7 +4937,7 @@
               <w:rPr>
                 <w:sz w:val="14"/>
               </w:rPr>
-              <w:t>El Niño fort (ONI &gt;= 1.5)</w:t>
+              <w:t>El Niño fort</w:t>
             </w:r>
           </w:p>
         </w:tc>
@@ -4951,7 +4951,7 @@
               <w:rPr>
                 <w:sz w:val="14"/>
               </w:rPr>
-              <w:t>3</w:t>
+              <w:t>2</w:t>
             </w:r>
           </w:p>
         </w:tc>
@@ -4965,7 +4965,7 @@
               <w:rPr>
                 <w:sz w:val="14"/>
               </w:rPr>
-              <w:t>+0.4 %</w:t>
+              <w:t>+2.2 %</w:t>
             </w:r>
           </w:p>
         </w:tc>
@@ -4979,7 +4979,7 @@
               <w:rPr>
                 <w:sz w:val="14"/>
               </w:rPr>
-              <w:t>-15.3 %</w:t>
+              <w:t>-18.4 %</w:t>
             </w:r>
           </w:p>
         </w:tc>
@@ -4993,13 +4993,27 @@
               <w:rPr>
                 <w:sz w:val="14"/>
               </w:rPr>
+              <w:t>-3.4 %</w:t>
+            </w:r>
+          </w:p>
+        </w:tc>
+        <w:tc>
+          <w:tcPr>
+            <w:tcW w:type="dxa" w:w="907"/>
+          </w:tcPr>
+          <w:p>
+            <w:r/>
+            <w:r>
+              <w:rPr>
+                <w:sz w:val="14"/>
+              </w:rPr>
               <w:t>-4.0 %</w:t>
             </w:r>
           </w:p>
         </w:tc>
         <w:tc>
           <w:tcPr>
-            <w:tcW w:type="dxa" w:w="907"/>
+            <w:tcW w:type="dxa" w:w="1304"/>
           </w:tcPr>
           <w:p>
             <w:r/>
@@ -5007,7 +5021,7 @@
               <w:rPr>
                 <w:sz w:val="14"/>
               </w:rPr>
-              <w:t>-2.7 %</w:t>
+              <w:t>-116 mm / +0.4 °C</w:t>
             </w:r>
           </w:p>
         </w:tc>
@@ -5021,13 +5035,13 @@
               <w:rPr>
                 <w:sz w:val="14"/>
               </w:rPr>
-              <w:t>-228 mm / +1.1 °C</w:t>
-            </w:r>
-          </w:p>
-        </w:tc>
-        <w:tc>
-          <w:tcPr>
-            <w:tcW w:type="dxa" w:w="1304"/>
+              <w:t>-277 mm / +0.8 °C</w:t>
+            </w:r>
+          </w:p>
+        </w:tc>
+        <w:tc>
+          <w:tcPr>
+            <w:tcW w:type="dxa" w:w="1984"/>
           </w:tcPr>
           <w:p>
             <w:r/>
@@ -5035,21 +5049,7 @@
               <w:rPr>
                 <w:sz w:val="14"/>
               </w:rPr>
-              <w:t>-298 mm / +1.1 °C</w:t>
-            </w:r>
-          </w:p>
-        </w:tc>
-        <w:tc>
-          <w:tcPr>
-            <w:tcW w:type="dxa" w:w="1984"/>
-          </w:tcPr>
-          <w:p>
-            <w:r/>
-            <w:r>
-              <w:rPr>
-                <w:sz w:val="14"/>
-              </w:rPr>
-              <w:t>2010/11 2016/17 2024/25</w:t>
+              <w:t>2010/11 2016/17</w:t>
             </w:r>
           </w:p>
         </w:tc>
@@ -5065,7 +5065,7 @@
               <w:rPr>
                 <w:sz w:val="14"/>
               </w:rPr>
-              <w:t>El Niño (ONI 0.5-1.5)</w:t>
+              <w:t>El Niño ordinaire</w:t>
             </w:r>
           </w:p>
         </w:tc>
@@ -5079,7 +5079,7 @@
               <w:rPr>
                 <w:sz w:val="14"/>
               </w:rPr>
-              <w:t>4</w:t>
+              <w:t>5</w:t>
             </w:r>
           </w:p>
         </w:tc>
@@ -5093,7 +5093,7 @@
               <w:rPr>
                 <w:sz w:val="14"/>
               </w:rPr>
-              <w:t>-4.7 %</w:t>
+              <w:t>-4.4 %</w:t>
             </w:r>
           </w:p>
         </w:tc>
@@ -5107,7 +5107,7 @@
               <w:rPr>
                 <w:sz w:val="14"/>
               </w:rPr>
-              <w:t>-1.3 %</w:t>
+              <w:t>-2.9 %</w:t>
             </w:r>
           </w:p>
         </w:tc>
@@ -5121,7 +5121,7 @@
               <w:rPr>
                 <w:sz w:val="14"/>
               </w:rPr>
-              <w:t>-3.8 %</w:t>
+              <w:t>-4.1 %</w:t>
             </w:r>
           </w:p>
         </w:tc>
@@ -5135,7 +5135,7 @@
               <w:rPr>
                 <w:sz w:val="14"/>
               </w:rPr>
-              <w:t>-5.9 %</w:t>
+              <w:t>-4.8 %</w:t>
             </w:r>
           </w:p>
         </w:tc>
@@ -5149,7 +5149,7 @@
               <w:rPr>
                 <w:sz w:val="14"/>
               </w:rPr>
-              <w:t>+105 mm / -0.2 °C</w:t>
+              <w:t>-6 mm / +0.4 °C</w:t>
             </w:r>
           </w:p>
         </w:tc>
@@ -5163,7 +5163,7 @@
               <w:rPr>
                 <w:sz w:val="14"/>
               </w:rPr>
-              <w:t>+85 mm / -0.1 °C</w:t>
+              <w:t>-0 mm / +0.3 °C</w:t>
             </w:r>
           </w:p>
         </w:tc>
@@ -5177,7 +5177,7 @@
               <w:rPr>
                 <w:sz w:val="14"/>
               </w:rPr>
-              <w:t>2003/04 2005/06 2007/08 2019/20</w:t>
+              <w:t>2003/04 2005/06 2007/08 2019/20 2024/25</w:t>
             </w:r>
           </w:p>
         </w:tc>
@@ -5193,7 +5193,7 @@
               <w:rPr>
                 <w:sz w:val="14"/>
               </w:rPr>
-              <w:t>La Niña (ONI -0.5 a -1.5)</w:t>
+              <w:t>La Niña ordinaire</w:t>
             </w:r>
           </w:p>
         </w:tc>
@@ -5321,7 +5321,7 @@
               <w:rPr>
                 <w:sz w:val="14"/>
               </w:rPr>
-              <w:t>La Niña forte (ONI &lt;= -1.5)</w:t>
+              <w:t>La Niña forte</w:t>
             </w:r>
           </w:p>
         </w:tc>
@@ -5447,7 +5447,7 @@
           <w:i w:val="0"/>
           <w:sz w:val="20"/>
         </w:rPr>
-        <w:t>Lecture : les El Niño forts de la période (2009/10, 2015/16, 2023/24) ont donné des campagnes N+1 avec -298 mm et +1.1 °C en Espírito Santo et -228 mm, +1.1 °C à Minas Gerais. Le conilon, non irrigué dans une bonne partie de São Mateus, a perdu -15.3 % par rapport à l'attendu (−30 % en 2016/17) ; l'arabica, en année ON les trois fois, est resté à +0.4 % de l'attendu : le cycle a masqué le choc. Les El Niño ordinaires (ONI &lt; 1,5) n'ont pas de signature météo nette ni de signature de rendement.</w:t>
+        <w:t>Lecture : les El Niño forts de la période (2009/10, 2015/16) ont donné des campagnes N+1 avec -277 mm et +0.8 °C en Espírito Santo et -116 mm, +0.4 °C à Minas Gerais. Le conilon, non irrigué dans une bonne partie de São Mateus, a perdu -18.4 % par rapport à l'attendu (−30 % en 2016/17) ; l'arabica, en année ON, est resté à +2.2 % de l'attendu : le cycle a masqué le choc. Les El Niño ordinaires ont une signature plus diffuse : 2024/25 (après l'épisode 2023/24) a tout de même connu −452 mm et +2,4 °C à Minas Gerais.</w:t>
       </w:r>
     </w:p>
     <w:p>
@@ -7038,7 +7038,7 @@
         <w:rPr>
           <w:sz w:val="17"/>
         </w:rPr>
-        <w:t>2027/28 : Arabica 43 119 = 26 423 (point de départ 2001/02, année OFF) + 16 696 (croissance structurelle 618 par an × 27 campagnes) + 0 (année OFF : pas de bonus) ; Robusta 23 196 = 7 813 (point de départ 2001/02, année OFF) + 15 383 (croissance structurelle 570 par an × 27 campagnes) ; Total 66 038 = 34 231 (point de départ 2001/02, année OFF) + 31 807 (croissance structurelle 1 178 par an × 27 campagnes) + 0 (année OFF : pas de bonus). Météo : normale, donc 0. Campagne pilotée par l'El Niño en cours : si El Niño ordinaire, arabica -4.7 % → 41 091, robusta -1.3 % → 22 892 ; si fort, arabica +0.4 % → 43 283, robusta -15.3 % → 19 652 (moyennes historiques des campagnes N+1 de chaque classe).</w:t>
+        <w:t>2027/28 : Arabica 43 119 = 26 423 (point de départ 2001/02, année OFF) + 16 696 (croissance structurelle 618 par an × 27 campagnes) + 0 (année OFF : pas de bonus) ; Robusta 23 196 = 7 813 (point de départ 2001/02, année OFF) + 15 383 (croissance structurelle 570 par an × 27 campagnes) ; Total 66 038 = 34 231 (point de départ 2001/02, année OFF) + 31 807 (croissance structurelle 1 178 par an × 27 campagnes) + 0 (année OFF : pas de bonus). Météo : normale, donc 0. Campagne pilotée par l'El Niño en cours : si El Niño ordinaire, arabica -4.4 % → 41 218, robusta -2.9 % → 22 533 ; si fort, arabica +2.2 % → 44 063, robusta -18.4 % → 18 928 (moyennes historiques des campagnes N+1 de chaque classe).</w:t>
       </w:r>
     </w:p>
     <w:p>

</xml_diff>

<commit_message>
Brazil report: USDA-style table 2010/11-2027/28 with the 2027/28 row computed cell by cell
Co-Authored-By: Claude Fable 5.1 <noreply@anthropic.com>
Claude-Session: https://claude.ai/code/session_01FCxjZoAHXMLJTirXSfbmgL
</commit_message>
<xml_diff>
--- a/timeseries/output/reports/Bresil_balance_sheet_cafe.docx
+++ b/timeseries/output/reports/Bresil_balance_sheet_cafe.docx
@@ -7143,6 +7143,3289 @@
           <w:sz w:val="16"/>
         </w:rPr>
         <w:t>Figure 6. Arabica : ajustement ON/OFF et prévision ARMAX.</w:t>
+      </w:r>
+    </w:p>
+    <w:p>
+      <w:pPr>
+        <w:pStyle w:val="Heading1"/>
+      </w:pPr>
+      <w:r>
+        <w:t>7 bis. Le tableau USDA 2010/11 – 2027/28 et le calcul de la ligne 2027/28</w:t>
+      </w:r>
+    </w:p>
+    <w:tbl>
+      <w:tblPr>
+        <w:tblStyle w:val="LightGrid-Accent1"/>
+        <w:tblW w:type="auto" w:w="0"/>
+        <w:jc w:val="center"/>
+        <w:tblLook w:firstColumn="1" w:firstRow="1" w:lastColumn="0" w:lastRow="0" w:noHBand="0" w:noVBand="1" w:val="04A0"/>
+      </w:tblPr>
+      <w:tblGrid>
+        <w:gridCol w:w="997"/>
+        <w:gridCol w:w="997"/>
+        <w:gridCol w:w="997"/>
+        <w:gridCol w:w="997"/>
+        <w:gridCol w:w="997"/>
+        <w:gridCol w:w="997"/>
+        <w:gridCol w:w="997"/>
+        <w:gridCol w:w="997"/>
+        <w:gridCol w:w="997"/>
+        <w:gridCol w:w="997"/>
+      </w:tblGrid>
+      <w:tr>
+        <w:tc>
+          <w:tcPr>
+            <w:tcW w:type="dxa" w:w="907"/>
+          </w:tcPr>
+          <w:p>
+            <w:r/>
+            <w:r>
+              <w:rPr>
+                <w:b/>
+                <w:sz w:val="14"/>
+              </w:rPr>
+              <w:t>Campagne</w:t>
+            </w:r>
+          </w:p>
+        </w:tc>
+        <w:tc>
+          <w:tcPr>
+            <w:tcW w:type="dxa" w:w="1474"/>
+          </w:tcPr>
+          <w:p>
+            <w:r/>
+            <w:r>
+              <w:rPr>
+                <w:b/>
+                <w:sz w:val="14"/>
+              </w:rPr>
+              <w:t>Statut</w:t>
+            </w:r>
+          </w:p>
+        </w:tc>
+        <w:tc>
+          <w:tcPr>
+            <w:tcW w:type="dxa" w:w="624"/>
+          </w:tcPr>
+          <w:p>
+            <w:r/>
+            <w:r>
+              <w:rPr>
+                <w:b/>
+                <w:sz w:val="14"/>
+              </w:rPr>
+              <w:t>Cycle</w:t>
+            </w:r>
+          </w:p>
+        </w:tc>
+        <w:tc>
+          <w:tcPr>
+            <w:tcW w:type="dxa" w:w="964"/>
+          </w:tcPr>
+          <w:p>
+            <w:r/>
+            <w:r>
+              <w:rPr>
+                <w:b/>
+                <w:sz w:val="14"/>
+              </w:rPr>
+              <w:t>Surface plantée (1000 ha)</w:t>
+            </w:r>
+          </w:p>
+        </w:tc>
+        <w:tc>
+          <w:tcPr>
+            <w:tcW w:type="dxa" w:w="964"/>
+          </w:tcPr>
+          <w:p>
+            <w:r/>
+            <w:r>
+              <w:rPr>
+                <w:b/>
+                <w:sz w:val="14"/>
+              </w:rPr>
+              <w:t>Surface récoltée (1000 ha)</w:t>
+            </w:r>
+          </w:p>
+        </w:tc>
+        <w:tc>
+          <w:tcPr>
+            <w:tcW w:type="dxa" w:w="907"/>
+          </w:tcPr>
+          <w:p>
+            <w:r/>
+            <w:r>
+              <w:rPr>
+                <w:b/>
+                <w:sz w:val="14"/>
+              </w:rPr>
+              <w:t>Rendement (sacs/ha)</w:t>
+            </w:r>
+          </w:p>
+        </w:tc>
+        <w:tc>
+          <w:tcPr>
+            <w:tcW w:type="dxa" w:w="850"/>
+          </w:tcPr>
+          <w:p>
+            <w:r/>
+            <w:r>
+              <w:rPr>
+                <w:b/>
+                <w:sz w:val="14"/>
+              </w:rPr>
+              <w:t>Arbres bearing (M)</w:t>
+            </w:r>
+          </w:p>
+        </w:tc>
+        <w:tc>
+          <w:tcPr>
+            <w:tcW w:type="dxa" w:w="907"/>
+          </w:tcPr>
+          <w:p>
+            <w:r/>
+            <w:r>
+              <w:rPr>
+                <w:b/>
+                <w:sz w:val="14"/>
+              </w:rPr>
+              <w:t>Arbres non-bearing (M)</w:t>
+            </w:r>
+          </w:p>
+        </w:tc>
+        <w:tc>
+          <w:tcPr>
+            <w:tcW w:type="dxa" w:w="964"/>
+          </w:tcPr>
+          <w:p>
+            <w:r/>
+            <w:r>
+              <w:rPr>
+                <w:b/>
+                <w:sz w:val="14"/>
+              </w:rPr>
+              <w:t>Arabica (1000 sacs)</w:t>
+            </w:r>
+          </w:p>
+        </w:tc>
+        <w:tc>
+          <w:tcPr>
+            <w:tcW w:type="dxa" w:w="964"/>
+          </w:tcPr>
+          <w:p>
+            <w:r/>
+            <w:r>
+              <w:rPr>
+                <w:b/>
+                <w:sz w:val="14"/>
+              </w:rPr>
+              <w:t>Robusta (1000 sacs)</w:t>
+            </w:r>
+          </w:p>
+        </w:tc>
+      </w:tr>
+      <w:tr>
+        <w:tc>
+          <w:tcPr>
+            <w:tcW w:type="dxa" w:w="907"/>
+          </w:tcPr>
+          <w:p>
+            <w:r/>
+            <w:r>
+              <w:rPr>
+                <w:sz w:val="14"/>
+              </w:rPr>
+              <w:t>2010/11</w:t>
+            </w:r>
+          </w:p>
+        </w:tc>
+        <w:tc>
+          <w:tcPr>
+            <w:tcW w:type="dxa" w:w="1474"/>
+          </w:tcPr>
+          <w:p>
+            <w:r/>
+            <w:r>
+              <w:rPr>
+                <w:sz w:val="14"/>
+              </w:rPr>
+              <w:t>Historique</w:t>
+            </w:r>
+          </w:p>
+        </w:tc>
+        <w:tc>
+          <w:tcPr>
+            <w:tcW w:type="dxa" w:w="624"/>
+          </w:tcPr>
+          <w:p>
+            <w:r/>
+            <w:r>
+              <w:rPr>
+                <w:sz w:val="14"/>
+              </w:rPr>
+              <w:t>ON</w:t>
+            </w:r>
+          </w:p>
+        </w:tc>
+        <w:tc>
+          <w:tcPr>
+            <w:tcW w:type="dxa" w:w="964"/>
+          </w:tcPr>
+          <w:p>
+            <w:r/>
+            <w:r>
+              <w:rPr>
+                <w:sz w:val="14"/>
+              </w:rPr>
+              <w:t>2 409</w:t>
+            </w:r>
+          </w:p>
+        </w:tc>
+        <w:tc>
+          <w:tcPr>
+            <w:tcW w:type="dxa" w:w="964"/>
+          </w:tcPr>
+          <w:p>
+            <w:r/>
+            <w:r>
+              <w:rPr>
+                <w:sz w:val="14"/>
+              </w:rPr>
+              <w:t>2 175</w:t>
+            </w:r>
+          </w:p>
+        </w:tc>
+        <w:tc>
+          <w:tcPr>
+            <w:tcW w:type="dxa" w:w="907"/>
+          </w:tcPr>
+          <w:p>
+            <w:r/>
+            <w:r>
+              <w:rPr>
+                <w:sz w:val="14"/>
+              </w:rPr>
+              <w:t>25.06</w:t>
+            </w:r>
+          </w:p>
+        </w:tc>
+        <w:tc>
+          <w:tcPr>
+            <w:tcW w:type="dxa" w:w="850"/>
+          </w:tcPr>
+          <w:p>
+            <w:r/>
+            <w:r>
+              <w:rPr>
+                <w:sz w:val="14"/>
+              </w:rPr>
+              <w:t>5 820</w:t>
+            </w:r>
+          </w:p>
+        </w:tc>
+        <w:tc>
+          <w:tcPr>
+            <w:tcW w:type="dxa" w:w="907"/>
+          </w:tcPr>
+          <w:p>
+            <w:r/>
+            <w:r>
+              <w:rPr>
+                <w:sz w:val="14"/>
+              </w:rPr>
+              <w:t>815</w:t>
+            </w:r>
+          </w:p>
+        </w:tc>
+        <w:tc>
+          <w:tcPr>
+            <w:tcW w:type="dxa" w:w="964"/>
+          </w:tcPr>
+          <w:p>
+            <w:r/>
+            <w:r>
+              <w:rPr>
+                <w:sz w:val="14"/>
+              </w:rPr>
+              <w:t>41 800</w:t>
+            </w:r>
+          </w:p>
+        </w:tc>
+        <w:tc>
+          <w:tcPr>
+            <w:tcW w:type="dxa" w:w="964"/>
+          </w:tcPr>
+          <w:p>
+            <w:r/>
+            <w:r>
+              <w:rPr>
+                <w:sz w:val="14"/>
+              </w:rPr>
+              <w:t>12 700</w:t>
+            </w:r>
+          </w:p>
+        </w:tc>
+      </w:tr>
+      <w:tr>
+        <w:tc>
+          <w:tcPr>
+            <w:tcW w:type="dxa" w:w="907"/>
+          </w:tcPr>
+          <w:p>
+            <w:r/>
+            <w:r>
+              <w:rPr>
+                <w:sz w:val="14"/>
+              </w:rPr>
+              <w:t>2011/12</w:t>
+            </w:r>
+          </w:p>
+        </w:tc>
+        <w:tc>
+          <w:tcPr>
+            <w:tcW w:type="dxa" w:w="1474"/>
+          </w:tcPr>
+          <w:p>
+            <w:r/>
+            <w:r>
+              <w:rPr>
+                <w:sz w:val="14"/>
+              </w:rPr>
+              <w:t>Historique</w:t>
+            </w:r>
+          </w:p>
+        </w:tc>
+        <w:tc>
+          <w:tcPr>
+            <w:tcW w:type="dxa" w:w="624"/>
+          </w:tcPr>
+          <w:p>
+            <w:r/>
+            <w:r>
+              <w:rPr>
+                <w:sz w:val="14"/>
+              </w:rPr>
+              <w:t>OFF</w:t>
+            </w:r>
+          </w:p>
+        </w:tc>
+        <w:tc>
+          <w:tcPr>
+            <w:tcW w:type="dxa" w:w="964"/>
+          </w:tcPr>
+          <w:p>
+            <w:r/>
+            <w:r>
+              <w:rPr>
+                <w:sz w:val="14"/>
+              </w:rPr>
+              <w:t>2 410</w:t>
+            </w:r>
+          </w:p>
+        </w:tc>
+        <w:tc>
+          <w:tcPr>
+            <w:tcW w:type="dxa" w:w="964"/>
+          </w:tcPr>
+          <w:p>
+            <w:r/>
+            <w:r>
+              <w:rPr>
+                <w:sz w:val="14"/>
+              </w:rPr>
+              <w:t>2 150</w:t>
+            </w:r>
+          </w:p>
+        </w:tc>
+        <w:tc>
+          <w:tcPr>
+            <w:tcW w:type="dxa" w:w="907"/>
+          </w:tcPr>
+          <w:p>
+            <w:r/>
+            <w:r>
+              <w:rPr>
+                <w:sz w:val="14"/>
+              </w:rPr>
+              <w:t>22.88</w:t>
+            </w:r>
+          </w:p>
+        </w:tc>
+        <w:tc>
+          <w:tcPr>
+            <w:tcW w:type="dxa" w:w="850"/>
+          </w:tcPr>
+          <w:p>
+            <w:r/>
+            <w:r>
+              <w:rPr>
+                <w:sz w:val="14"/>
+              </w:rPr>
+              <w:t>5 760</w:t>
+            </w:r>
+          </w:p>
+        </w:tc>
+        <w:tc>
+          <w:tcPr>
+            <w:tcW w:type="dxa" w:w="907"/>
+          </w:tcPr>
+          <w:p>
+            <w:r/>
+            <w:r>
+              <w:rPr>
+                <w:sz w:val="14"/>
+              </w:rPr>
+              <w:t>835</w:t>
+            </w:r>
+          </w:p>
+        </w:tc>
+        <w:tc>
+          <w:tcPr>
+            <w:tcW w:type="dxa" w:w="964"/>
+          </w:tcPr>
+          <w:p>
+            <w:r/>
+            <w:r>
+              <w:rPr>
+                <w:sz w:val="14"/>
+              </w:rPr>
+              <w:t>34 700</w:t>
+            </w:r>
+          </w:p>
+        </w:tc>
+        <w:tc>
+          <w:tcPr>
+            <w:tcW w:type="dxa" w:w="964"/>
+          </w:tcPr>
+          <w:p>
+            <w:r/>
+            <w:r>
+              <w:rPr>
+                <w:sz w:val="14"/>
+              </w:rPr>
+              <w:t>14 500</w:t>
+            </w:r>
+          </w:p>
+        </w:tc>
+      </w:tr>
+      <w:tr>
+        <w:tc>
+          <w:tcPr>
+            <w:tcW w:type="dxa" w:w="907"/>
+          </w:tcPr>
+          <w:p>
+            <w:r/>
+            <w:r>
+              <w:rPr>
+                <w:sz w:val="14"/>
+              </w:rPr>
+              <w:t>2012/13</w:t>
+            </w:r>
+          </w:p>
+        </w:tc>
+        <w:tc>
+          <w:tcPr>
+            <w:tcW w:type="dxa" w:w="1474"/>
+          </w:tcPr>
+          <w:p>
+            <w:r/>
+            <w:r>
+              <w:rPr>
+                <w:sz w:val="14"/>
+              </w:rPr>
+              <w:t>Historique</w:t>
+            </w:r>
+          </w:p>
+        </w:tc>
+        <w:tc>
+          <w:tcPr>
+            <w:tcW w:type="dxa" w:w="624"/>
+          </w:tcPr>
+          <w:p>
+            <w:r/>
+            <w:r>
+              <w:rPr>
+                <w:sz w:val="14"/>
+              </w:rPr>
+              <w:t>ON</w:t>
+            </w:r>
+          </w:p>
+        </w:tc>
+        <w:tc>
+          <w:tcPr>
+            <w:tcW w:type="dxa" w:w="964"/>
+          </w:tcPr>
+          <w:p>
+            <w:r/>
+            <w:r>
+              <w:rPr>
+                <w:sz w:val="14"/>
+              </w:rPr>
+              <w:t>2 387</w:t>
+            </w:r>
+          </w:p>
+        </w:tc>
+        <w:tc>
+          <w:tcPr>
+            <w:tcW w:type="dxa" w:w="964"/>
+          </w:tcPr>
+          <w:p>
+            <w:r/>
+            <w:r>
+              <w:rPr>
+                <w:sz w:val="14"/>
+              </w:rPr>
+              <w:t>2 105</w:t>
+            </w:r>
+          </w:p>
+        </w:tc>
+        <w:tc>
+          <w:tcPr>
+            <w:tcW w:type="dxa" w:w="907"/>
+          </w:tcPr>
+          <w:p>
+            <w:r/>
+            <w:r>
+              <w:rPr>
+                <w:sz w:val="14"/>
+              </w:rPr>
+              <w:t>27.36</w:t>
+            </w:r>
+          </w:p>
+        </w:tc>
+        <w:tc>
+          <w:tcPr>
+            <w:tcW w:type="dxa" w:w="850"/>
+          </w:tcPr>
+          <w:p>
+            <w:r/>
+            <w:r>
+              <w:rPr>
+                <w:sz w:val="14"/>
+              </w:rPr>
+              <w:t>5 860</w:t>
+            </w:r>
+          </w:p>
+        </w:tc>
+        <w:tc>
+          <w:tcPr>
+            <w:tcW w:type="dxa" w:w="907"/>
+          </w:tcPr>
+          <w:p>
+            <w:r/>
+            <w:r>
+              <w:rPr>
+                <w:sz w:val="14"/>
+              </w:rPr>
+              <w:t>1 000</w:t>
+            </w:r>
+          </w:p>
+        </w:tc>
+        <w:tc>
+          <w:tcPr>
+            <w:tcW w:type="dxa" w:w="964"/>
+          </w:tcPr>
+          <w:p>
+            <w:r/>
+            <w:r>
+              <w:rPr>
+                <w:sz w:val="14"/>
+              </w:rPr>
+              <w:t>42 100</w:t>
+            </w:r>
+          </w:p>
+        </w:tc>
+        <w:tc>
+          <w:tcPr>
+            <w:tcW w:type="dxa" w:w="964"/>
+          </w:tcPr>
+          <w:p>
+            <w:r/>
+            <w:r>
+              <w:rPr>
+                <w:sz w:val="14"/>
+              </w:rPr>
+              <w:t>15 500</w:t>
+            </w:r>
+          </w:p>
+        </w:tc>
+      </w:tr>
+      <w:tr>
+        <w:tc>
+          <w:tcPr>
+            <w:tcW w:type="dxa" w:w="907"/>
+          </w:tcPr>
+          <w:p>
+            <w:r/>
+            <w:r>
+              <w:rPr>
+                <w:sz w:val="14"/>
+              </w:rPr>
+              <w:t>2013/14</w:t>
+            </w:r>
+          </w:p>
+        </w:tc>
+        <w:tc>
+          <w:tcPr>
+            <w:tcW w:type="dxa" w:w="1474"/>
+          </w:tcPr>
+          <w:p>
+            <w:r/>
+            <w:r>
+              <w:rPr>
+                <w:sz w:val="14"/>
+              </w:rPr>
+              <w:t>Historique</w:t>
+            </w:r>
+          </w:p>
+        </w:tc>
+        <w:tc>
+          <w:tcPr>
+            <w:tcW w:type="dxa" w:w="624"/>
+          </w:tcPr>
+          <w:p>
+            <w:r/>
+            <w:r>
+              <w:rPr>
+                <w:sz w:val="14"/>
+              </w:rPr>
+              <w:t>OFF</w:t>
+            </w:r>
+          </w:p>
+        </w:tc>
+        <w:tc>
+          <w:tcPr>
+            <w:tcW w:type="dxa" w:w="964"/>
+          </w:tcPr>
+          <w:p>
+            <w:r/>
+            <w:r>
+              <w:rPr>
+                <w:sz w:val="14"/>
+              </w:rPr>
+              <w:t>2 442</w:t>
+            </w:r>
+          </w:p>
+        </w:tc>
+        <w:tc>
+          <w:tcPr>
+            <w:tcW w:type="dxa" w:w="964"/>
+          </w:tcPr>
+          <w:p>
+            <w:r/>
+            <w:r>
+              <w:rPr>
+                <w:sz w:val="14"/>
+              </w:rPr>
+              <w:t>2 135</w:t>
+            </w:r>
+          </w:p>
+        </w:tc>
+        <w:tc>
+          <w:tcPr>
+            <w:tcW w:type="dxa" w:w="907"/>
+          </w:tcPr>
+          <w:p>
+            <w:r/>
+            <w:r>
+              <w:rPr>
+                <w:sz w:val="14"/>
+              </w:rPr>
+              <w:t>26.79</w:t>
+            </w:r>
+          </w:p>
+        </w:tc>
+        <w:tc>
+          <w:tcPr>
+            <w:tcW w:type="dxa" w:w="850"/>
+          </w:tcPr>
+          <w:p>
+            <w:r/>
+            <w:r>
+              <w:rPr>
+                <w:sz w:val="14"/>
+              </w:rPr>
+              <w:t>5 810</w:t>
+            </w:r>
+          </w:p>
+        </w:tc>
+        <w:tc>
+          <w:tcPr>
+            <w:tcW w:type="dxa" w:w="907"/>
+          </w:tcPr>
+          <w:p>
+            <w:r/>
+            <w:r>
+              <w:rPr>
+                <w:sz w:val="14"/>
+              </w:rPr>
+              <w:t>1 055</w:t>
+            </w:r>
+          </w:p>
+        </w:tc>
+        <w:tc>
+          <w:tcPr>
+            <w:tcW w:type="dxa" w:w="964"/>
+          </w:tcPr>
+          <w:p>
+            <w:r/>
+            <w:r>
+              <w:rPr>
+                <w:sz w:val="14"/>
+              </w:rPr>
+              <w:t>41 800</w:t>
+            </w:r>
+          </w:p>
+        </w:tc>
+        <w:tc>
+          <w:tcPr>
+            <w:tcW w:type="dxa" w:w="964"/>
+          </w:tcPr>
+          <w:p>
+            <w:r/>
+            <w:r>
+              <w:rPr>
+                <w:sz w:val="14"/>
+              </w:rPr>
+              <w:t>15 400</w:t>
+            </w:r>
+          </w:p>
+        </w:tc>
+      </w:tr>
+      <w:tr>
+        <w:tc>
+          <w:tcPr>
+            <w:tcW w:type="dxa" w:w="907"/>
+          </w:tcPr>
+          <w:p>
+            <w:r/>
+            <w:r>
+              <w:rPr>
+                <w:sz w:val="14"/>
+              </w:rPr>
+              <w:t>2014/15</w:t>
+            </w:r>
+          </w:p>
+        </w:tc>
+        <w:tc>
+          <w:tcPr>
+            <w:tcW w:type="dxa" w:w="1474"/>
+          </w:tcPr>
+          <w:p>
+            <w:r/>
+            <w:r>
+              <w:rPr>
+                <w:sz w:val="14"/>
+              </w:rPr>
+              <w:t>Historique</w:t>
+            </w:r>
+          </w:p>
+        </w:tc>
+        <w:tc>
+          <w:tcPr>
+            <w:tcW w:type="dxa" w:w="624"/>
+          </w:tcPr>
+          <w:p>
+            <w:r/>
+            <w:r>
+              <w:rPr>
+                <w:sz w:val="14"/>
+              </w:rPr>
+              <w:t>ON</w:t>
+            </w:r>
+          </w:p>
+        </w:tc>
+        <w:tc>
+          <w:tcPr>
+            <w:tcW w:type="dxa" w:w="964"/>
+          </w:tcPr>
+          <w:p>
+            <w:r/>
+            <w:r>
+              <w:rPr>
+                <w:sz w:val="14"/>
+              </w:rPr>
+              <w:t>2 437</w:t>
+            </w:r>
+          </w:p>
+        </w:tc>
+        <w:tc>
+          <w:tcPr>
+            <w:tcW w:type="dxa" w:w="964"/>
+          </w:tcPr>
+          <w:p>
+            <w:r/>
+            <w:r>
+              <w:rPr>
+                <w:sz w:val="14"/>
+              </w:rPr>
+              <w:t>2 090</w:t>
+            </w:r>
+          </w:p>
+        </w:tc>
+        <w:tc>
+          <w:tcPr>
+            <w:tcW w:type="dxa" w:w="907"/>
+          </w:tcPr>
+          <w:p>
+            <w:r/>
+            <w:r>
+              <w:rPr>
+                <w:sz w:val="14"/>
+              </w:rPr>
+              <w:t>25.98</w:t>
+            </w:r>
+          </w:p>
+        </w:tc>
+        <w:tc>
+          <w:tcPr>
+            <w:tcW w:type="dxa" w:w="850"/>
+          </w:tcPr>
+          <w:p>
+            <w:r/>
+            <w:r>
+              <w:rPr>
+                <w:sz w:val="14"/>
+              </w:rPr>
+              <w:t>5 770</w:t>
+            </w:r>
+          </w:p>
+        </w:tc>
+        <w:tc>
+          <w:tcPr>
+            <w:tcW w:type="dxa" w:w="907"/>
+          </w:tcPr>
+          <w:p>
+            <w:r/>
+            <w:r>
+              <w:rPr>
+                <w:sz w:val="14"/>
+              </w:rPr>
+              <w:t>1 185</w:t>
+            </w:r>
+          </w:p>
+        </w:tc>
+        <w:tc>
+          <w:tcPr>
+            <w:tcW w:type="dxa" w:w="964"/>
+          </w:tcPr>
+          <w:p>
+            <w:r/>
+            <w:r>
+              <w:rPr>
+                <w:sz w:val="14"/>
+              </w:rPr>
+              <w:t>37 300</w:t>
+            </w:r>
+          </w:p>
+        </w:tc>
+        <w:tc>
+          <w:tcPr>
+            <w:tcW w:type="dxa" w:w="964"/>
+          </w:tcPr>
+          <w:p>
+            <w:r/>
+            <w:r>
+              <w:rPr>
+                <w:sz w:val="14"/>
+              </w:rPr>
+              <w:t>17 000</w:t>
+            </w:r>
+          </w:p>
+        </w:tc>
+      </w:tr>
+      <w:tr>
+        <w:tc>
+          <w:tcPr>
+            <w:tcW w:type="dxa" w:w="907"/>
+          </w:tcPr>
+          <w:p>
+            <w:r/>
+            <w:r>
+              <w:rPr>
+                <w:sz w:val="14"/>
+              </w:rPr>
+              <w:t>2015/16</w:t>
+            </w:r>
+          </w:p>
+        </w:tc>
+        <w:tc>
+          <w:tcPr>
+            <w:tcW w:type="dxa" w:w="1474"/>
+          </w:tcPr>
+          <w:p>
+            <w:r/>
+            <w:r>
+              <w:rPr>
+                <w:sz w:val="14"/>
+              </w:rPr>
+              <w:t>Historique</w:t>
+            </w:r>
+          </w:p>
+        </w:tc>
+        <w:tc>
+          <w:tcPr>
+            <w:tcW w:type="dxa" w:w="624"/>
+          </w:tcPr>
+          <w:p>
+            <w:r/>
+            <w:r>
+              <w:rPr>
+                <w:sz w:val="14"/>
+              </w:rPr>
+              <w:t>OFF</w:t>
+            </w:r>
+          </w:p>
+        </w:tc>
+        <w:tc>
+          <w:tcPr>
+            <w:tcW w:type="dxa" w:w="964"/>
+          </w:tcPr>
+          <w:p>
+            <w:r/>
+            <w:r>
+              <w:rPr>
+                <w:sz w:val="14"/>
+              </w:rPr>
+              <w:t>2 410</w:t>
+            </w:r>
+          </w:p>
+        </w:tc>
+        <w:tc>
+          <w:tcPr>
+            <w:tcW w:type="dxa" w:w="964"/>
+          </w:tcPr>
+          <w:p>
+            <w:r/>
+            <w:r>
+              <w:rPr>
+                <w:sz w:val="14"/>
+              </w:rPr>
+              <w:t>2 070</w:t>
+            </w:r>
+          </w:p>
+        </w:tc>
+        <w:tc>
+          <w:tcPr>
+            <w:tcW w:type="dxa" w:w="907"/>
+          </w:tcPr>
+          <w:p>
+            <w:r/>
+            <w:r>
+              <w:rPr>
+                <w:sz w:val="14"/>
+              </w:rPr>
+              <w:t>23.86</w:t>
+            </w:r>
+          </w:p>
+        </w:tc>
+        <w:tc>
+          <w:tcPr>
+            <w:tcW w:type="dxa" w:w="850"/>
+          </w:tcPr>
+          <w:p>
+            <w:r/>
+            <w:r>
+              <w:rPr>
+                <w:sz w:val="14"/>
+              </w:rPr>
+              <w:t>5 735</w:t>
+            </w:r>
+          </w:p>
+        </w:tc>
+        <w:tc>
+          <w:tcPr>
+            <w:tcW w:type="dxa" w:w="907"/>
+          </w:tcPr>
+          <w:p>
+            <w:r/>
+            <w:r>
+              <w:rPr>
+                <w:sz w:val="14"/>
+              </w:rPr>
+              <w:t>1 125</w:t>
+            </w:r>
+          </w:p>
+        </w:tc>
+        <w:tc>
+          <w:tcPr>
+            <w:tcW w:type="dxa" w:w="964"/>
+          </w:tcPr>
+          <w:p>
+            <w:r/>
+            <w:r>
+              <w:rPr>
+                <w:sz w:val="14"/>
+              </w:rPr>
+              <w:t>36 100</w:t>
+            </w:r>
+          </w:p>
+        </w:tc>
+        <w:tc>
+          <w:tcPr>
+            <w:tcW w:type="dxa" w:w="964"/>
+          </w:tcPr>
+          <w:p>
+            <w:r/>
+            <w:r>
+              <w:rPr>
+                <w:sz w:val="14"/>
+              </w:rPr>
+              <w:t>13 300</w:t>
+            </w:r>
+          </w:p>
+        </w:tc>
+      </w:tr>
+      <w:tr>
+        <w:tc>
+          <w:tcPr>
+            <w:tcW w:type="dxa" w:w="907"/>
+          </w:tcPr>
+          <w:p>
+            <w:r/>
+            <w:r>
+              <w:rPr>
+                <w:sz w:val="14"/>
+              </w:rPr>
+              <w:t>2016/17</w:t>
+            </w:r>
+          </w:p>
+        </w:tc>
+        <w:tc>
+          <w:tcPr>
+            <w:tcW w:type="dxa" w:w="1474"/>
+          </w:tcPr>
+          <w:p>
+            <w:r/>
+            <w:r>
+              <w:rPr>
+                <w:sz w:val="14"/>
+              </w:rPr>
+              <w:t>Historique</w:t>
+            </w:r>
+          </w:p>
+        </w:tc>
+        <w:tc>
+          <w:tcPr>
+            <w:tcW w:type="dxa" w:w="624"/>
+          </w:tcPr>
+          <w:p>
+            <w:r/>
+            <w:r>
+              <w:rPr>
+                <w:sz w:val="14"/>
+              </w:rPr>
+              <w:t>ON</w:t>
+            </w:r>
+          </w:p>
+        </w:tc>
+        <w:tc>
+          <w:tcPr>
+            <w:tcW w:type="dxa" w:w="964"/>
+          </w:tcPr>
+          <w:p>
+            <w:r/>
+            <w:r>
+              <w:rPr>
+                <w:sz w:val="14"/>
+              </w:rPr>
+              <w:t>2 410</w:t>
+            </w:r>
+          </w:p>
+        </w:tc>
+        <w:tc>
+          <w:tcPr>
+            <w:tcW w:type="dxa" w:w="964"/>
+          </w:tcPr>
+          <w:p>
+            <w:r/>
+            <w:r>
+              <w:rPr>
+                <w:sz w:val="14"/>
+              </w:rPr>
+              <w:t>2 070</w:t>
+            </w:r>
+          </w:p>
+        </w:tc>
+        <w:tc>
+          <w:tcPr>
+            <w:tcW w:type="dxa" w:w="907"/>
+          </w:tcPr>
+          <w:p>
+            <w:r/>
+            <w:r>
+              <w:rPr>
+                <w:sz w:val="14"/>
+              </w:rPr>
+              <w:t>27.10</w:t>
+            </w:r>
+          </w:p>
+        </w:tc>
+        <w:tc>
+          <w:tcPr>
+            <w:tcW w:type="dxa" w:w="850"/>
+          </w:tcPr>
+          <w:p>
+            <w:r/>
+            <w:r>
+              <w:rPr>
+                <w:sz w:val="14"/>
+              </w:rPr>
+              <w:t>5 735</w:t>
+            </w:r>
+          </w:p>
+        </w:tc>
+        <w:tc>
+          <w:tcPr>
+            <w:tcW w:type="dxa" w:w="907"/>
+          </w:tcPr>
+          <w:p>
+            <w:r/>
+            <w:r>
+              <w:rPr>
+                <w:sz w:val="14"/>
+              </w:rPr>
+              <w:t>1 125</w:t>
+            </w:r>
+          </w:p>
+        </w:tc>
+        <w:tc>
+          <w:tcPr>
+            <w:tcW w:type="dxa" w:w="964"/>
+          </w:tcPr>
+          <w:p>
+            <w:r/>
+            <w:r>
+              <w:rPr>
+                <w:sz w:val="14"/>
+              </w:rPr>
+              <w:t>45 600</w:t>
+            </w:r>
+          </w:p>
+        </w:tc>
+        <w:tc>
+          <w:tcPr>
+            <w:tcW w:type="dxa" w:w="964"/>
+          </w:tcPr>
+          <w:p>
+            <w:r/>
+            <w:r>
+              <w:rPr>
+                <w:sz w:val="14"/>
+              </w:rPr>
+              <w:t>10 500</w:t>
+            </w:r>
+          </w:p>
+        </w:tc>
+      </w:tr>
+      <w:tr>
+        <w:tc>
+          <w:tcPr>
+            <w:tcW w:type="dxa" w:w="907"/>
+          </w:tcPr>
+          <w:p>
+            <w:r/>
+            <w:r>
+              <w:rPr>
+                <w:sz w:val="14"/>
+              </w:rPr>
+              <w:t>2017/18</w:t>
+            </w:r>
+          </w:p>
+        </w:tc>
+        <w:tc>
+          <w:tcPr>
+            <w:tcW w:type="dxa" w:w="1474"/>
+          </w:tcPr>
+          <w:p>
+            <w:r/>
+            <w:r>
+              <w:rPr>
+                <w:sz w:val="14"/>
+              </w:rPr>
+              <w:t>Historique</w:t>
+            </w:r>
+          </w:p>
+        </w:tc>
+        <w:tc>
+          <w:tcPr>
+            <w:tcW w:type="dxa" w:w="624"/>
+          </w:tcPr>
+          <w:p>
+            <w:r/>
+            <w:r>
+              <w:rPr>
+                <w:sz w:val="14"/>
+              </w:rPr>
+              <w:t>OFF</w:t>
+            </w:r>
+          </w:p>
+        </w:tc>
+        <w:tc>
+          <w:tcPr>
+            <w:tcW w:type="dxa" w:w="964"/>
+          </w:tcPr>
+          <w:p>
+            <w:r/>
+            <w:r>
+              <w:rPr>
+                <w:sz w:val="14"/>
+              </w:rPr>
+              <w:t>2 400</w:t>
+            </w:r>
+          </w:p>
+        </w:tc>
+        <w:tc>
+          <w:tcPr>
+            <w:tcW w:type="dxa" w:w="964"/>
+          </w:tcPr>
+          <w:p>
+            <w:r/>
+            <w:r>
+              <w:rPr>
+                <w:sz w:val="14"/>
+              </w:rPr>
+              <w:t>2 020</w:t>
+            </w:r>
+          </w:p>
+        </w:tc>
+        <w:tc>
+          <w:tcPr>
+            <w:tcW w:type="dxa" w:w="907"/>
+          </w:tcPr>
+          <w:p>
+            <w:r/>
+            <w:r>
+              <w:rPr>
+                <w:sz w:val="14"/>
+              </w:rPr>
+              <w:t>25.79</w:t>
+            </w:r>
+          </w:p>
+        </w:tc>
+        <w:tc>
+          <w:tcPr>
+            <w:tcW w:type="dxa" w:w="850"/>
+          </w:tcPr>
+          <w:p>
+            <w:r/>
+            <w:r>
+              <w:rPr>
+                <w:sz w:val="14"/>
+              </w:rPr>
+              <w:t>5 640</w:t>
+            </w:r>
+          </w:p>
+        </w:tc>
+        <w:tc>
+          <w:tcPr>
+            <w:tcW w:type="dxa" w:w="907"/>
+          </w:tcPr>
+          <w:p>
+            <w:r/>
+            <w:r>
+              <w:rPr>
+                <w:sz w:val="14"/>
+              </w:rPr>
+              <w:t>1 300</w:t>
+            </w:r>
+          </w:p>
+        </w:tc>
+        <w:tc>
+          <w:tcPr>
+            <w:tcW w:type="dxa" w:w="964"/>
+          </w:tcPr>
+          <w:p>
+            <w:r/>
+            <w:r>
+              <w:rPr>
+                <w:sz w:val="14"/>
+              </w:rPr>
+              <w:t>39 500</w:t>
+            </w:r>
+          </w:p>
+        </w:tc>
+        <w:tc>
+          <w:tcPr>
+            <w:tcW w:type="dxa" w:w="964"/>
+          </w:tcPr>
+          <w:p>
+            <w:r/>
+            <w:r>
+              <w:rPr>
+                <w:sz w:val="14"/>
+              </w:rPr>
+              <w:t>12 600</w:t>
+            </w:r>
+          </w:p>
+        </w:tc>
+      </w:tr>
+      <w:tr>
+        <w:tc>
+          <w:tcPr>
+            <w:tcW w:type="dxa" w:w="907"/>
+          </w:tcPr>
+          <w:p>
+            <w:r/>
+            <w:r>
+              <w:rPr>
+                <w:sz w:val="14"/>
+              </w:rPr>
+              <w:t>2018/19</w:t>
+            </w:r>
+          </w:p>
+        </w:tc>
+        <w:tc>
+          <w:tcPr>
+            <w:tcW w:type="dxa" w:w="1474"/>
+          </w:tcPr>
+          <w:p>
+            <w:r/>
+            <w:r>
+              <w:rPr>
+                <w:sz w:val="14"/>
+              </w:rPr>
+              <w:t>Historique</w:t>
+            </w:r>
+          </w:p>
+        </w:tc>
+        <w:tc>
+          <w:tcPr>
+            <w:tcW w:type="dxa" w:w="624"/>
+          </w:tcPr>
+          <w:p>
+            <w:r/>
+            <w:r>
+              <w:rPr>
+                <w:sz w:val="14"/>
+              </w:rPr>
+              <w:t>ON</w:t>
+            </w:r>
+          </w:p>
+        </w:tc>
+        <w:tc>
+          <w:tcPr>
+            <w:tcW w:type="dxa" w:w="964"/>
+          </w:tcPr>
+          <w:p>
+            <w:r/>
+            <w:r>
+              <w:rPr>
+                <w:sz w:val="14"/>
+              </w:rPr>
+              <w:t>2 395</w:t>
+            </w:r>
+          </w:p>
+        </w:tc>
+        <w:tc>
+          <w:tcPr>
+            <w:tcW w:type="dxa" w:w="964"/>
+          </w:tcPr>
+          <w:p>
+            <w:r/>
+            <w:r>
+              <w:rPr>
+                <w:sz w:val="14"/>
+              </w:rPr>
+              <w:t>2 060</w:t>
+            </w:r>
+          </w:p>
+        </w:tc>
+        <w:tc>
+          <w:tcPr>
+            <w:tcW w:type="dxa" w:w="907"/>
+          </w:tcPr>
+          <w:p>
+            <w:r/>
+            <w:r>
+              <w:rPr>
+                <w:sz w:val="14"/>
+              </w:rPr>
+              <w:t>32.28</w:t>
+            </w:r>
+          </w:p>
+        </w:tc>
+        <w:tc>
+          <w:tcPr>
+            <w:tcW w:type="dxa" w:w="850"/>
+          </w:tcPr>
+          <w:p>
+            <w:r/>
+            <w:r>
+              <w:rPr>
+                <w:sz w:val="14"/>
+              </w:rPr>
+              <w:t>5 740</w:t>
+            </w:r>
+          </w:p>
+        </w:tc>
+        <w:tc>
+          <w:tcPr>
+            <w:tcW w:type="dxa" w:w="907"/>
+          </w:tcPr>
+          <w:p>
+            <w:r/>
+            <w:r>
+              <w:rPr>
+                <w:sz w:val="14"/>
+              </w:rPr>
+              <w:t>1 150</w:t>
+            </w:r>
+          </w:p>
+        </w:tc>
+        <w:tc>
+          <w:tcPr>
+            <w:tcW w:type="dxa" w:w="964"/>
+          </w:tcPr>
+          <w:p>
+            <w:r/>
+            <w:r>
+              <w:rPr>
+                <w:sz w:val="14"/>
+              </w:rPr>
+              <w:t>49 700</w:t>
+            </w:r>
+          </w:p>
+        </w:tc>
+        <w:tc>
+          <w:tcPr>
+            <w:tcW w:type="dxa" w:w="964"/>
+          </w:tcPr>
+          <w:p>
+            <w:r/>
+            <w:r>
+              <w:rPr>
+                <w:sz w:val="14"/>
+              </w:rPr>
+              <w:t>16 800</w:t>
+            </w:r>
+          </w:p>
+        </w:tc>
+      </w:tr>
+      <w:tr>
+        <w:tc>
+          <w:tcPr>
+            <w:tcW w:type="dxa" w:w="907"/>
+          </w:tcPr>
+          <w:p>
+            <w:r/>
+            <w:r>
+              <w:rPr>
+                <w:sz w:val="14"/>
+              </w:rPr>
+              <w:t>2019/20</w:t>
+            </w:r>
+          </w:p>
+        </w:tc>
+        <w:tc>
+          <w:tcPr>
+            <w:tcW w:type="dxa" w:w="1474"/>
+          </w:tcPr>
+          <w:p>
+            <w:r/>
+            <w:r>
+              <w:rPr>
+                <w:sz w:val="14"/>
+              </w:rPr>
+              <w:t>Historique</w:t>
+            </w:r>
+          </w:p>
+        </w:tc>
+        <w:tc>
+          <w:tcPr>
+            <w:tcW w:type="dxa" w:w="624"/>
+          </w:tcPr>
+          <w:p>
+            <w:r/>
+            <w:r>
+              <w:rPr>
+                <w:sz w:val="14"/>
+              </w:rPr>
+              <w:t>OFF</w:t>
+            </w:r>
+          </w:p>
+        </w:tc>
+        <w:tc>
+          <w:tcPr>
+            <w:tcW w:type="dxa" w:w="964"/>
+          </w:tcPr>
+          <w:p>
+            <w:r/>
+            <w:r>
+              <w:rPr>
+                <w:sz w:val="14"/>
+              </w:rPr>
+              <w:t>2 390</w:t>
+            </w:r>
+          </w:p>
+        </w:tc>
+        <w:tc>
+          <w:tcPr>
+            <w:tcW w:type="dxa" w:w="964"/>
+          </w:tcPr>
+          <w:p>
+            <w:r/>
+            <w:r>
+              <w:rPr>
+                <w:sz w:val="14"/>
+              </w:rPr>
+              <w:t>2 040</w:t>
+            </w:r>
+          </w:p>
+        </w:tc>
+        <w:tc>
+          <w:tcPr>
+            <w:tcW w:type="dxa" w:w="907"/>
+          </w:tcPr>
+          <w:p>
+            <w:r/>
+            <w:r>
+              <w:rPr>
+                <w:sz w:val="14"/>
+              </w:rPr>
+              <w:t>29.66</w:t>
+            </w:r>
+          </w:p>
+        </w:tc>
+        <w:tc>
+          <w:tcPr>
+            <w:tcW w:type="dxa" w:w="850"/>
+          </w:tcPr>
+          <w:p>
+            <w:r/>
+            <w:r>
+              <w:rPr>
+                <w:sz w:val="14"/>
+              </w:rPr>
+              <w:t>5 700</w:t>
+            </w:r>
+          </w:p>
+        </w:tc>
+        <w:tc>
+          <w:tcPr>
+            <w:tcW w:type="dxa" w:w="907"/>
+          </w:tcPr>
+          <w:p>
+            <w:r/>
+            <w:r>
+              <w:rPr>
+                <w:sz w:val="14"/>
+              </w:rPr>
+              <w:t>1 230</w:t>
+            </w:r>
+          </w:p>
+        </w:tc>
+        <w:tc>
+          <w:tcPr>
+            <w:tcW w:type="dxa" w:w="964"/>
+          </w:tcPr>
+          <w:p>
+            <w:r/>
+            <w:r>
+              <w:rPr>
+                <w:sz w:val="14"/>
+              </w:rPr>
+              <w:t>42 000</w:t>
+            </w:r>
+          </w:p>
+        </w:tc>
+        <w:tc>
+          <w:tcPr>
+            <w:tcW w:type="dxa" w:w="964"/>
+          </w:tcPr>
+          <w:p>
+            <w:r/>
+            <w:r>
+              <w:rPr>
+                <w:sz w:val="14"/>
+              </w:rPr>
+              <w:t>18 500</w:t>
+            </w:r>
+          </w:p>
+        </w:tc>
+      </w:tr>
+      <w:tr>
+        <w:tc>
+          <w:tcPr>
+            <w:tcW w:type="dxa" w:w="907"/>
+          </w:tcPr>
+          <w:p>
+            <w:r/>
+            <w:r>
+              <w:rPr>
+                <w:sz w:val="14"/>
+              </w:rPr>
+              <w:t>2020/21</w:t>
+            </w:r>
+          </w:p>
+        </w:tc>
+        <w:tc>
+          <w:tcPr>
+            <w:tcW w:type="dxa" w:w="1474"/>
+          </w:tcPr>
+          <w:p>
+            <w:r/>
+            <w:r>
+              <w:rPr>
+                <w:sz w:val="14"/>
+              </w:rPr>
+              <w:t>Historique</w:t>
+            </w:r>
+          </w:p>
+        </w:tc>
+        <w:tc>
+          <w:tcPr>
+            <w:tcW w:type="dxa" w:w="624"/>
+          </w:tcPr>
+          <w:p>
+            <w:r/>
+            <w:r>
+              <w:rPr>
+                <w:sz w:val="14"/>
+              </w:rPr>
+              <w:t>ON</w:t>
+            </w:r>
+          </w:p>
+        </w:tc>
+        <w:tc>
+          <w:tcPr>
+            <w:tcW w:type="dxa" w:w="964"/>
+          </w:tcPr>
+          <w:p>
+            <w:r/>
+            <w:r>
+              <w:rPr>
+                <w:sz w:val="14"/>
+              </w:rPr>
+              <w:t>2 420</w:t>
+            </w:r>
+          </w:p>
+        </w:tc>
+        <w:tc>
+          <w:tcPr>
+            <w:tcW w:type="dxa" w:w="964"/>
+          </w:tcPr>
+          <w:p>
+            <w:r/>
+            <w:r>
+              <w:rPr>
+                <w:sz w:val="14"/>
+              </w:rPr>
+              <w:t>2 100</w:t>
+            </w:r>
+          </w:p>
+        </w:tc>
+        <w:tc>
+          <w:tcPr>
+            <w:tcW w:type="dxa" w:w="907"/>
+          </w:tcPr>
+          <w:p>
+            <w:r/>
+            <w:r>
+              <w:rPr>
+                <w:sz w:val="14"/>
+              </w:rPr>
+              <w:t>33.29</w:t>
+            </w:r>
+          </w:p>
+        </w:tc>
+        <w:tc>
+          <w:tcPr>
+            <w:tcW w:type="dxa" w:w="850"/>
+          </w:tcPr>
+          <w:p>
+            <w:r/>
+            <w:r>
+              <w:rPr>
+                <w:sz w:val="14"/>
+              </w:rPr>
+              <w:t>6 200</w:t>
+            </w:r>
+          </w:p>
+        </w:tc>
+        <w:tc>
+          <w:tcPr>
+            <w:tcW w:type="dxa" w:w="907"/>
+          </w:tcPr>
+          <w:p>
+            <w:r/>
+            <w:r>
+              <w:rPr>
+                <w:sz w:val="14"/>
+              </w:rPr>
+              <w:t>1 050</w:t>
+            </w:r>
+          </w:p>
+        </w:tc>
+        <w:tc>
+          <w:tcPr>
+            <w:tcW w:type="dxa" w:w="964"/>
+          </w:tcPr>
+          <w:p>
+            <w:r/>
+            <w:r>
+              <w:rPr>
+                <w:sz w:val="14"/>
+              </w:rPr>
+              <w:t>49 700</w:t>
+            </w:r>
+          </w:p>
+        </w:tc>
+        <w:tc>
+          <w:tcPr>
+            <w:tcW w:type="dxa" w:w="964"/>
+          </w:tcPr>
+          <w:p>
+            <w:r/>
+            <w:r>
+              <w:rPr>
+                <w:sz w:val="14"/>
+              </w:rPr>
+              <w:t>20 200</w:t>
+            </w:r>
+          </w:p>
+        </w:tc>
+      </w:tr>
+      <w:tr>
+        <w:tc>
+          <w:tcPr>
+            <w:tcW w:type="dxa" w:w="907"/>
+          </w:tcPr>
+          <w:p>
+            <w:r/>
+            <w:r>
+              <w:rPr>
+                <w:sz w:val="14"/>
+              </w:rPr>
+              <w:t>2021/22</w:t>
+            </w:r>
+          </w:p>
+        </w:tc>
+        <w:tc>
+          <w:tcPr>
+            <w:tcW w:type="dxa" w:w="1474"/>
+          </w:tcPr>
+          <w:p>
+            <w:r/>
+            <w:r>
+              <w:rPr>
+                <w:sz w:val="14"/>
+              </w:rPr>
+              <w:t>Historique</w:t>
+            </w:r>
+          </w:p>
+        </w:tc>
+        <w:tc>
+          <w:tcPr>
+            <w:tcW w:type="dxa" w:w="624"/>
+          </w:tcPr>
+          <w:p>
+            <w:r/>
+            <w:r>
+              <w:rPr>
+                <w:sz w:val="14"/>
+              </w:rPr>
+              <w:t>OFF</w:t>
+            </w:r>
+          </w:p>
+        </w:tc>
+        <w:tc>
+          <w:tcPr>
+            <w:tcW w:type="dxa" w:w="964"/>
+          </w:tcPr>
+          <w:p>
+            <w:r/>
+            <w:r>
+              <w:rPr>
+                <w:sz w:val="14"/>
+              </w:rPr>
+              <w:t>2 480</w:t>
+            </w:r>
+          </w:p>
+        </w:tc>
+        <w:tc>
+          <w:tcPr>
+            <w:tcW w:type="dxa" w:w="964"/>
+          </w:tcPr>
+          <w:p>
+            <w:r/>
+            <w:r>
+              <w:rPr>
+                <w:sz w:val="14"/>
+              </w:rPr>
+              <w:t>2 010</w:t>
+            </w:r>
+          </w:p>
+        </w:tc>
+        <w:tc>
+          <w:tcPr>
+            <w:tcW w:type="dxa" w:w="907"/>
+          </w:tcPr>
+          <w:p>
+            <w:r/>
+            <w:r>
+              <w:rPr>
+                <w:sz w:val="14"/>
+              </w:rPr>
+              <w:t>28.91</w:t>
+            </w:r>
+          </w:p>
+        </w:tc>
+        <w:tc>
+          <w:tcPr>
+            <w:tcW w:type="dxa" w:w="850"/>
+          </w:tcPr>
+          <w:p>
+            <w:r/>
+            <w:r>
+              <w:rPr>
+                <w:sz w:val="14"/>
+              </w:rPr>
+              <w:t>6 010</w:t>
+            </w:r>
+          </w:p>
+        </w:tc>
+        <w:tc>
+          <w:tcPr>
+            <w:tcW w:type="dxa" w:w="907"/>
+          </w:tcPr>
+          <w:p>
+            <w:r/>
+            <w:r>
+              <w:rPr>
+                <w:sz w:val="14"/>
+              </w:rPr>
+              <w:t>1 500</w:t>
+            </w:r>
+          </w:p>
+        </w:tc>
+        <w:tc>
+          <w:tcPr>
+            <w:tcW w:type="dxa" w:w="964"/>
+          </w:tcPr>
+          <w:p>
+            <w:r/>
+            <w:r>
+              <w:rPr>
+                <w:sz w:val="14"/>
+              </w:rPr>
+              <w:t>36 400</w:t>
+            </w:r>
+          </w:p>
+        </w:tc>
+        <w:tc>
+          <w:tcPr>
+            <w:tcW w:type="dxa" w:w="964"/>
+          </w:tcPr>
+          <w:p>
+            <w:r/>
+            <w:r>
+              <w:rPr>
+                <w:sz w:val="14"/>
+              </w:rPr>
+              <w:t>21 700</w:t>
+            </w:r>
+          </w:p>
+        </w:tc>
+      </w:tr>
+      <w:tr>
+        <w:tc>
+          <w:tcPr>
+            <w:tcW w:type="dxa" w:w="907"/>
+          </w:tcPr>
+          <w:p>
+            <w:r/>
+            <w:r>
+              <w:rPr>
+                <w:sz w:val="14"/>
+              </w:rPr>
+              <w:t>2022/23</w:t>
+            </w:r>
+          </w:p>
+        </w:tc>
+        <w:tc>
+          <w:tcPr>
+            <w:tcW w:type="dxa" w:w="1474"/>
+          </w:tcPr>
+          <w:p>
+            <w:r/>
+            <w:r>
+              <w:rPr>
+                <w:sz w:val="14"/>
+              </w:rPr>
+              <w:t>Historique</w:t>
+            </w:r>
+          </w:p>
+        </w:tc>
+        <w:tc>
+          <w:tcPr>
+            <w:tcW w:type="dxa" w:w="624"/>
+          </w:tcPr>
+          <w:p>
+            <w:r/>
+            <w:r>
+              <w:rPr>
+                <w:sz w:val="14"/>
+              </w:rPr>
+              <w:t>ON</w:t>
+            </w:r>
+          </w:p>
+        </w:tc>
+        <w:tc>
+          <w:tcPr>
+            <w:tcW w:type="dxa" w:w="964"/>
+          </w:tcPr>
+          <w:p>
+            <w:r/>
+            <w:r>
+              <w:rPr>
+                <w:sz w:val="14"/>
+              </w:rPr>
+              <w:t>2 495</w:t>
+            </w:r>
+          </w:p>
+        </w:tc>
+        <w:tc>
+          <w:tcPr>
+            <w:tcW w:type="dxa" w:w="964"/>
+          </w:tcPr>
+          <w:p>
+            <w:r/>
+            <w:r>
+              <w:rPr>
+                <w:sz w:val="14"/>
+              </w:rPr>
+              <w:t>2 020</w:t>
+            </w:r>
+          </w:p>
+        </w:tc>
+        <w:tc>
+          <w:tcPr>
+            <w:tcW w:type="dxa" w:w="907"/>
+          </w:tcPr>
+          <w:p>
+            <w:r/>
+            <w:r>
+              <w:rPr>
+                <w:sz w:val="14"/>
+              </w:rPr>
+              <w:t>30.99</w:t>
+            </w:r>
+          </w:p>
+        </w:tc>
+        <w:tc>
+          <w:tcPr>
+            <w:tcW w:type="dxa" w:w="850"/>
+          </w:tcPr>
+          <w:p>
+            <w:r/>
+            <w:r>
+              <w:rPr>
+                <w:sz w:val="14"/>
+              </w:rPr>
+              <w:t>6 100</w:t>
+            </w:r>
+          </w:p>
+        </w:tc>
+        <w:tc>
+          <w:tcPr>
+            <w:tcW w:type="dxa" w:w="907"/>
+          </w:tcPr>
+          <w:p>
+            <w:r/>
+            <w:r>
+              <w:rPr>
+                <w:sz w:val="14"/>
+              </w:rPr>
+              <w:t>1 510</w:t>
+            </w:r>
+          </w:p>
+        </w:tc>
+        <w:tc>
+          <w:tcPr>
+            <w:tcW w:type="dxa" w:w="964"/>
+          </w:tcPr>
+          <w:p>
+            <w:r/>
+            <w:r>
+              <w:rPr>
+                <w:sz w:val="14"/>
+              </w:rPr>
+              <w:t>39 800</w:t>
+            </w:r>
+          </w:p>
+        </w:tc>
+        <w:tc>
+          <w:tcPr>
+            <w:tcW w:type="dxa" w:w="964"/>
+          </w:tcPr>
+          <w:p>
+            <w:r/>
+            <w:r>
+              <w:rPr>
+                <w:sz w:val="14"/>
+              </w:rPr>
+              <w:t>22 800</w:t>
+            </w:r>
+          </w:p>
+        </w:tc>
+      </w:tr>
+      <w:tr>
+        <w:tc>
+          <w:tcPr>
+            <w:tcW w:type="dxa" w:w="907"/>
+          </w:tcPr>
+          <w:p>
+            <w:r/>
+            <w:r>
+              <w:rPr>
+                <w:sz w:val="14"/>
+              </w:rPr>
+              <w:t>2023/24</w:t>
+            </w:r>
+          </w:p>
+        </w:tc>
+        <w:tc>
+          <w:tcPr>
+            <w:tcW w:type="dxa" w:w="1474"/>
+          </w:tcPr>
+          <w:p>
+            <w:r/>
+            <w:r>
+              <w:rPr>
+                <w:sz w:val="14"/>
+              </w:rPr>
+              <w:t>Historique</w:t>
+            </w:r>
+          </w:p>
+        </w:tc>
+        <w:tc>
+          <w:tcPr>
+            <w:tcW w:type="dxa" w:w="624"/>
+          </w:tcPr>
+          <w:p>
+            <w:r/>
+            <w:r>
+              <w:rPr>
+                <w:sz w:val="14"/>
+              </w:rPr>
+              <w:t>OFF</w:t>
+            </w:r>
+          </w:p>
+        </w:tc>
+        <w:tc>
+          <w:tcPr>
+            <w:tcW w:type="dxa" w:w="964"/>
+          </w:tcPr>
+          <w:p>
+            <w:r/>
+            <w:r>
+              <w:rPr>
+                <w:sz w:val="14"/>
+              </w:rPr>
+              <w:t>2 510</w:t>
+            </w:r>
+          </w:p>
+        </w:tc>
+        <w:tc>
+          <w:tcPr>
+            <w:tcW w:type="dxa" w:w="964"/>
+          </w:tcPr>
+          <w:p>
+            <w:r/>
+            <w:r>
+              <w:rPr>
+                <w:sz w:val="14"/>
+              </w:rPr>
+              <w:t>2 030</w:t>
+            </w:r>
+          </w:p>
+        </w:tc>
+        <w:tc>
+          <w:tcPr>
+            <w:tcW w:type="dxa" w:w="907"/>
+          </w:tcPr>
+          <w:p>
+            <w:r/>
+            <w:r>
+              <w:rPr>
+                <w:sz w:val="14"/>
+              </w:rPr>
+              <w:t>32.66</w:t>
+            </w:r>
+          </w:p>
+        </w:tc>
+        <w:tc>
+          <w:tcPr>
+            <w:tcW w:type="dxa" w:w="850"/>
+          </w:tcPr>
+          <w:p>
+            <w:r/>
+            <w:r>
+              <w:rPr>
+                <w:sz w:val="14"/>
+              </w:rPr>
+              <w:t>6 150</w:t>
+            </w:r>
+          </w:p>
+        </w:tc>
+        <w:tc>
+          <w:tcPr>
+            <w:tcW w:type="dxa" w:w="907"/>
+          </w:tcPr>
+          <w:p>
+            <w:r/>
+            <w:r>
+              <w:rPr>
+                <w:sz w:val="14"/>
+              </w:rPr>
+              <w:t>1 324</w:t>
+            </w:r>
+          </w:p>
+        </w:tc>
+        <w:tc>
+          <w:tcPr>
+            <w:tcW w:type="dxa" w:w="964"/>
+          </w:tcPr>
+          <w:p>
+            <w:r/>
+            <w:r>
+              <w:rPr>
+                <w:sz w:val="14"/>
+              </w:rPr>
+              <w:t>44 900</w:t>
+            </w:r>
+          </w:p>
+        </w:tc>
+        <w:tc>
+          <w:tcPr>
+            <w:tcW w:type="dxa" w:w="964"/>
+          </w:tcPr>
+          <w:p>
+            <w:r/>
+            <w:r>
+              <w:rPr>
+                <w:sz w:val="14"/>
+              </w:rPr>
+              <w:t>21 400</w:t>
+            </w:r>
+          </w:p>
+        </w:tc>
+      </w:tr>
+      <w:tr>
+        <w:tc>
+          <w:tcPr>
+            <w:tcW w:type="dxa" w:w="907"/>
+          </w:tcPr>
+          <w:p>
+            <w:r/>
+            <w:r>
+              <w:rPr>
+                <w:sz w:val="14"/>
+              </w:rPr>
+              <w:t>2024/25</w:t>
+            </w:r>
+          </w:p>
+        </w:tc>
+        <w:tc>
+          <w:tcPr>
+            <w:tcW w:type="dxa" w:w="1474"/>
+          </w:tcPr>
+          <w:p>
+            <w:r/>
+            <w:r>
+              <w:rPr>
+                <w:sz w:val="14"/>
+              </w:rPr>
+              <w:t>Historique</w:t>
+            </w:r>
+          </w:p>
+        </w:tc>
+        <w:tc>
+          <w:tcPr>
+            <w:tcW w:type="dxa" w:w="624"/>
+          </w:tcPr>
+          <w:p>
+            <w:r/>
+            <w:r>
+              <w:rPr>
+                <w:sz w:val="14"/>
+              </w:rPr>
+              <w:t>ON</w:t>
+            </w:r>
+          </w:p>
+        </w:tc>
+        <w:tc>
+          <w:tcPr>
+            <w:tcW w:type="dxa" w:w="964"/>
+          </w:tcPr>
+          <w:p>
+            <w:r/>
+            <w:r>
+              <w:rPr>
+                <w:sz w:val="14"/>
+              </w:rPr>
+              <w:t>2 235</w:t>
+            </w:r>
+          </w:p>
+        </w:tc>
+        <w:tc>
+          <w:tcPr>
+            <w:tcW w:type="dxa" w:w="964"/>
+          </w:tcPr>
+          <w:p>
+            <w:r/>
+            <w:r>
+              <w:rPr>
+                <w:sz w:val="14"/>
+              </w:rPr>
+              <w:t>1 881</w:t>
+            </w:r>
+          </w:p>
+        </w:tc>
+        <w:tc>
+          <w:tcPr>
+            <w:tcW w:type="dxa" w:w="907"/>
+          </w:tcPr>
+          <w:p>
+            <w:r/>
+            <w:r>
+              <w:rPr>
+                <w:sz w:val="14"/>
+              </w:rPr>
+              <w:t>34.82</w:t>
+            </w:r>
+          </w:p>
+        </w:tc>
+        <w:tc>
+          <w:tcPr>
+            <w:tcW w:type="dxa" w:w="850"/>
+          </w:tcPr>
+          <w:p>
+            <w:r/>
+            <w:r>
+              <w:rPr>
+                <w:sz w:val="14"/>
+              </w:rPr>
+              <w:t>6 577</w:t>
+            </w:r>
+          </w:p>
+        </w:tc>
+        <w:tc>
+          <w:tcPr>
+            <w:tcW w:type="dxa" w:w="907"/>
+          </w:tcPr>
+          <w:p>
+            <w:r/>
+            <w:r>
+              <w:rPr>
+                <w:sz w:val="14"/>
+              </w:rPr>
+              <w:t>1 306</w:t>
+            </w:r>
+          </w:p>
+        </w:tc>
+        <w:tc>
+          <w:tcPr>
+            <w:tcW w:type="dxa" w:w="964"/>
+          </w:tcPr>
+          <w:p>
+            <w:r/>
+            <w:r>
+              <w:rPr>
+                <w:sz w:val="14"/>
+              </w:rPr>
+              <w:t>44 500</w:t>
+            </w:r>
+          </w:p>
+        </w:tc>
+        <w:tc>
+          <w:tcPr>
+            <w:tcW w:type="dxa" w:w="964"/>
+          </w:tcPr>
+          <w:p>
+            <w:r/>
+            <w:r>
+              <w:rPr>
+                <w:sz w:val="14"/>
+              </w:rPr>
+              <w:t>21 000</w:t>
+            </w:r>
+          </w:p>
+        </w:tc>
+      </w:tr>
+      <w:tr>
+        <w:tc>
+          <w:tcPr>
+            <w:tcW w:type="dxa" w:w="907"/>
+          </w:tcPr>
+          <w:p>
+            <w:r/>
+            <w:r>
+              <w:rPr>
+                <w:sz w:val="14"/>
+              </w:rPr>
+              <w:t>2025/26</w:t>
+            </w:r>
+          </w:p>
+        </w:tc>
+        <w:tc>
+          <w:tcPr>
+            <w:tcW w:type="dxa" w:w="1474"/>
+          </w:tcPr>
+          <w:p>
+            <w:r/>
+            <w:r>
+              <w:rPr>
+                <w:sz w:val="14"/>
+              </w:rPr>
+              <w:t>Historique</w:t>
+            </w:r>
+          </w:p>
+        </w:tc>
+        <w:tc>
+          <w:tcPr>
+            <w:tcW w:type="dxa" w:w="624"/>
+          </w:tcPr>
+          <w:p>
+            <w:r/>
+            <w:r>
+              <w:rPr>
+                <w:sz w:val="14"/>
+              </w:rPr>
+              <w:t>OFF</w:t>
+            </w:r>
+          </w:p>
+        </w:tc>
+        <w:tc>
+          <w:tcPr>
+            <w:tcW w:type="dxa" w:w="964"/>
+          </w:tcPr>
+          <w:p>
+            <w:r/>
+            <w:r>
+              <w:rPr>
+                <w:sz w:val="14"/>
+              </w:rPr>
+              <w:t>2 255</w:t>
+            </w:r>
+          </w:p>
+        </w:tc>
+        <w:tc>
+          <w:tcPr>
+            <w:tcW w:type="dxa" w:w="964"/>
+          </w:tcPr>
+          <w:p>
+            <w:r/>
+            <w:r>
+              <w:rPr>
+                <w:sz w:val="14"/>
+              </w:rPr>
+              <w:t>1 859</w:t>
+            </w:r>
+          </w:p>
+        </w:tc>
+        <w:tc>
+          <w:tcPr>
+            <w:tcW w:type="dxa" w:w="907"/>
+          </w:tcPr>
+          <w:p>
+            <w:r/>
+            <w:r>
+              <w:rPr>
+                <w:sz w:val="14"/>
+              </w:rPr>
+              <w:t>33.89</w:t>
+            </w:r>
+          </w:p>
+        </w:tc>
+        <w:tc>
+          <w:tcPr>
+            <w:tcW w:type="dxa" w:w="850"/>
+          </w:tcPr>
+          <w:p>
+            <w:r/>
+            <w:r>
+              <w:rPr>
+                <w:sz w:val="14"/>
+              </w:rPr>
+              <w:t>6 482</w:t>
+            </w:r>
+          </w:p>
+        </w:tc>
+        <w:tc>
+          <w:tcPr>
+            <w:tcW w:type="dxa" w:w="907"/>
+          </w:tcPr>
+          <w:p>
+            <w:r/>
+            <w:r>
+              <w:rPr>
+                <w:sz w:val="14"/>
+              </w:rPr>
+              <w:t>1 440</w:t>
+            </w:r>
+          </w:p>
+        </w:tc>
+        <w:tc>
+          <w:tcPr>
+            <w:tcW w:type="dxa" w:w="964"/>
+          </w:tcPr>
+          <w:p>
+            <w:r/>
+            <w:r>
+              <w:rPr>
+                <w:sz w:val="14"/>
+              </w:rPr>
+              <w:t>38 000</w:t>
+            </w:r>
+          </w:p>
+        </w:tc>
+        <w:tc>
+          <w:tcPr>
+            <w:tcW w:type="dxa" w:w="964"/>
+          </w:tcPr>
+          <w:p>
+            <w:r/>
+            <w:r>
+              <w:rPr>
+                <w:sz w:val="14"/>
+              </w:rPr>
+              <w:t>25 000</w:t>
+            </w:r>
+          </w:p>
+        </w:tc>
+      </w:tr>
+      <w:tr>
+        <w:tc>
+          <w:tcPr>
+            <w:tcW w:type="dxa" w:w="907"/>
+          </w:tcPr>
+          <w:p>
+            <w:r/>
+            <w:r>
+              <w:rPr>
+                <w:sz w:val="14"/>
+              </w:rPr>
+              <w:t>2026/27</w:t>
+            </w:r>
+          </w:p>
+        </w:tc>
+        <w:tc>
+          <w:tcPr>
+            <w:tcW w:type="dxa" w:w="1474"/>
+          </w:tcPr>
+          <w:p>
+            <w:r/>
+            <w:r>
+              <w:rPr>
+                <w:sz w:val="14"/>
+              </w:rPr>
+              <w:t>Estimation USDA</w:t>
+            </w:r>
+          </w:p>
+        </w:tc>
+        <w:tc>
+          <w:tcPr>
+            <w:tcW w:type="dxa" w:w="624"/>
+          </w:tcPr>
+          <w:p>
+            <w:r/>
+            <w:r>
+              <w:rPr>
+                <w:sz w:val="14"/>
+              </w:rPr>
+              <w:t>ON</w:t>
+            </w:r>
+          </w:p>
+        </w:tc>
+        <w:tc>
+          <w:tcPr>
+            <w:tcW w:type="dxa" w:w="964"/>
+          </w:tcPr>
+          <w:p>
+            <w:r/>
+            <w:r>
+              <w:rPr>
+                <w:sz w:val="14"/>
+              </w:rPr>
+              <w:t>2 342</w:t>
+            </w:r>
+          </w:p>
+        </w:tc>
+        <w:tc>
+          <w:tcPr>
+            <w:tcW w:type="dxa" w:w="964"/>
+          </w:tcPr>
+          <w:p>
+            <w:r/>
+            <w:r>
+              <w:rPr>
+                <w:sz w:val="14"/>
+              </w:rPr>
+              <w:t>1 941</w:t>
+            </w:r>
+          </w:p>
+        </w:tc>
+        <w:tc>
+          <w:tcPr>
+            <w:tcW w:type="dxa" w:w="907"/>
+          </w:tcPr>
+          <w:p>
+            <w:r/>
+            <w:r>
+              <w:rPr>
+                <w:sz w:val="14"/>
+              </w:rPr>
+              <w:t>37.04</w:t>
+            </w:r>
+          </w:p>
+        </w:tc>
+        <w:tc>
+          <w:tcPr>
+            <w:tcW w:type="dxa" w:w="850"/>
+          </w:tcPr>
+          <w:p>
+            <w:r/>
+            <w:r>
+              <w:rPr>
+                <w:sz w:val="14"/>
+              </w:rPr>
+              <w:t>6 876</w:t>
+            </w:r>
+          </w:p>
+        </w:tc>
+        <w:tc>
+          <w:tcPr>
+            <w:tcW w:type="dxa" w:w="907"/>
+          </w:tcPr>
+          <w:p>
+            <w:r/>
+            <w:r>
+              <w:rPr>
+                <w:sz w:val="14"/>
+              </w:rPr>
+              <w:t>1 461</w:t>
+            </w:r>
+          </w:p>
+        </w:tc>
+        <w:tc>
+          <w:tcPr>
+            <w:tcW w:type="dxa" w:w="964"/>
+          </w:tcPr>
+          <w:p>
+            <w:r/>
+            <w:r>
+              <w:rPr>
+                <w:sz w:val="14"/>
+              </w:rPr>
+              <w:t>47 500</w:t>
+            </w:r>
+          </w:p>
+        </w:tc>
+        <w:tc>
+          <w:tcPr>
+            <w:tcW w:type="dxa" w:w="964"/>
+          </w:tcPr>
+          <w:p>
+            <w:r/>
+            <w:r>
+              <w:rPr>
+                <w:sz w:val="14"/>
+              </w:rPr>
+              <w:t>24 400</w:t>
+            </w:r>
+          </w:p>
+        </w:tc>
+      </w:tr>
+      <w:tr>
+        <w:tc>
+          <w:tcPr>
+            <w:tcW w:type="dxa" w:w="907"/>
+          </w:tcPr>
+          <w:p>
+            <w:r/>
+            <w:r>
+              <w:rPr>
+                <w:sz w:val="14"/>
+              </w:rPr>
+              <w:t>2027/28</w:t>
+            </w:r>
+          </w:p>
+        </w:tc>
+        <w:tc>
+          <w:tcPr>
+            <w:tcW w:type="dxa" w:w="1474"/>
+          </w:tcPr>
+          <w:p>
+            <w:r/>
+            <w:r>
+              <w:rPr>
+                <w:sz w:val="14"/>
+              </w:rPr>
+              <w:t>Prévision modèles, météo normale</w:t>
+            </w:r>
+          </w:p>
+        </w:tc>
+        <w:tc>
+          <w:tcPr>
+            <w:tcW w:type="dxa" w:w="624"/>
+          </w:tcPr>
+          <w:p>
+            <w:r/>
+            <w:r>
+              <w:rPr>
+                <w:sz w:val="14"/>
+              </w:rPr>
+              <w:t>OFF</w:t>
+            </w:r>
+          </w:p>
+        </w:tc>
+        <w:tc>
+          <w:tcPr>
+            <w:tcW w:type="dxa" w:w="964"/>
+          </w:tcPr>
+          <w:p>
+            <w:r/>
+            <w:r>
+              <w:rPr>
+                <w:sz w:val="14"/>
+              </w:rPr>
+              <w:t>2 350</w:t>
+            </w:r>
+          </w:p>
+        </w:tc>
+        <w:tc>
+          <w:tcPr>
+            <w:tcW w:type="dxa" w:w="964"/>
+          </w:tcPr>
+          <w:p>
+            <w:r/>
+            <w:r>
+              <w:rPr>
+                <w:sz w:val="14"/>
+              </w:rPr>
+              <w:t>1 940</w:t>
+            </w:r>
+          </w:p>
+        </w:tc>
+        <w:tc>
+          <w:tcPr>
+            <w:tcW w:type="dxa" w:w="907"/>
+          </w:tcPr>
+          <w:p>
+            <w:r/>
+            <w:r>
+              <w:rPr>
+                <w:sz w:val="14"/>
+              </w:rPr>
+              <w:t>34.19</w:t>
+            </w:r>
+          </w:p>
+        </w:tc>
+        <w:tc>
+          <w:tcPr>
+            <w:tcW w:type="dxa" w:w="850"/>
+          </w:tcPr>
+          <w:p>
+            <w:r/>
+            <w:r>
+              <w:rPr>
+                <w:sz w:val="14"/>
+              </w:rPr>
+              <w:t>7 007</w:t>
+            </w:r>
+          </w:p>
+        </w:tc>
+        <w:tc>
+          <w:tcPr>
+            <w:tcW w:type="dxa" w:w="907"/>
+          </w:tcPr>
+          <w:p>
+            <w:r/>
+            <w:r>
+              <w:rPr>
+                <w:sz w:val="14"/>
+              </w:rPr>
+              <w:t>1 461</w:t>
+            </w:r>
+          </w:p>
+        </w:tc>
+        <w:tc>
+          <w:tcPr>
+            <w:tcW w:type="dxa" w:w="964"/>
+          </w:tcPr>
+          <w:p>
+            <w:r/>
+            <w:r>
+              <w:rPr>
+                <w:sz w:val="14"/>
+              </w:rPr>
+              <w:t>43 119</w:t>
+            </w:r>
+          </w:p>
+        </w:tc>
+        <w:tc>
+          <w:tcPr>
+            <w:tcW w:type="dxa" w:w="964"/>
+          </w:tcPr>
+          <w:p>
+            <w:r/>
+            <w:r>
+              <w:rPr>
+                <w:sz w:val="14"/>
+              </w:rPr>
+              <w:t>23 196</w:t>
+            </w:r>
+          </w:p>
+        </w:tc>
+      </w:tr>
+      <w:tr>
+        <w:tc>
+          <w:tcPr>
+            <w:tcW w:type="dxa" w:w="907"/>
+          </w:tcPr>
+          <w:p>
+            <w:r/>
+            <w:r>
+              <w:rPr>
+                <w:sz w:val="14"/>
+              </w:rPr>
+              <w:t>2027/28</w:t>
+            </w:r>
+          </w:p>
+        </w:tc>
+        <w:tc>
+          <w:tcPr>
+            <w:tcW w:type="dxa" w:w="1474"/>
+          </w:tcPr>
+          <w:p>
+            <w:r/>
+            <w:r>
+              <w:rPr>
+                <w:sz w:val="14"/>
+              </w:rPr>
+              <w:t>Prévision modèles, El Niño ordinaire</w:t>
+            </w:r>
+          </w:p>
+        </w:tc>
+        <w:tc>
+          <w:tcPr>
+            <w:tcW w:type="dxa" w:w="624"/>
+          </w:tcPr>
+          <w:p>
+            <w:r/>
+            <w:r>
+              <w:rPr>
+                <w:sz w:val="14"/>
+              </w:rPr>
+              <w:t>OFF</w:t>
+            </w:r>
+          </w:p>
+        </w:tc>
+        <w:tc>
+          <w:tcPr>
+            <w:tcW w:type="dxa" w:w="964"/>
+          </w:tcPr>
+          <w:p>
+            <w:r/>
+            <w:r>
+              <w:rPr>
+                <w:sz w:val="14"/>
+              </w:rPr>
+              <w:t>2 350</w:t>
+            </w:r>
+          </w:p>
+        </w:tc>
+        <w:tc>
+          <w:tcPr>
+            <w:tcW w:type="dxa" w:w="964"/>
+          </w:tcPr>
+          <w:p>
+            <w:r/>
+            <w:r>
+              <w:rPr>
+                <w:sz w:val="14"/>
+              </w:rPr>
+              <w:t>1 940</w:t>
+            </w:r>
+          </w:p>
+        </w:tc>
+        <w:tc>
+          <w:tcPr>
+            <w:tcW w:type="dxa" w:w="907"/>
+          </w:tcPr>
+          <w:p>
+            <w:r/>
+            <w:r>
+              <w:rPr>
+                <w:sz w:val="14"/>
+              </w:rPr>
+              <w:t>32.87</w:t>
+            </w:r>
+          </w:p>
+        </w:tc>
+        <w:tc>
+          <w:tcPr>
+            <w:tcW w:type="dxa" w:w="850"/>
+          </w:tcPr>
+          <w:p>
+            <w:r/>
+            <w:r>
+              <w:rPr>
+                <w:sz w:val="14"/>
+              </w:rPr>
+              <w:t>7 007</w:t>
+            </w:r>
+          </w:p>
+        </w:tc>
+        <w:tc>
+          <w:tcPr>
+            <w:tcW w:type="dxa" w:w="907"/>
+          </w:tcPr>
+          <w:p>
+            <w:r/>
+            <w:r>
+              <w:rPr>
+                <w:sz w:val="14"/>
+              </w:rPr>
+              <w:t>1 461</w:t>
+            </w:r>
+          </w:p>
+        </w:tc>
+        <w:tc>
+          <w:tcPr>
+            <w:tcW w:type="dxa" w:w="964"/>
+          </w:tcPr>
+          <w:p>
+            <w:r/>
+            <w:r>
+              <w:rPr>
+                <w:sz w:val="14"/>
+              </w:rPr>
+              <w:t>41 218</w:t>
+            </w:r>
+          </w:p>
+        </w:tc>
+        <w:tc>
+          <w:tcPr>
+            <w:tcW w:type="dxa" w:w="964"/>
+          </w:tcPr>
+          <w:p>
+            <w:r/>
+            <w:r>
+              <w:rPr>
+                <w:sz w:val="14"/>
+              </w:rPr>
+              <w:t>22 533</w:t>
+            </w:r>
+          </w:p>
+        </w:tc>
+      </w:tr>
+      <w:tr>
+        <w:tc>
+          <w:tcPr>
+            <w:tcW w:type="dxa" w:w="907"/>
+          </w:tcPr>
+          <w:p>
+            <w:r/>
+            <w:r>
+              <w:rPr>
+                <w:sz w:val="14"/>
+              </w:rPr>
+              <w:t>2027/28</w:t>
+            </w:r>
+          </w:p>
+        </w:tc>
+        <w:tc>
+          <w:tcPr>
+            <w:tcW w:type="dxa" w:w="1474"/>
+          </w:tcPr>
+          <w:p>
+            <w:r/>
+            <w:r>
+              <w:rPr>
+                <w:sz w:val="14"/>
+              </w:rPr>
+              <w:t>Prévision modèles, El Niño fort</w:t>
+            </w:r>
+          </w:p>
+        </w:tc>
+        <w:tc>
+          <w:tcPr>
+            <w:tcW w:type="dxa" w:w="624"/>
+          </w:tcPr>
+          <w:p>
+            <w:r/>
+            <w:r>
+              <w:rPr>
+                <w:sz w:val="14"/>
+              </w:rPr>
+              <w:t>OFF</w:t>
+            </w:r>
+          </w:p>
+        </w:tc>
+        <w:tc>
+          <w:tcPr>
+            <w:tcW w:type="dxa" w:w="964"/>
+          </w:tcPr>
+          <w:p>
+            <w:r/>
+            <w:r>
+              <w:rPr>
+                <w:sz w:val="14"/>
+              </w:rPr>
+              <w:t>2 350</w:t>
+            </w:r>
+          </w:p>
+        </w:tc>
+        <w:tc>
+          <w:tcPr>
+            <w:tcW w:type="dxa" w:w="964"/>
+          </w:tcPr>
+          <w:p>
+            <w:r/>
+            <w:r>
+              <w:rPr>
+                <w:sz w:val="14"/>
+              </w:rPr>
+              <w:t>1 940</w:t>
+            </w:r>
+          </w:p>
+        </w:tc>
+        <w:tc>
+          <w:tcPr>
+            <w:tcW w:type="dxa" w:w="907"/>
+          </w:tcPr>
+          <w:p>
+            <w:r/>
+            <w:r>
+              <w:rPr>
+                <w:sz w:val="14"/>
+              </w:rPr>
+              <w:t>32.48</w:t>
+            </w:r>
+          </w:p>
+        </w:tc>
+        <w:tc>
+          <w:tcPr>
+            <w:tcW w:type="dxa" w:w="850"/>
+          </w:tcPr>
+          <w:p>
+            <w:r/>
+            <w:r>
+              <w:rPr>
+                <w:sz w:val="14"/>
+              </w:rPr>
+              <w:t>7 007</w:t>
+            </w:r>
+          </w:p>
+        </w:tc>
+        <w:tc>
+          <w:tcPr>
+            <w:tcW w:type="dxa" w:w="907"/>
+          </w:tcPr>
+          <w:p>
+            <w:r/>
+            <w:r>
+              <w:rPr>
+                <w:sz w:val="14"/>
+              </w:rPr>
+              <w:t>1 461</w:t>
+            </w:r>
+          </w:p>
+        </w:tc>
+        <w:tc>
+          <w:tcPr>
+            <w:tcW w:type="dxa" w:w="964"/>
+          </w:tcPr>
+          <w:p>
+            <w:r/>
+            <w:r>
+              <w:rPr>
+                <w:sz w:val="14"/>
+              </w:rPr>
+              <w:t>44 063</w:t>
+            </w:r>
+          </w:p>
+        </w:tc>
+        <w:tc>
+          <w:tcPr>
+            <w:tcW w:type="dxa" w:w="964"/>
+          </w:tcPr>
+          <w:p>
+            <w:r/>
+            <w:r>
+              <w:rPr>
+                <w:sz w:val="14"/>
+              </w:rPr>
+              <w:t>18 928</w:t>
+            </w:r>
+          </w:p>
+        </w:tc>
+      </w:tr>
+      <w:tr>
+        <w:tc>
+          <w:tcPr>
+            <w:tcW w:type="dxa" w:w="907"/>
+          </w:tcPr>
+          <w:p>
+            <w:r/>
+            <w:r>
+              <w:rPr>
+                <w:sz w:val="14"/>
+              </w:rPr>
+              <w:t>2027/28</w:t>
+            </w:r>
+          </w:p>
+        </w:tc>
+        <w:tc>
+          <w:tcPr>
+            <w:tcW w:type="dxa" w:w="1474"/>
+          </w:tcPr>
+          <w:p>
+            <w:r/>
+            <w:r>
+              <w:rPr>
+                <w:sz w:val="14"/>
+              </w:rPr>
+              <w:t>Ta ligne (tableau fourni)</w:t>
+            </w:r>
+          </w:p>
+        </w:tc>
+        <w:tc>
+          <w:tcPr>
+            <w:tcW w:type="dxa" w:w="624"/>
+          </w:tcPr>
+          <w:p>
+            <w:r/>
+            <w:r>
+              <w:rPr>
+                <w:sz w:val="14"/>
+              </w:rPr>
+              <w:t>OFF</w:t>
+            </w:r>
+          </w:p>
+        </w:tc>
+        <w:tc>
+          <w:tcPr>
+            <w:tcW w:type="dxa" w:w="964"/>
+          </w:tcPr>
+          <w:p>
+            <w:r/>
+            <w:r>
+              <w:rPr>
+                <w:sz w:val="14"/>
+              </w:rPr>
+              <w:t>–</w:t>
+            </w:r>
+          </w:p>
+        </w:tc>
+        <w:tc>
+          <w:tcPr>
+            <w:tcW w:type="dxa" w:w="964"/>
+          </w:tcPr>
+          <w:p>
+            <w:r/>
+            <w:r>
+              <w:rPr>
+                <w:sz w:val="14"/>
+              </w:rPr>
+              <w:t>1 906</w:t>
+            </w:r>
+          </w:p>
+        </w:tc>
+        <w:tc>
+          <w:tcPr>
+            <w:tcW w:type="dxa" w:w="907"/>
+          </w:tcPr>
+          <w:p>
+            <w:r/>
+            <w:r>
+              <w:rPr>
+                <w:sz w:val="14"/>
+              </w:rPr>
+              <w:t>34.82</w:t>
+            </w:r>
+          </w:p>
+        </w:tc>
+        <w:tc>
+          <w:tcPr>
+            <w:tcW w:type="dxa" w:w="850"/>
+          </w:tcPr>
+          <w:p>
+            <w:r/>
+            <w:r>
+              <w:rPr>
+                <w:sz w:val="14"/>
+              </w:rPr>
+              <w:t>6 807</w:t>
+            </w:r>
+          </w:p>
+        </w:tc>
+        <w:tc>
+          <w:tcPr>
+            <w:tcW w:type="dxa" w:w="907"/>
+          </w:tcPr>
+          <w:p>
+            <w:r/>
+            <w:r>
+              <w:rPr>
+                <w:sz w:val="14"/>
+              </w:rPr>
+              <w:t>1 592</w:t>
+            </w:r>
+          </w:p>
+        </w:tc>
+        <w:tc>
+          <w:tcPr>
+            <w:tcW w:type="dxa" w:w="964"/>
+          </w:tcPr>
+          <w:p>
+            <w:r/>
+            <w:r>
+              <w:rPr>
+                <w:sz w:val="14"/>
+              </w:rPr>
+              <w:t>41 325</w:t>
+            </w:r>
+          </w:p>
+        </w:tc>
+        <w:tc>
+          <w:tcPr>
+            <w:tcW w:type="dxa" w:w="964"/>
+          </w:tcPr>
+          <w:p>
+            <w:r/>
+            <w:r>
+              <w:rPr>
+                <w:sz w:val="14"/>
+              </w:rPr>
+              <w:t>22 226</w:t>
+            </w:r>
+          </w:p>
+        </w:tc>
+      </w:tr>
+    </w:tbl>
+    <w:p/>
+    <w:p>
+      <w:r>
+        <w:rPr>
+          <w:b w:val="0"/>
+          <w:i/>
+          <w:color w:val="52514E"/>
+          <w:sz w:val="16"/>
+        </w:rPr>
+        <w:t>Rendement = (arabica + robusta) / surface récoltée. Le tableau fourni indique 26,06 pour 2010/11 ; avec 54 500 / 2 175 on obtient 25,06.</w:t>
+      </w:r>
+    </w:p>
+    <w:p>
+      <w:r>
+        <w:rPr>
+          <w:b/>
+          <w:i w:val="0"/>
+          <w:sz w:val="20"/>
+        </w:rPr>
+        <w:t>Comment chaque case de 2027/28 est calculée :</w:t>
+      </w:r>
+    </w:p>
+    <w:p>
+      <w:pPr>
+        <w:pStyle w:val="ListBullet"/>
+      </w:pPr>
+      <w:r>
+        <w:rPr>
+          <w:sz w:val="17"/>
+        </w:rPr>
+        <w:t>Cycle : OFF. 2026/27 est ON, le cycle alterne.</w:t>
+      </w:r>
+    </w:p>
+    <w:p>
+      <w:pPr>
+        <w:pStyle w:val="ListBullet"/>
+      </w:pPr>
+      <w:r>
+        <w:rPr>
+          <w:sz w:val="17"/>
+        </w:rPr>
+        <w:t>Surface plantée 2 350 = 2 503 (droite en 2000/01) − 5.67 × 27 campagnes : la surface plantée baisse en moyenne de 5.7 milliers d'ha par an depuis 2001/02 (2 488 → 2 342). Dernière valeur USDA : 2 342.</w:t>
+      </w:r>
+    </w:p>
+    <w:p>
+      <w:pPr>
+        <w:pStyle w:val="ListBullet"/>
+      </w:pPr>
+      <w:r>
+        <w:rPr>
+          <w:sz w:val="17"/>
+        </w:rPr>
+        <w:t>Surface récoltée 1 940 = 2 258 − 11.79 × 27 : la surface en production recule de 11.8 milliers d'ha par an depuis 2001/02 (2 175 → 1 941), le rendement compense. Dernière valeur USDA : 1 941.</w:t>
+      </w:r>
+    </w:p>
+    <w:p>
+      <w:pPr>
+        <w:pStyle w:val="ListBullet"/>
+      </w:pPr>
+      <w:r>
+        <w:rPr>
+          <w:sz w:val="17"/>
+        </w:rPr>
+        <w:t>Arbres bearing 7 007 = 6 876 (2026/27) + 131 : le stock d'arbres en production gagne en moyenne 131 millions par an depuis 1998/99.</w:t>
+      </w:r>
+    </w:p>
+    <w:p>
+      <w:pPr>
+        <w:pStyle w:val="ListBullet"/>
+      </w:pPr>
+      <w:r>
+        <w:rPr>
+          <w:sz w:val="17"/>
+        </w:rPr>
+        <w:t>Arbres non-bearing 1 461 = 1 461, dernière valeur reconduite : aucune tendance stable sur cette série (marche aléatoire), l'intervalle 80 % va de 1 191 à 1 731.</w:t>
+      </w:r>
+    </w:p>
+    <w:p>
+      <w:pPr>
+        <w:pStyle w:val="ListBullet"/>
+      </w:pPr>
+      <w:r>
+        <w:rPr>
+          <w:sz w:val="17"/>
+        </w:rPr>
+        <w:t>Arabica 43 119 = 26 423 (point de départ 2001/02, année OFF) + 618 × 27 campagnes + 0 (année OFF, pas de bonus). Avec El Niño ordinaire (-4.4 % historique) : 41 218 ; avec El Niño fort (+2.2 %) : 44 063.</w:t>
+      </w:r>
+    </w:p>
+    <w:p>
+      <w:pPr>
+        <w:pStyle w:val="ListBullet"/>
+      </w:pPr>
+      <w:r>
+        <w:rPr>
+          <w:sz w:val="17"/>
+        </w:rPr>
+        <w:t>Robusta 23 196 = 7 813 + 570 × 27 campagnes (le report de surprise de 2025/26 ne joue plus). Avec El Niño ordinaire (-2.9 %) : 22 533 ; avec El Niño fort (-18.4 %) : 18 928.</w:t>
+      </w:r>
+    </w:p>
+    <w:p>
+      <w:pPr>
+        <w:pStyle w:val="ListBullet"/>
+      </w:pPr>
+      <w:r>
+        <w:rPr>
+          <w:sz w:val="17"/>
+        </w:rPr>
+        <w:t>Rendement 34.19 = (43 119 + 23 196) / 1 940 ; El Niño ordinaire 32.87 ; El Niño fort 32.48. Contrôle : le modèle de rendement direct (ON/OFF + tendance) donne 33.65 sacs/ha, soit 65 262 milliers de sacs par la surface récoltée : cohérent à 2 % près avec la production prévue.</w:t>
+      </w:r>
+    </w:p>
+    <w:p>
+      <w:pPr>
+        <w:pStyle w:val="ListBullet"/>
+      </w:pPr>
+      <w:r>
+        <w:rPr>
+          <w:sz w:val="17"/>
+        </w:rPr>
+        <w:t>Comparaison avec ta ligne : arabica 41 325 est entre mon scénario El Niño ordinaire (41 218) et la météo normale (43 119) ; robusta 22 226 est proche de mon El Niño ordinaire (22 533) ; ta surface récoltée 1 906 suppose un recul de 35 kha en un an, plus fort que la tendance (1 940) ; tes arbres bearing 6 807 supposent une baisse alors que la dérive historique est de +131 M par an.</w:t>
       </w:r>
     </w:p>
     <w:p>

</xml_diff>

<commit_message>
Brazil ENSO in the client's convention: RONI table, growing-season index, YoY change by species, Excel with charts; Linhares added to the NASA regions
Co-Authored-By: Claude Fable 5.1 <noreply@anthropic.com>
Claude-Session: https://claude.ai/code/session_01FCxjZoAHXMLJTirXSfbmgL
</commit_message>
<xml_diff>
--- a/timeseries/output/reports/Bresil_balance_sheet_cafe.docx
+++ b/timeseries/output/reports/Bresil_balance_sheet_cafe.docx
@@ -18,7 +18,7 @@
           <w:color w:val="52514E"/>
           <w:sz w:val="18"/>
         </w:rPr>
-        <w:t>Au 16 septembre 2026. Source des chiffres : balance sheet (onglet Brazil), USDA / CONAB. Classification ENSO : NOAA CPC episode list reproduced from memory (peak ONI approximate); drop the CPC table in data/oni.csv to replace it.</w:t>
+        <w:t>Au 16 septembre 2026. Source des chiffres : balance sheet (onglet Brazil), USDA / CONAB. Classification ENSO : official ONI/RONI table /home/user/procafe/timeseries/data/oni.csv.</w:t>
       </w:r>
     </w:p>
     <w:p>
@@ -4761,6 +4761,652 @@
       </w:tr>
     </w:tbl>
     <w:p/>
+    <w:p>
+      <w:r>
+        <w:rPr>
+          <w:b/>
+          <w:i w:val="0"/>
+          <w:sz w:val="20"/>
+        </w:rPr>
+        <w:t>Ta convention (index RONI de la saison de croissance, variation d'une campagne à l'autre, robusta et arabica séparés ; détail et graphiques dans brazil_enso_client.xlsx) :</w:t>
+      </w:r>
+    </w:p>
+    <w:tbl>
+      <w:tblPr>
+        <w:tblStyle w:val="LightGrid-Accent1"/>
+        <w:tblW w:type="auto" w:w="0"/>
+        <w:jc w:val="center"/>
+        <w:tblLook w:firstColumn="1" w:firstRow="1" w:lastColumn="0" w:lastRow="0" w:noHBand="0" w:noVBand="1" w:val="04A0"/>
+      </w:tblPr>
+      <w:tblGrid>
+        <w:gridCol w:w="1425"/>
+        <w:gridCol w:w="1425"/>
+        <w:gridCol w:w="1425"/>
+        <w:gridCol w:w="1425"/>
+        <w:gridCol w:w="1425"/>
+        <w:gridCol w:w="1425"/>
+        <w:gridCol w:w="1425"/>
+      </w:tblGrid>
+      <w:tr>
+        <w:tc>
+          <w:tcPr>
+            <w:tcW w:type="dxa" w:w="1474"/>
+          </w:tcPr>
+          <w:p>
+            <w:r/>
+            <w:r>
+              <w:rPr>
+                <w:b/>
+                <w:sz w:val="15"/>
+              </w:rPr>
+              <w:t>ENSO class</w:t>
+            </w:r>
+          </w:p>
+        </w:tc>
+        <w:tc>
+          <w:tcPr>
+            <w:tcW w:type="dxa" w:w="1247"/>
+          </w:tcPr>
+          <w:p>
+            <w:r/>
+            <w:r>
+              <w:rPr>
+                <w:b/>
+                <w:sz w:val="15"/>
+              </w:rPr>
+              <w:t>Index (RONI)</w:t>
+            </w:r>
+          </w:p>
+        </w:tc>
+        <w:tc>
+          <w:tcPr>
+            <w:tcW w:type="dxa" w:w="907"/>
+          </w:tcPr>
+          <w:p>
+            <w:r/>
+            <w:r>
+              <w:rPr>
+                <w:b/>
+                <w:sz w:val="15"/>
+              </w:rPr>
+              <w:t>Occurrences</w:t>
+            </w:r>
+          </w:p>
+        </w:tc>
+        <w:tc>
+          <w:tcPr>
+            <w:tcW w:type="dxa" w:w="1247"/>
+          </w:tcPr>
+          <w:p>
+            <w:r/>
+            <w:r>
+              <w:rPr>
+                <w:b/>
+                <w:sz w:val="15"/>
+              </w:rPr>
+              <w:t>Robusta avg change</w:t>
+            </w:r>
+          </w:p>
+        </w:tc>
+        <w:tc>
+          <w:tcPr>
+            <w:tcW w:type="dxa" w:w="1247"/>
+          </w:tcPr>
+          <w:p>
+            <w:r/>
+            <w:r>
+              <w:rPr>
+                <w:b/>
+                <w:sz w:val="15"/>
+              </w:rPr>
+              <w:t>Arabica avg change</w:t>
+            </w:r>
+          </w:p>
+        </w:tc>
+        <w:tc>
+          <w:tcPr>
+            <w:tcW w:type="dxa" w:w="1814"/>
+          </w:tcPr>
+          <w:p>
+            <w:r/>
+            <w:r>
+              <w:rPr>
+                <w:b/>
+                <w:sz w:val="15"/>
+              </w:rPr>
+              <w:t>Espírito Santo rain / temp dev.</w:t>
+            </w:r>
+          </w:p>
+        </w:tc>
+        <w:tc>
+          <w:tcPr>
+            <w:tcW w:type="dxa" w:w="2835"/>
+          </w:tcPr>
+          <w:p>
+            <w:r/>
+            <w:r>
+              <w:rPr>
+                <w:b/>
+                <w:sz w:val="15"/>
+              </w:rPr>
+              <w:t>Crop years</w:t>
+            </w:r>
+          </w:p>
+        </w:tc>
+      </w:tr>
+      <w:tr>
+        <w:tc>
+          <w:tcPr>
+            <w:tcW w:type="dxa" w:w="1474"/>
+          </w:tcPr>
+          <w:p>
+            <w:r/>
+            <w:r>
+              <w:rPr>
+                <w:sz w:val="15"/>
+              </w:rPr>
+              <w:t>El Nino strong</w:t>
+            </w:r>
+          </w:p>
+        </w:tc>
+        <w:tc>
+          <w:tcPr>
+            <w:tcW w:type="dxa" w:w="1247"/>
+          </w:tcPr>
+          <w:p>
+            <w:r/>
+            <w:r>
+              <w:rPr>
+                <w:sz w:val="15"/>
+              </w:rPr>
+              <w:t>&gt;= 1.6</w:t>
+            </w:r>
+          </w:p>
+        </w:tc>
+        <w:tc>
+          <w:tcPr>
+            <w:tcW w:type="dxa" w:w="907"/>
+          </w:tcPr>
+          <w:p>
+            <w:r/>
+            <w:r>
+              <w:rPr>
+                <w:sz w:val="15"/>
+              </w:rPr>
+              <w:t>1</w:t>
+            </w:r>
+          </w:p>
+        </w:tc>
+        <w:tc>
+          <w:tcPr>
+            <w:tcW w:type="dxa" w:w="1247"/>
+          </w:tcPr>
+          <w:p>
+            <w:r/>
+            <w:r>
+              <w:rPr>
+                <w:sz w:val="15"/>
+              </w:rPr>
+              <w:t>-21.1 %</w:t>
+            </w:r>
+          </w:p>
+        </w:tc>
+        <w:tc>
+          <w:tcPr>
+            <w:tcW w:type="dxa" w:w="1247"/>
+          </w:tcPr>
+          <w:p>
+            <w:r/>
+            <w:r>
+              <w:rPr>
+                <w:sz w:val="15"/>
+              </w:rPr>
+              <w:t>+26.3 %</w:t>
+            </w:r>
+          </w:p>
+        </w:tc>
+        <w:tc>
+          <w:tcPr>
+            <w:tcW w:type="dxa" w:w="1814"/>
+          </w:tcPr>
+          <w:p>
+            <w:r/>
+            <w:r>
+              <w:rPr>
+                <w:sz w:val="15"/>
+              </w:rPr>
+              <w:t>-472 mm / +1.3 °C</w:t>
+            </w:r>
+          </w:p>
+        </w:tc>
+        <w:tc>
+          <w:tcPr>
+            <w:tcW w:type="dxa" w:w="2835"/>
+          </w:tcPr>
+          <w:p>
+            <w:r/>
+            <w:r>
+              <w:rPr>
+                <w:sz w:val="15"/>
+              </w:rPr>
+              <w:t>2016/17</w:t>
+            </w:r>
+          </w:p>
+        </w:tc>
+      </w:tr>
+      <w:tr>
+        <w:tc>
+          <w:tcPr>
+            <w:tcW w:type="dxa" w:w="1474"/>
+          </w:tcPr>
+          <w:p>
+            <w:r/>
+            <w:r>
+              <w:rPr>
+                <w:sz w:val="15"/>
+              </w:rPr>
+              <w:t>El Nino normal</w:t>
+            </w:r>
+          </w:p>
+        </w:tc>
+        <w:tc>
+          <w:tcPr>
+            <w:tcW w:type="dxa" w:w="1247"/>
+          </w:tcPr>
+          <w:p>
+            <w:r/>
+            <w:r>
+              <w:rPr>
+                <w:sz w:val="15"/>
+              </w:rPr>
+              <w:t>0.7 to 1.5</w:t>
+            </w:r>
+          </w:p>
+        </w:tc>
+        <w:tc>
+          <w:tcPr>
+            <w:tcW w:type="dxa" w:w="907"/>
+          </w:tcPr>
+          <w:p>
+            <w:r/>
+            <w:r>
+              <w:rPr>
+                <w:sz w:val="15"/>
+              </w:rPr>
+              <w:t>3</w:t>
+            </w:r>
+          </w:p>
+        </w:tc>
+        <w:tc>
+          <w:tcPr>
+            <w:tcW w:type="dxa" w:w="1247"/>
+          </w:tcPr>
+          <w:p>
+            <w:r/>
+            <w:r>
+              <w:rPr>
+                <w:sz w:val="15"/>
+              </w:rPr>
+              <w:t>+5.3 %</w:t>
+            </w:r>
+          </w:p>
+        </w:tc>
+        <w:tc>
+          <w:tcPr>
+            <w:tcW w:type="dxa" w:w="1247"/>
+          </w:tcPr>
+          <w:p>
+            <w:r/>
+            <w:r>
+              <w:rPr>
+                <w:sz w:val="15"/>
+              </w:rPr>
+              <w:t>+3.4 %</w:t>
+            </w:r>
+          </w:p>
+        </w:tc>
+        <w:tc>
+          <w:tcPr>
+            <w:tcW w:type="dxa" w:w="1814"/>
+          </w:tcPr>
+          <w:p>
+            <w:r/>
+            <w:r>
+              <w:rPr>
+                <w:sz w:val="15"/>
+              </w:rPr>
+              <w:t>-131 mm / +0.8 °C</w:t>
+            </w:r>
+          </w:p>
+        </w:tc>
+        <w:tc>
+          <w:tcPr>
+            <w:tcW w:type="dxa" w:w="2835"/>
+          </w:tcPr>
+          <w:p>
+            <w:r/>
+            <w:r>
+              <w:rPr>
+                <w:sz w:val="15"/>
+              </w:rPr>
+              <w:t>2010/11, 2019/20, 2024/25</w:t>
+            </w:r>
+          </w:p>
+        </w:tc>
+      </w:tr>
+      <w:tr>
+        <w:tc>
+          <w:tcPr>
+            <w:tcW w:type="dxa" w:w="1474"/>
+          </w:tcPr>
+          <w:p>
+            <w:r/>
+            <w:r>
+              <w:rPr>
+                <w:sz w:val="15"/>
+              </w:rPr>
+              <w:t>El Nino weak</w:t>
+            </w:r>
+          </w:p>
+        </w:tc>
+        <w:tc>
+          <w:tcPr>
+            <w:tcW w:type="dxa" w:w="1247"/>
+          </w:tcPr>
+          <w:p>
+            <w:r/>
+            <w:r>
+              <w:rPr>
+                <w:sz w:val="15"/>
+              </w:rPr>
+              <w:t>0.5 to 0.7</w:t>
+            </w:r>
+          </w:p>
+        </w:tc>
+        <w:tc>
+          <w:tcPr>
+            <w:tcW w:type="dxa" w:w="907"/>
+          </w:tcPr>
+          <w:p>
+            <w:r/>
+            <w:r>
+              <w:rPr>
+                <w:sz w:val="15"/>
+              </w:rPr>
+              <w:t>1</w:t>
+            </w:r>
+          </w:p>
+        </w:tc>
+        <w:tc>
+          <w:tcPr>
+            <w:tcW w:type="dxa" w:w="1247"/>
+          </w:tcPr>
+          <w:p>
+            <w:r/>
+            <w:r>
+              <w:rPr>
+                <w:sz w:val="15"/>
+              </w:rPr>
+              <w:t>-21.8 %</w:t>
+            </w:r>
+          </w:p>
+        </w:tc>
+        <w:tc>
+          <w:tcPr>
+            <w:tcW w:type="dxa" w:w="1247"/>
+          </w:tcPr>
+          <w:p>
+            <w:r/>
+            <w:r>
+              <w:rPr>
+                <w:sz w:val="15"/>
+              </w:rPr>
+              <w:t>-3.2 %</w:t>
+            </w:r>
+          </w:p>
+        </w:tc>
+        <w:tc>
+          <w:tcPr>
+            <w:tcW w:type="dxa" w:w="1814"/>
+          </w:tcPr>
+          <w:p>
+            <w:r/>
+            <w:r>
+              <w:rPr>
+                <w:sz w:val="15"/>
+              </w:rPr>
+              <w:t>-327 mm / +0.6 °C</w:t>
+            </w:r>
+          </w:p>
+        </w:tc>
+        <w:tc>
+          <w:tcPr>
+            <w:tcW w:type="dxa" w:w="2835"/>
+          </w:tcPr>
+          <w:p>
+            <w:r/>
+            <w:r>
+              <w:rPr>
+                <w:sz w:val="15"/>
+              </w:rPr>
+              <w:t>2015/16</w:t>
+            </w:r>
+          </w:p>
+        </w:tc>
+      </w:tr>
+      <w:tr>
+        <w:tc>
+          <w:tcPr>
+            <w:tcW w:type="dxa" w:w="1474"/>
+          </w:tcPr>
+          <w:p>
+            <w:r/>
+            <w:r>
+              <w:rPr>
+                <w:sz w:val="15"/>
+              </w:rPr>
+              <w:t>Neutral</w:t>
+            </w:r>
+          </w:p>
+        </w:tc>
+        <w:tc>
+          <w:tcPr>
+            <w:tcW w:type="dxa" w:w="1247"/>
+          </w:tcPr>
+          <w:p>
+            <w:r/>
+            <w:r>
+              <w:rPr>
+                <w:sz w:val="15"/>
+              </w:rPr>
+              <w:t>-0.7 to 0.5</w:t>
+            </w:r>
+          </w:p>
+        </w:tc>
+        <w:tc>
+          <w:tcPr>
+            <w:tcW w:type="dxa" w:w="907"/>
+          </w:tcPr>
+          <w:p>
+            <w:r/>
+            <w:r>
+              <w:rPr>
+                <w:sz w:val="15"/>
+              </w:rPr>
+              <w:t>3</w:t>
+            </w:r>
+          </w:p>
+        </w:tc>
+        <w:tc>
+          <w:tcPr>
+            <w:tcW w:type="dxa" w:w="1247"/>
+          </w:tcPr>
+          <w:p>
+            <w:r/>
+            <w:r>
+              <w:rPr>
+                <w:sz w:val="15"/>
+              </w:rPr>
+              <w:t>+6.3 %</w:t>
+            </w:r>
+          </w:p>
+        </w:tc>
+        <w:tc>
+          <w:tcPr>
+            <w:tcW w:type="dxa" w:w="1247"/>
+          </w:tcPr>
+          <w:p>
+            <w:r/>
+            <w:r>
+              <w:rPr>
+                <w:sz w:val="15"/>
+              </w:rPr>
+              <w:t>+2.3 %</w:t>
+            </w:r>
+          </w:p>
+        </w:tc>
+        <w:tc>
+          <w:tcPr>
+            <w:tcW w:type="dxa" w:w="1814"/>
+          </w:tcPr>
+          <w:p>
+            <w:r/>
+            <w:r>
+              <w:rPr>
+                <w:sz w:val="15"/>
+              </w:rPr>
+              <w:t>+17 mm / -0.0 °C</w:t>
+            </w:r>
+          </w:p>
+        </w:tc>
+        <w:tc>
+          <w:tcPr>
+            <w:tcW w:type="dxa" w:w="2835"/>
+          </w:tcPr>
+          <w:p>
+            <w:r/>
+            <w:r>
+              <w:rPr>
+                <w:sz w:val="15"/>
+              </w:rPr>
+              <w:t>2013/14, 2014/15, 2020/21</w:t>
+            </w:r>
+          </w:p>
+        </w:tc>
+      </w:tr>
+      <w:tr>
+        <w:tc>
+          <w:tcPr>
+            <w:tcW w:type="dxa" w:w="1474"/>
+          </w:tcPr>
+          <w:p>
+            <w:r/>
+            <w:r>
+              <w:rPr>
+                <w:sz w:val="15"/>
+              </w:rPr>
+              <w:t>La Nina</w:t>
+            </w:r>
+          </w:p>
+        </w:tc>
+        <w:tc>
+          <w:tcPr>
+            <w:tcW w:type="dxa" w:w="1247"/>
+          </w:tcPr>
+          <w:p>
+            <w:r/>
+            <w:r>
+              <w:rPr>
+                <w:sz w:val="15"/>
+              </w:rPr>
+              <w:t>&lt;= -0.7</w:t>
+            </w:r>
+          </w:p>
+        </w:tc>
+        <w:tc>
+          <w:tcPr>
+            <w:tcW w:type="dxa" w:w="907"/>
+          </w:tcPr>
+          <w:p>
+            <w:r/>
+            <w:r>
+              <w:rPr>
+                <w:sz w:val="15"/>
+              </w:rPr>
+              <w:t>10</w:t>
+            </w:r>
+          </w:p>
+        </w:tc>
+        <w:tc>
+          <w:tcPr>
+            <w:tcW w:type="dxa" w:w="1247"/>
+          </w:tcPr>
+          <w:p>
+            <w:r/>
+            <w:r>
+              <w:rPr>
+                <w:sz w:val="15"/>
+              </w:rPr>
+              <w:t>+10.4 %</w:t>
+            </w:r>
+          </w:p>
+        </w:tc>
+        <w:tc>
+          <w:tcPr>
+            <w:tcW w:type="dxa" w:w="1247"/>
+          </w:tcPr>
+          <w:p>
+            <w:r/>
+            <w:r>
+              <w:rPr>
+                <w:sz w:val="15"/>
+              </w:rPr>
+              <w:t>+2.5 %</w:t>
+            </w:r>
+          </w:p>
+        </w:tc>
+        <w:tc>
+          <w:tcPr>
+            <w:tcW w:type="dxa" w:w="1814"/>
+          </w:tcPr>
+          <w:p>
+            <w:r/>
+            <w:r>
+              <w:rPr>
+                <w:sz w:val="15"/>
+              </w:rPr>
+              <w:t>+19 mm / -0.1 °C</w:t>
+            </w:r>
+          </w:p>
+        </w:tc>
+        <w:tc>
+          <w:tcPr>
+            <w:tcW w:type="dxa" w:w="2835"/>
+          </w:tcPr>
+          <w:p>
+            <w:r/>
+            <w:r>
+              <w:rPr>
+                <w:sz w:val="15"/>
+              </w:rPr>
+              <w:t>2008/09, 2009/10, 2011/12, 2012/13, 2017/18, 2018/19, 2021/22, 2022/23, 2023/24, 2025/26</w:t>
+            </w:r>
+          </w:p>
+        </w:tc>
+      </w:tr>
+    </w:tbl>
+    <w:p/>
+    <w:p>
+      <w:r>
+        <w:rPr>
+          <w:b w:val="0"/>
+          <w:i/>
+          <w:color w:val="52514E"/>
+          <w:sz w:val="16"/>
+        </w:rPr>
+        <w:t>Index de la campagne Y/Y+1 = valeur extrême du RONI entre SON de Y−1 et FMA de Y (floraison → fin du remplissage). Classement identique à ta liste ; 2009/10 ressort La Niña par l'index (−1,0) alors qu'elle n'y figurait pas. Espírito Santo = moyenne de l'État, en attendant São Mateus et Linhares (NASA POWER).</w:t>
+      </w:r>
+    </w:p>
     <w:p>
       <w:r>
         <w:rPr>

</xml_diff>

<commit_message>
Brazil ENSO client table: two El Nino classes (strong >= 1.6, normal otherwise)
Co-Authored-By: Claude Fable 5.1 <noreply@anthropic.com>
Claude-Session: https://claude.ai/code/session_01FCxjZoAHXMLJTirXSfbmgL
</commit_message>
<xml_diff>
--- a/timeseries/output/reports/Bresil_balance_sheet_cafe.docx
+++ b/timeseries/output/reports/Bresil_balance_sheet_cafe.docx
@@ -5019,7 +5019,7 @@
               <w:rPr>
                 <w:sz w:val="15"/>
               </w:rPr>
-              <w:t>0.7 to 1.5</w:t>
+              <w:t>0.5 to 1.5</w:t>
             </w:r>
           </w:p>
         </w:tc>
@@ -5033,7 +5033,7 @@
               <w:rPr>
                 <w:sz w:val="15"/>
               </w:rPr>
-              <w:t>3</w:t>
+              <w:t>4</w:t>
             </w:r>
           </w:p>
         </w:tc>
@@ -5047,7 +5047,7 @@
               <w:rPr>
                 <w:sz w:val="15"/>
               </w:rPr>
-              <w:t>+5.3 %</w:t>
+              <w:t>-1.5 %</w:t>
             </w:r>
           </w:p>
         </w:tc>
@@ -5061,7 +5061,7 @@
               <w:rPr>
                 <w:sz w:val="15"/>
               </w:rPr>
-              <w:t>+3.4 %</w:t>
+              <w:t>+1.8 %</w:t>
             </w:r>
           </w:p>
         </w:tc>
@@ -5075,7 +5075,7 @@
               <w:rPr>
                 <w:sz w:val="15"/>
               </w:rPr>
-              <w:t>-131 mm / +0.8 °C</w:t>
+              <w:t>-180 mm / +0.8 °C</w:t>
             </w:r>
           </w:p>
         </w:tc>
@@ -5089,107 +5089,7 @@
               <w:rPr>
                 <w:sz w:val="15"/>
               </w:rPr>
-              <w:t>2010/11, 2019/20, 2024/25</w:t>
-            </w:r>
-          </w:p>
-        </w:tc>
-      </w:tr>
-      <w:tr>
-        <w:tc>
-          <w:tcPr>
-            <w:tcW w:type="dxa" w:w="1474"/>
-          </w:tcPr>
-          <w:p>
-            <w:r/>
-            <w:r>
-              <w:rPr>
-                <w:sz w:val="15"/>
-              </w:rPr>
-              <w:t>El Nino weak</w:t>
-            </w:r>
-          </w:p>
-        </w:tc>
-        <w:tc>
-          <w:tcPr>
-            <w:tcW w:type="dxa" w:w="1247"/>
-          </w:tcPr>
-          <w:p>
-            <w:r/>
-            <w:r>
-              <w:rPr>
-                <w:sz w:val="15"/>
-              </w:rPr>
-              <w:t>0.5 to 0.7</w:t>
-            </w:r>
-          </w:p>
-        </w:tc>
-        <w:tc>
-          <w:tcPr>
-            <w:tcW w:type="dxa" w:w="907"/>
-          </w:tcPr>
-          <w:p>
-            <w:r/>
-            <w:r>
-              <w:rPr>
-                <w:sz w:val="15"/>
-              </w:rPr>
-              <w:t>1</w:t>
-            </w:r>
-          </w:p>
-        </w:tc>
-        <w:tc>
-          <w:tcPr>
-            <w:tcW w:type="dxa" w:w="1247"/>
-          </w:tcPr>
-          <w:p>
-            <w:r/>
-            <w:r>
-              <w:rPr>
-                <w:sz w:val="15"/>
-              </w:rPr>
-              <w:t>-21.8 %</w:t>
-            </w:r>
-          </w:p>
-        </w:tc>
-        <w:tc>
-          <w:tcPr>
-            <w:tcW w:type="dxa" w:w="1247"/>
-          </w:tcPr>
-          <w:p>
-            <w:r/>
-            <w:r>
-              <w:rPr>
-                <w:sz w:val="15"/>
-              </w:rPr>
-              <w:t>-3.2 %</w:t>
-            </w:r>
-          </w:p>
-        </w:tc>
-        <w:tc>
-          <w:tcPr>
-            <w:tcW w:type="dxa" w:w="1814"/>
-          </w:tcPr>
-          <w:p>
-            <w:r/>
-            <w:r>
-              <w:rPr>
-                <w:sz w:val="15"/>
-              </w:rPr>
-              <w:t>-327 mm / +0.6 °C</w:t>
-            </w:r>
-          </w:p>
-        </w:tc>
-        <w:tc>
-          <w:tcPr>
-            <w:tcW w:type="dxa" w:w="2835"/>
-          </w:tcPr>
-          <w:p>
-            <w:r/>
-            <w:r>
-              <w:rPr>
-                <w:sz w:val="15"/>
-              </w:rPr>
-              <w:t>2015/16</w:t>
+              <w:t>2010/11, 2015/16, 2019/20, 2024/25</w:t>
             </w:r>
           </w:p>
         </w:tc>

</xml_diff>

<commit_message>
Brazil ENSO client table: neutral band -0.5 to 0.5
Co-Authored-By: Claude Fable 5.1 <noreply@anthropic.com>
Claude-Session: https://claude.ai/code/session_01FCxjZoAHXMLJTirXSfbmgL
</commit_message>
<xml_diff>
--- a/timeseries/output/reports/Bresil_balance_sheet_cafe.docx
+++ b/timeseries/output/reports/Bresil_balance_sheet_cafe.docx
@@ -5119,7 +5119,7 @@
               <w:rPr>
                 <w:sz w:val="15"/>
               </w:rPr>
-              <w:t>-0.7 to 0.5</w:t>
+              <w:t>-0.5 to 0.5</w:t>
             </w:r>
           </w:p>
         </w:tc>
@@ -5133,7 +5133,7 @@
               <w:rPr>
                 <w:sz w:val="15"/>
               </w:rPr>
-              <w:t>3</w:t>
+              <w:t>2</w:t>
             </w:r>
           </w:p>
         </w:tc>
@@ -5147,7 +5147,7 @@
               <w:rPr>
                 <w:sz w:val="15"/>
               </w:rPr>
-              <w:t>+6.3 %</w:t>
+              <w:t>+9.8 %</w:t>
             </w:r>
           </w:p>
         </w:tc>
@@ -5161,7 +5161,7 @@
               <w:rPr>
                 <w:sz w:val="15"/>
               </w:rPr>
-              <w:t>+2.3 %</w:t>
+              <w:t>+3.8 %</w:t>
             </w:r>
           </w:p>
         </w:tc>
@@ -5175,7 +5175,7 @@
               <w:rPr>
                 <w:sz w:val="15"/>
               </w:rPr>
-              <w:t>+17 mm / -0.0 °C</w:t>
+              <w:t>+103 mm / -0.1 °C</w:t>
             </w:r>
           </w:p>
         </w:tc>
@@ -5189,7 +5189,7 @@
               <w:rPr>
                 <w:sz w:val="15"/>
               </w:rPr>
-              <w:t>2013/14, 2014/15, 2020/21</w:t>
+              <w:t>2014/15, 2020/21</w:t>
             </w:r>
           </w:p>
         </w:tc>
@@ -5219,7 +5219,7 @@
               <w:rPr>
                 <w:sz w:val="15"/>
               </w:rPr>
-              <w:t>&lt;= -0.7</w:t>
+              <w:t>&lt;= -0.5</w:t>
             </w:r>
           </w:p>
         </w:tc>
@@ -5233,7 +5233,7 @@
               <w:rPr>
                 <w:sz w:val="15"/>
               </w:rPr>
-              <w:t>10</w:t>
+              <w:t>11</w:t>
             </w:r>
           </w:p>
         </w:tc>
@@ -5247,7 +5247,7 @@
               <w:rPr>
                 <w:sz w:val="15"/>
               </w:rPr>
-              <w:t>+10.4 %</w:t>
+              <w:t>+9.4 %</w:t>
             </w:r>
           </w:p>
         </w:tc>
@@ -5261,7 +5261,7 @@
               <w:rPr>
                 <w:sz w:val="15"/>
               </w:rPr>
-              <w:t>+2.5 %</w:t>
+              <w:t>+2.3 %</w:t>
             </w:r>
           </w:p>
         </w:tc>
@@ -5275,7 +5275,7 @@
               <w:rPr>
                 <w:sz w:val="15"/>
               </w:rPr>
-              <w:t>+19 mm / -0.1 °C</w:t>
+              <w:t>+3 mm / -0.1 °C</w:t>
             </w:r>
           </w:p>
         </w:tc>
@@ -5289,7 +5289,7 @@
               <w:rPr>
                 <w:sz w:val="15"/>
               </w:rPr>
-              <w:t>2008/09, 2009/10, 2011/12, 2012/13, 2017/18, 2018/19, 2021/22, 2022/23, 2023/24, 2025/26</w:t>
+              <w:t>2008/09, 2009/10, 2011/12, 2012/13, 2013/14, 2017/18, 2018/19, 2021/22, 2022/23, 2023/24, 2025/26</w:t>
             </w:r>
           </w:p>
         </w:tc>
@@ -5304,7 +5304,7 @@
           <w:color w:val="52514E"/>
           <w:sz w:val="16"/>
         </w:rPr>
-        <w:t>Index de la campagne Y/Y+1 = valeur extrême du RONI entre SON de Y−1 et FMA de Y (floraison → fin du remplissage). Classement identique à ta liste (2009/10 La Niña, index −1,0 ; 2010/11 El Niño normal, index +1,5). Espírito Santo = moyenne de l'État, en attendant São Mateus et Linhares (NASA POWER).</w:t>
+        <w:t>Index de la campagne Y/Y+1 = valeur extrême du RONI entre SON de Y−1 et FMA de Y (floraison → fin du remplissage). Seuils : El Niño fort ≥ 1,6, El Niño normal 0,5 à 1,5, neutre entre −0,5 et 0,5, La Niña ≤ −0,5. Espírito Santo = moyenne de l'État, en attendant São Mateus et Linhares (NASA POWER).</w:t>
       </w:r>
     </w:p>
     <w:p>

</xml_diff>

<commit_message>
Brazil ENSO client table: 2015/16 counted as strong El Nino (peak 2.3 inside the marketing year)
Co-Authored-By: Claude Fable 5.1 <noreply@anthropic.com>
Claude-Session: https://claude.ai/code/session_01FCxjZoAHXMLJTirXSfbmgL
</commit_message>
<xml_diff>
--- a/timeseries/output/reports/Bresil_balance_sheet_cafe.docx
+++ b/timeseries/output/reports/Bresil_balance_sheet_cafe.docx
@@ -4933,7 +4933,7 @@
               <w:rPr>
                 <w:sz w:val="15"/>
               </w:rPr>
-              <w:t>1</w:t>
+              <w:t>2</w:t>
             </w:r>
           </w:p>
         </w:tc>
@@ -4947,7 +4947,7 @@
               <w:rPr>
                 <w:sz w:val="15"/>
               </w:rPr>
-              <w:t>-21.1 %</w:t>
+              <w:t>-21.4 %</w:t>
             </w:r>
           </w:p>
         </w:tc>
@@ -4961,7 +4961,7 @@
               <w:rPr>
                 <w:sz w:val="15"/>
               </w:rPr>
-              <w:t>+26.3 %</w:t>
+              <w:t>+11.6 %</w:t>
             </w:r>
           </w:p>
         </w:tc>
@@ -4975,7 +4975,7 @@
               <w:rPr>
                 <w:sz w:val="15"/>
               </w:rPr>
-              <w:t>-472 mm / +1.3 °C</w:t>
+              <w:t>-399 mm / +0.9 °C</w:t>
             </w:r>
           </w:p>
         </w:tc>
@@ -4989,7 +4989,7 @@
               <w:rPr>
                 <w:sz w:val="15"/>
               </w:rPr>
-              <w:t>2016/17</w:t>
+              <w:t>2015/16, 2016/17</w:t>
             </w:r>
           </w:p>
         </w:tc>
@@ -5033,7 +5033,7 @@
               <w:rPr>
                 <w:sz w:val="15"/>
               </w:rPr>
-              <w:t>4</w:t>
+              <w:t>3</w:t>
             </w:r>
           </w:p>
         </w:tc>
@@ -5047,7 +5047,7 @@
               <w:rPr>
                 <w:sz w:val="15"/>
               </w:rPr>
-              <w:t>-1.5 %</w:t>
+              <w:t>+5.3 %</w:t>
             </w:r>
           </w:p>
         </w:tc>
@@ -5061,7 +5061,7 @@
               <w:rPr>
                 <w:sz w:val="15"/>
               </w:rPr>
-              <w:t>+1.8 %</w:t>
+              <w:t>+3.4 %</w:t>
             </w:r>
           </w:p>
         </w:tc>
@@ -5075,7 +5075,7 @@
               <w:rPr>
                 <w:sz w:val="15"/>
               </w:rPr>
-              <w:t>-180 mm / +0.8 °C</w:t>
+              <w:t>-131 mm / +0.8 °C</w:t>
             </w:r>
           </w:p>
         </w:tc>
@@ -5089,7 +5089,7 @@
               <w:rPr>
                 <w:sz w:val="15"/>
               </w:rPr>
-              <w:t>2010/11, 2015/16, 2019/20, 2024/25</w:t>
+              <w:t>2010/11, 2019/20, 2024/25</w:t>
             </w:r>
           </w:p>
         </w:tc>
@@ -5304,7 +5304,7 @@
           <w:color w:val="52514E"/>
           <w:sz w:val="16"/>
         </w:rPr>
-        <w:t>Index de la campagne Y/Y+1 = valeur extrême du RONI entre SON de Y−1 et FMA de Y (floraison → fin du remplissage). Seuils : El Niño fort ≥ 1,6, El Niño normal 0,5 à 1,5, neutre entre −0,5 et 0,5, La Niña ≤ −0,5. Espírito Santo = moyenne de l'État, en attendant São Mateus et Linhares (NASA POWER).</w:t>
+        <w:t>Index de la campagne Y/Y+1 = valeur extrême du RONI entre SON de Y−1 et FMA de Y (floraison → fin du remplissage). Seuils : El Niño fort ≥ 1,6 (index de croissance, ou pic ≥ 1,6 pendant la campagne : 2015/16), El Niño normal 0,5 à 1,5, neutre entre −0,5 et 0,5, La Niña ≤ −0,5. Espírito Santo = moyenne de l'État, en attendant São Mateus et Linhares (NASA POWER).</w:t>
       </w:r>
     </w:p>
     <w:p>

</xml_diff>

<commit_message>
Brazil: exclude the 2002/03 episode (campaign 2003/04) from the ENSO averages
Co-Authored-By: Claude Fable 5.1 <noreply@anthropic.com>
Claude-Session: https://claude.ai/code/session_01FCxjZoAHXMLJTirXSfbmgL
</commit_message>
<xml_diff>
--- a/timeseries/output/reports/Bresil_balance_sheet_cafe.docx
+++ b/timeseries/output/reports/Bresil_balance_sheet_cafe.docx
@@ -69,7 +69,7 @@
         <w:rPr>
           <w:sz w:val="20"/>
         </w:rPr>
-        <w:t>El Niño : rendement en moyenne -4.5 % par rapport aux campagnes voisines sur 7 campagnes (86 % d'entre elles sous la moyenne) ; El Niño fort : -7.2 % (4 campagnes, 100 % sous la moyenne). La Niña : +0.1 % (10 campagnes).</w:t>
+        <w:t>El Niño : rendement en moyenne -1.9 % par rapport aux campagnes voisines sur 6 campagnes (83 % d'entre elles sous la moyenne) ; El Niño fort : -2.7 % (3 campagnes, 100 % sous la moyenne). La Niña : +0.4 % (11 campagnes).</w:t>
       </w:r>
     </w:p>
     <w:p>
@@ -80,7 +80,7 @@
         <w:rPr>
           <w:sz w:val="20"/>
         </w:rPr>
-        <w:t>El Niño fort (pic ≥ 1,6 : épisodes 2009/10, 2015/16, campagnes suivantes 2010/11, 2016/17) : Minas Gerais -116 mm et +0.4 °C, Espírito Santo -277 mm et +0.8 °C. Robusta -18.4 % par rapport à l'attendu, arabica +2.2 % (années ON, qui tiennent grâce au cycle), total -3.4 %.</w:t>
+        <w:t>El Niño fort (pic ≥ 1,6 : épisodes 2015/16, campagnes suivantes 2016/17) : Minas Gerais -118 mm et +0.8 °C, Espírito Santo -492 mm et +1.3 °C. Robusta -29.7 % par rapport à l'attendu, arabica +3.0 % (années ON, qui tiennent grâce au cycle), total -5.8 %.</w:t>
       </w:r>
     </w:p>
     <w:p>
@@ -91,7 +91,7 @@
         <w:rPr>
           <w:sz w:val="20"/>
         </w:rPr>
-        <w:t>El Niño ordinaire (pic entre 0,6 et 1,6, 2023/24 inclus : 2002/03, 2004/05, 2006/07, 2018/19, 2023/24) : arabica -4.4 %, robusta -2.9 %, total -4.1 % ; Minas Gerais -6 mm, Espírito Santo -0 mm : pas de signal net.</w:t>
+        <w:t>El Niño ordinaire (pic entre 0,6 et 1,6, 2023/24 inclus : 2004/05, 2006/07, 2009/10, 2018/19, 2023/24) : arabica -1.4 %, robusta -2.5 %, total -1.9 % ; Minas Gerais -52 mm, Espírito Santo +18 mm : pas de signal net.</w:t>
       </w:r>
     </w:p>
     <w:p>
@@ -113,7 +113,7 @@
         <w:rPr>
           <w:sz w:val="20"/>
         </w:rPr>
-        <w:t>Prévision Production Total 2027/28 : 70 056 (intervalle 80 % 65 509 – 74 604) par le modèle ARMA ; avec l'effet El Niño historique moyen (-3.9 %) : 67 310.</w:t>
+        <w:t>Prévision Production Total 2027/28 : 70 056 (intervalle 80 % 65 509 – 74 604) par le modèle ARMA ; avec l'effet El Niño historique moyen (-2.5 %) : 68 291.</w:t>
       </w:r>
     </w:p>
     <w:p>
@@ -2084,7 +2084,7 @@
               <w:rPr>
                 <w:sz w:val="16"/>
               </w:rPr>
-              <w:t>2003/04</w:t>
+              <w:t>2022/23</w:t>
             </w:r>
           </w:p>
         </w:tc>
@@ -2098,7 +2098,7 @@
               <w:rPr>
                 <w:sz w:val="16"/>
               </w:rPr>
-              <w:t>-20.5 %</w:t>
+              <w:t>-9.8 %</w:t>
             </w:r>
           </w:p>
         </w:tc>
@@ -2112,7 +2112,7 @@
               <w:rPr>
                 <w:sz w:val="16"/>
               </w:rPr>
-              <w:t>-47.4 %</w:t>
+              <w:t>+7.2 %</w:t>
             </w:r>
           </w:p>
         </w:tc>
@@ -2126,7 +2126,7 @@
               <w:rPr>
                 <w:sz w:val="16"/>
               </w:rPr>
-              <w:t>El Niño 2002/03 (+1.3)</w:t>
+              <w:t>La Niña 2021/22 (-1.3)</w:t>
             </w:r>
           </w:p>
         </w:tc>
@@ -2155,7 +2155,7 @@
               <w:rPr>
                 <w:sz w:val="16"/>
               </w:rPr>
-              <w:t>2022/23</w:t>
+              <w:t>2016/17</w:t>
             </w:r>
           </w:p>
         </w:tc>
@@ -2169,7 +2169,7 @@
               <w:rPr>
                 <w:sz w:val="16"/>
               </w:rPr>
-              <w:t>-9.8 %</w:t>
+              <w:t>-6.1 %</w:t>
             </w:r>
           </w:p>
         </w:tc>
@@ -2183,7 +2183,7 @@
               <w:rPr>
                 <w:sz w:val="16"/>
               </w:rPr>
-              <w:t>+7.2 %</w:t>
+              <w:t>+13.6 %</w:t>
             </w:r>
           </w:p>
         </w:tc>
@@ -2197,7 +2197,7 @@
               <w:rPr>
                 <w:sz w:val="16"/>
               </w:rPr>
-              <w:t>La Niña 2021/22 (-1.0)</w:t>
+              <w:t>El Niño 2015/16 (+2.3)</w:t>
             </w:r>
           </w:p>
         </w:tc>
@@ -2211,6 +2211,7 @@
               <w:rPr>
                 <w:sz w:val="16"/>
               </w:rPr>
+              <w:t>sécheresse 2015-16 en Espírito Santo : conilon au plus bas (10,5 M sacs)</w:t>
             </w:r>
           </w:p>
         </w:tc>
@@ -2226,7 +2227,7 @@
               <w:rPr>
                 <w:sz w:val="16"/>
               </w:rPr>
-              <w:t>2016/17</w:t>
+              <w:t>2004/05</w:t>
             </w:r>
           </w:p>
         </w:tc>
@@ -2240,7 +2241,7 @@
               <w:rPr>
                 <w:sz w:val="16"/>
               </w:rPr>
-              <w:t>-6.1 %</w:t>
+              <w:t>-4.6 %</w:t>
             </w:r>
           </w:p>
         </w:tc>
@@ -2254,7 +2255,7 @@
               <w:rPr>
                 <w:sz w:val="16"/>
               </w:rPr>
-              <w:t>+13.6 %</w:t>
+              <w:t>+42.6 %</w:t>
             </w:r>
           </w:p>
         </w:tc>
@@ -2268,7 +2269,7 @@
               <w:rPr>
                 <w:sz w:val="16"/>
               </w:rPr>
-              <w:t>El Niño 2015/16 (+2.6)</w:t>
+              <w:t>neutre 2003/04 (+0.4)</w:t>
             </w:r>
           </w:p>
         </w:tc>
@@ -2282,7 +2283,6 @@
               <w:rPr>
                 <w:sz w:val="16"/>
               </w:rPr>
-              <w:t>sécheresse 2015-16 en Espírito Santo : conilon au plus bas (10,5 M sacs)</w:t>
             </w:r>
           </w:p>
         </w:tc>
@@ -2298,7 +2298,7 @@
               <w:rPr>
                 <w:sz w:val="16"/>
               </w:rPr>
-              <w:t>2004/05</w:t>
+              <w:t>2007/08</w:t>
             </w:r>
           </w:p>
         </w:tc>
@@ -2326,7 +2326,7 @@
               <w:rPr>
                 <w:sz w:val="16"/>
               </w:rPr>
-              <w:t>+42.6 %</w:t>
+              <w:t>-13.7 %</w:t>
             </w:r>
           </w:p>
         </w:tc>
@@ -2340,7 +2340,7 @@
               <w:rPr>
                 <w:sz w:val="16"/>
               </w:rPr>
-              <w:t>neutre 2003/04 (+0.4)</w:t>
+              <w:t>El Niño 2006/07 (+0.9)</w:t>
             </w:r>
           </w:p>
         </w:tc>
@@ -2483,7 +2483,7 @@
               <w:rPr>
                 <w:sz w:val="16"/>
               </w:rPr>
-              <w:t>neutre 2012/13 (-0.2)</w:t>
+              <w:t>neutre 2012/13 (-0.6)</w:t>
             </w:r>
           </w:p>
         </w:tc>
@@ -2554,7 +2554,7 @@
               <w:rPr>
                 <w:sz w:val="16"/>
               </w:rPr>
-              <w:t>La Niña 2022/23 (-1.0)</w:t>
+              <w:t>La Niña 2022/23 (-1.1)</w:t>
             </w:r>
           </w:p>
         </w:tc>
@@ -2581,7 +2581,7 @@
           <w:i w:val="0"/>
           <w:sz w:val="20"/>
         </w:rPr>
-        <w:t>Sur 22 campagnes, 14 ont une production sous la moyenne de leurs voisines ; écart-type des écarts 9.5 % : c'est l'ordre de grandeur de l'aléa annuel que la météo et le cycle imposent, à comparer à la tendance.</w:t>
+        <w:t>Sur 21 campagnes, 13 ont une production sous la moyenne de leurs voisines ; écart-type des écarts 9.2 % : c'est l'ordre de grandeur de l'aléa annuel que la météo et le cycle imposent, à comparer à la tendance.</w:t>
       </w:r>
     </w:p>
     <w:p>
@@ -2619,7 +2619,7 @@
           <w:i w:val="0"/>
           <w:sz w:val="20"/>
         </w:rPr>
-        <w:t>Convention retenue, comme demandé : l'épisode ENSO de l'hiver N/N+1 est rattaché à la campagne N+1/N+2 (celle dont la floraison, sept.-nov. N+1, et le remplissage se déroulent pendant et juste après l'épisode). Exemples : El Niño 2015/16 → campagne 2016/17 ; El Niño 2023/24 → campagne 2024/25 ; El Niño 2009/10 → 2010/11. Niveaux : El Niño fort quand le pic atteint 1,6 (2009/10, 2015/16), El Niño entre 0,6 et 1,6, faible sous 0,6 ; même grille pour La Niña. 2023/24 est classé El Niño simple (pic ONI 2,0 mais indice relatif RONI d'environ 1,3). L'épisode 2014/15 est exclu des tableaux et des moyennes, comme demandé.</w:t>
+        <w:t>Convention retenue, comme demandé : l'épisode ENSO de l'hiver N/N+1 est rattaché à la campagne N+1/N+2 (celle dont la floraison, sept.-nov. N+1, et le remplissage se déroulent pendant et juste après l'épisode). Exemples : El Niño 2015/16 → campagne 2016/17 ; El Niño 2023/24 → campagne 2024/25 ; El Niño 2009/10 → 2010/11. Niveaux : El Niño fort quand le pic atteint 1,6 (2009/10, 2015/16), El Niño entre 0,6 et 1,6, faible sous 0,6 ; même grille pour La Niña. 2023/24 est classé El Niño simple (pic ONI 2,0 mais indice relatif RONI d'environ 1,3). Les épisodes 2014/15 et 2002/03 (campagne 2003/04) sont exclus des tableaux et des moyennes, comme demandé.</w:t>
       </w:r>
     </w:p>
     <w:p>
@@ -2832,7 +2832,7 @@
               <w:rPr>
                 <w:sz w:val="14"/>
               </w:rPr>
-              <w:t>2002/03 (+1.3)</w:t>
+              <w:t>2004/05 (+0.7)</w:t>
             </w:r>
           </w:p>
         </w:tc>
@@ -2860,7 +2860,7 @@
               <w:rPr>
                 <w:sz w:val="14"/>
               </w:rPr>
-              <w:t>2003/04 OFF</w:t>
+              <w:t>2005/06 OFF</w:t>
             </w:r>
           </w:p>
         </w:tc>
@@ -2874,7 +2874,7 @@
               <w:rPr>
                 <w:sz w:val="14"/>
               </w:rPr>
-              <w:t>23 600 (-43 % / -13.5 %)</w:t>
+              <w:t>26 000 (-24 % / -2.2 %)</w:t>
             </w:r>
           </w:p>
         </w:tc>
@@ -2888,7 +2888,7 @@
               <w:rPr>
                 <w:sz w:val="14"/>
               </w:rPr>
-              <w:t>9 600 (-20 % / -8.7 %)</w:t>
+              <w:t>10 100 (+9 % / -1.4 %)</w:t>
             </w:r>
           </w:p>
         </w:tc>
@@ -2902,7 +2902,7 @@
               <w:rPr>
                 <w:sz w:val="14"/>
               </w:rPr>
-              <w:t>-20.5 %</w:t>
+              <w:t>-3.1 %</w:t>
             </w:r>
           </w:p>
         </w:tc>
@@ -2916,7 +2916,7 @@
               <w:rPr>
                 <w:sz w:val="14"/>
               </w:rPr>
-              <w:t>+150 mm / -0.3 °C</w:t>
+              <w:t>+146 mm / -0.5 °C</w:t>
             </w:r>
           </w:p>
         </w:tc>
@@ -2930,7 +2930,7 @@
               <w:rPr>
                 <w:sz w:val="14"/>
               </w:rPr>
-              <w:t>-196 mm / +0.2 °C</w:t>
+              <w:t>+397 mm / -0.5 °C</w:t>
             </w:r>
           </w:p>
         </w:tc>
@@ -2946,7 +2946,7 @@
               <w:rPr>
                 <w:sz w:val="14"/>
               </w:rPr>
-              <w:t>2004/05 (+0.7)</w:t>
+              <w:t>2005/06 (-0.9)</w:t>
             </w:r>
           </w:p>
         </w:tc>
@@ -2960,7 +2960,7 @@
               <w:rPr>
                 <w:sz w:val="14"/>
               </w:rPr>
-              <w:t>El Niño ordinaire</w:t>
+              <w:t>La Niña ordinaire</w:t>
             </w:r>
           </w:p>
         </w:tc>
@@ -2974,7 +2974,7 @@
               <w:rPr>
                 <w:sz w:val="14"/>
               </w:rPr>
-              <w:t>2005/06 OFF</w:t>
+              <w:t>2006/07 ON</w:t>
             </w:r>
           </w:p>
         </w:tc>
@@ -2988,7 +2988,7 @@
               <w:rPr>
                 <w:sz w:val="14"/>
               </w:rPr>
-              <w:t>26 000 (-24 % / -2.2 %)</w:t>
+              <w:t>36 000 (+38 % / +0.5 %)</w:t>
             </w:r>
           </w:p>
         </w:tc>
@@ -3002,7 +3002,7 @@
               <w:rPr>
                 <w:sz w:val="14"/>
               </w:rPr>
-              <w:t>10 100 (+9 % / -1.4 %)</w:t>
+              <w:t>10 700 (+6 % / -2.1 %)</w:t>
             </w:r>
           </w:p>
         </w:tc>
@@ -3016,7 +3016,7 @@
               <w:rPr>
                 <w:sz w:val="14"/>
               </w:rPr>
-              <w:t>-3.1 %</w:t>
+              <w:t>-4.1 %</w:t>
             </w:r>
           </w:p>
         </w:tc>
@@ -3030,7 +3030,7 @@
               <w:rPr>
                 <w:sz w:val="14"/>
               </w:rPr>
-              <w:t>+141 mm / -0.5 °C</w:t>
+              <w:t>-8 mm / -0.5 °C</w:t>
             </w:r>
           </w:p>
         </w:tc>
@@ -3044,7 +3044,7 @@
               <w:rPr>
                 <w:sz w:val="14"/>
               </w:rPr>
-              <w:t>+405 mm / -0.5 °C</w:t>
+              <w:t>-33 mm / -0.5 °C</w:t>
             </w:r>
           </w:p>
         </w:tc>
@@ -3060,7 +3060,7 @@
               <w:rPr>
                 <w:sz w:val="14"/>
               </w:rPr>
-              <w:t>2005/06 (-0.9)</w:t>
+              <w:t>2006/07 (+0.9)</w:t>
             </w:r>
           </w:p>
         </w:tc>
@@ -3074,7 +3074,7 @@
               <w:rPr>
                 <w:sz w:val="14"/>
               </w:rPr>
-              <w:t>La Niña ordinaire</w:t>
+              <w:t>El Niño ordinaire</w:t>
             </w:r>
           </w:p>
         </w:tc>
@@ -3088,7 +3088,7 @@
               <w:rPr>
                 <w:sz w:val="14"/>
               </w:rPr>
-              <w:t>2006/07 ON</w:t>
+              <w:t>2007/08 OFF</w:t>
             </w:r>
           </w:p>
         </w:tc>
@@ -3102,7 +3102,7 @@
               <w:rPr>
                 <w:sz w:val="14"/>
               </w:rPr>
-              <w:t>36 000 (+38 % / +0.5 %)</w:t>
+              <w:t>27 650 (-23 % / -7.4 %)</w:t>
             </w:r>
           </w:p>
         </w:tc>
@@ -3116,7 +3116,7 @@
               <w:rPr>
                 <w:sz w:val="14"/>
               </w:rPr>
-              <w:t>10 700 (+6 % / -2.1 %)</w:t>
+              <w:t>11 450 (+7 % / +1.0 %)</w:t>
             </w:r>
           </w:p>
         </w:tc>
@@ -3130,7 +3130,7 @@
               <w:rPr>
                 <w:sz w:val="14"/>
               </w:rPr>
-              <w:t>-4.1 %</w:t>
+              <w:t>-4.6 %</w:t>
             </w:r>
           </w:p>
         </w:tc>
@@ -3144,7 +3144,7 @@
               <w:rPr>
                 <w:sz w:val="14"/>
               </w:rPr>
-              <w:t>-13 mm / -0.5 °C</w:t>
+              <w:t>+140 mm / -0.5 °C</w:t>
             </w:r>
           </w:p>
         </w:tc>
@@ -3158,7 +3158,7 @@
               <w:rPr>
                 <w:sz w:val="14"/>
               </w:rPr>
-              <w:t>-25 mm / -0.5 °C</w:t>
+              <w:t>+141 mm / -0.6 °C</w:t>
             </w:r>
           </w:p>
         </w:tc>
@@ -3174,7 +3174,7 @@
               <w:rPr>
                 <w:sz w:val="14"/>
               </w:rPr>
-              <w:t>2006/07 (+0.9)</w:t>
+              <w:t>2007/08 (-1.6)</w:t>
             </w:r>
           </w:p>
         </w:tc>
@@ -3188,7 +3188,7 @@
               <w:rPr>
                 <w:sz w:val="14"/>
               </w:rPr>
-              <w:t>El Niño ordinaire</w:t>
+              <w:t>La Niña forte</w:t>
             </w:r>
           </w:p>
         </w:tc>
@@ -3202,7 +3202,7 @@
               <w:rPr>
                 <w:sz w:val="14"/>
               </w:rPr>
-              <w:t>2007/08 OFF</w:t>
+              <w:t>2008/09 ON</w:t>
             </w:r>
           </w:p>
         </w:tc>
@@ -3216,7 +3216,7 @@
               <w:rPr>
                 <w:sz w:val="14"/>
               </w:rPr>
-              <w:t>27 650 (-23 % / -7.4 %)</w:t>
+              <w:t>40 500 (+46 % / +6.3 %)</w:t>
             </w:r>
           </w:p>
         </w:tc>
@@ -3230,7 +3230,7 @@
               <w:rPr>
                 <w:sz w:val="14"/>
               </w:rPr>
-              <w:t>11 450 (+7 % / +1.0 %)</w:t>
+              <w:t>12 800 (+12 % / +9.6 %)</w:t>
             </w:r>
           </w:p>
         </w:tc>
@@ -3244,7 +3244,7 @@
               <w:rPr>
                 <w:sz w:val="14"/>
               </w:rPr>
-              <w:t>-4.6 %</w:t>
+              <w:t>+6.3 %</w:t>
             </w:r>
           </w:p>
         </w:tc>
@@ -3258,7 +3258,7 @@
               <w:rPr>
                 <w:sz w:val="14"/>
               </w:rPr>
-              <w:t>+134 mm / -0.5 °C</w:t>
+              <w:t>+68 mm / -0.5 °C</w:t>
             </w:r>
           </w:p>
         </w:tc>
@@ -3272,7 +3272,7 @@
               <w:rPr>
                 <w:sz w:val="14"/>
               </w:rPr>
-              <w:t>+149 mm / -0.6 °C</w:t>
+              <w:t>-228 mm / +0.0 °C</w:t>
             </w:r>
           </w:p>
         </w:tc>
@@ -3288,7 +3288,7 @@
               <w:rPr>
                 <w:sz w:val="14"/>
               </w:rPr>
-              <w:t>2007/08 (-1.6)</w:t>
+              <w:t>2008/09 (-1.0)</w:t>
             </w:r>
           </w:p>
         </w:tc>
@@ -3302,7 +3302,7 @@
               <w:rPr>
                 <w:sz w:val="14"/>
               </w:rPr>
-              <w:t>La Niña forte</w:t>
+              <w:t>La Niña ordinaire</w:t>
             </w:r>
           </w:p>
         </w:tc>
@@ -3316,7 +3316,7 @@
               <w:rPr>
                 <w:sz w:val="14"/>
               </w:rPr>
-              <w:t>2008/09 ON</w:t>
+              <w:t>2009/10 OFF</w:t>
             </w:r>
           </w:p>
         </w:tc>
@@ -3330,7 +3330,7 @@
               <w:rPr>
                 <w:sz w:val="14"/>
               </w:rPr>
-              <w:t>40 500 (+46 % / +6.3 %)</w:t>
+              <w:t>33 000 (-19 % / +1.6 %)</w:t>
             </w:r>
           </w:p>
         </w:tc>
@@ -3344,7 +3344,7 @@
               <w:rPr>
                 <w:sz w:val="14"/>
               </w:rPr>
-              <w:t>12 800 (+12 % / +9.6 %)</w:t>
+              <w:t>11 800 (-8 % / -8.2 %)</w:t>
             </w:r>
           </w:p>
         </w:tc>
@@ -3358,7 +3358,7 @@
               <w:rPr>
                 <w:sz w:val="14"/>
               </w:rPr>
-              <w:t>+6.3 %</w:t>
+              <w:t>+1.0 %</w:t>
             </w:r>
           </w:p>
         </w:tc>
@@ -3372,7 +3372,7 @@
               <w:rPr>
                 <w:sz w:val="14"/>
               </w:rPr>
-              <w:t>+63 mm / -0.5 °C</w:t>
+              <w:t>+294 mm / -0.5 °C</w:t>
             </w:r>
           </w:p>
         </w:tc>
@@ -3386,7 +3386,7 @@
               <w:rPr>
                 <w:sz w:val="14"/>
               </w:rPr>
-              <w:t>-220 mm / +0.0 °C</w:t>
+              <w:t>+246 mm / -0.3 °C</w:t>
             </w:r>
           </w:p>
         </w:tc>
@@ -3402,7 +3402,7 @@
               <w:rPr>
                 <w:sz w:val="14"/>
               </w:rPr>
-              <w:t>2008/09 (-0.8)</w:t>
+              <w:t>2009/10 (+1.5)</w:t>
             </w:r>
           </w:p>
         </w:tc>
@@ -3416,7 +3416,7 @@
               <w:rPr>
                 <w:sz w:val="14"/>
               </w:rPr>
-              <w:t>La Niña ordinaire</w:t>
+              <w:t>El Niño ordinaire</w:t>
             </w:r>
           </w:p>
         </w:tc>
@@ -3430,7 +3430,7 @@
               <w:rPr>
                 <w:sz w:val="14"/>
               </w:rPr>
-              <w:t>2009/10 OFF</w:t>
+              <w:t>2010/11 ON</w:t>
             </w:r>
           </w:p>
         </w:tc>
@@ -3444,7 +3444,7 @@
               <w:rPr>
                 <w:sz w:val="14"/>
               </w:rPr>
-              <w:t>33 000 (-19 % / +1.6 %)</w:t>
+              <w:t>41 800 (+27 % / +1.4 %)</w:t>
             </w:r>
           </w:p>
         </w:tc>
@@ -3458,7 +3458,7 @@
               <w:rPr>
                 <w:sz w:val="14"/>
               </w:rPr>
-              <w:t>11 800 (-8 % / -8.2 %)</w:t>
+              <w:t>12 700 (+8 % / -7.1 %)</w:t>
             </w:r>
           </w:p>
         </w:tc>
@@ -3472,7 +3472,7 @@
               <w:rPr>
                 <w:sz w:val="14"/>
               </w:rPr>
-              <w:t>+1.0 %</w:t>
+              <w:t>-2.0 %</w:t>
             </w:r>
           </w:p>
         </w:tc>
@@ -3486,7 +3486,7 @@
               <w:rPr>
                 <w:sz w:val="14"/>
               </w:rPr>
-              <w:t>+288 mm / -0.5 °C</w:t>
+              <w:t>-102 mm / -0.1 °C</w:t>
             </w:r>
           </w:p>
         </w:tc>
@@ -3500,7 +3500,7 @@
               <w:rPr>
                 <w:sz w:val="14"/>
               </w:rPr>
-              <w:t>+254 mm / -0.3 °C</w:t>
+              <w:t>-77 mm / +0.2 °C</w:t>
             </w:r>
           </w:p>
         </w:tc>
@@ -3516,7 +3516,7 @@
               <w:rPr>
                 <w:sz w:val="14"/>
               </w:rPr>
-              <w:t>2009/10 (+1.6)</w:t>
+              <w:t>2010/11 (-1.6)</w:t>
             </w:r>
           </w:p>
         </w:tc>
@@ -3530,7 +3530,7 @@
               <w:rPr>
                 <w:sz w:val="14"/>
               </w:rPr>
-              <w:t>El Niño fort</w:t>
+              <w:t>La Niña forte</w:t>
             </w:r>
           </w:p>
         </w:tc>
@@ -3544,7 +3544,7 @@
               <w:rPr>
                 <w:sz w:val="14"/>
               </w:rPr>
-              <w:t>2010/11 ON</w:t>
+              <w:t>2011/12 OFF</w:t>
             </w:r>
           </w:p>
         </w:tc>
@@ -3558,7 +3558,7 @@
               <w:rPr>
                 <w:sz w:val="14"/>
               </w:rPr>
-              <w:t>41 800 (+27 % / +1.4 %)</w:t>
+              <w:t>34 700 (-17 % / -3.2 %)</w:t>
             </w:r>
           </w:p>
         </w:tc>
@@ -3572,7 +3572,7 @@
               <w:rPr>
                 <w:sz w:val="14"/>
               </w:rPr>
-              <w:t>12 700 (+8 % / -7.1 %)</w:t>
+              <w:t>14 500 (+14 % / +4.8 %)</w:t>
             </w:r>
           </w:p>
         </w:tc>
@@ -3586,7 +3586,7 @@
               <w:rPr>
                 <w:sz w:val="14"/>
               </w:rPr>
-              <w:t>-2.0 %</w:t>
+              <w:t>-1.5 %</w:t>
             </w:r>
           </w:p>
         </w:tc>
@@ -3600,7 +3600,7 @@
               <w:rPr>
                 <w:sz w:val="14"/>
               </w:rPr>
-              <w:t>-108 mm / -0.1 °C</w:t>
+              <w:t>+156 mm / -0.6 °C</w:t>
             </w:r>
           </w:p>
         </w:tc>
@@ -3614,7 +3614,7 @@
               <w:rPr>
                 <w:sz w:val="14"/>
               </w:rPr>
-              <w:t>-69 mm / +0.2 °C</w:t>
+              <w:t>+174 mm / -0.7 °C</w:t>
             </w:r>
           </w:p>
         </w:tc>
@@ -3630,7 +3630,7 @@
               <w:rPr>
                 <w:sz w:val="14"/>
               </w:rPr>
-              <w:t>2010/11 (-1.6)</w:t>
+              <w:t>2011/12 (-1.0)</w:t>
             </w:r>
           </w:p>
         </w:tc>
@@ -3644,7 +3644,7 @@
               <w:rPr>
                 <w:sz w:val="14"/>
               </w:rPr>
-              <w:t>La Niña forte</w:t>
+              <w:t>La Niña ordinaire</w:t>
             </w:r>
           </w:p>
         </w:tc>
@@ -3658,7 +3658,7 @@
               <w:rPr>
                 <w:sz w:val="14"/>
               </w:rPr>
-              <w:t>2011/12 OFF</w:t>
+              <w:t>2012/13 ON</w:t>
             </w:r>
           </w:p>
         </w:tc>
@@ -3672,7 +3672,7 @@
               <w:rPr>
                 <w:sz w:val="14"/>
               </w:rPr>
-              <w:t>34 700 (-17 % / -3.2 %)</w:t>
+              <w:t>42 100 (+21 % / -1.4 %)</w:t>
             </w:r>
           </w:p>
         </w:tc>
@@ -3686,7 +3686,7 @@
               <w:rPr>
                 <w:sz w:val="14"/>
               </w:rPr>
-              <w:t>14 500 (+14 % / +4.8 %)</w:t>
+              <w:t>15 500 (+7 % / +3.9 %)</w:t>
             </w:r>
           </w:p>
         </w:tc>
@@ -3700,7 +3700,7 @@
               <w:rPr>
                 <w:sz w:val="14"/>
               </w:rPr>
-              <w:t>-1.5 %</w:t>
+              <w:t>+1.9 %</w:t>
             </w:r>
           </w:p>
         </w:tc>
@@ -3714,7 +3714,7 @@
               <w:rPr>
                 <w:sz w:val="14"/>
               </w:rPr>
-              <w:t>+150 mm / -0.6 °C</w:t>
+              <w:t>+26 mm / -0.7 °C</w:t>
             </w:r>
           </w:p>
         </w:tc>
@@ -3728,7 +3728,7 @@
               <w:rPr>
                 <w:sz w:val="14"/>
               </w:rPr>
-              <w:t>+182 mm / -0.7 °C</w:t>
+              <w:t>+105 mm / -0.7 °C</w:t>
             </w:r>
           </w:p>
         </w:tc>
@@ -3744,7 +3744,7 @@
               <w:rPr>
                 <w:sz w:val="14"/>
               </w:rPr>
-              <w:t>2011/12 (-1.1)</w:t>
+              <w:t>2015/16 (+2.3)</w:t>
             </w:r>
           </w:p>
         </w:tc>
@@ -3758,7 +3758,7 @@
               <w:rPr>
                 <w:sz w:val="14"/>
               </w:rPr>
-              <w:t>La Niña ordinaire</w:t>
+              <w:t>El Niño fort</w:t>
             </w:r>
           </w:p>
         </w:tc>
@@ -3772,7 +3772,7 @@
               <w:rPr>
                 <w:sz w:val="14"/>
               </w:rPr>
-              <w:t>2012/13 ON</w:t>
+              <w:t>2016/17 ON</w:t>
             </w:r>
           </w:p>
         </w:tc>
@@ -3786,7 +3786,7 @@
               <w:rPr>
                 <w:sz w:val="14"/>
               </w:rPr>
-              <w:t>42 100 (+21 % / -1.4 %)</w:t>
+              <w:t>45 600 (+26 % / +3.0 %)</w:t>
             </w:r>
           </w:p>
         </w:tc>
@@ -3800,7 +3800,7 @@
               <w:rPr>
                 <w:sz w:val="14"/>
               </w:rPr>
-              <w:t>15 500 (+7 % / +3.9 %)</w:t>
+              <w:t>10 500 (-21 % / -29.7 %)</w:t>
             </w:r>
           </w:p>
         </w:tc>
@@ -3814,7 +3814,7 @@
               <w:rPr>
                 <w:sz w:val="14"/>
               </w:rPr>
-              <w:t>+1.9 %</w:t>
+              <w:t>-6.1 %</w:t>
             </w:r>
           </w:p>
         </w:tc>
@@ -3828,7 +3828,7 @@
               <w:rPr>
                 <w:sz w:val="14"/>
               </w:rPr>
-              <w:t>+20 mm / -0.7 °C</w:t>
+              <w:t>-118 mm / +0.8 °C</w:t>
             </w:r>
           </w:p>
         </w:tc>
@@ -3842,7 +3842,7 @@
               <w:rPr>
                 <w:sz w:val="14"/>
               </w:rPr>
-              <w:t>+113 mm / -0.7 °C</w:t>
+              <w:t>-492 mm / +1.3 °C</w:t>
             </w:r>
           </w:p>
         </w:tc>
@@ -3858,7 +3858,7 @@
               <w:rPr>
                 <w:sz w:val="14"/>
               </w:rPr>
-              <w:t>2015/16 (+2.6)</w:t>
+              <w:t>2016/17 (-1.0)</w:t>
             </w:r>
           </w:p>
         </w:tc>
@@ -3872,7 +3872,7 @@
               <w:rPr>
                 <w:sz w:val="14"/>
               </w:rPr>
-              <w:t>El Niño fort</w:t>
+              <w:t>La Niña ordinaire</w:t>
             </w:r>
           </w:p>
         </w:tc>
@@ -3886,7 +3886,7 @@
               <w:rPr>
                 <w:sz w:val="14"/>
               </w:rPr>
-              <w:t>2016/17 ON</w:t>
+              <w:t>2017/18 OFF</w:t>
             </w:r>
           </w:p>
         </w:tc>
@@ -3900,7 +3900,7 @@
               <w:rPr>
                 <w:sz w:val="14"/>
               </w:rPr>
-              <w:t>45 600 (+26 % / +3.0 %)</w:t>
+              <w:t>39 500 (-13 % / -0.3 %)</w:t>
             </w:r>
           </w:p>
         </w:tc>
@@ -3914,7 +3914,7 @@
               <w:rPr>
                 <w:sz w:val="14"/>
               </w:rPr>
-              <w:t>10 500 (-21 % / -29.7 %)</w:t>
+              <w:t>12 600 (+20 % / -14.6 %)</w:t>
             </w:r>
           </w:p>
         </w:tc>
@@ -3928,7 +3928,7 @@
               <w:rPr>
                 <w:sz w:val="14"/>
               </w:rPr>
-              <w:t>-6.1 %</w:t>
+              <w:t>-2.4 %</w:t>
             </w:r>
           </w:p>
         </w:tc>
@@ -3942,7 +3942,7 @@
               <w:rPr>
                 <w:sz w:val="14"/>
               </w:rPr>
-              <w:t>-124 mm / +0.8 °C</w:t>
+              <w:t>-210 mm / +0.1 °C</w:t>
             </w:r>
           </w:p>
         </w:tc>
@@ -3956,7 +3956,7 @@
               <w:rPr>
                 <w:sz w:val="14"/>
               </w:rPr>
-              <w:t>-484 mm / +1.3 °C</w:t>
+              <w:t>-93 mm / -0.2 °C</w:t>
             </w:r>
           </w:p>
         </w:tc>
@@ -3972,7 +3972,7 @@
               <w:rPr>
                 <w:sz w:val="14"/>
               </w:rPr>
-              <w:t>2016/17 (-0.7)</w:t>
+              <w:t>2017/18 (-1.1)</w:t>
             </w:r>
           </w:p>
         </w:tc>
@@ -4000,7 +4000,7 @@
               <w:rPr>
                 <w:sz w:val="14"/>
               </w:rPr>
-              <w:t>2017/18 OFF</w:t>
+              <w:t>2018/19 ON</w:t>
             </w:r>
           </w:p>
         </w:tc>
@@ -4014,7 +4014,7 @@
               <w:rPr>
                 <w:sz w:val="14"/>
               </w:rPr>
-              <w:t>39 500 (-13 % / -0.3 %)</w:t>
+              <w:t>49 700 (+26 % / +4.0 %)</w:t>
             </w:r>
           </w:p>
         </w:tc>
@@ -4028,7 +4028,7 @@
               <w:rPr>
                 <w:sz w:val="14"/>
               </w:rPr>
-              <w:t>12 600 (+20 % / -14.6 %)</w:t>
+              <w:t>16 800 (+33 % / +8.7 %)</w:t>
             </w:r>
           </w:p>
         </w:tc>
@@ -4042,7 +4042,7 @@
               <w:rPr>
                 <w:sz w:val="14"/>
               </w:rPr>
-              <w:t>-2.4 %</w:t>
+              <w:t>+5.4 %</w:t>
             </w:r>
           </w:p>
         </w:tc>
@@ -4056,7 +4056,7 @@
               <w:rPr>
                 <w:sz w:val="14"/>
               </w:rPr>
-              <w:t>-215 mm / +0.1 °C</w:t>
+              <w:t>-70 mm / +0.1 °C</w:t>
             </w:r>
           </w:p>
         </w:tc>
@@ -4070,7 +4070,7 @@
               <w:rPr>
                 <w:sz w:val="14"/>
               </w:rPr>
-              <w:t>-85 mm / -0.2 °C</w:t>
+              <w:t>+24 mm / -0.1 °C</w:t>
             </w:r>
           </w:p>
         </w:tc>
@@ -4086,7 +4086,7 @@
               <w:rPr>
                 <w:sz w:val="14"/>
               </w:rPr>
-              <w:t>2017/18 (-1.0)</w:t>
+              <w:t>2018/19 (+0.8)</w:t>
             </w:r>
           </w:p>
         </w:tc>
@@ -4100,7 +4100,7 @@
               <w:rPr>
                 <w:sz w:val="14"/>
               </w:rPr>
-              <w:t>La Niña ordinaire</w:t>
+              <w:t>El Niño ordinaire</w:t>
             </w:r>
           </w:p>
         </w:tc>
@@ -4114,7 +4114,7 @@
               <w:rPr>
                 <w:sz w:val="14"/>
               </w:rPr>
-              <w:t>2018/19 ON</w:t>
+              <w:t>2019/20 OFF</w:t>
             </w:r>
           </w:p>
         </w:tc>
@@ -4128,7 +4128,7 @@
               <w:rPr>
                 <w:sz w:val="14"/>
               </w:rPr>
-              <w:t>49 700 (+26 % / +4.0 %)</w:t>
+              <w:t>42 000 (-15 % / +4.3 %)</w:t>
             </w:r>
           </w:p>
         </w:tc>
@@ -4142,7 +4142,7 @@
               <w:rPr>
                 <w:sz w:val="14"/>
               </w:rPr>
-              <w:t>16 800 (+33 % / +8.7 %)</w:t>
+              <w:t>18 500 (+10 % / +3.9 %)</w:t>
             </w:r>
           </w:p>
         </w:tc>
@@ -4156,7 +4156,7 @@
               <w:rPr>
                 <w:sz w:val="14"/>
               </w:rPr>
-              <w:t>+5.4 %</w:t>
+              <w:t>+4.5 %</w:t>
             </w:r>
           </w:p>
         </w:tc>
@@ -4170,7 +4170,7 @@
               <w:rPr>
                 <w:sz w:val="14"/>
               </w:rPr>
-              <w:t>-75 mm / +0.1 °C</w:t>
+              <w:t>+4 mm / +0.5 °C</w:t>
             </w:r>
           </w:p>
         </w:tc>
@@ -4184,7 +4184,7 @@
               <w:rPr>
                 <w:sz w:val="14"/>
               </w:rPr>
-              <w:t>+32 mm / -0.1 °C</w:t>
+              <w:t>-27 mm / +0.6 °C</w:t>
             </w:r>
           </w:p>
         </w:tc>
@@ -4200,7 +4200,7 @@
               <w:rPr>
                 <w:sz w:val="14"/>
               </w:rPr>
-              <w:t>2018/19 (+0.9)</w:t>
+              <w:t>2019/20 (-0.7)</w:t>
             </w:r>
           </w:p>
         </w:tc>
@@ -4214,7 +4214,7 @@
               <w:rPr>
                 <w:sz w:val="14"/>
               </w:rPr>
-              <w:t>El Niño ordinaire</w:t>
+              <w:t>La Niña ordinaire</w:t>
             </w:r>
           </w:p>
         </w:tc>
@@ -4228,7 +4228,7 @@
               <w:rPr>
                 <w:sz w:val="14"/>
               </w:rPr>
-              <w:t>2019/20 OFF</w:t>
+              <w:t>2020/21 ON</w:t>
             </w:r>
           </w:p>
         </w:tc>
@@ -4242,7 +4242,7 @@
               <w:rPr>
                 <w:sz w:val="14"/>
               </w:rPr>
-              <w:t>42 000 (-15 % / +4.3 %)</w:t>
+              <w:t>49 700 (+18 % / +9.6 %)</w:t>
             </w:r>
           </w:p>
         </w:tc>
@@ -4256,7 +4256,7 @@
               <w:rPr>
                 <w:sz w:val="14"/>
               </w:rPr>
-              <w:t>18 500 (+10 % / +3.9 %)</w:t>
+              <w:t>20 200 (+9 % / +1.2 %)</w:t>
             </w:r>
           </w:p>
         </w:tc>
@@ -4270,7 +4270,7 @@
               <w:rPr>
                 <w:sz w:val="14"/>
               </w:rPr>
-              <w:t>+4.5 %</w:t>
+              <w:t>+3.5 %</w:t>
             </w:r>
           </w:p>
         </w:tc>
@@ -4284,7 +4284,7 @@
               <w:rPr>
                 <w:sz w:val="14"/>
               </w:rPr>
-              <w:t>-2 mm / +0.5 °C</w:t>
+              <w:t>-28 mm / +0.2 °C</w:t>
             </w:r>
           </w:p>
         </w:tc>
@@ -4298,7 +4298,7 @@
               <w:rPr>
                 <w:sz w:val="14"/>
               </w:rPr>
-              <w:t>-19 mm / +0.6 °C</w:t>
+              <w:t>+107 mm / +0.0 °C</w:t>
             </w:r>
           </w:p>
         </w:tc>
@@ -4314,7 +4314,7 @@
               <w:rPr>
                 <w:sz w:val="14"/>
               </w:rPr>
-              <w:t>2020/21 (-1.3)</w:t>
+              <w:t>2020/21 (-1.5)</w:t>
             </w:r>
           </w:p>
         </w:tc>
@@ -4398,7 +4398,7 @@
               <w:rPr>
                 <w:sz w:val="14"/>
               </w:rPr>
-              <w:t>-373 mm / +0.8 °C</w:t>
+              <w:t>-368 mm / +0.8 °C</w:t>
             </w:r>
           </w:p>
         </w:tc>
@@ -4412,7 +4412,7 @@
               <w:rPr>
                 <w:sz w:val="14"/>
               </w:rPr>
-              <w:t>-202 mm / +0.3 °C</w:t>
+              <w:t>-210 mm / +0.3 °C</w:t>
             </w:r>
           </w:p>
         </w:tc>
@@ -4428,7 +4428,7 @@
               <w:rPr>
                 <w:sz w:val="14"/>
               </w:rPr>
-              <w:t>2021/22 (-1.0)</w:t>
+              <w:t>2021/22 (-1.3)</w:t>
             </w:r>
           </w:p>
         </w:tc>
@@ -4512,7 +4512,7 @@
               <w:rPr>
                 <w:sz w:val="14"/>
               </w:rPr>
-              <w:t>+165 mm / -0.4 °C</w:t>
+              <w:t>+170 mm / -0.4 °C</w:t>
             </w:r>
           </w:p>
         </w:tc>
@@ -4526,7 +4526,7 @@
               <w:rPr>
                 <w:sz w:val="14"/>
               </w:rPr>
-              <w:t>+20 mm / -0.1 °C</w:t>
+              <w:t>+12 mm / -0.1 °C</w:t>
             </w:r>
           </w:p>
         </w:tc>
@@ -4542,7 +4542,7 @@
               <w:rPr>
                 <w:sz w:val="14"/>
               </w:rPr>
-              <w:t>2022/23 (-1.0)</w:t>
+              <w:t>2022/23 (-1.1)</w:t>
             </w:r>
           </w:p>
         </w:tc>
@@ -4626,7 +4626,7 @@
               <w:rPr>
                 <w:sz w:val="14"/>
               </w:rPr>
-              <w:t>-23 mm / +0.1 °C</w:t>
+              <w:t>-18 mm / +0.1 °C</w:t>
             </w:r>
           </w:p>
         </w:tc>
@@ -4640,7 +4640,7 @@
               <w:rPr>
                 <w:sz w:val="14"/>
               </w:rPr>
-              <w:t>+60 mm / +0.2 °C</w:t>
+              <w:t>+52 mm / +0.2 °C</w:t>
             </w:r>
           </w:p>
         </w:tc>
@@ -4656,7 +4656,7 @@
               <w:rPr>
                 <w:sz w:val="14"/>
               </w:rPr>
-              <w:t>2023/24 (+2.0)</w:t>
+              <w:t>2023/24 (+1.4)</w:t>
             </w:r>
           </w:p>
         </w:tc>
@@ -4740,7 +4740,7 @@
               <w:rPr>
                 <w:sz w:val="14"/>
               </w:rPr>
-              <w:t>-452 mm / +2.4 °C</w:t>
+              <w:t>-446 mm / +2.4 °C</w:t>
             </w:r>
           </w:p>
         </w:tc>
@@ -4754,7 +4754,7 @@
               <w:rPr>
                 <w:sz w:val="14"/>
               </w:rPr>
-              <w:t>-340 mm / +1.7 °C</w:t>
+              <w:t>-348 mm / +1.7 °C</w:t>
             </w:r>
           </w:p>
         </w:tc>
@@ -5497,7 +5497,7 @@
               <w:rPr>
                 <w:sz w:val="14"/>
               </w:rPr>
-              <w:t>2</w:t>
+              <w:t>1</w:t>
             </w:r>
           </w:p>
         </w:tc>
@@ -5511,7 +5511,7 @@
               <w:rPr>
                 <w:sz w:val="14"/>
               </w:rPr>
-              <w:t>+2.2 %</w:t>
+              <w:t>+3.0 %</w:t>
             </w:r>
           </w:p>
         </w:tc>
@@ -5525,7 +5525,7 @@
               <w:rPr>
                 <w:sz w:val="14"/>
               </w:rPr>
-              <w:t>-18.4 %</w:t>
+              <w:t>-29.7 %</w:t>
             </w:r>
           </w:p>
         </w:tc>
@@ -5539,7 +5539,7 @@
               <w:rPr>
                 <w:sz w:val="14"/>
               </w:rPr>
-              <w:t>-3.4 %</w:t>
+              <w:t>-5.8 %</w:t>
             </w:r>
           </w:p>
         </w:tc>
@@ -5553,7 +5553,7 @@
               <w:rPr>
                 <w:sz w:val="14"/>
               </w:rPr>
-              <w:t>-4.0 %</w:t>
+              <w:t>-6.1 %</w:t>
             </w:r>
           </w:p>
         </w:tc>
@@ -5567,7 +5567,7 @@
               <w:rPr>
                 <w:sz w:val="14"/>
               </w:rPr>
-              <w:t>-116 mm / +0.4 °C</w:t>
+              <w:t>-118 mm / +0.8 °C</w:t>
             </w:r>
           </w:p>
         </w:tc>
@@ -5581,7 +5581,7 @@
               <w:rPr>
                 <w:sz w:val="14"/>
               </w:rPr>
-              <w:t>-277 mm / +0.8 °C</w:t>
+              <w:t>-492 mm / +1.3 °C</w:t>
             </w:r>
           </w:p>
         </w:tc>
@@ -5595,7 +5595,7 @@
               <w:rPr>
                 <w:sz w:val="14"/>
               </w:rPr>
-              <w:t>2010/11 2016/17</w:t>
+              <w:t>2016/17</w:t>
             </w:r>
           </w:p>
         </w:tc>
@@ -5639,7 +5639,7 @@
               <w:rPr>
                 <w:sz w:val="14"/>
               </w:rPr>
-              <w:t>-4.4 %</w:t>
+              <w:t>-1.4 %</w:t>
             </w:r>
           </w:p>
         </w:tc>
@@ -5653,7 +5653,7 @@
               <w:rPr>
                 <w:sz w:val="14"/>
               </w:rPr>
-              <w:t>-2.9 %</w:t>
+              <w:t>-2.5 %</w:t>
             </w:r>
           </w:p>
         </w:tc>
@@ -5667,7 +5667,7 @@
               <w:rPr>
                 <w:sz w:val="14"/>
               </w:rPr>
-              <w:t>-4.1 %</w:t>
+              <w:t>-1.9 %</w:t>
             </w:r>
           </w:p>
         </w:tc>
@@ -5681,7 +5681,7 @@
               <w:rPr>
                 <w:sz w:val="14"/>
               </w:rPr>
-              <w:t>-4.8 %</w:t>
+              <w:t>-1.1 %</w:t>
             </w:r>
           </w:p>
         </w:tc>
@@ -5695,7 +5695,7 @@
               <w:rPr>
                 <w:sz w:val="14"/>
               </w:rPr>
-              <w:t>-6 mm / +0.4 °C</w:t>
+              <w:t>-52 mm / +0.4 °C</w:t>
             </w:r>
           </w:p>
         </w:tc>
@@ -5709,7 +5709,7 @@
               <w:rPr>
                 <w:sz w:val="14"/>
               </w:rPr>
-              <w:t>-0 mm / +0.3 °C</w:t>
+              <w:t>+18 mm / +0.3 °C</w:t>
             </w:r>
           </w:p>
         </w:tc>
@@ -5723,7 +5723,7 @@
               <w:rPr>
                 <w:sz w:val="14"/>
               </w:rPr>
-              <w:t>2003/04 2005/06 2007/08 2019/20 2024/25</w:t>
+              <w:t>2005/06 2007/08 2010/11 2019/20 2024/25</w:t>
             </w:r>
           </w:p>
         </w:tc>
@@ -5753,7 +5753,7 @@
               <w:rPr>
                 <w:sz w:val="14"/>
               </w:rPr>
-              <w:t>8</w:t>
+              <w:t>9</w:t>
             </w:r>
           </w:p>
         </w:tc>
@@ -5767,7 +5767,7 @@
               <w:rPr>
                 <w:sz w:val="14"/>
               </w:rPr>
-              <w:t>+0.0 %</w:t>
+              <w:t>+1.1 %</w:t>
             </w:r>
           </w:p>
         </w:tc>
@@ -5781,7 +5781,7 @@
               <w:rPr>
                 <w:sz w:val="14"/>
               </w:rPr>
-              <w:t>-0.6 %</w:t>
+              <w:t>-0.4 %</w:t>
             </w:r>
           </w:p>
         </w:tc>
@@ -5795,26 +5795,26 @@
               <w:rPr>
                 <w:sz w:val="14"/>
               </w:rPr>
+              <w:t>+0.6 %</w:t>
+            </w:r>
+          </w:p>
+        </w:tc>
+        <w:tc>
+          <w:tcPr>
+            <w:tcW w:type="dxa" w:w="907"/>
+          </w:tcPr>
+          <w:p>
+            <w:r/>
+            <w:r>
+              <w:rPr>
+                <w:sz w:val="14"/>
+              </w:rPr>
               <w:t>-0.1 %</w:t>
             </w:r>
           </w:p>
         </w:tc>
         <w:tc>
           <w:tcPr>
-            <w:tcW w:type="dxa" w:w="907"/>
-          </w:tcPr>
-          <w:p>
-            <w:r/>
-            <w:r>
-              <w:rPr>
-                <w:sz w:val="14"/>
-              </w:rPr>
-              <w:t>-0.5 %</w:t>
-            </w:r>
-          </w:p>
-        </w:tc>
-        <w:tc>
-          <w:tcPr>
             <w:tcW w:type="dxa" w:w="1304"/>
           </w:tcPr>
           <w:p>
@@ -5823,7 +5823,7 @@
               <w:rPr>
                 <w:sz w:val="14"/>
               </w:rPr>
-              <w:t>-29 mm / -0.1 °C</w:t>
+              <w:t>-23 mm / -0.1 °C</w:t>
             </w:r>
           </w:p>
         </w:tc>
@@ -5837,7 +5837,7 @@
               <w:rPr>
                 <w:sz w:val="14"/>
               </w:rPr>
-              <w:t>+21 mm / -0.2 °C</w:t>
+              <w:t>+24 mm / -0.1 °C</w:t>
             </w:r>
           </w:p>
         </w:tc>
@@ -5851,7 +5851,7 @@
               <w:rPr>
                 <w:sz w:val="14"/>
               </w:rPr>
-              <w:t>2006/07 2009/10 2012/13 2017/18 2018/19 2021/22 2022/23 2023/24</w:t>
+              <w:t>2006/07 2009/10 2012/13 2017/18 2018/19 2020/21 2021/22 2022/23 2023/24</w:t>
             </w:r>
           </w:p>
         </w:tc>
@@ -5951,7 +5951,7 @@
               <w:rPr>
                 <w:sz w:val="14"/>
               </w:rPr>
-              <w:t>+106 mm / -0.5 °C</w:t>
+              <w:t>+112 mm / -0.5 °C</w:t>
             </w:r>
           </w:p>
         </w:tc>
@@ -5965,7 +5965,7 @@
               <w:rPr>
                 <w:sz w:val="14"/>
               </w:rPr>
-              <w:t>-19 mm / -0.3 °C</w:t>
+              <w:t>-27 mm / -0.3 °C</w:t>
             </w:r>
           </w:p>
         </w:tc>
@@ -5993,7 +5993,7 @@
           <w:i w:val="0"/>
           <w:sz w:val="20"/>
         </w:rPr>
-        <w:t>Lecture : les El Niño forts de la période (2009/10, 2015/16) ont donné des campagnes N+1 avec -277 mm et +0.8 °C en Espírito Santo et -116 mm, +0.4 °C à Minas Gerais. Le conilon, non irrigué dans une bonne partie de São Mateus, a perdu -18.4 % par rapport à l'attendu (−30 % en 2016/17) ; l'arabica, en année ON, est resté à +2.2 % de l'attendu : le cycle a masqué le choc. Les El Niño ordinaires ont une signature plus diffuse : 2024/25 (après l'épisode 2023/24) a tout de même connu −452 mm et +2,4 °C à Minas Gerais.</w:t>
+        <w:t>Lecture : les El Niño forts de la période (2015/16) ont donné des campagnes N+1 avec -492 mm et +1.3 °C en Espírito Santo et -118 mm, +0.8 °C à Minas Gerais. Le conilon, non irrigué dans une bonne partie de São Mateus, a perdu -29.7 % par rapport à l'attendu (−30 % en 2016/17) ; l'arabica, en année ON, est resté à +3.0 % de l'attendu : le cycle a masqué le choc. Les El Niño ordinaires ont une signature plus diffuse : 2024/25 (après l'épisode 2023/24) a tout de même connu −452 mm et +2,4 °C à Minas Gerais.</w:t>
       </w:r>
     </w:p>
     <w:p>
@@ -6003,7 +6003,7 @@
           <w:i w:val="0"/>
           <w:sz w:val="20"/>
         </w:rPr>
-        <w:t>Dans les données : les campagnes El Niño ont eu -21 mm de pluie à Minas Gerais et -104 mm en Espírito Santo, avec +0.35 °C et +0.46 °C, mais +145 mm au Paraná ; les campagnes La Niña +4 mm à Minas et -78 mm au Paraná. Le signal attendu (Sud plus humide, Sudeste plus sec et plus chaud sous El Niño) est bien là, et c'est le Sudeste qui porte l'arabica et le conilon.</w:t>
+        <w:t>Dans les données : les campagnes El Niño ont eu -39 mm de pluie à Minas Gerais et -98 mm en Espírito Santo, avec +0.43 °C et +0.51 °C, mais +159 mm au Paraná ; les campagnes La Niña +7 mm à Minas et -86 mm au Paraná. Le signal attendu (Sud plus humide, Sudeste plus sec et plus chaud sous El Niño) est bien là, et c'est le Sudeste qui porte l'arabica et le conilon.</w:t>
       </w:r>
     </w:p>
     <w:p>
@@ -6188,7 +6188,7 @@
               <w:rPr>
                 <w:sz w:val="15"/>
               </w:rPr>
-              <w:t>4</w:t>
+              <w:t>3</w:t>
             </w:r>
           </w:p>
         </w:tc>
@@ -6202,7 +6202,7 @@
               <w:rPr>
                 <w:sz w:val="15"/>
               </w:rPr>
-              <w:t>-7.2 %</w:t>
+              <w:t>-2.7 %</w:t>
             </w:r>
           </w:p>
         </w:tc>
@@ -6230,7 +6230,7 @@
               <w:rPr>
                 <w:sz w:val="15"/>
               </w:rPr>
-              <w:t>-6.1 %</w:t>
+              <w:t>-4.0 %</w:t>
             </w:r>
           </w:p>
         </w:tc>
@@ -6244,7 +6244,7 @@
               <w:rPr>
                 <w:sz w:val="15"/>
               </w:rPr>
-              <w:t>2003/04 2010/11 2016/17 2024/25</w:t>
+              <w:t>2010/11 2016/17 2024/25</w:t>
             </w:r>
           </w:p>
         </w:tc>
@@ -6274,7 +6274,7 @@
               <w:rPr>
                 <w:sz w:val="15"/>
               </w:rPr>
-              <w:t>7</w:t>
+              <w:t>6</w:t>
             </w:r>
           </w:p>
         </w:tc>
@@ -6288,7 +6288,7 @@
               <w:rPr>
                 <w:sz w:val="15"/>
               </w:rPr>
-              <w:t>-4.5 %</w:t>
+              <w:t>-1.9 %</w:t>
             </w:r>
           </w:p>
         </w:tc>
@@ -6302,7 +6302,7 @@
               <w:rPr>
                 <w:sz w:val="15"/>
               </w:rPr>
-              <w:t>86 %</w:t>
+              <w:t>83 %</w:t>
             </w:r>
           </w:p>
         </w:tc>
@@ -6316,7 +6316,7 @@
               <w:rPr>
                 <w:sz w:val="15"/>
               </w:rPr>
-              <w:t>-3.9 %</w:t>
+              <w:t>-2.5 %</w:t>
             </w:r>
           </w:p>
         </w:tc>
@@ -6330,7 +6330,7 @@
               <w:rPr>
                 <w:sz w:val="15"/>
               </w:rPr>
-              <w:t>2003/04 2005/06 2007/08 2010/11 2016/17 2019/20 2024/25</w:t>
+              <w:t>2005/06 2007/08 2010/11 2016/17 2019/20 2024/25</w:t>
             </w:r>
           </w:p>
         </w:tc>
@@ -6360,7 +6360,7 @@
               <w:rPr>
                 <w:sz w:val="15"/>
               </w:rPr>
-              <w:t>5</w:t>
+              <w:t>4</w:t>
             </w:r>
           </w:p>
         </w:tc>
@@ -6374,7 +6374,7 @@
               <w:rPr>
                 <w:sz w:val="15"/>
               </w:rPr>
-              <w:t>+9.3 %</w:t>
+              <w:t>+10.8 %</w:t>
             </w:r>
           </w:p>
         </w:tc>
@@ -6388,7 +6388,7 @@
               <w:rPr>
                 <w:sz w:val="15"/>
               </w:rPr>
-              <w:t>40 %</w:t>
+              <w:t>50 %</w:t>
             </w:r>
           </w:p>
         </w:tc>
@@ -6402,7 +6402,7 @@
               <w:rPr>
                 <w:sz w:val="15"/>
               </w:rPr>
-              <w:t>+7.6 %</w:t>
+              <w:t>+7.8 %</w:t>
             </w:r>
           </w:p>
         </w:tc>
@@ -6416,7 +6416,7 @@
               <w:rPr>
                 <w:sz w:val="15"/>
               </w:rPr>
-              <w:t>2002/03 2004/05 2013/14 2014/15 2020/21</w:t>
+              <w:t>2002/03 2004/05 2013/14 2014/15</w:t>
             </w:r>
           </w:p>
         </w:tc>
@@ -6446,7 +6446,7 @@
               <w:rPr>
                 <w:sz w:val="15"/>
               </w:rPr>
-              <w:t>10</w:t>
+              <w:t>11</w:t>
             </w:r>
           </w:p>
         </w:tc>
@@ -6460,7 +6460,7 @@
               <w:rPr>
                 <w:sz w:val="15"/>
               </w:rPr>
-              <w:t>+0.1 %</w:t>
+              <w:t>+0.4 %</w:t>
             </w:r>
           </w:p>
         </w:tc>
@@ -6474,7 +6474,7 @@
               <w:rPr>
                 <w:sz w:val="15"/>
               </w:rPr>
-              <w:t>50 %</w:t>
+              <w:t>45 %</w:t>
             </w:r>
           </w:p>
         </w:tc>
@@ -6488,7 +6488,7 @@
               <w:rPr>
                 <w:sz w:val="15"/>
               </w:rPr>
-              <w:t>+0.5 %</w:t>
+              <w:t>+1.1 %</w:t>
             </w:r>
           </w:p>
         </w:tc>
@@ -6502,7 +6502,7 @@
               <w:rPr>
                 <w:sz w:val="15"/>
               </w:rPr>
-              <w:t>2006/07 2008/09 2009/10 2011/12 2012/13 2017/18 2018/19 2021/22 2022/23 2023/24</w:t>
+              <w:t>2006/07 2008/09 2009/10 2011/12 2012/13 2017/18 2018/19 2020/21 2021/22 2022/23 2023/24</w:t>
             </w:r>
           </w:p>
         </w:tc>
@@ -6532,7 +6532,7 @@
               <w:rPr>
                 <w:sz w:val="15"/>
               </w:rPr>
-              <w:t>7</w:t>
+              <w:t>9</w:t>
             </w:r>
           </w:p>
         </w:tc>
@@ -6546,7 +6546,7 @@
               <w:rPr>
                 <w:sz w:val="15"/>
               </w:rPr>
-              <w:t>+0.9 %</w:t>
+              <w:t>+0.5 %</w:t>
             </w:r>
           </w:p>
         </w:tc>
@@ -6560,7 +6560,7 @@
               <w:rPr>
                 <w:sz w:val="15"/>
               </w:rPr>
-              <w:t>43 %</w:t>
+              <w:t>44 %</w:t>
             </w:r>
           </w:p>
         </w:tc>
@@ -6574,7 +6574,7 @@
               <w:rPr>
                 <w:sz w:val="15"/>
               </w:rPr>
-              <w:t>+1.4 %</w:t>
+              <w:t>+0.6 %</w:t>
             </w:r>
           </w:p>
         </w:tc>
@@ -6588,7 +6588,7 @@
               <w:rPr>
                 <w:sz w:val="15"/>
               </w:rPr>
-              <w:t>2008/09 2011/12 2012/13 2018/19 2021/22 2022/23 2023/24</w:t>
+              <w:t>2008/09 2009/10 2011/12 2012/13 2017/18 2018/19 2021/22 2022/23 2023/24</w:t>
             </w:r>
           </w:p>
         </w:tc>
@@ -6602,7 +6602,7 @@
           <w:i w:val="0"/>
           <w:sz w:val="20"/>
         </w:rPr>
-        <w:t>Lecture : pour Brésil, El Niño est historiquement négatif pour le rendement (-4.5 %) et La Niña neutre (+0.1 %). Avec 8 à 15 campagnes par phase, ce sont des tendances centrales, pas des lois : l'intensité de l'épisode, son calage sur la floraison et l'état du verger font l'écart.</w:t>
+        <w:t>Lecture : pour Brésil, El Niño est historiquement négatif pour le rendement (-1.9 %) et La Niña neutre (+0.4 %). Avec 8 à 15 campagnes par phase, ce sont des tendances centrales, pas des lois : l'intensité de l'épisode, son calage sur la floraison et l'état du verger font l'écart.</w:t>
       </w:r>
     </w:p>
     <w:p>
@@ -6622,7 +6622,7 @@
           <w:i w:val="0"/>
           <w:sz w:val="20"/>
         </w:rPr>
-        <w:t>Campagne pilotée : 2027/28. Point de départ (modèle, ON/OFF connu pour le Brésil) : 66 038 ; avec l'effet El Niño moyen (-3.9 %) : 63 449 ; avec l'effet des El Niño forts (-6.1 %) : 62 016 (milliers de sacs).</w:t>
+        <w:t>Campagne pilotée : 2027/28. Point de départ (modèle, ON/OFF connu pour le Brésil) : 66 038 ; avec l'effet El Niño moyen (-2.5 %) : 64 373 ; avec l'effet des El Niño forts (-4.0 %) : 63 383 (milliers de sacs).</w:t>
       </w:r>
     </w:p>
     <w:p>
@@ -7584,7 +7584,7 @@
         <w:rPr>
           <w:sz w:val="17"/>
         </w:rPr>
-        <w:t>2027/28 : Arabica 43 119 = 26 423 (point de départ 2001/02, année OFF) + 16 696 (croissance structurelle 618 par an × 27 campagnes) + 0 (année OFF : pas de bonus) ; Robusta 23 196 = 7 813 (point de départ 2001/02, année OFF) + 15 383 (croissance structurelle 570 par an × 27 campagnes) ; Total 66 038 = 34 231 (point de départ 2001/02, année OFF) + 31 807 (croissance structurelle 1 178 par an × 27 campagnes) + 0 (année OFF : pas de bonus). Météo : normale, donc 0. Campagne pilotée par l'El Niño en cours : si El Niño ordinaire, arabica -4.4 % → 41 218, robusta -2.9 % → 22 533 ; si fort, arabica +2.2 % → 44 063, robusta -18.4 % → 18 928 (moyennes historiques des campagnes N+1 de chaque classe).</w:t>
+        <w:t>2027/28 : Arabica 43 119 = 26 423 (point de départ 2001/02, année OFF) + 16 696 (croissance structurelle 618 par an × 27 campagnes) + 0 (année OFF : pas de bonus) ; Robusta 23 196 = 7 813 (point de départ 2001/02, année OFF) + 15 383 (croissance structurelle 570 par an × 27 campagnes) ; Total 66 038 = 34 231 (point de départ 2001/02, année OFF) + 31 807 (croissance structurelle 1 178 par an × 27 campagnes) + 0 (année OFF : pas de bonus). Météo : normale, donc 0. Campagne pilotée par l'El Niño en cours : si El Niño ordinaire, arabica -1.4 % → 42 501, robusta -2.5 % → 22 607 ; si fort, arabica +3.0 % → 44 426, robusta -29.7 % → 16 298 (moyennes historiques des campagnes N+1 de chaque classe).</w:t>
       </w:r>
     </w:p>
     <w:p>
@@ -10507,7 +10507,7 @@
               <w:rPr>
                 <w:sz w:val="14"/>
               </w:rPr>
-              <w:t>32.87</w:t>
+              <w:t>33.57</w:t>
             </w:r>
           </w:p>
         </w:tc>
@@ -10549,7 +10549,7 @@
               <w:rPr>
                 <w:sz w:val="14"/>
               </w:rPr>
-              <w:t>41 218</w:t>
+              <w:t>42 501</w:t>
             </w:r>
           </w:p>
         </w:tc>
@@ -10563,7 +10563,7 @@
               <w:rPr>
                 <w:sz w:val="14"/>
               </w:rPr>
-              <w:t>22 533</w:t>
+              <w:t>22 607</w:t>
             </w:r>
           </w:p>
         </w:tc>
@@ -10649,7 +10649,7 @@
               <w:rPr>
                 <w:sz w:val="14"/>
               </w:rPr>
-              <w:t>32.48</w:t>
+              <w:t>31.31</w:t>
             </w:r>
           </w:p>
         </w:tc>
@@ -10691,7 +10691,7 @@
               <w:rPr>
                 <w:sz w:val="14"/>
               </w:rPr>
-              <w:t>44 063</w:t>
+              <w:t>44 426</w:t>
             </w:r>
           </w:p>
         </w:tc>
@@ -10705,7 +10705,7 @@
               <w:rPr>
                 <w:sz w:val="14"/>
               </w:rPr>
-              <w:t>18 928</w:t>
+              <w:t>16 298</w:t>
             </w:r>
           </w:p>
         </w:tc>
@@ -10938,7 +10938,7 @@
         <w:rPr>
           <w:sz w:val="17"/>
         </w:rPr>
-        <w:t>Arabica 43 119 = 26 423 (point de départ 2001/02, année OFF) + 618 × 27 campagnes + 0 (année OFF, pas de bonus). Avec El Niño ordinaire (-4.4 % historique) : 41 218 ; avec El Niño fort (+2.2 %) : 44 063.</w:t>
+        <w:t>Arabica 43 119 = 26 423 (point de départ 2001/02, année OFF) + 618 × 27 campagnes + 0 (année OFF, pas de bonus). Avec El Niño ordinaire (-1.4 % historique) : 42 501 ; avec El Niño fort (+3.0 %) : 44 426.</w:t>
       </w:r>
     </w:p>
     <w:p>
@@ -10949,7 +10949,7 @@
         <w:rPr>
           <w:sz w:val="17"/>
         </w:rPr>
-        <w:t>Robusta 23 196 = 7 813 + 570 × 27 campagnes (le report de surprise de 2025/26 ne joue plus). Avec El Niño ordinaire (-2.9 %) : 22 533 ; avec El Niño fort (-18.4 %) : 18 928.</w:t>
+        <w:t>Robusta 23 196 = 7 813 + 570 × 27 campagnes (le report de surprise de 2025/26 ne joue plus). Avec El Niño ordinaire (-2.5 %) : 22 607 ; avec El Niño fort (-29.7 %) : 16 298.</w:t>
       </w:r>
     </w:p>
     <w:p>
@@ -10960,7 +10960,7 @@
         <w:rPr>
           <w:sz w:val="17"/>
         </w:rPr>
-        <w:t>Rendement 34.19 = (43 119 + 23 196) / 1 940 ; El Niño ordinaire 32.87 ; El Niño fort 32.48. Contrôle : le modèle de rendement direct (ON/OFF + tendance) donne 33.65 sacs/ha, soit 65 262 milliers de sacs par la surface récoltée : cohérent à 2 % près avec la production prévue.</w:t>
+        <w:t>Rendement 34.19 = (43 119 + 23 196) / 1 940 ; El Niño ordinaire 33.57 ; El Niño fort 31.31. Contrôle : le modèle de rendement direct (ON/OFF + tendance) donne 33.65 sacs/ha, soit 65 262 milliers de sacs par la surface récoltée : cohérent à 2 % près avec la production prévue.</w:t>
       </w:r>
     </w:p>
     <w:p>
@@ -10971,7 +10971,7 @@
         <w:rPr>
           <w:sz w:val="17"/>
         </w:rPr>
-        <w:t>Comparaison avec ta ligne : arabica 41 325 est entre mon scénario El Niño ordinaire (41 218) et la météo normale (43 119) ; robusta 22 226 est proche de mon El Niño ordinaire (22 533) ; ta surface récoltée 1 906 suppose un recul de 35 kha en un an, plus fort que la tendance (1 940) ; tes arbres bearing 6 807 supposent une baisse alors que la dérive historique est de +131 M par an.</w:t>
+        <w:t>Comparaison avec ta ligne : arabica 41 325 est entre mon scénario El Niño ordinaire (42 501) et la météo normale (43 119) ; robusta 22 226 est proche de mon El Niño ordinaire (22 607) ; ta surface récoltée 1 906 suppose un recul de 35 kha en un an, plus fort que la tendance (1 940) ; tes arbres bearing 6 807 supposent une baisse alors que la dérive historique est de +131 M par an.</w:t>
       </w:r>
     </w:p>
     <w:p>

</xml_diff>

<commit_message>
Reports: phase table on the intensity classes (fort >= 1.6)
Co-Authored-By: Claude Fable 5.1 <noreply@anthropic.com>
Claude-Session: https://claude.ai/code/session_01FCxjZoAHXMLJTirXSfbmgL
</commit_message>
<xml_diff>
--- a/timeseries/output/reports/Bresil_balance_sheet_cafe.docx
+++ b/timeseries/output/reports/Bresil_balance_sheet_cafe.docx
@@ -6174,7 +6174,7 @@
               <w:rPr>
                 <w:sz w:val="15"/>
               </w:rPr>
-              <w:t>El Niño fort (|ONI| ≥ 1)</w:t>
+              <w:t>El Niño fort (≥ 1,6)</w:t>
             </w:r>
           </w:p>
         </w:tc>
@@ -6188,7 +6188,7 @@
               <w:rPr>
                 <w:sz w:val="15"/>
               </w:rPr>
-              <w:t>3</w:t>
+              <w:t>1</w:t>
             </w:r>
           </w:p>
         </w:tc>
@@ -6202,7 +6202,7 @@
               <w:rPr>
                 <w:sz w:val="15"/>
               </w:rPr>
-              <w:t>-2.7 %</w:t>
+              <w:t>-6.1 %</w:t>
             </w:r>
           </w:p>
         </w:tc>
@@ -6230,7 +6230,7 @@
               <w:rPr>
                 <w:sz w:val="15"/>
               </w:rPr>
-              <w:t>-4.0 %</w:t>
+              <w:t>-5.8 %</w:t>
             </w:r>
           </w:p>
         </w:tc>
@@ -6244,7 +6244,7 @@
               <w:rPr>
                 <w:sz w:val="15"/>
               </w:rPr>
-              <w:t>2010/11 2016/17 2024/25</w:t>
+              <w:t>2016/17</w:t>
             </w:r>
           </w:p>
         </w:tc>
@@ -6260,7 +6260,7 @@
               <w:rPr>
                 <w:sz w:val="15"/>
               </w:rPr>
-              <w:t>El Niño</w:t>
+              <w:t>El Niño (0,5 à 1,5)</w:t>
             </w:r>
           </w:p>
         </w:tc>
@@ -6274,7 +6274,7 @@
               <w:rPr>
                 <w:sz w:val="15"/>
               </w:rPr>
-              <w:t>6</w:t>
+              <w:t>5</w:t>
             </w:r>
           </w:p>
         </w:tc>
@@ -6288,13 +6288,41 @@
               <w:rPr>
                 <w:sz w:val="15"/>
               </w:rPr>
+              <w:t>-1.1 %</w:t>
+            </w:r>
+          </w:p>
+        </w:tc>
+        <w:tc>
+          <w:tcPr>
+            <w:tcW w:type="dxa" w:w="1134"/>
+          </w:tcPr>
+          <w:p>
+            <w:r/>
+            <w:r>
+              <w:rPr>
+                <w:sz w:val="15"/>
+              </w:rPr>
+              <w:t>80 %</w:t>
+            </w:r>
+          </w:p>
+        </w:tc>
+        <w:tc>
+          <w:tcPr>
+            <w:tcW w:type="dxa" w:w="1361"/>
+          </w:tcPr>
+          <w:p>
+            <w:r/>
+            <w:r>
+              <w:rPr>
+                <w:sz w:val="15"/>
+              </w:rPr>
               <w:t>-1.9 %</w:t>
             </w:r>
           </w:p>
         </w:tc>
         <w:tc>
           <w:tcPr>
-            <w:tcW w:type="dxa" w:w="1134"/>
+            <w:tcW w:type="dxa" w:w="3402"/>
           </w:tcPr>
           <w:p>
             <w:r/>
@@ -6302,35 +6330,7 @@
               <w:rPr>
                 <w:sz w:val="15"/>
               </w:rPr>
-              <w:t>83 %</w:t>
-            </w:r>
-          </w:p>
-        </w:tc>
-        <w:tc>
-          <w:tcPr>
-            <w:tcW w:type="dxa" w:w="1361"/>
-          </w:tcPr>
-          <w:p>
-            <w:r/>
-            <w:r>
-              <w:rPr>
-                <w:sz w:val="15"/>
-              </w:rPr>
-              <w:t>-2.5 %</w:t>
-            </w:r>
-          </w:p>
-        </w:tc>
-        <w:tc>
-          <w:tcPr>
-            <w:tcW w:type="dxa" w:w="3402"/>
-          </w:tcPr>
-          <w:p>
-            <w:r/>
-            <w:r>
-              <w:rPr>
-                <w:sz w:val="15"/>
-              </w:rPr>
-              <w:t>2005/06 2007/08 2010/11 2016/17 2019/20 2024/25</w:t>
+              <w:t>2005/06 2007/08 2010/11 2019/20 2024/25</w:t>
             </w:r>
           </w:p>
         </w:tc>
@@ -6446,7 +6446,7 @@
               <w:rPr>
                 <w:sz w:val="15"/>
               </w:rPr>
-              <w:t>11</w:t>
+              <w:t>9</w:t>
             </w:r>
           </w:p>
         </w:tc>
@@ -6460,7 +6460,7 @@
               <w:rPr>
                 <w:sz w:val="15"/>
               </w:rPr>
-              <w:t>+0.4 %</w:t>
+              <w:t>-0.1 %</w:t>
             </w:r>
           </w:p>
         </w:tc>
@@ -6474,7 +6474,7 @@
               <w:rPr>
                 <w:sz w:val="15"/>
               </w:rPr>
-              <w:t>45 %</w:t>
+              <w:t>44 %</w:t>
             </w:r>
           </w:p>
         </w:tc>
@@ -6488,7 +6488,7 @@
               <w:rPr>
                 <w:sz w:val="15"/>
               </w:rPr>
-              <w:t>+1.1 %</w:t>
+              <w:t>+0.6 %</w:t>
             </w:r>
           </w:p>
         </w:tc>
@@ -6502,7 +6502,7 @@
               <w:rPr>
                 <w:sz w:val="15"/>
               </w:rPr>
-              <w:t>2006/07 2008/09 2009/10 2011/12 2012/13 2017/18 2018/19 2020/21 2021/22 2022/23 2023/24</w:t>
+              <w:t>2006/07 2009/10 2012/13 2017/18 2018/19 2020/21 2021/22 2022/23 2023/24</w:t>
             </w:r>
           </w:p>
         </w:tc>
@@ -6518,7 +6518,7 @@
               <w:rPr>
                 <w:sz w:val="15"/>
               </w:rPr>
-              <w:t>La Niña forte (|ONI| ≥ 1)</w:t>
+              <w:t>La Niña forte (≤ −1,6)</w:t>
             </w:r>
           </w:p>
         </w:tc>
@@ -6532,7 +6532,7 @@
               <w:rPr>
                 <w:sz w:val="15"/>
               </w:rPr>
-              <w:t>9</w:t>
+              <w:t>2</w:t>
             </w:r>
           </w:p>
         </w:tc>
@@ -6546,7 +6546,7 @@
               <w:rPr>
                 <w:sz w:val="15"/>
               </w:rPr>
-              <w:t>+0.5 %</w:t>
+              <w:t>+2.4 %</w:t>
             </w:r>
           </w:p>
         </w:tc>
@@ -6560,7 +6560,7 @@
               <w:rPr>
                 <w:sz w:val="15"/>
               </w:rPr>
-              <w:t>44 %</w:t>
+              <w:t>50 %</w:t>
             </w:r>
           </w:p>
         </w:tc>
@@ -6574,7 +6574,7 @@
               <w:rPr>
                 <w:sz w:val="15"/>
               </w:rPr>
-              <w:t>+0.6 %</w:t>
+              <w:t>+3.0 %</w:t>
             </w:r>
           </w:p>
         </w:tc>
@@ -6588,7 +6588,7 @@
               <w:rPr>
                 <w:sz w:val="15"/>
               </w:rPr>
-              <w:t>2008/09 2009/10 2011/12 2012/13 2017/18 2018/19 2021/22 2022/23 2023/24</w:t>
+              <w:t>2008/09 2011/12</w:t>
             </w:r>
           </w:p>
         </w:tc>

</xml_diff>

<commit_message>
Brazil report: area and tree forecasts net of the 2024/25 source break
Co-Authored-By: Claude Fable 5.1 <noreply@anthropic.com>
Claude-Session: https://claude.ai/code/session_01FCxjZoAHXMLJTirXSfbmgL
</commit_message>
<xml_diff>
--- a/timeseries/output/reports/Bresil_balance_sheet_cafe.docx
+++ b/timeseries/output/reports/Bresil_balance_sheet_cafe.docx
@@ -1871,7 +1871,7 @@
           <w:color w:val="52514E"/>
           <w:sz w:val="16"/>
         </w:rPr>
-        <w:t>2025/26 et 2026/27 sont des estimations / projections USDA, pas des récoltes réalisées.</w:t>
+        <w:t>2025/26 et 2026/27 sont des estimations / projections USDA, pas des récoltes réalisées. Surfaces et arbres : changement de source en 2024/25, les niveaux avant et après ne sont pas comparables (le calcul de la ligne 2027/28, section 7 bis, en tient compte).</w:t>
       </w:r>
     </w:p>
     <w:p>
@@ -10337,7 +10337,7 @@
               <w:rPr>
                 <w:sz w:val="14"/>
               </w:rPr>
-              <w:t>2 350</w:t>
+              <w:t>2 340</w:t>
             </w:r>
           </w:p>
         </w:tc>
@@ -10351,7 +10351,7 @@
               <w:rPr>
                 <w:sz w:val="14"/>
               </w:rPr>
-              <w:t>1 940</w:t>
+              <w:t>1 932</w:t>
             </w:r>
           </w:p>
         </w:tc>
@@ -10365,7 +10365,7 @@
               <w:rPr>
                 <w:sz w:val="14"/>
               </w:rPr>
-              <w:t>34.19</w:t>
+              <w:t>34.33</w:t>
             </w:r>
           </w:p>
         </w:tc>
@@ -10379,7 +10379,7 @@
               <w:rPr>
                 <w:sz w:val="14"/>
               </w:rPr>
-              <w:t>7 007</w:t>
+              <w:t>6 972</w:t>
             </w:r>
           </w:p>
         </w:tc>
@@ -10393,7 +10393,7 @@
               <w:rPr>
                 <w:sz w:val="14"/>
               </w:rPr>
-              <w:t>1 461</w:t>
+              <w:t>1 479</w:t>
             </w:r>
           </w:p>
         </w:tc>
@@ -10479,7 +10479,7 @@
               <w:rPr>
                 <w:sz w:val="14"/>
               </w:rPr>
-              <w:t>2 350</w:t>
+              <w:t>2 340</w:t>
             </w:r>
           </w:p>
         </w:tc>
@@ -10493,7 +10493,7 @@
               <w:rPr>
                 <w:sz w:val="14"/>
               </w:rPr>
-              <w:t>1 940</w:t>
+              <w:t>1 932</w:t>
             </w:r>
           </w:p>
         </w:tc>
@@ -10507,7 +10507,7 @@
               <w:rPr>
                 <w:sz w:val="14"/>
               </w:rPr>
-              <w:t>33.57</w:t>
+              <w:t>33.70</w:t>
             </w:r>
           </w:p>
         </w:tc>
@@ -10521,7 +10521,7 @@
               <w:rPr>
                 <w:sz w:val="14"/>
               </w:rPr>
-              <w:t>7 007</w:t>
+              <w:t>6 972</w:t>
             </w:r>
           </w:p>
         </w:tc>
@@ -10535,7 +10535,7 @@
               <w:rPr>
                 <w:sz w:val="14"/>
               </w:rPr>
-              <w:t>1 461</w:t>
+              <w:t>1 479</w:t>
             </w:r>
           </w:p>
         </w:tc>
@@ -10621,7 +10621,7 @@
               <w:rPr>
                 <w:sz w:val="14"/>
               </w:rPr>
-              <w:t>2 350</w:t>
+              <w:t>2 340</w:t>
             </w:r>
           </w:p>
         </w:tc>
@@ -10635,7 +10635,7 @@
               <w:rPr>
                 <w:sz w:val="14"/>
               </w:rPr>
-              <w:t>1 940</w:t>
+              <w:t>1 932</w:t>
             </w:r>
           </w:p>
         </w:tc>
@@ -10649,7 +10649,7 @@
               <w:rPr>
                 <w:sz w:val="14"/>
               </w:rPr>
-              <w:t>31.31</w:t>
+              <w:t>31.43</w:t>
             </w:r>
           </w:p>
         </w:tc>
@@ -10663,7 +10663,7 @@
               <w:rPr>
                 <w:sz w:val="14"/>
               </w:rPr>
-              <w:t>7 007</w:t>
+              <w:t>6 972</w:t>
             </w:r>
           </w:p>
         </w:tc>
@@ -10677,7 +10677,7 @@
               <w:rPr>
                 <w:sz w:val="14"/>
               </w:rPr>
-              <w:t>1 461</w:t>
+              <w:t>1 479</w:t>
             </w:r>
           </w:p>
         </w:tc>
@@ -10862,7 +10862,7 @@
           <w:color w:val="52514E"/>
           <w:sz w:val="16"/>
         </w:rPr>
-        <w:t>Rendement = (arabica + robusta) / surface récoltée. Le tableau fourni indique 26,06 pour 2010/11 ; avec 54 500 / 2 175 on obtient 25,06.</w:t>
+        <w:t>Rendement = (arabica + robusta) / surface récoltée. Le tableau fourni indique 26,06 pour 2010/11 ; avec 54 500 / 2 175 on obtient 25,06. Rupture de source en 2024/25 sur les surfaces et les arbres (2 510 → 2 235 kha plantés, 2 030 → 1 881 récoltés) : le saut n'est pas physique, et le rendement 2024/25 est mécaniquement gonflé d'environ 7 % par le dénominateur.</w:t>
       </w:r>
     </w:p>
     <w:p>
@@ -10894,7 +10894,7 @@
         <w:rPr>
           <w:sz w:val="17"/>
         </w:rPr>
-        <w:t>Surface plantée 2 350 = 2 503 (droite en 2000/01) − 5.67 × 27 campagnes : la surface plantée baisse en moyenne de 5.7 milliers d'ha par an depuis 2001/02 (2 488 → 2 342). Dernière valeur USDA : 2 342.</w:t>
+        <w:t>Surfaces et arbres : la source change en 2024/25, donc la droite est tracée avec un décrochement à cette date ; la pente retenue est la pente hors décrochement, appliquée à la dernière valeur (nouvelle source).</w:t>
       </w:r>
     </w:p>
     <w:p>
@@ -10905,7 +10905,7 @@
         <w:rPr>
           <w:sz w:val="17"/>
         </w:rPr>
-        <w:t>Surface récoltée 1 940 = 2 258 − 11.79 × 27 : la surface en production recule de 11.8 milliers d'ha par an depuis 2001/02 (2 175 → 1 941), le rendement compense. Dernière valeur USDA : 1 941.</w:t>
+        <w:t>Surface plantée 2 340 = 2 342 (2026/27) -2.5 : hors saut de source (-136 kha), la surface plantée bouge de -2.5 milliers d'ha par an depuis 2001/02, c'est-à-dire qu'elle est stable.</w:t>
       </w:r>
     </w:p>
     <w:p>
@@ -10916,7 +10916,7 @@
         <w:rPr>
           <w:sz w:val="17"/>
         </w:rPr>
-        <w:t>Arbres bearing 7 007 = 6 876 (2026/27) + 131 : le stock d'arbres en production gagne en moyenne 131 millions par an depuis 1998/99.</w:t>
+        <w:t>Surface récoltée 1 932 = 1 941 (2026/27) -9.1 : hors saut de source (-113 kha), la surface en production recule de 9.1 milliers d'ha par an (densification, arrachage des vieux vergers), le rendement compense.</w:t>
       </w:r>
     </w:p>
     <w:p>
@@ -10927,7 +10927,18 @@
         <w:rPr>
           <w:sz w:val="17"/>
         </w:rPr>
-        <w:t>Arbres non-bearing 1 461 = 1 461, dernière valeur reconduite : aucune tendance stable sur cette série (marche aléatoire), l'intervalle 80 % va de 1 191 à 1 731.</w:t>
+        <w:t>Arbres bearing 6 972 = 6 876 (2026/27) +96 : le stock d'arbres en production gagne +96 millions par an, saut de source -76.</w:t>
+      </w:r>
+    </w:p>
+    <w:p>
+      <w:pPr>
+        <w:pStyle w:val="ListBullet"/>
+      </w:pPr>
+      <w:r>
+        <w:rPr>
+          <w:sz w:val="17"/>
+        </w:rPr>
+        <w:t>Arbres non-bearing 1 479 = 1 461 (2026/27) +18 : les jeunes arbres augmentent de +18 millions par an (renouvellement du verger), saut de source +110.</w:t>
       </w:r>
     </w:p>
     <w:p>
@@ -10960,7 +10971,7 @@
         <w:rPr>
           <w:sz w:val="17"/>
         </w:rPr>
-        <w:t>Rendement 34.19 = (43 119 + 23 196) / 1 940 ; El Niño ordinaire 33.57 ; El Niño fort 31.31. Contrôle : le modèle de rendement direct (ON/OFF + tendance) donne 33.65 sacs/ha, soit 65 262 milliers de sacs par la surface récoltée : cohérent à 2 % près avec la production prévue.</w:t>
+        <w:t>Rendement 34.33 = (43 119 + 23 196) / 1 932 ; El Niño ordinaire 33.70 ; El Niño fort 31.43. Contrôle : le modèle de rendement direct (ON/OFF + tendance) donne 33.65 sacs/ha, soit 65 003 milliers de sacs par la surface récoltée : cohérent à 2 % près avec la production prévue.</w:t>
       </w:r>
     </w:p>
     <w:p>
@@ -10971,7 +10982,7 @@
         <w:rPr>
           <w:sz w:val="17"/>
         </w:rPr>
-        <w:t>Comparaison avec ta ligne : arabica 41 325 est entre mon scénario El Niño ordinaire (42 501) et la météo normale (43 119) ; robusta 22 226 est proche de mon El Niño ordinaire (22 607) ; ta surface récoltée 1 906 suppose un recul de 35 kha en un an, plus fort que la tendance (1 940) ; tes arbres bearing 6 807 supposent une baisse alors que la dérive historique est de +131 M par an.</w:t>
+        <w:t>Comparaison avec ta ligne : arabica 41 325 est entre mon scénario El Niño ordinaire (42 501) et la météo normale (43 119) ; robusta 22 226 est proche de mon El Niño ordinaire (22 607) ; ta surface récoltée 1 906 suppose un recul de 35 kha en un an, plus fort que la tendance (1 932) ; tes arbres bearing 6 807 supposent une baisse alors que la tendance historique est de +96 M par an.</w:t>
       </w:r>
     </w:p>
     <w:p>

</xml_diff>

<commit_message>
Brazil: campaign 2015/16 back in the El Nino ordinaire class
Co-Authored-By: Claude Fable 5.1 <noreply@anthropic.com>
Claude-Session: https://claude.ai/code/session_01FCxjZoAHXMLJTirXSfbmgL
</commit_message>
<xml_diff>
--- a/timeseries/output/reports/Bresil_balance_sheet_cafe.docx
+++ b/timeseries/output/reports/Bresil_balance_sheet_cafe.docx
@@ -69,7 +69,7 @@
         <w:rPr>
           <w:sz w:val="20"/>
         </w:rPr>
-        <w:t>El Niño : rendement en moyenne -1.9 % par rapport aux campagnes voisines sur 6 campagnes (83 % d'entre elles sous la moyenne) ; El Niño fort : -2.7 % (3 campagnes, 100 % sous la moyenne). La Niña : +0.4 % (11 campagnes).</w:t>
+        <w:t>El Niño : rendement en moyenne -2.1 % par rapport aux campagnes voisines sur 7 campagnes (86 % d'entre elles sous la moyenne) ; El Niño fort : -2.8 % (4 campagnes, 100 % sous la moyenne). La Niña : +0.4 % (11 campagnes).</w:t>
       </w:r>
     </w:p>
     <w:p>
@@ -80,7 +80,7 @@
         <w:rPr>
           <w:sz w:val="20"/>
         </w:rPr>
-        <w:t>El Niño fort (pic ≥ 1,6 : épisodes 2015/16, campagnes suivantes 2016/17) : Minas Gerais -118 mm et +0.8 °C, Espírito Santo -492 mm et +1.3 °C. Robusta -29.7 % par rapport à l'attendu, arabica +3.0 % (années ON, qui tiennent grâce au cycle), total -5.8 %.</w:t>
+        <w:t>El Niño fort (pic ≥ 1,6 : épisodes 2015/16, campagnes suivantes 2016/17) : Minas Gerais -112 mm et +0.8 °C, Espírito Santo -479 mm et +1.3 °C. Robusta -29.7 % par rapport à l'attendu, arabica +3.0 % (années ON, qui tiennent grâce au cycle), total -5.8 %.</w:t>
       </w:r>
     </w:p>
     <w:p>
@@ -91,7 +91,7 @@
         <w:rPr>
           <w:sz w:val="20"/>
         </w:rPr>
-        <w:t>El Niño ordinaire (pic entre 0,6 et 1,6, 2023/24 inclus : 2004/05, 2006/07, 2009/10, 2018/19, 2023/24) : arabica -1.4 %, robusta -2.5 %, total -1.9 % ; Minas Gerais -52 mm, Espírito Santo +18 mm : pas de signal net.</w:t>
+        <w:t>El Niño ordinaire (pic entre 0,6 et 1,6, 2023/24 inclus : 2004/05, 2006/07, 2009/10, 2014/15, 2018/19, 2023/24) : arabica -1.7 %, robusta -2.8 %, total -2.1 % ; Minas Gerais -67 mm, Espírito Santo -30 mm : pas de signal net.</w:t>
       </w:r>
     </w:p>
     <w:p>
@@ -113,7 +113,7 @@
         <w:rPr>
           <w:sz w:val="20"/>
         </w:rPr>
-        <w:t>Prévision Production Total 2027/28 : 70 056 (intervalle 80 % 65 509 – 74 604) par le modèle ARMA ; avec l'effet El Niño historique moyen (-2.5 %) : 68 291.</w:t>
+        <w:t>Prévision Production Total 2027/28 : 70 056 (intervalle 80 % 65 509 – 74 604) par le modèle ARMA ; avec l'effet El Niño historique moyen (-2.6 %) : 68 214.</w:t>
       </w:r>
     </w:p>
     <w:p>
@@ -2155,7 +2155,7 @@
               <w:rPr>
                 <w:sz w:val="16"/>
               </w:rPr>
-              <w:t>2016/17</w:t>
+              <w:t>2014/15</w:t>
             </w:r>
           </w:p>
         </w:tc>
@@ -2169,7 +2169,7 @@
               <w:rPr>
                 <w:sz w:val="16"/>
               </w:rPr>
-              <w:t>-6.1 %</w:t>
+              <w:t>-7.9 %</w:t>
             </w:r>
           </w:p>
         </w:tc>
@@ -2183,7 +2183,7 @@
               <w:rPr>
                 <w:sz w:val="16"/>
               </w:rPr>
-              <w:t>+13.6 %</w:t>
+              <w:t>-3.0 %</w:t>
             </w:r>
           </w:p>
         </w:tc>
@@ -2197,7 +2197,7 @@
               <w:rPr>
                 <w:sz w:val="16"/>
               </w:rPr>
-              <w:t>El Niño 2015/16 (+2.3)</w:t>
+              <w:t>neutre 2013/14 (-0.5)</w:t>
             </w:r>
           </w:p>
         </w:tc>
@@ -2211,7 +2211,7 @@
               <w:rPr>
                 <w:sz w:val="16"/>
               </w:rPr>
-              <w:t>sécheresse 2015-16 en Espírito Santo : conilon au plus bas (10,5 M sacs)</w:t>
+              <w:t>sécheresse et chaleur de janvier-février 2014 à Minas Gerais (année ON amputée)</w:t>
             </w:r>
           </w:p>
         </w:tc>
@@ -2227,7 +2227,7 @@
               <w:rPr>
                 <w:sz w:val="16"/>
               </w:rPr>
-              <w:t>2004/05</w:t>
+              <w:t>2016/17</w:t>
             </w:r>
           </w:p>
         </w:tc>
@@ -2241,7 +2241,7 @@
               <w:rPr>
                 <w:sz w:val="16"/>
               </w:rPr>
-              <w:t>-4.6 %</w:t>
+              <w:t>-6.1 %</w:t>
             </w:r>
           </w:p>
         </w:tc>
@@ -2255,7 +2255,7 @@
               <w:rPr>
                 <w:sz w:val="16"/>
               </w:rPr>
-              <w:t>+42.6 %</w:t>
+              <w:t>+13.6 %</w:t>
             </w:r>
           </w:p>
         </w:tc>
@@ -2269,7 +2269,7 @@
               <w:rPr>
                 <w:sz w:val="16"/>
               </w:rPr>
-              <w:t>neutre 2003/04 (+0.4)</w:t>
+              <w:t>El Niño 2015/16 (+2.3)</w:t>
             </w:r>
           </w:p>
         </w:tc>
@@ -2283,6 +2283,7 @@
               <w:rPr>
                 <w:sz w:val="16"/>
               </w:rPr>
+              <w:t>sécheresse 2015-16 en Espírito Santo : conilon au plus bas (10,5 M sacs)</w:t>
             </w:r>
           </w:p>
         </w:tc>
@@ -2298,7 +2299,7 @@
               <w:rPr>
                 <w:sz w:val="16"/>
               </w:rPr>
-              <w:t>2007/08</w:t>
+              <w:t>2004/05</w:t>
             </w:r>
           </w:p>
         </w:tc>
@@ -2326,7 +2327,7 @@
               <w:rPr>
                 <w:sz w:val="16"/>
               </w:rPr>
-              <w:t>-13.7 %</w:t>
+              <w:t>+42.6 %</w:t>
             </w:r>
           </w:p>
         </w:tc>
@@ -2340,7 +2341,7 @@
               <w:rPr>
                 <w:sz w:val="16"/>
               </w:rPr>
-              <w:t>El Niño 2006/07 (+0.9)</w:t>
+              <w:t>neutre 2003/04 (+0.4)</w:t>
             </w:r>
           </w:p>
         </w:tc>
@@ -2581,7 +2582,7 @@
           <w:i w:val="0"/>
           <w:sz w:val="20"/>
         </w:rPr>
-        <w:t>Sur 21 campagnes, 13 ont une production sous la moyenne de leurs voisines ; écart-type des écarts 9.2 % : c'est l'ordre de grandeur de l'aléa annuel que la météo et le cycle imposent, à comparer à la tendance.</w:t>
+        <w:t>Sur 22 campagnes, 14 ont une production sous la moyenne de leurs voisines ; écart-type des écarts 9.1 % : c'est l'ordre de grandeur de l'aléa annuel que la météo et le cycle imposent, à comparer à la tendance.</w:t>
       </w:r>
     </w:p>
     <w:p>
@@ -2619,7 +2620,7 @@
           <w:i w:val="0"/>
           <w:sz w:val="20"/>
         </w:rPr>
-        <w:t>Convention retenue, comme demandé : l'épisode ENSO de l'hiver N/N+1 est rattaché à la campagne N+1/N+2 (celle dont la floraison, sept.-nov. N+1, et le remplissage se déroulent pendant et juste après l'épisode). Exemples : El Niño 2015/16 → campagne 2016/17 ; El Niño 2023/24 → campagne 2024/25 ; El Niño 2009/10 → 2010/11. Niveaux : El Niño fort quand le pic atteint 1,6 (2009/10, 2015/16), El Niño entre 0,6 et 1,6, faible sous 0,6 ; même grille pour La Niña. 2023/24 est classé El Niño simple (pic ONI 2,0 mais indice relatif RONI d'environ 1,3). Les épisodes 2014/15 et 2002/03 (campagne 2003/04) sont exclus des tableaux et des moyennes, comme demandé.</w:t>
+        <w:t>Convention retenue, comme demandé : l'épisode ENSO de l'hiver N/N+1 est rattaché à la campagne N+1/N+2 (celle dont la floraison, sept.-nov. N+1, et le remplissage se déroulent pendant et juste après l'épisode). Exemples : El Niño 2015/16 → campagne 2016/17 ; El Niño 2023/24 → campagne 2024/25 ; El Niño 2009/10 → 2010/11. Niveaux : El Niño fort quand le pic atteint 1,6 (2009/10, 2015/16), El Niño entre 0,6 et 1,6, faible sous 0,6 ; même grille pour La Niña. 2023/24 est classé El Niño simple (pic ONI 2,0 mais indice relatif RONI d'environ 1,3). L'épisode 2002/03 (campagne 2003/04) est exclu des tableaux et des moyennes, comme demandé.</w:t>
       </w:r>
     </w:p>
     <w:p>
@@ -2916,7 +2917,7 @@
               <w:rPr>
                 <w:sz w:val="14"/>
               </w:rPr>
-              <w:t>+146 mm / -0.5 °C</w:t>
+              <w:t>+153 mm / -0.5 °C</w:t>
             </w:r>
           </w:p>
         </w:tc>
@@ -2930,7 +2931,7 @@
               <w:rPr>
                 <w:sz w:val="14"/>
               </w:rPr>
-              <w:t>+397 mm / -0.5 °C</w:t>
+              <w:t>+410 mm / -0.5 °C</w:t>
             </w:r>
           </w:p>
         </w:tc>
@@ -3030,7 +3031,7 @@
               <w:rPr>
                 <w:sz w:val="14"/>
               </w:rPr>
-              <w:t>-8 mm / -0.5 °C</w:t>
+              <w:t>-1 mm / -0.5 °C</w:t>
             </w:r>
           </w:p>
         </w:tc>
@@ -3044,7 +3045,7 @@
               <w:rPr>
                 <w:sz w:val="14"/>
               </w:rPr>
-              <w:t>-33 mm / -0.5 °C</w:t>
+              <w:t>-20 mm / -0.5 °C</w:t>
             </w:r>
           </w:p>
         </w:tc>
@@ -3144,7 +3145,7 @@
               <w:rPr>
                 <w:sz w:val="14"/>
               </w:rPr>
-              <w:t>+140 mm / -0.5 °C</w:t>
+              <w:t>+146 mm / -0.5 °C</w:t>
             </w:r>
           </w:p>
         </w:tc>
@@ -3158,7 +3159,7 @@
               <w:rPr>
                 <w:sz w:val="14"/>
               </w:rPr>
-              <w:t>+141 mm / -0.6 °C</w:t>
+              <w:t>+154 mm / -0.6 °C</w:t>
             </w:r>
           </w:p>
         </w:tc>
@@ -3258,7 +3259,7 @@
               <w:rPr>
                 <w:sz w:val="14"/>
               </w:rPr>
-              <w:t>+68 mm / -0.5 °C</w:t>
+              <w:t>+75 mm / -0.5 °C</w:t>
             </w:r>
           </w:p>
         </w:tc>
@@ -3272,7 +3273,7 @@
               <w:rPr>
                 <w:sz w:val="14"/>
               </w:rPr>
-              <w:t>-228 mm / +0.0 °C</w:t>
+              <w:t>-215 mm / +0.0 °C</w:t>
             </w:r>
           </w:p>
         </w:tc>
@@ -3372,7 +3373,7 @@
               <w:rPr>
                 <w:sz w:val="14"/>
               </w:rPr>
-              <w:t>+294 mm / -0.5 °C</w:t>
+              <w:t>+300 mm / -0.5 °C</w:t>
             </w:r>
           </w:p>
         </w:tc>
@@ -3386,7 +3387,7 @@
               <w:rPr>
                 <w:sz w:val="14"/>
               </w:rPr>
-              <w:t>+246 mm / -0.3 °C</w:t>
+              <w:t>+259 mm / -0.3 °C</w:t>
             </w:r>
           </w:p>
         </w:tc>
@@ -3486,7 +3487,7 @@
               <w:rPr>
                 <w:sz w:val="14"/>
               </w:rPr>
-              <w:t>-102 mm / -0.1 °C</w:t>
+              <w:t>-96 mm / -0.1 °C</w:t>
             </w:r>
           </w:p>
         </w:tc>
@@ -3500,7 +3501,7 @@
               <w:rPr>
                 <w:sz w:val="14"/>
               </w:rPr>
-              <w:t>-77 mm / +0.2 °C</w:t>
+              <w:t>-64 mm / +0.2 °C</w:t>
             </w:r>
           </w:p>
         </w:tc>
@@ -3600,7 +3601,7 @@
               <w:rPr>
                 <w:sz w:val="14"/>
               </w:rPr>
-              <w:t>+156 mm / -0.6 °C</w:t>
+              <w:t>+162 mm / -0.6 °C</w:t>
             </w:r>
           </w:p>
         </w:tc>
@@ -3614,7 +3615,7 @@
               <w:rPr>
                 <w:sz w:val="14"/>
               </w:rPr>
-              <w:t>+174 mm / -0.7 °C</w:t>
+              <w:t>+187 mm / -0.7 °C</w:t>
             </w:r>
           </w:p>
         </w:tc>
@@ -3714,7 +3715,7 @@
               <w:rPr>
                 <w:sz w:val="14"/>
               </w:rPr>
-              <w:t>+26 mm / -0.7 °C</w:t>
+              <w:t>+32 mm / -0.7 °C</w:t>
             </w:r>
           </w:p>
         </w:tc>
@@ -3728,7 +3729,7 @@
               <w:rPr>
                 <w:sz w:val="14"/>
               </w:rPr>
-              <w:t>+105 mm / -0.7 °C</w:t>
+              <w:t>+118 mm / -0.7 °C</w:t>
             </w:r>
           </w:p>
         </w:tc>
@@ -3744,7 +3745,7 @@
               <w:rPr>
                 <w:sz w:val="14"/>
               </w:rPr>
-              <w:t>2015/16 (+2.3)</w:t>
+              <w:t>2014/15 (+1.0)</w:t>
             </w:r>
           </w:p>
         </w:tc>
@@ -3758,7 +3759,7 @@
               <w:rPr>
                 <w:sz w:val="14"/>
               </w:rPr>
-              <w:t>El Niño fort</w:t>
+              <w:t>El Niño ordinaire</w:t>
             </w:r>
           </w:p>
         </w:tc>
@@ -3772,7 +3773,7 @@
               <w:rPr>
                 <w:sz w:val="14"/>
               </w:rPr>
-              <w:t>2016/17 ON</w:t>
+              <w:t>2015/16 OFF</w:t>
             </w:r>
           </w:p>
         </w:tc>
@@ -3786,7 +3787,7 @@
               <w:rPr>
                 <w:sz w:val="14"/>
               </w:rPr>
-              <w:t>45 600 (+26 % / +3.0 %)</w:t>
+              <w:t>36 100 (-3 % / -3.0 %)</w:t>
             </w:r>
           </w:p>
         </w:tc>
@@ -3800,7 +3801,7 @@
               <w:rPr>
                 <w:sz w:val="14"/>
               </w:rPr>
-              <w:t>10 500 (-21 % / -29.7 %)</w:t>
+              <w:t>13 300 (-22 % / -4.0 %)</w:t>
             </w:r>
           </w:p>
         </w:tc>
@@ -3814,7 +3815,7 @@
               <w:rPr>
                 <w:sz w:val="14"/>
               </w:rPr>
-              <w:t>-6.1 %</w:t>
+              <w:t>-3.0 %</w:t>
             </w:r>
           </w:p>
         </w:tc>
@@ -3828,7 +3829,7 @@
               <w:rPr>
                 <w:sz w:val="14"/>
               </w:rPr>
-              <w:t>-118 mm / +0.8 °C</w:t>
+              <w:t>-178 mm / +0.6 °C</w:t>
             </w:r>
           </w:p>
         </w:tc>
@@ -3842,7 +3843,7 @@
               <w:rPr>
                 <w:sz w:val="14"/>
               </w:rPr>
-              <w:t>-492 mm / +1.3 °C</w:t>
+              <w:t>-334 mm / +0.6 °C</w:t>
             </w:r>
           </w:p>
         </w:tc>
@@ -3858,7 +3859,7 @@
               <w:rPr>
                 <w:sz w:val="14"/>
               </w:rPr>
-              <w:t>2016/17 (-1.0)</w:t>
+              <w:t>2015/16 (+2.3)</w:t>
             </w:r>
           </w:p>
         </w:tc>
@@ -3872,7 +3873,7 @@
               <w:rPr>
                 <w:sz w:val="14"/>
               </w:rPr>
-              <w:t>La Niña ordinaire</w:t>
+              <w:t>El Niño fort</w:t>
             </w:r>
           </w:p>
         </w:tc>
@@ -3886,7 +3887,7 @@
               <w:rPr>
                 <w:sz w:val="14"/>
               </w:rPr>
-              <w:t>2017/18 OFF</w:t>
+              <w:t>2016/17 ON</w:t>
             </w:r>
           </w:p>
         </w:tc>
@@ -3900,7 +3901,7 @@
               <w:rPr>
                 <w:sz w:val="14"/>
               </w:rPr>
-              <w:t>39 500 (-13 % / -0.3 %)</w:t>
+              <w:t>45 600 (+26 % / +3.0 %)</w:t>
             </w:r>
           </w:p>
         </w:tc>
@@ -3914,7 +3915,7 @@
               <w:rPr>
                 <w:sz w:val="14"/>
               </w:rPr>
-              <w:t>12 600 (+20 % / -14.6 %)</w:t>
+              <w:t>10 500 (-21 % / -29.7 %)</w:t>
             </w:r>
           </w:p>
         </w:tc>
@@ -3928,7 +3929,7 @@
               <w:rPr>
                 <w:sz w:val="14"/>
               </w:rPr>
-              <w:t>-2.4 %</w:t>
+              <w:t>-6.1 %</w:t>
             </w:r>
           </w:p>
         </w:tc>
@@ -3942,7 +3943,7 @@
               <w:rPr>
                 <w:sz w:val="14"/>
               </w:rPr>
-              <w:t>-210 mm / +0.1 °C</w:t>
+              <w:t>-112 mm / +0.8 °C</w:t>
             </w:r>
           </w:p>
         </w:tc>
@@ -3956,7 +3957,7 @@
               <w:rPr>
                 <w:sz w:val="14"/>
               </w:rPr>
-              <w:t>-93 mm / -0.2 °C</w:t>
+              <w:t>-479 mm / +1.3 °C</w:t>
             </w:r>
           </w:p>
         </w:tc>
@@ -3972,7 +3973,7 @@
               <w:rPr>
                 <w:sz w:val="14"/>
               </w:rPr>
-              <w:t>2017/18 (-1.1)</w:t>
+              <w:t>2016/17 (-1.0)</w:t>
             </w:r>
           </w:p>
         </w:tc>
@@ -4000,7 +4001,7 @@
               <w:rPr>
                 <w:sz w:val="14"/>
               </w:rPr>
-              <w:t>2018/19 ON</w:t>
+              <w:t>2017/18 OFF</w:t>
             </w:r>
           </w:p>
         </w:tc>
@@ -4014,7 +4015,7 @@
               <w:rPr>
                 <w:sz w:val="14"/>
               </w:rPr>
-              <w:t>49 700 (+26 % / +4.0 %)</w:t>
+              <w:t>39 500 (-13 % / -0.3 %)</w:t>
             </w:r>
           </w:p>
         </w:tc>
@@ -4028,7 +4029,7 @@
               <w:rPr>
                 <w:sz w:val="14"/>
               </w:rPr>
-              <w:t>16 800 (+33 % / +8.7 %)</w:t>
+              <w:t>12 600 (+20 % / -14.6 %)</w:t>
             </w:r>
           </w:p>
         </w:tc>
@@ -4042,7 +4043,7 @@
               <w:rPr>
                 <w:sz w:val="14"/>
               </w:rPr>
-              <w:t>+5.4 %</w:t>
+              <w:t>-2.4 %</w:t>
             </w:r>
           </w:p>
         </w:tc>
@@ -4056,7 +4057,7 @@
               <w:rPr>
                 <w:sz w:val="14"/>
               </w:rPr>
-              <w:t>-70 mm / +0.1 °C</w:t>
+              <w:t>-203 mm / +0.1 °C</w:t>
             </w:r>
           </w:p>
         </w:tc>
@@ -4070,7 +4071,7 @@
               <w:rPr>
                 <w:sz w:val="14"/>
               </w:rPr>
-              <w:t>+24 mm / -0.1 °C</w:t>
+              <w:t>-80 mm / -0.2 °C</w:t>
             </w:r>
           </w:p>
         </w:tc>
@@ -4086,7 +4087,7 @@
               <w:rPr>
                 <w:sz w:val="14"/>
               </w:rPr>
-              <w:t>2018/19 (+0.8)</w:t>
+              <w:t>2017/18 (-1.1)</w:t>
             </w:r>
           </w:p>
         </w:tc>
@@ -4100,7 +4101,7 @@
               <w:rPr>
                 <w:sz w:val="14"/>
               </w:rPr>
-              <w:t>El Niño ordinaire</w:t>
+              <w:t>La Niña ordinaire</w:t>
             </w:r>
           </w:p>
         </w:tc>
@@ -4114,7 +4115,7 @@
               <w:rPr>
                 <w:sz w:val="14"/>
               </w:rPr>
-              <w:t>2019/20 OFF</w:t>
+              <w:t>2018/19 ON</w:t>
             </w:r>
           </w:p>
         </w:tc>
@@ -4128,7 +4129,7 @@
               <w:rPr>
                 <w:sz w:val="14"/>
               </w:rPr>
-              <w:t>42 000 (-15 % / +4.3 %)</w:t>
+              <w:t>49 700 (+26 % / +4.0 %)</w:t>
             </w:r>
           </w:p>
         </w:tc>
@@ -4142,7 +4143,7 @@
               <w:rPr>
                 <w:sz w:val="14"/>
               </w:rPr>
-              <w:t>18 500 (+10 % / +3.9 %)</w:t>
+              <w:t>16 800 (+33 % / +8.7 %)</w:t>
             </w:r>
           </w:p>
         </w:tc>
@@ -4156,7 +4157,7 @@
               <w:rPr>
                 <w:sz w:val="14"/>
               </w:rPr>
-              <w:t>+4.5 %</w:t>
+              <w:t>+5.4 %</w:t>
             </w:r>
           </w:p>
         </w:tc>
@@ -4170,7 +4171,7 @@
               <w:rPr>
                 <w:sz w:val="14"/>
               </w:rPr>
-              <w:t>+4 mm / +0.5 °C</w:t>
+              <w:t>-63 mm / +0.1 °C</w:t>
             </w:r>
           </w:p>
         </w:tc>
@@ -4184,7 +4185,7 @@
               <w:rPr>
                 <w:sz w:val="14"/>
               </w:rPr>
-              <w:t>-27 mm / +0.6 °C</w:t>
+              <w:t>+37 mm / -0.1 °C</w:t>
             </w:r>
           </w:p>
         </w:tc>
@@ -4200,7 +4201,7 @@
               <w:rPr>
                 <w:sz w:val="14"/>
               </w:rPr>
-              <w:t>2019/20 (-0.7)</w:t>
+              <w:t>2018/19 (+0.8)</w:t>
             </w:r>
           </w:p>
         </w:tc>
@@ -4214,7 +4215,7 @@
               <w:rPr>
                 <w:sz w:val="14"/>
               </w:rPr>
-              <w:t>La Niña ordinaire</w:t>
+              <w:t>El Niño ordinaire</w:t>
             </w:r>
           </w:p>
         </w:tc>
@@ -4228,7 +4229,7 @@
               <w:rPr>
                 <w:sz w:val="14"/>
               </w:rPr>
-              <w:t>2020/21 ON</w:t>
+              <w:t>2019/20 OFF</w:t>
             </w:r>
           </w:p>
         </w:tc>
@@ -4242,7 +4243,7 @@
               <w:rPr>
                 <w:sz w:val="14"/>
               </w:rPr>
-              <w:t>49 700 (+18 % / +9.6 %)</w:t>
+              <w:t>42 000 (-15 % / +4.3 %)</w:t>
             </w:r>
           </w:p>
         </w:tc>
@@ -4256,7 +4257,7 @@
               <w:rPr>
                 <w:sz w:val="14"/>
               </w:rPr>
-              <w:t>20 200 (+9 % / +1.2 %)</w:t>
+              <w:t>18 500 (+10 % / +3.9 %)</w:t>
             </w:r>
           </w:p>
         </w:tc>
@@ -4270,7 +4271,7 @@
               <w:rPr>
                 <w:sz w:val="14"/>
               </w:rPr>
-              <w:t>+3.5 %</w:t>
+              <w:t>+4.5 %</w:t>
             </w:r>
           </w:p>
         </w:tc>
@@ -4284,7 +4285,7 @@
               <w:rPr>
                 <w:sz w:val="14"/>
               </w:rPr>
-              <w:t>-28 mm / +0.2 °C</w:t>
+              <w:t>+10 mm / +0.5 °C</w:t>
             </w:r>
           </w:p>
         </w:tc>
@@ -4298,7 +4299,7 @@
               <w:rPr>
                 <w:sz w:val="14"/>
               </w:rPr>
-              <w:t>+107 mm / +0.0 °C</w:t>
+              <w:t>-14 mm / +0.6 °C</w:t>
             </w:r>
           </w:p>
         </w:tc>
@@ -4314,7 +4315,7 @@
               <w:rPr>
                 <w:sz w:val="14"/>
               </w:rPr>
-              <w:t>2020/21 (-1.5)</w:t>
+              <w:t>2019/20 (-0.7)</w:t>
             </w:r>
           </w:p>
         </w:tc>
@@ -4342,7 +4343,7 @@
               <w:rPr>
                 <w:sz w:val="14"/>
               </w:rPr>
-              <w:t>2021/22 OFF</w:t>
+              <w:t>2020/21 ON</w:t>
             </w:r>
           </w:p>
         </w:tc>
@@ -4356,7 +4357,7 @@
               <w:rPr>
                 <w:sz w:val="14"/>
               </w:rPr>
-              <w:t>36 400 (-27 % / -9.1 %)</w:t>
+              <w:t>49 700 (+18 % / +9.6 %)</w:t>
             </w:r>
           </w:p>
         </w:tc>
@@ -4370,7 +4371,7 @@
               <w:rPr>
                 <w:sz w:val="14"/>
               </w:rPr>
-              <w:t>21 700 (+7 % / +4.8 %)</w:t>
+              <w:t>20 200 (+9 % / +1.2 %)</w:t>
             </w:r>
           </w:p>
         </w:tc>
@@ -4384,7 +4385,7 @@
               <w:rPr>
                 <w:sz w:val="14"/>
               </w:rPr>
-              <w:t>-3.1 %</w:t>
+              <w:t>+3.5 %</w:t>
             </w:r>
           </w:p>
         </w:tc>
@@ -4398,7 +4399,7 @@
               <w:rPr>
                 <w:sz w:val="14"/>
               </w:rPr>
-              <w:t>-368 mm / +0.8 °C</w:t>
+              <w:t>-21 mm / +0.2 °C</w:t>
             </w:r>
           </w:p>
         </w:tc>
@@ -4412,7 +4413,7 @@
               <w:rPr>
                 <w:sz w:val="14"/>
               </w:rPr>
-              <w:t>-210 mm / +0.3 °C</w:t>
+              <w:t>+120 mm / +0.0 °C</w:t>
             </w:r>
           </w:p>
         </w:tc>
@@ -4428,7 +4429,7 @@
               <w:rPr>
                 <w:sz w:val="14"/>
               </w:rPr>
-              <w:t>2021/22 (-1.3)</w:t>
+              <w:t>2020/21 (-1.5)</w:t>
             </w:r>
           </w:p>
         </w:tc>
@@ -4456,7 +4457,7 @@
               <w:rPr>
                 <w:sz w:val="14"/>
               </w:rPr>
-              <w:t>2022/23 ON</w:t>
+              <w:t>2021/22 OFF</w:t>
             </w:r>
           </w:p>
         </w:tc>
@@ -4470,7 +4471,7 @@
               <w:rPr>
                 <w:sz w:val="14"/>
               </w:rPr>
-              <w:t>39 800 (+9 % / -17.8 %)</w:t>
+              <w:t>36 400 (-27 % / -9.1 %)</w:t>
             </w:r>
           </w:p>
         </w:tc>
@@ -4484,7 +4485,7 @@
               <w:rPr>
                 <w:sz w:val="14"/>
               </w:rPr>
-              <w:t>22 800 (+5 % / +8.1 %)</w:t>
+              <w:t>21 700 (+7 % / +4.8 %)</w:t>
             </w:r>
           </w:p>
         </w:tc>
@@ -4498,7 +4499,7 @@
               <w:rPr>
                 <w:sz w:val="14"/>
               </w:rPr>
-              <w:t>-9.8 %</w:t>
+              <w:t>-3.1 %</w:t>
             </w:r>
           </w:p>
         </w:tc>
@@ -4512,7 +4513,7 @@
               <w:rPr>
                 <w:sz w:val="14"/>
               </w:rPr>
-              <w:t>+170 mm / -0.4 °C</w:t>
+              <w:t>-361 mm / +0.8 °C</w:t>
             </w:r>
           </w:p>
         </w:tc>
@@ -4526,7 +4527,7 @@
               <w:rPr>
                 <w:sz w:val="14"/>
               </w:rPr>
-              <w:t>+12 mm / -0.1 °C</w:t>
+              <w:t>-197 mm / +0.3 °C</w:t>
             </w:r>
           </w:p>
         </w:tc>
@@ -4542,7 +4543,7 @@
               <w:rPr>
                 <w:sz w:val="14"/>
               </w:rPr>
-              <w:t>2022/23 (-1.1)</w:t>
+              <w:t>2021/22 (-1.3)</w:t>
             </w:r>
           </w:p>
         </w:tc>
@@ -4570,7 +4571,7 @@
               <w:rPr>
                 <w:sz w:val="14"/>
               </w:rPr>
-              <w:t>2023/24 OFF</w:t>
+              <w:t>2022/23 ON</w:t>
             </w:r>
           </w:p>
         </w:tc>
@@ -4584,7 +4585,7 @@
               <w:rPr>
                 <w:sz w:val="14"/>
               </w:rPr>
-              <w:t>44 900 (+13 % / +22.6 %)</w:t>
+              <w:t>39 800 (+9 % / -17.8 %)</w:t>
             </w:r>
           </w:p>
         </w:tc>
@@ -4598,7 +4599,7 @@
               <w:rPr>
                 <w:sz w:val="14"/>
               </w:rPr>
-              <w:t>21 400 (-6 % / -5.3 %)</w:t>
+              <w:t>22 800 (+5 % / +8.1 %)</w:t>
             </w:r>
           </w:p>
         </w:tc>
@@ -4612,7 +4613,7 @@
               <w:rPr>
                 <w:sz w:val="14"/>
               </w:rPr>
-              <w:t>+7.1 %</w:t>
+              <w:t>-9.8 %</w:t>
             </w:r>
           </w:p>
         </w:tc>
@@ -4626,7 +4627,7 @@
               <w:rPr>
                 <w:sz w:val="14"/>
               </w:rPr>
-              <w:t>-18 mm / +0.1 °C</w:t>
+              <w:t>+177 mm / -0.4 °C</w:t>
             </w:r>
           </w:p>
         </w:tc>
@@ -4640,7 +4641,7 @@
               <w:rPr>
                 <w:sz w:val="14"/>
               </w:rPr>
-              <w:t>+52 mm / +0.2 °C</w:t>
+              <w:t>+25 mm / -0.1 °C</w:t>
             </w:r>
           </w:p>
         </w:tc>
@@ -4656,6 +4657,120 @@
               <w:rPr>
                 <w:sz w:val="14"/>
               </w:rPr>
+              <w:t>2022/23 (-1.1)</w:t>
+            </w:r>
+          </w:p>
+        </w:tc>
+        <w:tc>
+          <w:tcPr>
+            <w:tcW w:type="dxa" w:w="1474"/>
+          </w:tcPr>
+          <w:p>
+            <w:r/>
+            <w:r>
+              <w:rPr>
+                <w:sz w:val="14"/>
+              </w:rPr>
+              <w:t>La Niña ordinaire</w:t>
+            </w:r>
+          </w:p>
+        </w:tc>
+        <w:tc>
+          <w:tcPr>
+            <w:tcW w:type="dxa" w:w="1077"/>
+          </w:tcPr>
+          <w:p>
+            <w:r/>
+            <w:r>
+              <w:rPr>
+                <w:sz w:val="14"/>
+              </w:rPr>
+              <w:t>2023/24 OFF</w:t>
+            </w:r>
+          </w:p>
+        </w:tc>
+        <w:tc>
+          <w:tcPr>
+            <w:tcW w:type="dxa" w:w="1587"/>
+          </w:tcPr>
+          <w:p>
+            <w:r/>
+            <w:r>
+              <w:rPr>
+                <w:sz w:val="14"/>
+              </w:rPr>
+              <w:t>44 900 (+13 % / +22.6 %)</w:t>
+            </w:r>
+          </w:p>
+        </w:tc>
+        <w:tc>
+          <w:tcPr>
+            <w:tcW w:type="dxa" w:w="1587"/>
+          </w:tcPr>
+          <w:p>
+            <w:r/>
+            <w:r>
+              <w:rPr>
+                <w:sz w:val="14"/>
+              </w:rPr>
+              <w:t>21 400 (-6 % / -5.3 %)</w:t>
+            </w:r>
+          </w:p>
+        </w:tc>
+        <w:tc>
+          <w:tcPr>
+            <w:tcW w:type="dxa" w:w="850"/>
+          </w:tcPr>
+          <w:p>
+            <w:r/>
+            <w:r>
+              <w:rPr>
+                <w:sz w:val="14"/>
+              </w:rPr>
+              <w:t>+7.1 %</w:t>
+            </w:r>
+          </w:p>
+        </w:tc>
+        <w:tc>
+          <w:tcPr>
+            <w:tcW w:type="dxa" w:w="1247"/>
+          </w:tcPr>
+          <w:p>
+            <w:r/>
+            <w:r>
+              <w:rPr>
+                <w:sz w:val="14"/>
+              </w:rPr>
+              <w:t>-11 mm / +0.1 °C</w:t>
+            </w:r>
+          </w:p>
+        </w:tc>
+        <w:tc>
+          <w:tcPr>
+            <w:tcW w:type="dxa" w:w="1247"/>
+          </w:tcPr>
+          <w:p>
+            <w:r/>
+            <w:r>
+              <w:rPr>
+                <w:sz w:val="14"/>
+              </w:rPr>
+              <w:t>+65 mm / +0.2 °C</w:t>
+            </w:r>
+          </w:p>
+        </w:tc>
+      </w:tr>
+      <w:tr>
+        <w:tc>
+          <w:tcPr>
+            <w:tcW w:type="dxa" w:w="1247"/>
+          </w:tcPr>
+          <w:p>
+            <w:r/>
+            <w:r>
+              <w:rPr>
+                <w:sz w:val="14"/>
+              </w:rPr>
               <w:t>2023/24 (+1.4)</w:t>
             </w:r>
           </w:p>
@@ -4740,7 +4855,7 @@
               <w:rPr>
                 <w:sz w:val="14"/>
               </w:rPr>
-              <w:t>-446 mm / +2.4 °C</w:t>
+              <w:t>-440 mm / +2.4 °C</w:t>
             </w:r>
           </w:p>
         </w:tc>
@@ -4754,7 +4869,7 @@
               <w:rPr>
                 <w:sz w:val="14"/>
               </w:rPr>
-              <w:t>-348 mm / +1.7 °C</w:t>
+              <w:t>-335 mm / +1.7 °C</w:t>
             </w:r>
           </w:p>
         </w:tc>
@@ -5567,7 +5682,7 @@
               <w:rPr>
                 <w:sz w:val="14"/>
               </w:rPr>
-              <w:t>-118 mm / +0.8 °C</w:t>
+              <w:t>-112 mm / +0.8 °C</w:t>
             </w:r>
           </w:p>
         </w:tc>
@@ -5581,7 +5696,7 @@
               <w:rPr>
                 <w:sz w:val="14"/>
               </w:rPr>
-              <w:t>-492 mm / +1.3 °C</w:t>
+              <w:t>-479 mm / +1.3 °C</w:t>
             </w:r>
           </w:p>
         </w:tc>
@@ -5625,7 +5740,7 @@
               <w:rPr>
                 <w:sz w:val="14"/>
               </w:rPr>
-              <w:t>5</w:t>
+              <w:t>6</w:t>
             </w:r>
           </w:p>
         </w:tc>
@@ -5639,54 +5754,54 @@
               <w:rPr>
                 <w:sz w:val="14"/>
               </w:rPr>
+              <w:t>-1.7 %</w:t>
+            </w:r>
+          </w:p>
+        </w:tc>
+        <w:tc>
+          <w:tcPr>
+            <w:tcW w:type="dxa" w:w="850"/>
+          </w:tcPr>
+          <w:p>
+            <w:r/>
+            <w:r>
+              <w:rPr>
+                <w:sz w:val="14"/>
+              </w:rPr>
+              <w:t>-2.8 %</w:t>
+            </w:r>
+          </w:p>
+        </w:tc>
+        <w:tc>
+          <w:tcPr>
+            <w:tcW w:type="dxa" w:w="850"/>
+          </w:tcPr>
+          <w:p>
+            <w:r/>
+            <w:r>
+              <w:rPr>
+                <w:sz w:val="14"/>
+              </w:rPr>
+              <w:t>-2.1 %</w:t>
+            </w:r>
+          </w:p>
+        </w:tc>
+        <w:tc>
+          <w:tcPr>
+            <w:tcW w:type="dxa" w:w="907"/>
+          </w:tcPr>
+          <w:p>
+            <w:r/>
+            <w:r>
+              <w:rPr>
+                <w:sz w:val="14"/>
+              </w:rPr>
               <w:t>-1.4 %</w:t>
             </w:r>
           </w:p>
         </w:tc>
         <w:tc>
           <w:tcPr>
-            <w:tcW w:type="dxa" w:w="850"/>
-          </w:tcPr>
-          <w:p>
-            <w:r/>
-            <w:r>
-              <w:rPr>
-                <w:sz w:val="14"/>
-              </w:rPr>
-              <w:t>-2.5 %</w:t>
-            </w:r>
-          </w:p>
-        </w:tc>
-        <w:tc>
-          <w:tcPr>
-            <w:tcW w:type="dxa" w:w="850"/>
-          </w:tcPr>
-          <w:p>
-            <w:r/>
-            <w:r>
-              <w:rPr>
-                <w:sz w:val="14"/>
-              </w:rPr>
-              <w:t>-1.9 %</w:t>
-            </w:r>
-          </w:p>
-        </w:tc>
-        <w:tc>
-          <w:tcPr>
-            <w:tcW w:type="dxa" w:w="907"/>
-          </w:tcPr>
-          <w:p>
-            <w:r/>
-            <w:r>
-              <w:rPr>
-                <w:sz w:val="14"/>
-              </w:rPr>
-              <w:t>-1.1 %</w:t>
-            </w:r>
-          </w:p>
-        </w:tc>
-        <w:tc>
-          <w:tcPr>
             <w:tcW w:type="dxa" w:w="1304"/>
           </w:tcPr>
           <w:p>
@@ -5695,7 +5810,7 @@
               <w:rPr>
                 <w:sz w:val="14"/>
               </w:rPr>
-              <w:t>-52 mm / +0.4 °C</w:t>
+              <w:t>-67 mm / +0.4 °C</w:t>
             </w:r>
           </w:p>
         </w:tc>
@@ -5709,7 +5824,7 @@
               <w:rPr>
                 <w:sz w:val="14"/>
               </w:rPr>
-              <w:t>+18 mm / +0.3 °C</w:t>
+              <w:t>-30 mm / +0.3 °C</w:t>
             </w:r>
           </w:p>
         </w:tc>
@@ -5723,7 +5838,7 @@
               <w:rPr>
                 <w:sz w:val="14"/>
               </w:rPr>
-              <w:t>2005/06 2007/08 2010/11 2019/20 2024/25</w:t>
+              <w:t>2005/06 2007/08 2010/11 2015/16 2019/20 2024/25</w:t>
             </w:r>
           </w:p>
         </w:tc>
@@ -5823,7 +5938,7 @@
               <w:rPr>
                 <w:sz w:val="14"/>
               </w:rPr>
-              <w:t>-23 mm / -0.1 °C</w:t>
+              <w:t>-16 mm / -0.1 °C</w:t>
             </w:r>
           </w:p>
         </w:tc>
@@ -5837,7 +5952,7 @@
               <w:rPr>
                 <w:sz w:val="14"/>
               </w:rPr>
-              <w:t>+24 mm / -0.1 °C</w:t>
+              <w:t>+37 mm / -0.2 °C</w:t>
             </w:r>
           </w:p>
         </w:tc>
@@ -5951,7 +6066,7 @@
               <w:rPr>
                 <w:sz w:val="14"/>
               </w:rPr>
-              <w:t>+112 mm / -0.5 °C</w:t>
+              <w:t>+119 mm / -0.6 °C</w:t>
             </w:r>
           </w:p>
         </w:tc>
@@ -5965,7 +6080,7 @@
               <w:rPr>
                 <w:sz w:val="14"/>
               </w:rPr>
-              <w:t>-27 mm / -0.3 °C</w:t>
+              <w:t>-14 mm / -0.3 °C</w:t>
             </w:r>
           </w:p>
         </w:tc>
@@ -5993,7 +6108,7 @@
           <w:i w:val="0"/>
           <w:sz w:val="20"/>
         </w:rPr>
-        <w:t>Lecture : les El Niño forts de la période (2015/16) ont donné des campagnes N+1 avec -492 mm et +1.3 °C en Espírito Santo et -118 mm, +0.8 °C à Minas Gerais. Le conilon, non irrigué dans une bonne partie de São Mateus, a perdu -29.7 % par rapport à l'attendu (−30 % en 2016/17) ; l'arabica, en année ON, est resté à +3.0 % de l'attendu : le cycle a masqué le choc. Les El Niño ordinaires ont une signature plus diffuse : 2024/25 (après l'épisode 2023/24) a tout de même connu −452 mm et +2,4 °C à Minas Gerais.</w:t>
+        <w:t>Lecture : les El Niño forts de la période (2015/16) ont donné des campagnes N+1 avec -479 mm et +1.3 °C en Espírito Santo et -112 mm, +0.8 °C à Minas Gerais. Le conilon, non irrigué dans une bonne partie de São Mateus, a perdu -29.7 % par rapport à l'attendu (−30 % en 2016/17) ; l'arabica, en année ON, est resté à +3.0 % de l'attendu : le cycle a masqué le choc. Les El Niño ordinaires ont une signature plus diffuse : 2024/25 (après l'épisode 2023/24) a tout de même connu −452 mm et +2,4 °C à Minas Gerais.</w:t>
       </w:r>
     </w:p>
     <w:p>
@@ -6003,7 +6118,7 @@
           <w:i w:val="0"/>
           <w:sz w:val="20"/>
         </w:rPr>
-        <w:t>Dans les données : les campagnes El Niño ont eu -39 mm de pluie à Minas Gerais et -98 mm en Espírito Santo, avec +0.43 °C et +0.51 °C, mais +159 mm au Paraná ; les campagnes La Niña +7 mm à Minas et -86 mm au Paraná. Le signal attendu (Sud plus humide, Sudeste plus sec et plus chaud sous El Niño) est bien là, et c'est le Sudeste qui porte l'arabica et le conilon.</w:t>
+        <w:t>Dans les données : les campagnes El Niño ont eu -51 mm de pluie à Minas Gerais et -116 mm en Espírito Santo, avec +0.43 °C et +0.50 °C, mais +155 mm au Paraná ; les campagnes La Niña +14 mm à Minas et -93 mm au Paraná. Le signal attendu (Sud plus humide, Sudeste plus sec et plus chaud sous El Niño) est bien là, et c'est le Sudeste qui porte l'arabica et le conilon.</w:t>
       </w:r>
     </w:p>
     <w:p>
@@ -6274,7 +6389,7 @@
               <w:rPr>
                 <w:sz w:val="15"/>
               </w:rPr>
-              <w:t>5</w:t>
+              <w:t>6</w:t>
             </w:r>
           </w:p>
         </w:tc>
@@ -6288,7 +6403,7 @@
               <w:rPr>
                 <w:sz w:val="15"/>
               </w:rPr>
-              <w:t>-1.1 %</w:t>
+              <w:t>-1.4 %</w:t>
             </w:r>
           </w:p>
         </w:tc>
@@ -6302,7 +6417,7 @@
               <w:rPr>
                 <w:sz w:val="15"/>
               </w:rPr>
-              <w:t>80 %</w:t>
+              <w:t>83 %</w:t>
             </w:r>
           </w:p>
         </w:tc>
@@ -6316,7 +6431,7 @@
               <w:rPr>
                 <w:sz w:val="15"/>
               </w:rPr>
-              <w:t>-1.9 %</w:t>
+              <w:t>-2.1 %</w:t>
             </w:r>
           </w:p>
         </w:tc>
@@ -6330,7 +6445,7 @@
               <w:rPr>
                 <w:sz w:val="15"/>
               </w:rPr>
-              <w:t>2005/06 2007/08 2010/11 2019/20 2024/25</w:t>
+              <w:t>2005/06 2007/08 2010/11 2015/16 2019/20 2024/25</w:t>
             </w:r>
           </w:p>
         </w:tc>
@@ -6602,7 +6717,7 @@
           <w:i w:val="0"/>
           <w:sz w:val="20"/>
         </w:rPr>
-        <w:t>Lecture : pour Brésil, El Niño est historiquement négatif pour le rendement (-1.9 %) et La Niña neutre (+0.4 %). Avec 8 à 15 campagnes par phase, ce sont des tendances centrales, pas des lois : l'intensité de l'épisode, son calage sur la floraison et l'état du verger font l'écart.</w:t>
+        <w:t>Lecture : pour Brésil, El Niño est historiquement négatif pour le rendement (-2.1 %) et La Niña neutre (+0.4 %). Avec 8 à 15 campagnes par phase, ce sont des tendances centrales, pas des lois : l'intensité de l'épisode, son calage sur la floraison et l'état du verger font l'écart.</w:t>
       </w:r>
     </w:p>
     <w:p>
@@ -6622,7 +6737,7 @@
           <w:i w:val="0"/>
           <w:sz w:val="20"/>
         </w:rPr>
-        <w:t>Campagne pilotée : 2027/28. Point de départ (modèle, ON/OFF connu pour le Brésil) : 66 038 ; avec l'effet El Niño moyen (-2.5 %) : 64 373 ; avec l'effet des El Niño forts (-4.0 %) : 63 383 (milliers de sacs).</w:t>
+        <w:t>Campagne pilotée : 2027/28. Point de départ (modèle, ON/OFF connu pour le Brésil) : 66 038 ; avec l'effet El Niño moyen (-2.6 %) : 64 301 ; avec l'effet des El Niño forts (-3.8 %) : 63 508 (milliers de sacs).</w:t>
       </w:r>
     </w:p>
     <w:p>
@@ -7584,7 +7699,7 @@
         <w:rPr>
           <w:sz w:val="17"/>
         </w:rPr>
-        <w:t>2027/28 : Arabica 43 119 = 26 423 (point de départ 2001/02, année OFF) + 16 696 (croissance structurelle 618 par an × 27 campagnes) + 0 (année OFF : pas de bonus) ; Robusta 23 196 = 7 813 (point de départ 2001/02, année OFF) + 15 383 (croissance structurelle 570 par an × 27 campagnes) ; Total 66 038 = 34 231 (point de départ 2001/02, année OFF) + 31 807 (croissance structurelle 1 178 par an × 27 campagnes) + 0 (année OFF : pas de bonus). Météo : normale, donc 0. Campagne pilotée par l'El Niño en cours : si El Niño ordinaire, arabica -1.4 % → 42 501, robusta -2.5 % → 22 607 ; si fort, arabica +3.0 % → 44 426, robusta -29.7 % → 16 298 (moyennes historiques des campagnes N+1 de chaque classe).</w:t>
+        <w:t>2027/28 : Arabica 43 119 = 26 423 (point de départ 2001/02, année OFF) + 16 696 (croissance structurelle 618 par an × 27 campagnes) + 0 (année OFF : pas de bonus) ; Robusta 23 196 = 7 813 (point de départ 2001/02, année OFF) + 15 383 (croissance structurelle 570 par an × 27 campagnes) ; Total 66 038 = 34 231 (point de départ 2001/02, année OFF) + 31 807 (croissance structurelle 1 178 par an × 27 campagnes) + 0 (année OFF : pas de bonus). Météo : normale, donc 0. Campagne pilotée par l'El Niño en cours : si El Niño ordinaire, arabica -1.7 % → 42 388, robusta -2.8 % → 22 549 ; si fort, arabica +3.0 % → 44 426, robusta -29.7 % → 16 298 (moyennes historiques des campagnes N+1 de chaque classe).</w:t>
       </w:r>
     </w:p>
     <w:p>
@@ -10507,7 +10622,7 @@
               <w:rPr>
                 <w:sz w:val="14"/>
               </w:rPr>
-              <w:t>33.70</w:t>
+              <w:t>33.61</w:t>
             </w:r>
           </w:p>
         </w:tc>
@@ -10549,7 +10664,7 @@
               <w:rPr>
                 <w:sz w:val="14"/>
               </w:rPr>
-              <w:t>42 501</w:t>
+              <w:t>42 388</w:t>
             </w:r>
           </w:p>
         </w:tc>
@@ -10563,7 +10678,7 @@
               <w:rPr>
                 <w:sz w:val="14"/>
               </w:rPr>
-              <w:t>22 607</w:t>
+              <w:t>22 549</w:t>
             </w:r>
           </w:p>
         </w:tc>
@@ -10949,7 +11064,7 @@
         <w:rPr>
           <w:sz w:val="17"/>
         </w:rPr>
-        <w:t>Arabica 43 119 = 26 423 (point de départ 2001/02, année OFF) + 618 × 27 campagnes + 0 (année OFF, pas de bonus). Avec El Niño ordinaire (-1.4 % historique) : 42 501 ; avec El Niño fort (+3.0 %) : 44 426.</w:t>
+        <w:t>Arabica 43 119 = 26 423 (point de départ 2001/02, année OFF) + 618 × 27 campagnes + 0 (année OFF, pas de bonus). Avec El Niño ordinaire (-1.7 % historique) : 42 388 ; avec El Niño fort (+3.0 %) : 44 426.</w:t>
       </w:r>
     </w:p>
     <w:p>
@@ -10960,7 +11075,7 @@
         <w:rPr>
           <w:sz w:val="17"/>
         </w:rPr>
-        <w:t>Robusta 23 196 = 7 813 + 570 × 27 campagnes (le report de surprise de 2025/26 ne joue plus). Avec El Niño ordinaire (-2.5 %) : 22 607 ; avec El Niño fort (-29.7 %) : 16 298.</w:t>
+        <w:t>Robusta 23 196 = 7 813 + 570 × 27 campagnes (le report de surprise de 2025/26 ne joue plus). Avec El Niño ordinaire (-2.8 %) : 22 549 ; avec El Niño fort (-29.7 %) : 16 298.</w:t>
       </w:r>
     </w:p>
     <w:p>
@@ -10971,7 +11086,7 @@
         <w:rPr>
           <w:sz w:val="17"/>
         </w:rPr>
-        <w:t>Rendement 34.33 = (43 119 + 23 196) / 1 932 ; El Niño ordinaire 33.70 ; El Niño fort 31.43. Contrôle : le modèle de rendement direct (ON/OFF + tendance) donne 33.65 sacs/ha, soit 65 003 milliers de sacs par la surface récoltée : cohérent à 2 % près avec la production prévue.</w:t>
+        <w:t>Rendement 34.33 = (43 119 + 23 196) / 1 932 ; El Niño ordinaire 33.61 ; El Niño fort 31.43. Contrôle : le modèle de rendement direct (ON/OFF + tendance) donne 33.65 sacs/ha, soit 65 003 milliers de sacs par la surface récoltée : cohérent à 2 % près avec la production prévue.</w:t>
       </w:r>
     </w:p>
     <w:p>
@@ -10982,7 +11097,7 @@
         <w:rPr>
           <w:sz w:val="17"/>
         </w:rPr>
-        <w:t>Comparaison avec ta ligne : arabica 41 325 est entre mon scénario El Niño ordinaire (42 501) et la météo normale (43 119) ; robusta 22 226 est proche de mon El Niño ordinaire (22 607) ; ta surface récoltée 1 906 suppose un recul de 35 kha en un an, plus fort que la tendance (1 932) ; tes arbres bearing 6 807 supposent une baisse alors que la tendance historique est de +96 M par an.</w:t>
+        <w:t>Comparaison avec ta ligne : arabica 41 325 est entre mon scénario El Niño ordinaire (42 388) et la météo normale (43 119) ; robusta 22 226 est proche de mon El Niño ordinaire (22 549) ; ta surface récoltée 1 906 suppose un recul de 35 kha en un an, plus fort que la tendance (1 932) ; tes arbres bearing 6 807 supposent une baisse alors que la tendance historique est de +96 M par an.</w:t>
       </w:r>
     </w:p>
     <w:p>

</xml_diff>

<commit_message>
Brazil: weather-by-phase chart on the same crop years as the tables; thresholds 0.5 / 1.6 everywhere
Co-Authored-By: Claude Fable 5.1 <noreply@anthropic.com>
Claude-Session: https://claude.ai/code/session_01FCxjZoAHXMLJTirXSfbmgL
</commit_message>
<xml_diff>
--- a/timeseries/output/reports/Bresil_balance_sheet_cafe.docx
+++ b/timeseries/output/reports/Bresil_balance_sheet_cafe.docx
@@ -80,7 +80,7 @@
         <w:rPr>
           <w:sz w:val="20"/>
         </w:rPr>
-        <w:t>El Niño fort (pic ≥ 1,6 : épisodes 2015/16, campagnes suivantes 2016/17) : Minas Gerais -112 mm et +0.8 °C, Espírito Santo -479 mm et +1.3 °C. Robusta -29.7 % par rapport à l'attendu, arabica +3.0 % (années ON, qui tiennent grâce au cycle), total -5.8 %.</w:t>
+        <w:t>El Niño fort (pic ≥ 1,6 : épisodes 2015/16, campagnes suivantes 2016/17) : Minas Gerais -86 mm et +0.7 °C, Espírito Santo -482 mm et +1.3 °C. Robusta -29.7 % par rapport à l'attendu, arabica +3.0 % (années ON, qui tiennent grâce au cycle), total -5.8 %.</w:t>
       </w:r>
     </w:p>
     <w:p>
@@ -91,7 +91,7 @@
         <w:rPr>
           <w:sz w:val="20"/>
         </w:rPr>
-        <w:t>El Niño ordinaire (pic entre 0,6 et 1,6, 2023/24 inclus : 2004/05, 2006/07, 2009/10, 2014/15, 2018/19, 2023/24) : arabica -1.7 %, robusta -2.8 %, total -2.1 % ; Minas Gerais -67 mm, Espírito Santo -30 mm : pas de signal net.</w:t>
+        <w:t>El Niño ordinaire (pic entre 0,6 et 1,6, 2023/24 inclus : 2004/05, 2006/07, 2009/10, 2014/15, 2018/19, 2023/24) : arabica -1.7 %, robusta -2.8 %, total -2.1 % ; Minas Gerais -42 mm, Espírito Santo -33 mm : pas de signal net.</w:t>
       </w:r>
     </w:p>
     <w:p>
@@ -2670,7 +2670,7 @@
           <w:color w:val="52514E"/>
           <w:sz w:val="16"/>
         </w:rPr>
-        <w:t>Figure 4. Météo des États caféiers pendant la campagne qui suit chaque classe d'épisode (écart à la moyenne 1998-2025).</w:t>
+        <w:t>Figure 4. Météo des États caféiers pendant la campagne qui suit chaque classe d'épisode, 2001/02-2025/26, écart à la moyenne 1998-2025 (mêmes campagnes que les tableaux).</w:t>
       </w:r>
     </w:p>
     <w:p>
@@ -2917,7 +2917,7 @@
               <w:rPr>
                 <w:sz w:val="14"/>
               </w:rPr>
-              <w:t>+153 mm / -0.5 °C</w:t>
+              <w:t>+179 mm / -0.6 °C</w:t>
             </w:r>
           </w:p>
         </w:tc>
@@ -2931,7 +2931,7 @@
               <w:rPr>
                 <w:sz w:val="14"/>
               </w:rPr>
-              <w:t>+410 mm / -0.5 °C</w:t>
+              <w:t>+408 mm / -0.5 °C</w:t>
             </w:r>
           </w:p>
         </w:tc>
@@ -3031,7 +3031,7 @@
               <w:rPr>
                 <w:sz w:val="14"/>
               </w:rPr>
-              <w:t>-1 mm / -0.5 °C</w:t>
+              <w:t>+25 mm / -0.6 °C</w:t>
             </w:r>
           </w:p>
         </w:tc>
@@ -3045,7 +3045,7 @@
               <w:rPr>
                 <w:sz w:val="14"/>
               </w:rPr>
-              <w:t>-20 mm / -0.5 °C</w:t>
+              <w:t>-22 mm / -0.5 °C</w:t>
             </w:r>
           </w:p>
         </w:tc>
@@ -3145,7 +3145,7 @@
               <w:rPr>
                 <w:sz w:val="14"/>
               </w:rPr>
-              <w:t>+146 mm / -0.5 °C</w:t>
+              <w:t>+172 mm / -0.6 °C</w:t>
             </w:r>
           </w:p>
         </w:tc>
@@ -3159,7 +3159,7 @@
               <w:rPr>
                 <w:sz w:val="14"/>
               </w:rPr>
-              <w:t>+154 mm / -0.6 °C</w:t>
+              <w:t>+152 mm / -0.6 °C</w:t>
             </w:r>
           </w:p>
         </w:tc>
@@ -3259,7 +3259,7 @@
               <w:rPr>
                 <w:sz w:val="14"/>
               </w:rPr>
-              <w:t>+75 mm / -0.5 °C</w:t>
+              <w:t>+101 mm / -0.6 °C</w:t>
             </w:r>
           </w:p>
         </w:tc>
@@ -3273,7 +3273,7 @@
               <w:rPr>
                 <w:sz w:val="14"/>
               </w:rPr>
-              <w:t>-215 mm / +0.0 °C</w:t>
+              <w:t>-218 mm / -0.0 °C</w:t>
             </w:r>
           </w:p>
         </w:tc>
@@ -3373,7 +3373,7 @@
               <w:rPr>
                 <w:sz w:val="14"/>
               </w:rPr>
-              <w:t>+300 mm / -0.5 °C</w:t>
+              <w:t>+326 mm / -0.6 °C</w:t>
             </w:r>
           </w:p>
         </w:tc>
@@ -3387,7 +3387,7 @@
               <w:rPr>
                 <w:sz w:val="14"/>
               </w:rPr>
-              <w:t>+259 mm / -0.3 °C</w:t>
+              <w:t>+256 mm / -0.3 °C</w:t>
             </w:r>
           </w:p>
         </w:tc>
@@ -3487,7 +3487,7 @@
               <w:rPr>
                 <w:sz w:val="14"/>
               </w:rPr>
-              <w:t>-96 mm / -0.1 °C</w:t>
+              <w:t>-70 mm / -0.2 °C</w:t>
             </w:r>
           </w:p>
         </w:tc>
@@ -3501,7 +3501,7 @@
               <w:rPr>
                 <w:sz w:val="14"/>
               </w:rPr>
-              <w:t>-64 mm / +0.2 °C</w:t>
+              <w:t>-66 mm / +0.2 °C</w:t>
             </w:r>
           </w:p>
         </w:tc>
@@ -3601,7 +3601,7 @@
               <w:rPr>
                 <w:sz w:val="14"/>
               </w:rPr>
-              <w:t>+162 mm / -0.6 °C</w:t>
+              <w:t>+188 mm / -0.7 °C</w:t>
             </w:r>
           </w:p>
         </w:tc>
@@ -3615,7 +3615,7 @@
               <w:rPr>
                 <w:sz w:val="14"/>
               </w:rPr>
-              <w:t>+187 mm / -0.7 °C</w:t>
+              <w:t>+184 mm / -0.7 °C</w:t>
             </w:r>
           </w:p>
         </w:tc>
@@ -3715,7 +3715,7 @@
               <w:rPr>
                 <w:sz w:val="14"/>
               </w:rPr>
-              <w:t>+32 mm / -0.7 °C</w:t>
+              <w:t>+58 mm / -0.8 °C</w:t>
             </w:r>
           </w:p>
         </w:tc>
@@ -3729,7 +3729,7 @@
               <w:rPr>
                 <w:sz w:val="14"/>
               </w:rPr>
-              <w:t>+118 mm / -0.7 °C</w:t>
+              <w:t>+116 mm / -0.7 °C</w:t>
             </w:r>
           </w:p>
         </w:tc>
@@ -3829,7 +3829,7 @@
               <w:rPr>
                 <w:sz w:val="14"/>
               </w:rPr>
-              <w:t>-178 mm / +0.6 °C</w:t>
+              <w:t>-152 mm / +0.5 °C</w:t>
             </w:r>
           </w:p>
         </w:tc>
@@ -3843,7 +3843,7 @@
               <w:rPr>
                 <w:sz w:val="14"/>
               </w:rPr>
-              <w:t>-334 mm / +0.6 °C</w:t>
+              <w:t>-336 mm / +0.6 °C</w:t>
             </w:r>
           </w:p>
         </w:tc>
@@ -3943,7 +3943,7 @@
               <w:rPr>
                 <w:sz w:val="14"/>
               </w:rPr>
-              <w:t>-112 mm / +0.8 °C</w:t>
+              <w:t>-86 mm / +0.7 °C</w:t>
             </w:r>
           </w:p>
         </w:tc>
@@ -3957,7 +3957,7 @@
               <w:rPr>
                 <w:sz w:val="14"/>
               </w:rPr>
-              <w:t>-479 mm / +1.3 °C</w:t>
+              <w:t>-482 mm / +1.3 °C</w:t>
             </w:r>
           </w:p>
         </w:tc>
@@ -4057,7 +4057,7 @@
               <w:rPr>
                 <w:sz w:val="14"/>
               </w:rPr>
-              <w:t>-203 mm / +0.1 °C</w:t>
+              <w:t>-177 mm / +0.0 °C</w:t>
             </w:r>
           </w:p>
         </w:tc>
@@ -4071,7 +4071,7 @@
               <w:rPr>
                 <w:sz w:val="14"/>
               </w:rPr>
-              <w:t>-80 mm / -0.2 °C</w:t>
+              <w:t>-82 mm / -0.2 °C</w:t>
             </w:r>
           </w:p>
         </w:tc>
@@ -4171,7 +4171,7 @@
               <w:rPr>
                 <w:sz w:val="14"/>
               </w:rPr>
-              <w:t>-63 mm / +0.1 °C</w:t>
+              <w:t>-37 mm / +0.0 °C</w:t>
             </w:r>
           </w:p>
         </w:tc>
@@ -4185,7 +4185,7 @@
               <w:rPr>
                 <w:sz w:val="14"/>
               </w:rPr>
-              <w:t>+37 mm / -0.1 °C</w:t>
+              <w:t>+34 mm / -0.1 °C</w:t>
             </w:r>
           </w:p>
         </w:tc>
@@ -4285,7 +4285,7 @@
               <w:rPr>
                 <w:sz w:val="14"/>
               </w:rPr>
-              <w:t>+10 mm / +0.5 °C</w:t>
+              <w:t>+36 mm / +0.4 °C</w:t>
             </w:r>
           </w:p>
         </w:tc>
@@ -4299,7 +4299,7 @@
               <w:rPr>
                 <w:sz w:val="14"/>
               </w:rPr>
-              <w:t>-14 mm / +0.6 °C</w:t>
+              <w:t>-16 mm / +0.6 °C</w:t>
             </w:r>
           </w:p>
         </w:tc>
@@ -4399,7 +4399,7 @@
               <w:rPr>
                 <w:sz w:val="14"/>
               </w:rPr>
-              <w:t>-21 mm / +0.2 °C</w:t>
+              <w:t>+5 mm / +0.1 °C</w:t>
             </w:r>
           </w:p>
         </w:tc>
@@ -4413,7 +4413,7 @@
               <w:rPr>
                 <w:sz w:val="14"/>
               </w:rPr>
-              <w:t>+120 mm / +0.0 °C</w:t>
+              <w:t>+118 mm / -0.0 °C</w:t>
             </w:r>
           </w:p>
         </w:tc>
@@ -4513,7 +4513,7 @@
               <w:rPr>
                 <w:sz w:val="14"/>
               </w:rPr>
-              <w:t>-361 mm / +0.8 °C</w:t>
+              <w:t>-335 mm / +0.7 °C</w:t>
             </w:r>
           </w:p>
         </w:tc>
@@ -4527,7 +4527,7 @@
               <w:rPr>
                 <w:sz w:val="14"/>
               </w:rPr>
-              <w:t>-197 mm / +0.3 °C</w:t>
+              <w:t>-200 mm / +0.3 °C</w:t>
             </w:r>
           </w:p>
         </w:tc>
@@ -4627,7 +4627,7 @@
               <w:rPr>
                 <w:sz w:val="14"/>
               </w:rPr>
-              <w:t>+177 mm / -0.4 °C</w:t>
+              <w:t>+203 mm / -0.5 °C</w:t>
             </w:r>
           </w:p>
         </w:tc>
@@ -4641,7 +4641,7 @@
               <w:rPr>
                 <w:sz w:val="14"/>
               </w:rPr>
-              <w:t>+25 mm / -0.1 °C</w:t>
+              <w:t>+22 mm / -0.1 °C</w:t>
             </w:r>
           </w:p>
         </w:tc>
@@ -4741,7 +4741,7 @@
               <w:rPr>
                 <w:sz w:val="14"/>
               </w:rPr>
-              <w:t>-11 mm / +0.1 °C</w:t>
+              <w:t>+15 mm / +0.0 °C</w:t>
             </w:r>
           </w:p>
         </w:tc>
@@ -4755,7 +4755,7 @@
               <w:rPr>
                 <w:sz w:val="14"/>
               </w:rPr>
-              <w:t>+65 mm / +0.2 °C</w:t>
+              <w:t>+62 mm / +0.2 °C</w:t>
             </w:r>
           </w:p>
         </w:tc>
@@ -4855,7 +4855,7 @@
               <w:rPr>
                 <w:sz w:val="14"/>
               </w:rPr>
-              <w:t>-440 mm / +2.4 °C</w:t>
+              <w:t>-414 mm / +2.3 °C</w:t>
             </w:r>
           </w:p>
         </w:tc>
@@ -4869,7 +4869,7 @@
               <w:rPr>
                 <w:sz w:val="14"/>
               </w:rPr>
-              <w:t>-335 mm / +1.7 °C</w:t>
+              <w:t>-338 mm / +1.7 °C</w:t>
             </w:r>
           </w:p>
         </w:tc>
@@ -5682,7 +5682,7 @@
               <w:rPr>
                 <w:sz w:val="14"/>
               </w:rPr>
-              <w:t>-112 mm / +0.8 °C</w:t>
+              <w:t>-86 mm / +0.7 °C</w:t>
             </w:r>
           </w:p>
         </w:tc>
@@ -5696,7 +5696,7 @@
               <w:rPr>
                 <w:sz w:val="14"/>
               </w:rPr>
-              <w:t>-479 mm / +1.3 °C</w:t>
+              <w:t>-482 mm / +1.3 °C</w:t>
             </w:r>
           </w:p>
         </w:tc>
@@ -5810,7 +5810,7 @@
               <w:rPr>
                 <w:sz w:val="14"/>
               </w:rPr>
-              <w:t>-67 mm / +0.4 °C</w:t>
+              <w:t>-42 mm / +0.3 °C</w:t>
             </w:r>
           </w:p>
         </w:tc>
@@ -5824,7 +5824,7 @@
               <w:rPr>
                 <w:sz w:val="14"/>
               </w:rPr>
-              <w:t>-30 mm / +0.3 °C</w:t>
+              <w:t>-33 mm / +0.3 °C</w:t>
             </w:r>
           </w:p>
         </w:tc>
@@ -5938,7 +5938,7 @@
               <w:rPr>
                 <w:sz w:val="14"/>
               </w:rPr>
-              <w:t>-16 mm / -0.1 °C</w:t>
+              <w:t>+9 mm / -0.1 °C</w:t>
             </w:r>
           </w:p>
         </w:tc>
@@ -5952,7 +5952,7 @@
               <w:rPr>
                 <w:sz w:val="14"/>
               </w:rPr>
-              <w:t>+37 mm / -0.2 °C</w:t>
+              <w:t>+34 mm / -0.2 °C</w:t>
             </w:r>
           </w:p>
         </w:tc>
@@ -6066,7 +6066,7 @@
               <w:rPr>
                 <w:sz w:val="14"/>
               </w:rPr>
-              <w:t>+119 mm / -0.6 °C</w:t>
+              <w:t>+144 mm / -0.6 °C</w:t>
             </w:r>
           </w:p>
         </w:tc>
@@ -6080,7 +6080,7 @@
               <w:rPr>
                 <w:sz w:val="14"/>
               </w:rPr>
-              <w:t>-14 mm / -0.3 °C</w:t>
+              <w:t>-16 mm / -0.4 °C</w:t>
             </w:r>
           </w:p>
         </w:tc>
@@ -6108,7 +6108,7 @@
           <w:i w:val="0"/>
           <w:sz w:val="20"/>
         </w:rPr>
-        <w:t>Lecture : les El Niño forts de la période (2015/16) ont donné des campagnes N+1 avec -479 mm et +1.3 °C en Espírito Santo et -112 mm, +0.8 °C à Minas Gerais. Le conilon, non irrigué dans une bonne partie de São Mateus, a perdu -29.7 % par rapport à l'attendu (−30 % en 2016/17) ; l'arabica, en année ON, est resté à +3.0 % de l'attendu : le cycle a masqué le choc. Les El Niño ordinaires ont une signature plus diffuse : 2024/25 (après l'épisode 2023/24) a tout de même connu −452 mm et +2,4 °C à Minas Gerais.</w:t>
+        <w:t>Lecture : les El Niño forts de la période (2015/16) ont donné des campagnes N+1 avec -482 mm et +1.3 °C en Espírito Santo et -86 mm, +0.7 °C à Minas Gerais. Le conilon, non irrigué dans une bonne partie de São Mateus, a perdu -29.7 % par rapport à l'attendu (−30 % en 2016/17) ; l'arabica, en année ON, est resté à +3.0 % de l'attendu : le cycle a masqué le choc. Les El Niño ordinaires ont une signature plus diffuse : 2024/25 (après l'épisode 2023/24) a tout de même connu −452 mm et +2,4 °C à Minas Gerais.</w:t>
       </w:r>
     </w:p>
     <w:p>
@@ -6118,7 +6118,7 @@
           <w:i w:val="0"/>
           <w:sz w:val="20"/>
         </w:rPr>
-        <w:t>Dans les données : les campagnes El Niño ont eu -51 mm de pluie à Minas Gerais et -116 mm en Espírito Santo, avec +0.43 °C et +0.50 °C, mais +155 mm au Paraná ; les campagnes La Niña +14 mm à Minas et -93 mm au Paraná. Le signal attendu (Sud plus humide, Sudeste plus sec et plus chaud sous El Niño) est bien là, et c'est le Sudeste qui porte l'arabica et le conilon.</w:t>
+        <w:t>Dans les données : les campagnes El Niño ont eu -48 mm de pluie à Minas Gerais et -97 mm en Espírito Santo, avec +0.40 °C et +0.45 °C, mais +121 mm au Paraná ; les campagnes La Niña +3 mm à Minas et -82 mm au Paraná. Le signal attendu (Sud plus humide, Sudeste plus sec et plus chaud sous El Niño) est bien là, et c'est le Sudeste qui porte l'arabica et le conilon.</w:t>
       </w:r>
     </w:p>
     <w:p>
@@ -6375,7 +6375,7 @@
               <w:rPr>
                 <w:sz w:val="15"/>
               </w:rPr>
-              <w:t>El Niño (0,5 à 1,5)</w:t>
+              <w:t>El Niño (0,5 à 1,6)</w:t>
             </w:r>
           </w:p>
         </w:tc>

</xml_diff>

<commit_message>
Reports: ENSO charts and phase table on year-over-year change
Co-Authored-By: Claude Fable 5.1 <noreply@anthropic.com>
Claude-Session: https://claude.ai/code/session_01FCxjZoAHXMLJTirXSfbmgL
</commit_message>
<xml_diff>
--- a/timeseries/output/reports/Bresil_balance_sheet_cafe.docx
+++ b/timeseries/output/reports/Bresil_balance_sheet_cafe.docx
@@ -6168,7 +6168,7 @@
           <w:color w:val="52514E"/>
           <w:sz w:val="16"/>
         </w:rPr>
-        <w:t>Figure 5. Écart moyen du rendement et de la production par phase ENSO.</w:t>
+        <w:t>Figure 5. Variation annuelle moyenne du rendement et de la production par phase ENSO.</w:t>
       </w:r>
     </w:p>
     <w:tbl>
@@ -6219,7 +6219,7 @@
         </w:tc>
         <w:tc>
           <w:tcPr>
-            <w:tcW w:type="dxa" w:w="1361"/>
+            <w:tcW w:type="dxa" w:w="1474"/>
           </w:tcPr>
           <w:p>
             <w:r/>
@@ -6228,13 +6228,13 @@
                 <w:b/>
                 <w:sz w:val="15"/>
               </w:rPr>
-              <w:t>Rendement : écart moyen</w:t>
-            </w:r>
-          </w:p>
-        </w:tc>
-        <w:tc>
-          <w:tcPr>
-            <w:tcW w:type="dxa" w:w="1134"/>
+              <w:t>Rendement : variation annuelle moyenne</w:t>
+            </w:r>
+          </w:p>
+        </w:tc>
+        <w:tc>
+          <w:tcPr>
+            <w:tcW w:type="dxa" w:w="1361"/>
           </w:tcPr>
           <w:p>
             <w:r/>
@@ -6243,13 +6243,13 @@
                 <w:b/>
                 <w:sz w:val="15"/>
               </w:rPr>
-              <w:t>% sous la moyenne</w:t>
-            </w:r>
-          </w:p>
-        </w:tc>
-        <w:tc>
-          <w:tcPr>
-            <w:tcW w:type="dxa" w:w="1361"/>
+              <w:t>Rendement : écart aux voisines</w:t>
+            </w:r>
+          </w:p>
+        </w:tc>
+        <w:tc>
+          <w:tcPr>
+            <w:tcW w:type="dxa" w:w="1474"/>
           </w:tcPr>
           <w:p>
             <w:r/>
@@ -6258,13 +6258,13 @@
                 <w:b/>
                 <w:sz w:val="15"/>
               </w:rPr>
-              <w:t>Production : écart moyen</w:t>
-            </w:r>
-          </w:p>
-        </w:tc>
-        <w:tc>
-          <w:tcPr>
-            <w:tcW w:type="dxa" w:w="3402"/>
+              <w:t>Production : variation annuelle moyenne</w:t>
+            </w:r>
+          </w:p>
+        </w:tc>
+        <w:tc>
+          <w:tcPr>
+            <w:tcW w:type="dxa" w:w="2948"/>
           </w:tcPr>
           <w:p>
             <w:r/>
@@ -6309,6 +6309,20 @@
         </w:tc>
         <w:tc>
           <w:tcPr>
+            <w:tcW w:type="dxa" w:w="1474"/>
+          </w:tcPr>
+          <w:p>
+            <w:r/>
+            <w:r>
+              <w:rPr>
+                <w:sz w:val="15"/>
+              </w:rPr>
+              <w:t>+13.6 %</w:t>
+            </w:r>
+          </w:p>
+        </w:tc>
+        <w:tc>
+          <w:tcPr>
             <w:tcW w:type="dxa" w:w="1361"/>
           </w:tcPr>
           <w:p>
@@ -6323,7 +6337,7 @@
         </w:tc>
         <w:tc>
           <w:tcPr>
-            <w:tcW w:type="dxa" w:w="1134"/>
+            <w:tcW w:type="dxa" w:w="1474"/>
           </w:tcPr>
           <w:p>
             <w:r/>
@@ -6331,27 +6345,13 @@
               <w:rPr>
                 <w:sz w:val="15"/>
               </w:rPr>
-              <w:t>100 %</w:t>
-            </w:r>
-          </w:p>
-        </w:tc>
-        <w:tc>
-          <w:tcPr>
-            <w:tcW w:type="dxa" w:w="1361"/>
-          </w:tcPr>
-          <w:p>
-            <w:r/>
-            <w:r>
-              <w:rPr>
-                <w:sz w:val="15"/>
-              </w:rPr>
-              <w:t>-5.8 %</w:t>
-            </w:r>
-          </w:p>
-        </w:tc>
-        <w:tc>
-          <w:tcPr>
-            <w:tcW w:type="dxa" w:w="3402"/>
+              <w:t>+13.6 %</w:t>
+            </w:r>
+          </w:p>
+        </w:tc>
+        <w:tc>
+          <w:tcPr>
+            <w:tcW w:type="dxa" w:w="2948"/>
           </w:tcPr>
           <w:p>
             <w:r/>
@@ -6395,6 +6395,20 @@
         </w:tc>
         <w:tc>
           <w:tcPr>
+            <w:tcW w:type="dxa" w:w="1474"/>
+          </w:tcPr>
+          <w:p>
+            <w:r/>
+            <w:r>
+              <w:rPr>
+                <w:sz w:val="15"/>
+              </w:rPr>
+              <w:t>-4.2 %</w:t>
+            </w:r>
+          </w:p>
+        </w:tc>
+        <w:tc>
+          <w:tcPr>
             <w:tcW w:type="dxa" w:w="1361"/>
           </w:tcPr>
           <w:p>
@@ -6409,7 +6423,7 @@
         </w:tc>
         <w:tc>
           <w:tcPr>
-            <w:tcW w:type="dxa" w:w="1134"/>
+            <w:tcW w:type="dxa" w:w="1474"/>
           </w:tcPr>
           <w:p>
             <w:r/>
@@ -6417,27 +6431,13 @@
               <w:rPr>
                 <w:sz w:val="15"/>
               </w:rPr>
-              <w:t>83 %</w:t>
-            </w:r>
-          </w:p>
-        </w:tc>
-        <w:tc>
-          <w:tcPr>
-            <w:tcW w:type="dxa" w:w="1361"/>
-          </w:tcPr>
-          <w:p>
-            <w:r/>
-            <w:r>
-              <w:rPr>
-                <w:sz w:val="15"/>
-              </w:rPr>
-              <w:t>-2.1 %</w:t>
-            </w:r>
-          </w:p>
-        </w:tc>
-        <w:tc>
-          <w:tcPr>
-            <w:tcW w:type="dxa" w:w="3402"/>
+              <w:t>-5.2 %</w:t>
+            </w:r>
+          </w:p>
+        </w:tc>
+        <w:tc>
+          <w:tcPr>
+            <w:tcW w:type="dxa" w:w="2948"/>
           </w:tcPr>
           <w:p>
             <w:r/>
@@ -6481,6 +6481,20 @@
         </w:tc>
         <w:tc>
           <w:tcPr>
+            <w:tcW w:type="dxa" w:w="1474"/>
+          </w:tcPr>
+          <w:p>
+            <w:r/>
+            <w:r>
+              <w:rPr>
+                <w:sz w:val="15"/>
+              </w:rPr>
+              <w:t>+23.4 %</w:t>
+            </w:r>
+          </w:p>
+        </w:tc>
+        <w:tc>
+          <w:tcPr>
             <w:tcW w:type="dxa" w:w="1361"/>
           </w:tcPr>
           <w:p>
@@ -6495,7 +6509,7 @@
         </w:tc>
         <w:tc>
           <w:tcPr>
-            <w:tcW w:type="dxa" w:w="1134"/>
+            <w:tcW w:type="dxa" w:w="1474"/>
           </w:tcPr>
           <w:p>
             <w:r/>
@@ -6503,27 +6517,13 @@
               <w:rPr>
                 <w:sz w:val="15"/>
               </w:rPr>
-              <w:t>50 %</w:t>
-            </w:r>
-          </w:p>
-        </w:tc>
-        <w:tc>
-          <w:tcPr>
-            <w:tcW w:type="dxa" w:w="1361"/>
-          </w:tcPr>
-          <w:p>
-            <w:r/>
-            <w:r>
-              <w:rPr>
-                <w:sz w:val="15"/>
-              </w:rPr>
-              <w:t>+7.8 %</w:t>
-            </w:r>
-          </w:p>
-        </w:tc>
-        <w:tc>
-          <w:tcPr>
-            <w:tcW w:type="dxa" w:w="3402"/>
+              <w:t>+19.5 %</w:t>
+            </w:r>
+          </w:p>
+        </w:tc>
+        <w:tc>
+          <w:tcPr>
+            <w:tcW w:type="dxa" w:w="2948"/>
           </w:tcPr>
           <w:p>
             <w:r/>
@@ -6567,6 +6567,20 @@
         </w:tc>
         <w:tc>
           <w:tcPr>
+            <w:tcW w:type="dxa" w:w="1474"/>
+          </w:tcPr>
+          <w:p>
+            <w:r/>
+            <w:r>
+              <w:rPr>
+                <w:sz w:val="15"/>
+              </w:rPr>
+              <w:t>+7.6 %</w:t>
+            </w:r>
+          </w:p>
+        </w:tc>
+        <w:tc>
+          <w:tcPr>
             <w:tcW w:type="dxa" w:w="1361"/>
           </w:tcPr>
           <w:p>
@@ -6581,7 +6595,7 @@
         </w:tc>
         <w:tc>
           <w:tcPr>
-            <w:tcW w:type="dxa" w:w="1134"/>
+            <w:tcW w:type="dxa" w:w="1474"/>
           </w:tcPr>
           <w:p>
             <w:r/>
@@ -6589,27 +6603,13 @@
               <w:rPr>
                 <w:sz w:val="15"/>
               </w:rPr>
-              <w:t>44 %</w:t>
-            </w:r>
-          </w:p>
-        </w:tc>
-        <w:tc>
-          <w:tcPr>
-            <w:tcW w:type="dxa" w:w="1361"/>
-          </w:tcPr>
-          <w:p>
-            <w:r/>
-            <w:r>
-              <w:rPr>
-                <w:sz w:val="15"/>
-              </w:rPr>
-              <w:t>+0.6 %</w:t>
-            </w:r>
-          </w:p>
-        </w:tc>
-        <w:tc>
-          <w:tcPr>
-            <w:tcW w:type="dxa" w:w="3402"/>
+              <w:t>+7.1 %</w:t>
+            </w:r>
+          </w:p>
+        </w:tc>
+        <w:tc>
+          <w:tcPr>
+            <w:tcW w:type="dxa" w:w="2948"/>
           </w:tcPr>
           <w:p>
             <w:r/>
@@ -6653,6 +6653,20 @@
         </w:tc>
         <w:tc>
           <w:tcPr>
+            <w:tcW w:type="dxa" w:w="1474"/>
+          </w:tcPr>
+          <w:p>
+            <w:r/>
+            <w:r>
+              <w:rPr>
+                <w:sz w:val="15"/>
+              </w:rPr>
+              <w:t>+14.2 %</w:t>
+            </w:r>
+          </w:p>
+        </w:tc>
+        <w:tc>
+          <w:tcPr>
             <w:tcW w:type="dxa" w:w="1361"/>
           </w:tcPr>
           <w:p>
@@ -6667,7 +6681,7 @@
         </w:tc>
         <w:tc>
           <w:tcPr>
-            <w:tcW w:type="dxa" w:w="1134"/>
+            <w:tcW w:type="dxa" w:w="1474"/>
           </w:tcPr>
           <w:p>
             <w:r/>
@@ -6675,27 +6689,13 @@
               <w:rPr>
                 <w:sz w:val="15"/>
               </w:rPr>
-              <w:t>50 %</w:t>
-            </w:r>
-          </w:p>
-        </w:tc>
-        <w:tc>
-          <w:tcPr>
-            <w:tcW w:type="dxa" w:w="1361"/>
-          </w:tcPr>
-          <w:p>
-            <w:r/>
-            <w:r>
-              <w:rPr>
-                <w:sz w:val="15"/>
-              </w:rPr>
-              <w:t>+3.0 %</w:t>
-            </w:r>
-          </w:p>
-        </w:tc>
-        <w:tc>
-          <w:tcPr>
-            <w:tcW w:type="dxa" w:w="3402"/>
+              <w:t>+13.3 %</w:t>
+            </w:r>
+          </w:p>
+        </w:tc>
+        <w:tc>
+          <w:tcPr>
+            <w:tcW w:type="dxa" w:w="2948"/>
           </w:tcPr>
           <w:p>
             <w:r/>
@@ -6714,10 +6714,21 @@
       <w:r>
         <w:rPr>
           <w:b w:val="0"/>
+          <w:i/>
+          <w:color w:val="52514E"/>
+          <w:sz w:val="16"/>
+        </w:rPr>
+        <w:t>Variation annuelle = campagne N contre N−1 ; écart aux voisines = campagne N contre la moyenne des deux campagnes d'avant et des deux d'après (cycle ON/OFF retiré au Brésil). Au Brésil la variation annuelle porte le cycle : une classe composée surtout d'années ON affiche une hausse mécanique, et inversement.</w:t>
+      </w:r>
+    </w:p>
+    <w:p>
+      <w:r>
+        <w:rPr>
+          <w:b w:val="0"/>
           <w:i w:val="0"/>
           <w:sz w:val="20"/>
         </w:rPr>
-        <w:t>Lecture : pour Brésil, El Niño est historiquement négatif pour le rendement (-2.1 %) et La Niña neutre (+0.4 %). Avec 8 à 15 campagnes par phase, ce sont des tendances centrales, pas des lois : l'intensité de l'épisode, son calage sur la floraison et l'état du verger font l'écart.</w:t>
+        <w:t>Lecture : pour Brésil, El Niño est historiquement négatif pour le rendement (variation annuelle moyenne -1.6 %, écart aux voisines -2.1 %) et La Niña positif (+8.8 %, écart +0.4 %). Avec 8 à 15 campagnes par phase, ce sont des tendances centrales, pas des lois : l'intensité de l'épisode, son calage sur la floraison et l'état du verger font l'écart.</w:t>
       </w:r>
     </w:p>
     <w:p>

</xml_diff>

<commit_message>
Reports: single La Nina class
Co-Authored-By: Claude Fable 5.1 <noreply@anthropic.com>
Claude-Session: https://claude.ai/code/session_01FCxjZoAHXMLJTirXSfbmgL
</commit_message>
<xml_diff>
--- a/timeseries/output/reports/Bresil_balance_sheet_cafe.docx
+++ b/timeseries/output/reports/Bresil_balance_sheet_cafe.docx
@@ -5854,7 +5854,7 @@
               <w:rPr>
                 <w:sz w:val="14"/>
               </w:rPr>
-              <w:t>La Niña ordinaire</w:t>
+              <w:t>La Niña</w:t>
             </w:r>
           </w:p>
         </w:tc>
@@ -5868,7 +5868,7 @@
               <w:rPr>
                 <w:sz w:val="14"/>
               </w:rPr>
-              <w:t>9</w:t>
+              <w:t>11</w:t>
             </w:r>
           </w:p>
         </w:tc>
@@ -5882,40 +5882,40 @@
               <w:rPr>
                 <w:sz w:val="14"/>
               </w:rPr>
+              <w:t>+1.2 %</w:t>
+            </w:r>
+          </w:p>
+        </w:tc>
+        <w:tc>
+          <w:tcPr>
+            <w:tcW w:type="dxa" w:w="850"/>
+          </w:tcPr>
+          <w:p>
+            <w:r/>
+            <w:r>
+              <w:rPr>
+                <w:sz w:val="14"/>
+              </w:rPr>
+              <w:t>+1.0 %</w:t>
+            </w:r>
+          </w:p>
+        </w:tc>
+        <w:tc>
+          <w:tcPr>
+            <w:tcW w:type="dxa" w:w="850"/>
+          </w:tcPr>
+          <w:p>
+            <w:r/>
+            <w:r>
+              <w:rPr>
+                <w:sz w:val="14"/>
+              </w:rPr>
               <w:t>+1.1 %</w:t>
             </w:r>
           </w:p>
         </w:tc>
         <w:tc>
           <w:tcPr>
-            <w:tcW w:type="dxa" w:w="850"/>
-          </w:tcPr>
-          <w:p>
-            <w:r/>
-            <w:r>
-              <w:rPr>
-                <w:sz w:val="14"/>
-              </w:rPr>
-              <w:t>-0.4 %</w:t>
-            </w:r>
-          </w:p>
-        </w:tc>
-        <w:tc>
-          <w:tcPr>
-            <w:tcW w:type="dxa" w:w="850"/>
-          </w:tcPr>
-          <w:p>
-            <w:r/>
-            <w:r>
-              <w:rPr>
-                <w:sz w:val="14"/>
-              </w:rPr>
-              <w:t>+0.6 %</w:t>
-            </w:r>
-          </w:p>
-        </w:tc>
-        <w:tc>
-          <w:tcPr>
             <w:tcW w:type="dxa" w:w="907"/>
           </w:tcPr>
           <w:p>
@@ -5924,7 +5924,7 @@
               <w:rPr>
                 <w:sz w:val="14"/>
               </w:rPr>
-              <w:t>-0.1 %</w:t>
+              <w:t>+0.4 %</w:t>
             </w:r>
           </w:p>
         </w:tc>
@@ -5938,7 +5938,7 @@
               <w:rPr>
                 <w:sz w:val="14"/>
               </w:rPr>
-              <w:t>+9 mm / -0.1 °C</w:t>
+              <w:t>+33 mm / -0.2 °C</w:t>
             </w:r>
           </w:p>
         </w:tc>
@@ -5952,7 +5952,7 @@
               <w:rPr>
                 <w:sz w:val="14"/>
               </w:rPr>
-              <w:t>+34 mm / -0.2 °C</w:t>
+              <w:t>+25 mm / -0.2 °C</w:t>
             </w:r>
           </w:p>
         </w:tc>
@@ -5966,135 +5966,7 @@
               <w:rPr>
                 <w:sz w:val="14"/>
               </w:rPr>
-              <w:t>2006/07 2009/10 2012/13 2017/18 2018/19 2020/21 2021/22 2022/23 2023/24</w:t>
-            </w:r>
-          </w:p>
-        </w:tc>
-      </w:tr>
-      <w:tr>
-        <w:tc>
-          <w:tcPr>
-            <w:tcW w:type="dxa" w:w="1587"/>
-          </w:tcPr>
-          <w:p>
-            <w:r/>
-            <w:r>
-              <w:rPr>
-                <w:sz w:val="14"/>
-              </w:rPr>
-              <w:t>La Niña forte</w:t>
-            </w:r>
-          </w:p>
-        </w:tc>
-        <w:tc>
-          <w:tcPr>
-            <w:tcW w:type="dxa" w:w="454"/>
-          </w:tcPr>
-          <w:p>
-            <w:r/>
-            <w:r>
-              <w:rPr>
-                <w:sz w:val="14"/>
-              </w:rPr>
-              <w:t>2</w:t>
-            </w:r>
-          </w:p>
-        </w:tc>
-        <w:tc>
-          <w:tcPr>
-            <w:tcW w:type="dxa" w:w="850"/>
-          </w:tcPr>
-          <w:p>
-            <w:r/>
-            <w:r>
-              <w:rPr>
-                <w:sz w:val="14"/>
-              </w:rPr>
-              <w:t>+1.6 %</w:t>
-            </w:r>
-          </w:p>
-        </w:tc>
-        <w:tc>
-          <w:tcPr>
-            <w:tcW w:type="dxa" w:w="850"/>
-          </w:tcPr>
-          <w:p>
-            <w:r/>
-            <w:r>
-              <w:rPr>
-                <w:sz w:val="14"/>
-              </w:rPr>
-              <w:t>+7.2 %</w:t>
-            </w:r>
-          </w:p>
-        </w:tc>
-        <w:tc>
-          <w:tcPr>
-            <w:tcW w:type="dxa" w:w="850"/>
-          </w:tcPr>
-          <w:p>
-            <w:r/>
-            <w:r>
-              <w:rPr>
-                <w:sz w:val="14"/>
-              </w:rPr>
-              <w:t>+3.0 %</w:t>
-            </w:r>
-          </w:p>
-        </w:tc>
-        <w:tc>
-          <w:tcPr>
-            <w:tcW w:type="dxa" w:w="907"/>
-          </w:tcPr>
-          <w:p>
-            <w:r/>
-            <w:r>
-              <w:rPr>
-                <w:sz w:val="14"/>
-              </w:rPr>
-              <w:t>+2.4 %</w:t>
-            </w:r>
-          </w:p>
-        </w:tc>
-        <w:tc>
-          <w:tcPr>
-            <w:tcW w:type="dxa" w:w="1304"/>
-          </w:tcPr>
-          <w:p>
-            <w:r/>
-            <w:r>
-              <w:rPr>
-                <w:sz w:val="14"/>
-              </w:rPr>
-              <w:t>+144 mm / -0.6 °C</w:t>
-            </w:r>
-          </w:p>
-        </w:tc>
-        <w:tc>
-          <w:tcPr>
-            <w:tcW w:type="dxa" w:w="1304"/>
-          </w:tcPr>
-          <w:p>
-            <w:r/>
-            <w:r>
-              <w:rPr>
-                <w:sz w:val="14"/>
-              </w:rPr>
-              <w:t>-16 mm / -0.4 °C</w:t>
-            </w:r>
-          </w:p>
-        </w:tc>
-        <w:tc>
-          <w:tcPr>
-            <w:tcW w:type="dxa" w:w="1984"/>
-          </w:tcPr>
-          <w:p>
-            <w:r/>
-            <w:r>
-              <w:rPr>
-                <w:sz w:val="14"/>
-              </w:rPr>
-              <w:t>2008/09 2011/12</w:t>
+              <w:t>2006/07 2008/09 2009/10 2011/12 2012/13 2017/18 2018/19 2020/21 2021/22 2022/23 2023/24</w:t>
             </w:r>
           </w:p>
         </w:tc>
@@ -6561,7 +6433,7 @@
               <w:rPr>
                 <w:sz w:val="15"/>
               </w:rPr>
-              <w:t>9</w:t>
+              <w:t>11</w:t>
             </w:r>
           </w:p>
         </w:tc>
@@ -6575,7 +6447,7 @@
               <w:rPr>
                 <w:sz w:val="15"/>
               </w:rPr>
-              <w:t>+7.6 %</w:t>
+              <w:t>+8.8 %</w:t>
             </w:r>
           </w:p>
         </w:tc>
@@ -6589,7 +6461,7 @@
               <w:rPr>
                 <w:sz w:val="15"/>
               </w:rPr>
-              <w:t>-0.1 %</w:t>
+              <w:t>+0.4 %</w:t>
             </w:r>
           </w:p>
         </w:tc>
@@ -6603,7 +6475,7 @@
               <w:rPr>
                 <w:sz w:val="15"/>
               </w:rPr>
-              <w:t>+7.1 %</w:t>
+              <w:t>+8.2 %</w:t>
             </w:r>
           </w:p>
         </w:tc>
@@ -6617,93 +6489,7 @@
               <w:rPr>
                 <w:sz w:val="15"/>
               </w:rPr>
-              <w:t>2006/07 2009/10 2012/13 2017/18 2018/19 2020/21 2021/22 2022/23 2023/24</w:t>
-            </w:r>
-          </w:p>
-        </w:tc>
-      </w:tr>
-      <w:tr>
-        <w:tc>
-          <w:tcPr>
-            <w:tcW w:type="dxa" w:w="1814"/>
-          </w:tcPr>
-          <w:p>
-            <w:r/>
-            <w:r>
-              <w:rPr>
-                <w:sz w:val="15"/>
-              </w:rPr>
-              <w:t>La Niña forte (≤ −1,6)</w:t>
-            </w:r>
-          </w:p>
-        </w:tc>
-        <w:tc>
-          <w:tcPr>
-            <w:tcW w:type="dxa" w:w="567"/>
-          </w:tcPr>
-          <w:p>
-            <w:r/>
-            <w:r>
-              <w:rPr>
-                <w:sz w:val="15"/>
-              </w:rPr>
-              <w:t>2</w:t>
-            </w:r>
-          </w:p>
-        </w:tc>
-        <w:tc>
-          <w:tcPr>
-            <w:tcW w:type="dxa" w:w="1474"/>
-          </w:tcPr>
-          <w:p>
-            <w:r/>
-            <w:r>
-              <w:rPr>
-                <w:sz w:val="15"/>
-              </w:rPr>
-              <w:t>+14.2 %</w:t>
-            </w:r>
-          </w:p>
-        </w:tc>
-        <w:tc>
-          <w:tcPr>
-            <w:tcW w:type="dxa" w:w="1361"/>
-          </w:tcPr>
-          <w:p>
-            <w:r/>
-            <w:r>
-              <w:rPr>
-                <w:sz w:val="15"/>
-              </w:rPr>
-              <w:t>+2.4 %</w:t>
-            </w:r>
-          </w:p>
-        </w:tc>
-        <w:tc>
-          <w:tcPr>
-            <w:tcW w:type="dxa" w:w="1474"/>
-          </w:tcPr>
-          <w:p>
-            <w:r/>
-            <w:r>
-              <w:rPr>
-                <w:sz w:val="15"/>
-              </w:rPr>
-              <w:t>+13.3 %</w:t>
-            </w:r>
-          </w:p>
-        </w:tc>
-        <w:tc>
-          <w:tcPr>
-            <w:tcW w:type="dxa" w:w="2948"/>
-          </w:tcPr>
-          <w:p>
-            <w:r/>
-            <w:r>
-              <w:rPr>
-                <w:sz w:val="15"/>
-              </w:rPr>
-              <w:t>2008/09 2011/12</w:t>
+              <w:t>2006/07 2008/09 2009/10 2011/12 2012/13 2017/18 2018/19 2020/21 2021/22 2022/23 2023/24</w:t>
             </w:r>
           </w:p>
         </w:tc>

</xml_diff>

<commit_message>
Brazil report: 2027/28 scenarios on the client ENSO classes
Co-Authored-By: Claude Fable 5.1 <noreply@anthropic.com>
Claude-Session: https://claude.ai/code/session_01FCxjZoAHXMLJTirXSfbmgL
</commit_message>
<xml_diff>
--- a/timeseries/output/reports/Bresil_balance_sheet_cafe.docx
+++ b/timeseries/output/reports/Bresil_balance_sheet_cafe.docx
@@ -6344,7 +6344,7 @@
         <w:rPr>
           <w:sz w:val="17"/>
         </w:rPr>
-        <w:t>2027/28 : Arabica 43 119 = 26 423 (point de départ 2001/02, année OFF) + 16 696 (croissance structurelle 618 par an × 27 campagnes) + 0 (année OFF : pas de bonus) ; Robusta 23 196 = 7 813 (point de départ 2001/02, année OFF) + 15 383 (croissance structurelle 570 par an × 27 campagnes) ; Total 66 038 = 34 231 (point de départ 2001/02, année OFF) + 31 807 (croissance structurelle 1 178 par an × 27 campagnes) + 0 (année OFF : pas de bonus). Météo : normale, donc 0. Campagne pilotée par l'El Niño en cours : si El Niño ordinaire, arabica -1.7 % → 42 388, robusta -2.8 % → 22 549 ; si fort, arabica +3.0 % → 44 426, robusta -29.7 % → 16 298 (moyennes historiques des campagnes N+1 de chaque classe).</w:t>
+        <w:t>2027/28 : Arabica 43 119 = 26 423 (point de départ 2001/02, année OFF) + 16 696 (croissance structurelle 618 par an × 27 campagnes) + 0 (année OFF : pas de bonus) ; Robusta 23 196 = 7 813 (point de départ 2001/02, année OFF) + 15 383 (croissance structurelle 570 par an × 27 campagnes) ; Total 66 038 = 34 231 (point de départ 2001/02, année OFF) + 31 807 (croissance structurelle 1 178 par an × 27 campagnes) + 0 (année OFF : pas de bonus). Météo : normale, donc 0. Campagne pilotée par l'El Niño en cours : si El Niño normal, robusta +5.3 % → 24 423 ; si fort, robusta -21.4 % → 18 230 (ta classification, variation annuelle historique). Arabica 43 119 inchangé : l'historique par classe porte le cycle ON/OFF.</w:t>
       </w:r>
     </w:p>
     <w:p>
@@ -9211,7 +9211,7 @@
               <w:rPr>
                 <w:sz w:val="14"/>
               </w:rPr>
-              <w:t>Prévision modèles, El Niño ordinaire</w:t>
+              <w:t>Prévision modèles, El Niño normal</w:t>
             </w:r>
           </w:p>
         </w:tc>
@@ -9267,7 +9267,7 @@
               <w:rPr>
                 <w:sz w:val="14"/>
               </w:rPr>
-              <w:t>33.61</w:t>
+              <w:t>34.96</w:t>
             </w:r>
           </w:p>
         </w:tc>
@@ -9309,7 +9309,7 @@
               <w:rPr>
                 <w:sz w:val="14"/>
               </w:rPr>
-              <w:t>42 388</w:t>
+              <w:t>43 119</w:t>
             </w:r>
           </w:p>
         </w:tc>
@@ -9323,7 +9323,7 @@
               <w:rPr>
                 <w:sz w:val="14"/>
               </w:rPr>
-              <w:t>22 549</w:t>
+              <w:t>24 423</w:t>
             </w:r>
           </w:p>
         </w:tc>
@@ -9409,7 +9409,7 @@
               <w:rPr>
                 <w:sz w:val="14"/>
               </w:rPr>
-              <w:t>31.43</w:t>
+              <w:t>31.76</w:t>
             </w:r>
           </w:p>
         </w:tc>
@@ -9451,7 +9451,7 @@
               <w:rPr>
                 <w:sz w:val="14"/>
               </w:rPr>
-              <w:t>44 426</w:t>
+              <w:t>43 119</w:t>
             </w:r>
           </w:p>
         </w:tc>
@@ -9465,7 +9465,7 @@
               <w:rPr>
                 <w:sz w:val="14"/>
               </w:rPr>
-              <w:t>16 298</w:t>
+              <w:t>18 230</w:t>
             </w:r>
           </w:p>
         </w:tc>
@@ -9709,7 +9709,7 @@
         <w:rPr>
           <w:sz w:val="17"/>
         </w:rPr>
-        <w:t>Arabica 43 119 = 26 423 (point de départ 2001/02, année OFF) + 618 × 27 campagnes + 0 (année OFF, pas de bonus). Avec El Niño ordinaire (-1.7 % historique) : 42 388 ; avec El Niño fort (+3.0 %) : 44 426.</w:t>
+        <w:t>Arabica 43 119 = 26 423 (point de départ 2001/02, année OFF) + 618 × 27 campagnes + 0 (année OFF, pas de bonus). Pas d'ajustement El Niño sur l'arabica : l'historique par classe est dominé par le cycle ON/OFF (années ON en 2016/17 et 2024/25) et ne se transpose pas à une année OFF.</w:t>
       </w:r>
     </w:p>
     <w:p>
@@ -9720,7 +9720,7 @@
         <w:rPr>
           <w:sz w:val="17"/>
         </w:rPr>
-        <w:t>Robusta 23 196 = 7 813 + 570 × 27 campagnes (le report de surprise de 2025/26 ne joue plus). Avec El Niño ordinaire (-2.8 %) : 22 549 ; avec El Niño fort (-29.7 %) : 16 298.</w:t>
+        <w:t>Robusta 23 196 = 7 813 + 570 × 27 campagnes (le report de surprise de 2025/26 ne joue plus). Avec El Niño normal (+5.3 % historique, ta classification) : 24 423 ; avec El Niño fort (-21.4 %, 2015/16 et 2016/17) : 18 230.</w:t>
       </w:r>
     </w:p>
     <w:p>
@@ -9731,7 +9731,7 @@
         <w:rPr>
           <w:sz w:val="17"/>
         </w:rPr>
-        <w:t>Rendement 34.33 = (43 119 + 23 196) / 1 932 ; El Niño ordinaire 33.61 ; El Niño fort 31.43. Contrôle : le modèle de rendement direct (ON/OFF + tendance) donne 33.65 sacs/ha, soit 65 003 milliers de sacs par la surface récoltée : cohérent à 2 % près avec la production prévue.</w:t>
+        <w:t>Rendement 34.33 = (43 119 + 23 196) / 1 932 ; El Niño normal 34.96 ; El Niño fort 31.76. Contrôle : le modèle de rendement direct (ON/OFF + tendance) donne 33.65 sacs/ha, soit 65 003 milliers de sacs par la surface récoltée : cohérent à 2 % près avec la production prévue.</w:t>
       </w:r>
     </w:p>
     <w:p>
@@ -9742,7 +9742,7 @@
         <w:rPr>
           <w:sz w:val="17"/>
         </w:rPr>
-        <w:t>Comparaison avec ta ligne : arabica 41 325 est entre mon scénario El Niño ordinaire (42 388) et la météo normale (43 119) ; robusta 22 226 est proche de mon El Niño ordinaire (22 549) ; ta surface récoltée 1 906 suppose un recul de 35 kha en un an, plus fort que la tendance (1 932) ; tes arbres bearing 6 807 supposent une baisse alors que la tendance historique est de +96 M par an.</w:t>
+        <w:t>Comparaison avec ta ligne : arabica 41 325 est 4 % sous ma prévision (43 119), ce qui revient à retenir un choc météo ; robusta 22 226 est entre mon El Niño fort (18 230) et la météo normale (23 196) ; ta surface récoltée 1 906 suppose un recul de 35 kha en un an, plus fort que la tendance (1 932) ; tes arbres bearing 6 807 supposent une baisse alors que la tendance historique est de +96 M par an.</w:t>
       </w:r>
     </w:p>
     <w:p>

</xml_diff>

<commit_message>
Reports: client weather chart labels
Co-Authored-By: Claude Fable 5.1 <noreply@anthropic.com>
Claude-Session: https://claude.ai/code/session_01FCxjZoAHXMLJTirXSfbmgL
</commit_message>
<xml_diff>
--- a/timeseries/output/reports/Bresil_balance_sheet_cafe.docx
+++ b/timeseries/output/reports/Bresil_balance_sheet_cafe.docx
@@ -2630,7 +2630,7 @@
       <w:r>
         <w:drawing>
           <wp:inline xmlns:a="http://schemas.openxmlformats.org/drawingml/2006/main" xmlns:pic="http://schemas.openxmlformats.org/drawingml/2006/picture">
-            <wp:extent cx="6120000" cy="2147103"/>
+            <wp:extent cx="6120000" cy="2115740"/>
             <wp:docPr id="4" name="Picture 4"/>
             <wp:cNvGraphicFramePr>
               <a:graphicFrameLocks noChangeAspect="1"/>
@@ -2651,7 +2651,7 @@
                   <pic:spPr>
                     <a:xfrm>
                       <a:off x="0" y="0"/>
-                      <a:ext cx="6120000" cy="2147103"/>
+                      <a:ext cx="6120000" cy="2115740"/>
                     </a:xfrm>
                     <a:prstGeom prst="rect"/>
                   </pic:spPr>

</xml_diff>